<commit_message>
Labels: price trend is quantity-weighted average (hotlist stays minimum), radar number is mean over topics, active computers 44 days; manual updated
Co-Authored-By: Claude Opus 5.5 (1M context) <noreply@anthropic.com>
</commit_message>
<xml_diff>
--- a/TrafagSalesExporter/wwwroot/handbuch/Trafag_Cockpit_Handbuch.docx
+++ b/TrafagSalesExporter/wwwroot/handbuch/Trafag_Cockpit_Handbuch.docx
@@ -13,7 +13,7 @@
           <w:noProof/>
         </w:rPr>
         <w:drawing>
-          <wp:inline distT="0" distB="0" distL="0" distR="0" wp14:anchorId="6BCBA27E" wp14:editId="7E25B0E2">
+          <wp:inline distT="0" distB="0" distL="0" distR="0" wp14:anchorId="61371D34" wp14:editId="1A684F4D">
             <wp:extent cx="1655999" cy="803159"/>
             <wp:effectExtent l="0" t="0" r="0" b="0"/>
             <wp:docPr id="1" name="Trafag Logo"/>
@@ -129,7 +129,7 @@
       <w:r>
         <w:fldChar w:fldCharType="separate"/>
       </w:r>
-      <w:hyperlink w:anchor="_Toc242172914" w:history="1">
+      <w:hyperlink w:anchor="_Toc242173521" w:history="1">
         <w:r>
           <w:rPr>
             <w:rStyle w:val="Hyperlink"/>
@@ -156,7 +156,7 @@
             <w:noProof/>
             <w:webHidden/>
           </w:rPr>
-          <w:instrText xml:space="preserve"> PAGEREF _Toc242172914 \h </w:instrText>
+          <w:instrText xml:space="preserve"> PAGEREF _Toc242173521 \h </w:instrText>
         </w:r>
         <w:r>
           <w:rPr>
@@ -199,7 +199,7 @@
           <w:sz w:val="24"/>
         </w:rPr>
       </w:pPr>
-      <w:hyperlink w:anchor="_Toc242172915" w:history="1">
+      <w:hyperlink w:anchor="_Toc242173522" w:history="1">
         <w:r>
           <w:rPr>
             <w:rStyle w:val="Hyperlink"/>
@@ -226,7 +226,7 @@
             <w:noProof/>
             <w:webHidden/>
           </w:rPr>
-          <w:instrText xml:space="preserve"> PAGEREF _Toc242172915 \h </w:instrText>
+          <w:instrText xml:space="preserve"> PAGEREF _Toc242173522 \h </w:instrText>
         </w:r>
         <w:r>
           <w:rPr>
@@ -269,7 +269,7 @@
           <w:sz w:val="24"/>
         </w:rPr>
       </w:pPr>
-      <w:hyperlink w:anchor="_Toc242172916" w:history="1">
+      <w:hyperlink w:anchor="_Toc242173523" w:history="1">
         <w:r>
           <w:rPr>
             <w:rStyle w:val="Hyperlink"/>
@@ -296,7 +296,7 @@
             <w:noProof/>
             <w:webHidden/>
           </w:rPr>
-          <w:instrText xml:space="preserve"> PAGEREF _Toc242172916 \h </w:instrText>
+          <w:instrText xml:space="preserve"> PAGEREF _Toc242173523 \h </w:instrText>
         </w:r>
         <w:r>
           <w:rPr>
@@ -339,7 +339,7 @@
           <w:sz w:val="24"/>
         </w:rPr>
       </w:pPr>
-      <w:hyperlink w:anchor="_Toc242172917" w:history="1">
+      <w:hyperlink w:anchor="_Toc242173524" w:history="1">
         <w:r>
           <w:rPr>
             <w:rStyle w:val="Hyperlink"/>
@@ -366,7 +366,7 @@
             <w:noProof/>
             <w:webHidden/>
           </w:rPr>
-          <w:instrText xml:space="preserve"> PAGEREF _Toc242172917 \h </w:instrText>
+          <w:instrText xml:space="preserve"> PAGEREF _Toc242173524 \h </w:instrText>
         </w:r>
         <w:r>
           <w:rPr>
@@ -410,7 +410,7 @@
           <w:sz w:val="24"/>
         </w:rPr>
       </w:pPr>
-      <w:hyperlink w:anchor="_Toc242172918" w:history="1">
+      <w:hyperlink w:anchor="_Toc242173525" w:history="1">
         <w:r>
           <w:rPr>
             <w:rStyle w:val="Hyperlink"/>
@@ -437,7 +437,7 @@
             <w:noProof/>
             <w:webHidden/>
           </w:rPr>
-          <w:instrText xml:space="preserve"> PAGEREF _Toc242172918 \h </w:instrText>
+          <w:instrText xml:space="preserve"> PAGEREF _Toc242173525 \h </w:instrText>
         </w:r>
         <w:r>
           <w:rPr>
@@ -480,7 +480,7 @@
           <w:sz w:val="24"/>
         </w:rPr>
       </w:pPr>
-      <w:hyperlink w:anchor="_Toc242172919" w:history="1">
+      <w:hyperlink w:anchor="_Toc242173526" w:history="1">
         <w:r>
           <w:rPr>
             <w:rStyle w:val="Hyperlink"/>
@@ -507,7 +507,7 @@
             <w:noProof/>
             <w:webHidden/>
           </w:rPr>
-          <w:instrText xml:space="preserve"> PAGEREF _Toc242172919 \h </w:instrText>
+          <w:instrText xml:space="preserve"> PAGEREF _Toc242173526 \h </w:instrText>
         </w:r>
         <w:r>
           <w:rPr>
@@ -550,7 +550,7 @@
           <w:sz w:val="24"/>
         </w:rPr>
       </w:pPr>
-      <w:hyperlink w:anchor="_Toc242172920" w:history="1">
+      <w:hyperlink w:anchor="_Toc242173527" w:history="1">
         <w:r>
           <w:rPr>
             <w:rStyle w:val="Hyperlink"/>
@@ -577,7 +577,7 @@
             <w:noProof/>
             <w:webHidden/>
           </w:rPr>
-          <w:instrText xml:space="preserve"> PAGEREF _Toc242172920 \h </w:instrText>
+          <w:instrText xml:space="preserve"> PAGEREF _Toc242173527 \h </w:instrText>
         </w:r>
         <w:r>
           <w:rPr>
@@ -620,7 +620,7 @@
           <w:sz w:val="24"/>
         </w:rPr>
       </w:pPr>
-      <w:hyperlink w:anchor="_Toc242172921" w:history="1">
+      <w:hyperlink w:anchor="_Toc242173528" w:history="1">
         <w:r>
           <w:rPr>
             <w:rStyle w:val="Hyperlink"/>
@@ -647,7 +647,7 @@
             <w:noProof/>
             <w:webHidden/>
           </w:rPr>
-          <w:instrText xml:space="preserve"> PAGEREF _Toc242172921 \h </w:instrText>
+          <w:instrText xml:space="preserve"> PAGEREF _Toc242173528 \h </w:instrText>
         </w:r>
         <w:r>
           <w:rPr>
@@ -690,7 +690,7 @@
           <w:sz w:val="24"/>
         </w:rPr>
       </w:pPr>
-      <w:hyperlink w:anchor="_Toc242172922" w:history="1">
+      <w:hyperlink w:anchor="_Toc242173529" w:history="1">
         <w:r>
           <w:rPr>
             <w:rStyle w:val="Hyperlink"/>
@@ -717,7 +717,7 @@
             <w:noProof/>
             <w:webHidden/>
           </w:rPr>
-          <w:instrText xml:space="preserve"> PAGEREF _Toc242172922 \h </w:instrText>
+          <w:instrText xml:space="preserve"> PAGEREF _Toc242173529 \h </w:instrText>
         </w:r>
         <w:r>
           <w:rPr>
@@ -760,7 +760,7 @@
           <w:sz w:val="24"/>
         </w:rPr>
       </w:pPr>
-      <w:hyperlink w:anchor="_Toc242172923" w:history="1">
+      <w:hyperlink w:anchor="_Toc242173530" w:history="1">
         <w:r>
           <w:rPr>
             <w:rStyle w:val="Hyperlink"/>
@@ -787,7 +787,7 @@
             <w:noProof/>
             <w:webHidden/>
           </w:rPr>
-          <w:instrText xml:space="preserve"> PAGEREF _Toc242172923 \h </w:instrText>
+          <w:instrText xml:space="preserve"> PAGEREF _Toc242173530 \h </w:instrText>
         </w:r>
         <w:r>
           <w:rPr>
@@ -830,7 +830,7 @@
           <w:sz w:val="24"/>
         </w:rPr>
       </w:pPr>
-      <w:hyperlink w:anchor="_Toc242172924" w:history="1">
+      <w:hyperlink w:anchor="_Toc242173531" w:history="1">
         <w:r>
           <w:rPr>
             <w:rStyle w:val="Hyperlink"/>
@@ -857,7 +857,7 @@
             <w:noProof/>
             <w:webHidden/>
           </w:rPr>
-          <w:instrText xml:space="preserve"> PAGEREF _Toc242172924 \h </w:instrText>
+          <w:instrText xml:space="preserve"> PAGEREF _Toc242173531 \h </w:instrText>
         </w:r>
         <w:r>
           <w:rPr>
@@ -900,7 +900,7 @@
           <w:sz w:val="24"/>
         </w:rPr>
       </w:pPr>
-      <w:hyperlink w:anchor="_Toc242172925" w:history="1">
+      <w:hyperlink w:anchor="_Toc242173532" w:history="1">
         <w:r>
           <w:rPr>
             <w:rStyle w:val="Hyperlink"/>
@@ -927,7 +927,7 @@
             <w:noProof/>
             <w:webHidden/>
           </w:rPr>
-          <w:instrText xml:space="preserve"> PAGEREF _Toc242172925 \h </w:instrText>
+          <w:instrText xml:space="preserve"> PAGEREF _Toc242173532 \h </w:instrText>
         </w:r>
         <w:r>
           <w:rPr>
@@ -970,7 +970,7 @@
           <w:sz w:val="24"/>
         </w:rPr>
       </w:pPr>
-      <w:hyperlink w:anchor="_Toc242172926" w:history="1">
+      <w:hyperlink w:anchor="_Toc242173533" w:history="1">
         <w:r>
           <w:rPr>
             <w:rStyle w:val="Hyperlink"/>
@@ -997,7 +997,7 @@
             <w:noProof/>
             <w:webHidden/>
           </w:rPr>
-          <w:instrText xml:space="preserve"> PAGEREF _Toc242172926 \h </w:instrText>
+          <w:instrText xml:space="preserve"> PAGEREF _Toc242173533 \h </w:instrText>
         </w:r>
         <w:r>
           <w:rPr>
@@ -1040,7 +1040,7 @@
           <w:sz w:val="24"/>
         </w:rPr>
       </w:pPr>
-      <w:hyperlink w:anchor="_Toc242172927" w:history="1">
+      <w:hyperlink w:anchor="_Toc242173534" w:history="1">
         <w:r>
           <w:rPr>
             <w:rStyle w:val="Hyperlink"/>
@@ -1067,7 +1067,7 @@
             <w:noProof/>
             <w:webHidden/>
           </w:rPr>
-          <w:instrText xml:space="preserve"> PAGEREF _Toc242172927 \h </w:instrText>
+          <w:instrText xml:space="preserve"> PAGEREF _Toc242173534 \h </w:instrText>
         </w:r>
         <w:r>
           <w:rPr>
@@ -1110,7 +1110,7 @@
           <w:sz w:val="24"/>
         </w:rPr>
       </w:pPr>
-      <w:hyperlink w:anchor="_Toc242172928" w:history="1">
+      <w:hyperlink w:anchor="_Toc242173535" w:history="1">
         <w:r>
           <w:rPr>
             <w:rStyle w:val="Hyperlink"/>
@@ -1137,7 +1137,7 @@
             <w:noProof/>
             <w:webHidden/>
           </w:rPr>
-          <w:instrText xml:space="preserve"> PAGEREF _Toc242172928 \h </w:instrText>
+          <w:instrText xml:space="preserve"> PAGEREF _Toc242173535 \h </w:instrText>
         </w:r>
         <w:r>
           <w:rPr>
@@ -1180,7 +1180,7 @@
           <w:sz w:val="24"/>
         </w:rPr>
       </w:pPr>
-      <w:hyperlink w:anchor="_Toc242172929" w:history="1">
+      <w:hyperlink w:anchor="_Toc242173536" w:history="1">
         <w:r>
           <w:rPr>
             <w:rStyle w:val="Hyperlink"/>
@@ -1207,7 +1207,7 @@
             <w:noProof/>
             <w:webHidden/>
           </w:rPr>
-          <w:instrText xml:space="preserve"> PAGEREF _Toc242172929 \h </w:instrText>
+          <w:instrText xml:space="preserve"> PAGEREF _Toc242173536 \h </w:instrText>
         </w:r>
         <w:r>
           <w:rPr>
@@ -1250,7 +1250,7 @@
           <w:sz w:val="24"/>
         </w:rPr>
       </w:pPr>
-      <w:hyperlink w:anchor="_Toc242172930" w:history="1">
+      <w:hyperlink w:anchor="_Toc242173537" w:history="1">
         <w:r>
           <w:rPr>
             <w:rStyle w:val="Hyperlink"/>
@@ -1277,7 +1277,7 @@
             <w:noProof/>
             <w:webHidden/>
           </w:rPr>
-          <w:instrText xml:space="preserve"> PAGEREF _Toc242172930 \h </w:instrText>
+          <w:instrText xml:space="preserve"> PAGEREF _Toc242173537 \h </w:instrText>
         </w:r>
         <w:r>
           <w:rPr>
@@ -1320,7 +1320,7 @@
           <w:sz w:val="24"/>
         </w:rPr>
       </w:pPr>
-      <w:hyperlink w:anchor="_Toc242172931" w:history="1">
+      <w:hyperlink w:anchor="_Toc242173538" w:history="1">
         <w:r>
           <w:rPr>
             <w:rStyle w:val="Hyperlink"/>
@@ -1347,7 +1347,7 @@
             <w:noProof/>
             <w:webHidden/>
           </w:rPr>
-          <w:instrText xml:space="preserve"> PAGEREF _Toc242172931 \h </w:instrText>
+          <w:instrText xml:space="preserve"> PAGEREF _Toc242173538 \h </w:instrText>
         </w:r>
         <w:r>
           <w:rPr>
@@ -1390,7 +1390,7 @@
           <w:sz w:val="24"/>
         </w:rPr>
       </w:pPr>
-      <w:hyperlink w:anchor="_Toc242172932" w:history="1">
+      <w:hyperlink w:anchor="_Toc242173539" w:history="1">
         <w:r>
           <w:rPr>
             <w:rStyle w:val="Hyperlink"/>
@@ -1417,7 +1417,7 @@
             <w:noProof/>
             <w:webHidden/>
           </w:rPr>
-          <w:instrText xml:space="preserve"> PAGEREF _Toc242172932 \h </w:instrText>
+          <w:instrText xml:space="preserve"> PAGEREF _Toc242173539 \h </w:instrText>
         </w:r>
         <w:r>
           <w:rPr>
@@ -1460,7 +1460,7 @@
           <w:sz w:val="24"/>
         </w:rPr>
       </w:pPr>
-      <w:hyperlink w:anchor="_Toc242172933" w:history="1">
+      <w:hyperlink w:anchor="_Toc242173540" w:history="1">
         <w:r>
           <w:rPr>
             <w:rStyle w:val="Hyperlink"/>
@@ -1487,7 +1487,7 @@
             <w:noProof/>
             <w:webHidden/>
           </w:rPr>
-          <w:instrText xml:space="preserve"> PAGEREF _Toc242172933 \h </w:instrText>
+          <w:instrText xml:space="preserve"> PAGEREF _Toc242173540 \h </w:instrText>
         </w:r>
         <w:r>
           <w:rPr>
@@ -1530,7 +1530,7 @@
           <w:sz w:val="24"/>
         </w:rPr>
       </w:pPr>
-      <w:hyperlink w:anchor="_Toc242172934" w:history="1">
+      <w:hyperlink w:anchor="_Toc242173541" w:history="1">
         <w:r>
           <w:rPr>
             <w:rStyle w:val="Hyperlink"/>
@@ -1557,7 +1557,7 @@
             <w:noProof/>
             <w:webHidden/>
           </w:rPr>
-          <w:instrText xml:space="preserve"> PAGEREF _Toc242172934 \h </w:instrText>
+          <w:instrText xml:space="preserve"> PAGEREF _Toc242173541 \h </w:instrText>
         </w:r>
         <w:r>
           <w:rPr>
@@ -1600,7 +1600,7 @@
           <w:sz w:val="24"/>
         </w:rPr>
       </w:pPr>
-      <w:hyperlink w:anchor="_Toc242172935" w:history="1">
+      <w:hyperlink w:anchor="_Toc242173542" w:history="1">
         <w:r>
           <w:rPr>
             <w:rStyle w:val="Hyperlink"/>
@@ -1627,7 +1627,7 @@
             <w:noProof/>
             <w:webHidden/>
           </w:rPr>
-          <w:instrText xml:space="preserve"> PAGEREF _Toc242172935 \h </w:instrText>
+          <w:instrText xml:space="preserve"> PAGEREF _Toc242173542 \h </w:instrText>
         </w:r>
         <w:r>
           <w:rPr>
@@ -1670,7 +1670,7 @@
           <w:sz w:val="24"/>
         </w:rPr>
       </w:pPr>
-      <w:hyperlink w:anchor="_Toc242172936" w:history="1">
+      <w:hyperlink w:anchor="_Toc242173543" w:history="1">
         <w:r>
           <w:rPr>
             <w:rStyle w:val="Hyperlink"/>
@@ -1697,7 +1697,7 @@
             <w:noProof/>
             <w:webHidden/>
           </w:rPr>
-          <w:instrText xml:space="preserve"> PAGEREF _Toc242172936 \h </w:instrText>
+          <w:instrText xml:space="preserve"> PAGEREF _Toc242173543 \h </w:instrText>
         </w:r>
         <w:r>
           <w:rPr>
@@ -1740,7 +1740,7 @@
           <w:sz w:val="24"/>
         </w:rPr>
       </w:pPr>
-      <w:hyperlink w:anchor="_Toc242172937" w:history="1">
+      <w:hyperlink w:anchor="_Toc242173544" w:history="1">
         <w:r>
           <w:rPr>
             <w:rStyle w:val="Hyperlink"/>
@@ -1767,7 +1767,7 @@
             <w:noProof/>
             <w:webHidden/>
           </w:rPr>
-          <w:instrText xml:space="preserve"> PAGEREF _Toc242172937 \h </w:instrText>
+          <w:instrText xml:space="preserve"> PAGEREF _Toc242173544 \h </w:instrText>
         </w:r>
         <w:r>
           <w:rPr>
@@ -1810,7 +1810,7 @@
           <w:sz w:val="24"/>
         </w:rPr>
       </w:pPr>
-      <w:hyperlink w:anchor="_Toc242172938" w:history="1">
+      <w:hyperlink w:anchor="_Toc242173545" w:history="1">
         <w:r>
           <w:rPr>
             <w:rStyle w:val="Hyperlink"/>
@@ -1837,7 +1837,7 @@
             <w:noProof/>
             <w:webHidden/>
           </w:rPr>
-          <w:instrText xml:space="preserve"> PAGEREF _Toc242172938 \h </w:instrText>
+          <w:instrText xml:space="preserve"> PAGEREF _Toc242173545 \h </w:instrText>
         </w:r>
         <w:r>
           <w:rPr>
@@ -1880,7 +1880,7 @@
           <w:sz w:val="24"/>
         </w:rPr>
       </w:pPr>
-      <w:hyperlink w:anchor="_Toc242172939" w:history="1">
+      <w:hyperlink w:anchor="_Toc242173546" w:history="1">
         <w:r>
           <w:rPr>
             <w:rStyle w:val="Hyperlink"/>
@@ -1907,7 +1907,7 @@
             <w:noProof/>
             <w:webHidden/>
           </w:rPr>
-          <w:instrText xml:space="preserve"> PAGEREF _Toc242172939 \h </w:instrText>
+          <w:instrText xml:space="preserve"> PAGEREF _Toc242173546 \h </w:instrText>
         </w:r>
         <w:r>
           <w:rPr>
@@ -1950,7 +1950,7 @@
           <w:sz w:val="24"/>
         </w:rPr>
       </w:pPr>
-      <w:hyperlink w:anchor="_Toc242172940" w:history="1">
+      <w:hyperlink w:anchor="_Toc242173547" w:history="1">
         <w:r>
           <w:rPr>
             <w:rStyle w:val="Hyperlink"/>
@@ -1977,7 +1977,7 @@
             <w:noProof/>
             <w:webHidden/>
           </w:rPr>
-          <w:instrText xml:space="preserve"> PAGEREF _Toc242172940 \h </w:instrText>
+          <w:instrText xml:space="preserve"> PAGEREF _Toc242173547 \h </w:instrText>
         </w:r>
         <w:r>
           <w:rPr>
@@ -2020,7 +2020,7 @@
           <w:sz w:val="24"/>
         </w:rPr>
       </w:pPr>
-      <w:hyperlink w:anchor="_Toc242172941" w:history="1">
+      <w:hyperlink w:anchor="_Toc242173548" w:history="1">
         <w:r>
           <w:rPr>
             <w:rStyle w:val="Hyperlink"/>
@@ -2047,7 +2047,7 @@
             <w:noProof/>
             <w:webHidden/>
           </w:rPr>
-          <w:instrText xml:space="preserve"> PAGEREF _Toc242172941 \h </w:instrText>
+          <w:instrText xml:space="preserve"> PAGEREF _Toc242173548 \h </w:instrText>
         </w:r>
         <w:r>
           <w:rPr>
@@ -2090,7 +2090,7 @@
           <w:sz w:val="24"/>
         </w:rPr>
       </w:pPr>
-      <w:hyperlink w:anchor="_Toc242172942" w:history="1">
+      <w:hyperlink w:anchor="_Toc242173549" w:history="1">
         <w:r>
           <w:rPr>
             <w:rStyle w:val="Hyperlink"/>
@@ -2117,7 +2117,7 @@
             <w:noProof/>
             <w:webHidden/>
           </w:rPr>
-          <w:instrText xml:space="preserve"> PAGEREF _Toc242172942 \h </w:instrText>
+          <w:instrText xml:space="preserve"> PAGEREF _Toc242173549 \h </w:instrText>
         </w:r>
         <w:r>
           <w:rPr>
@@ -2160,7 +2160,7 @@
           <w:sz w:val="24"/>
         </w:rPr>
       </w:pPr>
-      <w:hyperlink w:anchor="_Toc242172943" w:history="1">
+      <w:hyperlink w:anchor="_Toc242173550" w:history="1">
         <w:r>
           <w:rPr>
             <w:rStyle w:val="Hyperlink"/>
@@ -2187,7 +2187,7 @@
             <w:noProof/>
             <w:webHidden/>
           </w:rPr>
-          <w:instrText xml:space="preserve"> PAGEREF _Toc242172943 \h </w:instrText>
+          <w:instrText xml:space="preserve"> PAGEREF _Toc242173550 \h </w:instrText>
         </w:r>
         <w:r>
           <w:rPr>
@@ -2231,7 +2231,7 @@
           <w:sz w:val="24"/>
         </w:rPr>
       </w:pPr>
-      <w:hyperlink w:anchor="_Toc242172944" w:history="1">
+      <w:hyperlink w:anchor="_Toc242173551" w:history="1">
         <w:r>
           <w:rPr>
             <w:rStyle w:val="Hyperlink"/>
@@ -2258,7 +2258,7 @@
             <w:noProof/>
             <w:webHidden/>
           </w:rPr>
-          <w:instrText xml:space="preserve"> PAGEREF _Toc242172944 \h </w:instrText>
+          <w:instrText xml:space="preserve"> PAGEREF _Toc242173551 \h </w:instrText>
         </w:r>
         <w:r>
           <w:rPr>
@@ -2301,7 +2301,7 @@
           <w:sz w:val="24"/>
         </w:rPr>
       </w:pPr>
-      <w:hyperlink w:anchor="_Toc242172945" w:history="1">
+      <w:hyperlink w:anchor="_Toc242173552" w:history="1">
         <w:r>
           <w:rPr>
             <w:rStyle w:val="Hyperlink"/>
@@ -2328,7 +2328,7 @@
             <w:noProof/>
             <w:webHidden/>
           </w:rPr>
-          <w:instrText xml:space="preserve"> PAGEREF _Toc242172945 \h </w:instrText>
+          <w:instrText xml:space="preserve"> PAGEREF _Toc242173552 \h </w:instrText>
         </w:r>
         <w:r>
           <w:rPr>
@@ -2371,7 +2371,7 @@
           <w:sz w:val="24"/>
         </w:rPr>
       </w:pPr>
-      <w:hyperlink w:anchor="_Toc242172946" w:history="1">
+      <w:hyperlink w:anchor="_Toc242173553" w:history="1">
         <w:r>
           <w:rPr>
             <w:rStyle w:val="Hyperlink"/>
@@ -2398,7 +2398,7 @@
             <w:noProof/>
             <w:webHidden/>
           </w:rPr>
-          <w:instrText xml:space="preserve"> PAGEREF _Toc242172946 \h </w:instrText>
+          <w:instrText xml:space="preserve"> PAGEREF _Toc242173553 \h </w:instrText>
         </w:r>
         <w:r>
           <w:rPr>
@@ -2441,7 +2441,7 @@
           <w:sz w:val="24"/>
         </w:rPr>
       </w:pPr>
-      <w:hyperlink w:anchor="_Toc242172947" w:history="1">
+      <w:hyperlink w:anchor="_Toc242173554" w:history="1">
         <w:r>
           <w:rPr>
             <w:rStyle w:val="Hyperlink"/>
@@ -2468,7 +2468,7 @@
             <w:noProof/>
             <w:webHidden/>
           </w:rPr>
-          <w:instrText xml:space="preserve"> PAGEREF _Toc242172947 \h </w:instrText>
+          <w:instrText xml:space="preserve"> PAGEREF _Toc242173554 \h </w:instrText>
         </w:r>
         <w:r>
           <w:rPr>
@@ -2511,7 +2511,7 @@
           <w:sz w:val="24"/>
         </w:rPr>
       </w:pPr>
-      <w:hyperlink w:anchor="_Toc242172948" w:history="1">
+      <w:hyperlink w:anchor="_Toc242173555" w:history="1">
         <w:r>
           <w:rPr>
             <w:rStyle w:val="Hyperlink"/>
@@ -2538,7 +2538,7 @@
             <w:noProof/>
             <w:webHidden/>
           </w:rPr>
-          <w:instrText xml:space="preserve"> PAGEREF _Toc242172948 \h </w:instrText>
+          <w:instrText xml:space="preserve"> PAGEREF _Toc242173555 \h </w:instrText>
         </w:r>
         <w:r>
           <w:rPr>
@@ -2581,7 +2581,7 @@
           <w:sz w:val="24"/>
         </w:rPr>
       </w:pPr>
-      <w:hyperlink w:anchor="_Toc242172949" w:history="1">
+      <w:hyperlink w:anchor="_Toc242173556" w:history="1">
         <w:r>
           <w:rPr>
             <w:rStyle w:val="Hyperlink"/>
@@ -2608,7 +2608,7 @@
             <w:noProof/>
             <w:webHidden/>
           </w:rPr>
-          <w:instrText xml:space="preserve"> PAGEREF _Toc242172949 \h </w:instrText>
+          <w:instrText xml:space="preserve"> PAGEREF _Toc242173556 \h </w:instrText>
         </w:r>
         <w:r>
           <w:rPr>
@@ -2651,7 +2651,7 @@
           <w:sz w:val="24"/>
         </w:rPr>
       </w:pPr>
-      <w:hyperlink w:anchor="_Toc242172950" w:history="1">
+      <w:hyperlink w:anchor="_Toc242173557" w:history="1">
         <w:r>
           <w:rPr>
             <w:rStyle w:val="Hyperlink"/>
@@ -2678,7 +2678,7 @@
             <w:noProof/>
             <w:webHidden/>
           </w:rPr>
-          <w:instrText xml:space="preserve"> PAGEREF _Toc242172950 \h </w:instrText>
+          <w:instrText xml:space="preserve"> PAGEREF _Toc242173557 \h </w:instrText>
         </w:r>
         <w:r>
           <w:rPr>
@@ -2721,7 +2721,7 @@
           <w:sz w:val="24"/>
         </w:rPr>
       </w:pPr>
-      <w:hyperlink w:anchor="_Toc242172951" w:history="1">
+      <w:hyperlink w:anchor="_Toc242173558" w:history="1">
         <w:r>
           <w:rPr>
             <w:rStyle w:val="Hyperlink"/>
@@ -2748,7 +2748,7 @@
             <w:noProof/>
             <w:webHidden/>
           </w:rPr>
-          <w:instrText xml:space="preserve"> PAGEREF _Toc242172951 \h </w:instrText>
+          <w:instrText xml:space="preserve"> PAGEREF _Toc242173558 \h </w:instrText>
         </w:r>
         <w:r>
           <w:rPr>
@@ -2791,7 +2791,7 @@
           <w:sz w:val="24"/>
         </w:rPr>
       </w:pPr>
-      <w:hyperlink w:anchor="_Toc242172952" w:history="1">
+      <w:hyperlink w:anchor="_Toc242173559" w:history="1">
         <w:r>
           <w:rPr>
             <w:rStyle w:val="Hyperlink"/>
@@ -2818,7 +2818,7 @@
             <w:noProof/>
             <w:webHidden/>
           </w:rPr>
-          <w:instrText xml:space="preserve"> PAGEREF _Toc242172952 \h </w:instrText>
+          <w:instrText xml:space="preserve"> PAGEREF _Toc242173559 \h </w:instrText>
         </w:r>
         <w:r>
           <w:rPr>
@@ -2861,7 +2861,7 @@
           <w:sz w:val="24"/>
         </w:rPr>
       </w:pPr>
-      <w:hyperlink w:anchor="_Toc242172953" w:history="1">
+      <w:hyperlink w:anchor="_Toc242173560" w:history="1">
         <w:r>
           <w:rPr>
             <w:rStyle w:val="Hyperlink"/>
@@ -2888,7 +2888,7 @@
             <w:noProof/>
             <w:webHidden/>
           </w:rPr>
-          <w:instrText xml:space="preserve"> PAGEREF _Toc242172953 \h </w:instrText>
+          <w:instrText xml:space="preserve"> PAGEREF _Toc242173560 \h </w:instrText>
         </w:r>
         <w:r>
           <w:rPr>
@@ -2931,7 +2931,7 @@
           <w:sz w:val="24"/>
         </w:rPr>
       </w:pPr>
-      <w:hyperlink w:anchor="_Toc242172954" w:history="1">
+      <w:hyperlink w:anchor="_Toc242173561" w:history="1">
         <w:r>
           <w:rPr>
             <w:rStyle w:val="Hyperlink"/>
@@ -2958,7 +2958,7 @@
             <w:noProof/>
             <w:webHidden/>
           </w:rPr>
-          <w:instrText xml:space="preserve"> PAGEREF _Toc242172954 \h </w:instrText>
+          <w:instrText xml:space="preserve"> PAGEREF _Toc242173561 \h </w:instrText>
         </w:r>
         <w:r>
           <w:rPr>
@@ -3001,7 +3001,7 @@
           <w:sz w:val="24"/>
         </w:rPr>
       </w:pPr>
-      <w:hyperlink w:anchor="_Toc242172955" w:history="1">
+      <w:hyperlink w:anchor="_Toc242173562" w:history="1">
         <w:r>
           <w:rPr>
             <w:rStyle w:val="Hyperlink"/>
@@ -3028,7 +3028,7 @@
             <w:noProof/>
             <w:webHidden/>
           </w:rPr>
-          <w:instrText xml:space="preserve"> PAGEREF _Toc242172955 \h </w:instrText>
+          <w:instrText xml:space="preserve"> PAGEREF _Toc242173562 \h </w:instrText>
         </w:r>
         <w:r>
           <w:rPr>
@@ -3071,7 +3071,7 @@
           <w:sz w:val="24"/>
         </w:rPr>
       </w:pPr>
-      <w:hyperlink w:anchor="_Toc242172956" w:history="1">
+      <w:hyperlink w:anchor="_Toc242173563" w:history="1">
         <w:r>
           <w:rPr>
             <w:rStyle w:val="Hyperlink"/>
@@ -3098,7 +3098,7 @@
             <w:noProof/>
             <w:webHidden/>
           </w:rPr>
-          <w:instrText xml:space="preserve"> PAGEREF _Toc242172956 \h </w:instrText>
+          <w:instrText xml:space="preserve"> PAGEREF _Toc242173563 \h </w:instrText>
         </w:r>
         <w:r>
           <w:rPr>
@@ -3141,7 +3141,7 @@
           <w:sz w:val="24"/>
         </w:rPr>
       </w:pPr>
-      <w:hyperlink w:anchor="_Toc242172957" w:history="1">
+      <w:hyperlink w:anchor="_Toc242173564" w:history="1">
         <w:r>
           <w:rPr>
             <w:rStyle w:val="Hyperlink"/>
@@ -3168,7 +3168,7 @@
             <w:noProof/>
             <w:webHidden/>
           </w:rPr>
-          <w:instrText xml:space="preserve"> PAGEREF _Toc242172957 \h </w:instrText>
+          <w:instrText xml:space="preserve"> PAGEREF _Toc242173564 \h </w:instrText>
         </w:r>
         <w:r>
           <w:rPr>
@@ -3211,7 +3211,7 @@
           <w:sz w:val="24"/>
         </w:rPr>
       </w:pPr>
-      <w:hyperlink w:anchor="_Toc242172958" w:history="1">
+      <w:hyperlink w:anchor="_Toc242173565" w:history="1">
         <w:r>
           <w:rPr>
             <w:rStyle w:val="Hyperlink"/>
@@ -3238,7 +3238,7 @@
             <w:noProof/>
             <w:webHidden/>
           </w:rPr>
-          <w:instrText xml:space="preserve"> PAGEREF _Toc242172958 \h </w:instrText>
+          <w:instrText xml:space="preserve"> PAGEREF _Toc242173565 \h </w:instrText>
         </w:r>
         <w:r>
           <w:rPr>
@@ -3281,7 +3281,7 @@
           <w:sz w:val="24"/>
         </w:rPr>
       </w:pPr>
-      <w:hyperlink w:anchor="_Toc242172959" w:history="1">
+      <w:hyperlink w:anchor="_Toc242173566" w:history="1">
         <w:r>
           <w:rPr>
             <w:rStyle w:val="Hyperlink"/>
@@ -3308,7 +3308,7 @@
             <w:noProof/>
             <w:webHidden/>
           </w:rPr>
-          <w:instrText xml:space="preserve"> PAGEREF _Toc242172959 \h </w:instrText>
+          <w:instrText xml:space="preserve"> PAGEREF _Toc242173566 \h </w:instrText>
         </w:r>
         <w:r>
           <w:rPr>
@@ -3351,7 +3351,7 @@
           <w:sz w:val="24"/>
         </w:rPr>
       </w:pPr>
-      <w:hyperlink w:anchor="_Toc242172960" w:history="1">
+      <w:hyperlink w:anchor="_Toc242173567" w:history="1">
         <w:r>
           <w:rPr>
             <w:rStyle w:val="Hyperlink"/>
@@ -3378,7 +3378,7 @@
             <w:noProof/>
             <w:webHidden/>
           </w:rPr>
-          <w:instrText xml:space="preserve"> PAGEREF _Toc242172960 \h </w:instrText>
+          <w:instrText xml:space="preserve"> PAGEREF _Toc242173567 \h </w:instrText>
         </w:r>
         <w:r>
           <w:rPr>
@@ -3421,7 +3421,7 @@
           <w:sz w:val="24"/>
         </w:rPr>
       </w:pPr>
-      <w:hyperlink w:anchor="_Toc242172961" w:history="1">
+      <w:hyperlink w:anchor="_Toc242173568" w:history="1">
         <w:r>
           <w:rPr>
             <w:rStyle w:val="Hyperlink"/>
@@ -3448,7 +3448,7 @@
             <w:noProof/>
             <w:webHidden/>
           </w:rPr>
-          <w:instrText xml:space="preserve"> PAGEREF _Toc242172961 \h </w:instrText>
+          <w:instrText xml:space="preserve"> PAGEREF _Toc242173568 \h </w:instrText>
         </w:r>
         <w:r>
           <w:rPr>
@@ -3491,7 +3491,7 @@
           <w:sz w:val="24"/>
         </w:rPr>
       </w:pPr>
-      <w:hyperlink w:anchor="_Toc242172962" w:history="1">
+      <w:hyperlink w:anchor="_Toc242173569" w:history="1">
         <w:r>
           <w:rPr>
             <w:rStyle w:val="Hyperlink"/>
@@ -3518,7 +3518,7 @@
             <w:noProof/>
             <w:webHidden/>
           </w:rPr>
-          <w:instrText xml:space="preserve"> PAGEREF _Toc242172962 \h </w:instrText>
+          <w:instrText xml:space="preserve"> PAGEREF _Toc242173569 \h </w:instrText>
         </w:r>
         <w:r>
           <w:rPr>
@@ -3561,7 +3561,7 @@
           <w:sz w:val="24"/>
         </w:rPr>
       </w:pPr>
-      <w:hyperlink w:anchor="_Toc242172963" w:history="1">
+      <w:hyperlink w:anchor="_Toc242173570" w:history="1">
         <w:r>
           <w:rPr>
             <w:rStyle w:val="Hyperlink"/>
@@ -3588,7 +3588,7 @@
             <w:noProof/>
             <w:webHidden/>
           </w:rPr>
-          <w:instrText xml:space="preserve"> PAGEREF _Toc242172963 \h </w:instrText>
+          <w:instrText xml:space="preserve"> PAGEREF _Toc242173570 \h </w:instrText>
         </w:r>
         <w:r>
           <w:rPr>
@@ -3631,7 +3631,7 @@
           <w:sz w:val="24"/>
         </w:rPr>
       </w:pPr>
-      <w:hyperlink w:anchor="_Toc242172964" w:history="1">
+      <w:hyperlink w:anchor="_Toc242173571" w:history="1">
         <w:r>
           <w:rPr>
             <w:rStyle w:val="Hyperlink"/>
@@ -3658,7 +3658,7 @@
             <w:noProof/>
             <w:webHidden/>
           </w:rPr>
-          <w:instrText xml:space="preserve"> PAGEREF _Toc242172964 \h </w:instrText>
+          <w:instrText xml:space="preserve"> PAGEREF _Toc242173571 \h </w:instrText>
         </w:r>
         <w:r>
           <w:rPr>
@@ -3701,7 +3701,7 @@
           <w:sz w:val="24"/>
         </w:rPr>
       </w:pPr>
-      <w:hyperlink w:anchor="_Toc242172965" w:history="1">
+      <w:hyperlink w:anchor="_Toc242173572" w:history="1">
         <w:r>
           <w:rPr>
             <w:rStyle w:val="Hyperlink"/>
@@ -3728,7 +3728,7 @@
             <w:noProof/>
             <w:webHidden/>
           </w:rPr>
-          <w:instrText xml:space="preserve"> PAGEREF _Toc242172965 \h </w:instrText>
+          <w:instrText xml:space="preserve"> PAGEREF _Toc242173572 \h </w:instrText>
         </w:r>
         <w:r>
           <w:rPr>
@@ -3772,7 +3772,7 @@
           <w:sz w:val="24"/>
         </w:rPr>
       </w:pPr>
-      <w:hyperlink w:anchor="_Toc242172966" w:history="1">
+      <w:hyperlink w:anchor="_Toc242173573" w:history="1">
         <w:r>
           <w:rPr>
             <w:rStyle w:val="Hyperlink"/>
@@ -3799,7 +3799,7 @@
             <w:noProof/>
             <w:webHidden/>
           </w:rPr>
-          <w:instrText xml:space="preserve"> PAGEREF _Toc242172966 \h </w:instrText>
+          <w:instrText xml:space="preserve"> PAGEREF _Toc242173573 \h </w:instrText>
         </w:r>
         <w:r>
           <w:rPr>
@@ -3842,7 +3842,7 @@
           <w:sz w:val="24"/>
         </w:rPr>
       </w:pPr>
-      <w:hyperlink w:anchor="_Toc242172967" w:history="1">
+      <w:hyperlink w:anchor="_Toc242173574" w:history="1">
         <w:r>
           <w:rPr>
             <w:rStyle w:val="Hyperlink"/>
@@ -3869,7 +3869,7 @@
             <w:noProof/>
             <w:webHidden/>
           </w:rPr>
-          <w:instrText xml:space="preserve"> PAGEREF _Toc242172967 \h </w:instrText>
+          <w:instrText xml:space="preserve"> PAGEREF _Toc242173574 \h </w:instrText>
         </w:r>
         <w:r>
           <w:rPr>
@@ -3912,7 +3912,7 @@
           <w:sz w:val="24"/>
         </w:rPr>
       </w:pPr>
-      <w:hyperlink w:anchor="_Toc242172968" w:history="1">
+      <w:hyperlink w:anchor="_Toc242173575" w:history="1">
         <w:r>
           <w:rPr>
             <w:rStyle w:val="Hyperlink"/>
@@ -3939,7 +3939,7 @@
             <w:noProof/>
             <w:webHidden/>
           </w:rPr>
-          <w:instrText xml:space="preserve"> PAGEREF _Toc242172968 \h </w:instrText>
+          <w:instrText xml:space="preserve"> PAGEREF _Toc242173575 \h </w:instrText>
         </w:r>
         <w:r>
           <w:rPr>
@@ -3982,7 +3982,7 @@
           <w:sz w:val="24"/>
         </w:rPr>
       </w:pPr>
-      <w:hyperlink w:anchor="_Toc242172969" w:history="1">
+      <w:hyperlink w:anchor="_Toc242173576" w:history="1">
         <w:r>
           <w:rPr>
             <w:rStyle w:val="Hyperlink"/>
@@ -4009,7 +4009,7 @@
             <w:noProof/>
             <w:webHidden/>
           </w:rPr>
-          <w:instrText xml:space="preserve"> PAGEREF _Toc242172969 \h </w:instrText>
+          <w:instrText xml:space="preserve"> PAGEREF _Toc242173576 \h </w:instrText>
         </w:r>
         <w:r>
           <w:rPr>
@@ -4052,7 +4052,7 @@
           <w:sz w:val="24"/>
         </w:rPr>
       </w:pPr>
-      <w:hyperlink w:anchor="_Toc242172970" w:history="1">
+      <w:hyperlink w:anchor="_Toc242173577" w:history="1">
         <w:r>
           <w:rPr>
             <w:rStyle w:val="Hyperlink"/>
@@ -4079,7 +4079,7 @@
             <w:noProof/>
             <w:webHidden/>
           </w:rPr>
-          <w:instrText xml:space="preserve"> PAGEREF _Toc242172970 \h </w:instrText>
+          <w:instrText xml:space="preserve"> PAGEREF _Toc242173577 \h </w:instrText>
         </w:r>
         <w:r>
           <w:rPr>
@@ -4122,7 +4122,7 @@
           <w:sz w:val="24"/>
         </w:rPr>
       </w:pPr>
-      <w:hyperlink w:anchor="_Toc242172971" w:history="1">
+      <w:hyperlink w:anchor="_Toc242173578" w:history="1">
         <w:r>
           <w:rPr>
             <w:rStyle w:val="Hyperlink"/>
@@ -4149,7 +4149,7 @@
             <w:noProof/>
             <w:webHidden/>
           </w:rPr>
-          <w:instrText xml:space="preserve"> PAGEREF _Toc242172971 \h </w:instrText>
+          <w:instrText xml:space="preserve"> PAGEREF _Toc242173578 \h </w:instrText>
         </w:r>
         <w:r>
           <w:rPr>
@@ -4192,7 +4192,7 @@
           <w:sz w:val="24"/>
         </w:rPr>
       </w:pPr>
-      <w:hyperlink w:anchor="_Toc242172972" w:history="1">
+      <w:hyperlink w:anchor="_Toc242173579" w:history="1">
         <w:r>
           <w:rPr>
             <w:rStyle w:val="Hyperlink"/>
@@ -4219,7 +4219,7 @@
             <w:noProof/>
             <w:webHidden/>
           </w:rPr>
-          <w:instrText xml:space="preserve"> PAGEREF _Toc242172972 \h </w:instrText>
+          <w:instrText xml:space="preserve"> PAGEREF _Toc242173579 \h </w:instrText>
         </w:r>
         <w:r>
           <w:rPr>
@@ -4262,7 +4262,7 @@
           <w:sz w:val="24"/>
         </w:rPr>
       </w:pPr>
-      <w:hyperlink w:anchor="_Toc242172973" w:history="1">
+      <w:hyperlink w:anchor="_Toc242173580" w:history="1">
         <w:r>
           <w:rPr>
             <w:rStyle w:val="Hyperlink"/>
@@ -4289,7 +4289,7 @@
             <w:noProof/>
             <w:webHidden/>
           </w:rPr>
-          <w:instrText xml:space="preserve"> PAGEREF _Toc242172973 \h </w:instrText>
+          <w:instrText xml:space="preserve"> PAGEREF _Toc242173580 \h </w:instrText>
         </w:r>
         <w:r>
           <w:rPr>
@@ -4332,7 +4332,7 @@
           <w:sz w:val="24"/>
         </w:rPr>
       </w:pPr>
-      <w:hyperlink w:anchor="_Toc242172974" w:history="1">
+      <w:hyperlink w:anchor="_Toc242173581" w:history="1">
         <w:r>
           <w:rPr>
             <w:rStyle w:val="Hyperlink"/>
@@ -4359,7 +4359,7 @@
             <w:noProof/>
             <w:webHidden/>
           </w:rPr>
-          <w:instrText xml:space="preserve"> PAGEREF _Toc242172974 \h </w:instrText>
+          <w:instrText xml:space="preserve"> PAGEREF _Toc242173581 \h </w:instrText>
         </w:r>
         <w:r>
           <w:rPr>
@@ -4402,7 +4402,7 @@
           <w:sz w:val="24"/>
         </w:rPr>
       </w:pPr>
-      <w:hyperlink w:anchor="_Toc242172975" w:history="1">
+      <w:hyperlink w:anchor="_Toc242173582" w:history="1">
         <w:r>
           <w:rPr>
             <w:rStyle w:val="Hyperlink"/>
@@ -4429,7 +4429,7 @@
             <w:noProof/>
             <w:webHidden/>
           </w:rPr>
-          <w:instrText xml:space="preserve"> PAGEREF _Toc242172975 \h </w:instrText>
+          <w:instrText xml:space="preserve"> PAGEREF _Toc242173582 \h </w:instrText>
         </w:r>
         <w:r>
           <w:rPr>
@@ -4472,7 +4472,7 @@
           <w:sz w:val="24"/>
         </w:rPr>
       </w:pPr>
-      <w:hyperlink w:anchor="_Toc242172976" w:history="1">
+      <w:hyperlink w:anchor="_Toc242173583" w:history="1">
         <w:r>
           <w:rPr>
             <w:rStyle w:val="Hyperlink"/>
@@ -4499,7 +4499,7 @@
             <w:noProof/>
             <w:webHidden/>
           </w:rPr>
-          <w:instrText xml:space="preserve"> PAGEREF _Toc242172976 \h </w:instrText>
+          <w:instrText xml:space="preserve"> PAGEREF _Toc242173583 \h </w:instrText>
         </w:r>
         <w:r>
           <w:rPr>
@@ -4542,7 +4542,7 @@
           <w:sz w:val="24"/>
         </w:rPr>
       </w:pPr>
-      <w:hyperlink w:anchor="_Toc242172977" w:history="1">
+      <w:hyperlink w:anchor="_Toc242173584" w:history="1">
         <w:r>
           <w:rPr>
             <w:rStyle w:val="Hyperlink"/>
@@ -4569,7 +4569,7 @@
             <w:noProof/>
             <w:webHidden/>
           </w:rPr>
-          <w:instrText xml:space="preserve"> PAGEREF _Toc242172977 \h </w:instrText>
+          <w:instrText xml:space="preserve"> PAGEREF _Toc242173584 \h </w:instrText>
         </w:r>
         <w:r>
           <w:rPr>
@@ -4612,7 +4612,7 @@
           <w:sz w:val="24"/>
         </w:rPr>
       </w:pPr>
-      <w:hyperlink w:anchor="_Toc242172978" w:history="1">
+      <w:hyperlink w:anchor="_Toc242173585" w:history="1">
         <w:r>
           <w:rPr>
             <w:rStyle w:val="Hyperlink"/>
@@ -4639,7 +4639,7 @@
             <w:noProof/>
             <w:webHidden/>
           </w:rPr>
-          <w:instrText xml:space="preserve"> PAGEREF _Toc242172978 \h </w:instrText>
+          <w:instrText xml:space="preserve"> PAGEREF _Toc242173585 \h </w:instrText>
         </w:r>
         <w:r>
           <w:rPr>
@@ -4682,7 +4682,7 @@
           <w:sz w:val="24"/>
         </w:rPr>
       </w:pPr>
-      <w:hyperlink w:anchor="_Toc242172979" w:history="1">
+      <w:hyperlink w:anchor="_Toc242173586" w:history="1">
         <w:r>
           <w:rPr>
             <w:rStyle w:val="Hyperlink"/>
@@ -4709,7 +4709,7 @@
             <w:noProof/>
             <w:webHidden/>
           </w:rPr>
-          <w:instrText xml:space="preserve"> PAGEREF _Toc242172979 \h </w:instrText>
+          <w:instrText xml:space="preserve"> PAGEREF _Toc242173586 \h </w:instrText>
         </w:r>
         <w:r>
           <w:rPr>
@@ -4752,7 +4752,7 @@
           <w:sz w:val="24"/>
         </w:rPr>
       </w:pPr>
-      <w:hyperlink w:anchor="_Toc242172980" w:history="1">
+      <w:hyperlink w:anchor="_Toc242173587" w:history="1">
         <w:r>
           <w:rPr>
             <w:rStyle w:val="Hyperlink"/>
@@ -4779,7 +4779,7 @@
             <w:noProof/>
             <w:webHidden/>
           </w:rPr>
-          <w:instrText xml:space="preserve"> PAGEREF _Toc242172980 \h </w:instrText>
+          <w:instrText xml:space="preserve"> PAGEREF _Toc242173587 \h </w:instrText>
         </w:r>
         <w:r>
           <w:rPr>
@@ -4822,7 +4822,7 @@
           <w:sz w:val="24"/>
         </w:rPr>
       </w:pPr>
-      <w:hyperlink w:anchor="_Toc242172981" w:history="1">
+      <w:hyperlink w:anchor="_Toc242173588" w:history="1">
         <w:r>
           <w:rPr>
             <w:rStyle w:val="Hyperlink"/>
@@ -4849,7 +4849,7 @@
             <w:noProof/>
             <w:webHidden/>
           </w:rPr>
-          <w:instrText xml:space="preserve"> PAGEREF _Toc242172981 \h </w:instrText>
+          <w:instrText xml:space="preserve"> PAGEREF _Toc242173588 \h </w:instrText>
         </w:r>
         <w:r>
           <w:rPr>
@@ -4892,7 +4892,7 @@
           <w:sz w:val="24"/>
         </w:rPr>
       </w:pPr>
-      <w:hyperlink w:anchor="_Toc242172982" w:history="1">
+      <w:hyperlink w:anchor="_Toc242173589" w:history="1">
         <w:r>
           <w:rPr>
             <w:rStyle w:val="Hyperlink"/>
@@ -4919,7 +4919,7 @@
             <w:noProof/>
             <w:webHidden/>
           </w:rPr>
-          <w:instrText xml:space="preserve"> PAGEREF _Toc242172982 \h </w:instrText>
+          <w:instrText xml:space="preserve"> PAGEREF _Toc242173589 \h </w:instrText>
         </w:r>
         <w:r>
           <w:rPr>
@@ -4962,7 +4962,7 @@
           <w:sz w:val="24"/>
         </w:rPr>
       </w:pPr>
-      <w:hyperlink w:anchor="_Toc242172983" w:history="1">
+      <w:hyperlink w:anchor="_Toc242173590" w:history="1">
         <w:r>
           <w:rPr>
             <w:rStyle w:val="Hyperlink"/>
@@ -4989,7 +4989,7 @@
             <w:noProof/>
             <w:webHidden/>
           </w:rPr>
-          <w:instrText xml:space="preserve"> PAGEREF _Toc242172983 \h </w:instrText>
+          <w:instrText xml:space="preserve"> PAGEREF _Toc242173590 \h </w:instrText>
         </w:r>
         <w:r>
           <w:rPr>
@@ -5032,7 +5032,7 @@
           <w:sz w:val="24"/>
         </w:rPr>
       </w:pPr>
-      <w:hyperlink w:anchor="_Toc242172984" w:history="1">
+      <w:hyperlink w:anchor="_Toc242173591" w:history="1">
         <w:r>
           <w:rPr>
             <w:rStyle w:val="Hyperlink"/>
@@ -5059,7 +5059,7 @@
             <w:noProof/>
             <w:webHidden/>
           </w:rPr>
-          <w:instrText xml:space="preserve"> PAGEREF _Toc242172984 \h </w:instrText>
+          <w:instrText xml:space="preserve"> PAGEREF _Toc242173591 \h </w:instrText>
         </w:r>
         <w:r>
           <w:rPr>
@@ -5102,7 +5102,7 @@
           <w:sz w:val="24"/>
         </w:rPr>
       </w:pPr>
-      <w:hyperlink w:anchor="_Toc242172985" w:history="1">
+      <w:hyperlink w:anchor="_Toc242173592" w:history="1">
         <w:r>
           <w:rPr>
             <w:rStyle w:val="Hyperlink"/>
@@ -5129,7 +5129,7 @@
             <w:noProof/>
             <w:webHidden/>
           </w:rPr>
-          <w:instrText xml:space="preserve"> PAGEREF _Toc242172985 \h </w:instrText>
+          <w:instrText xml:space="preserve"> PAGEREF _Toc242173592 \h </w:instrText>
         </w:r>
         <w:r>
           <w:rPr>
@@ -5173,7 +5173,7 @@
           <w:sz w:val="24"/>
         </w:rPr>
       </w:pPr>
-      <w:hyperlink w:anchor="_Toc242172986" w:history="1">
+      <w:hyperlink w:anchor="_Toc242173593" w:history="1">
         <w:r>
           <w:rPr>
             <w:rStyle w:val="Hyperlink"/>
@@ -5200,7 +5200,7 @@
             <w:noProof/>
             <w:webHidden/>
           </w:rPr>
-          <w:instrText xml:space="preserve"> PAGEREF _Toc242172986 \h </w:instrText>
+          <w:instrText xml:space="preserve"> PAGEREF _Toc242173593 \h </w:instrText>
         </w:r>
         <w:r>
           <w:rPr>
@@ -5243,7 +5243,7 @@
           <w:sz w:val="24"/>
         </w:rPr>
       </w:pPr>
-      <w:hyperlink w:anchor="_Toc242172987" w:history="1">
+      <w:hyperlink w:anchor="_Toc242173594" w:history="1">
         <w:r>
           <w:rPr>
             <w:rStyle w:val="Hyperlink"/>
@@ -5270,7 +5270,7 @@
             <w:noProof/>
             <w:webHidden/>
           </w:rPr>
-          <w:instrText xml:space="preserve"> PAGEREF _Toc242172987 \h </w:instrText>
+          <w:instrText xml:space="preserve"> PAGEREF _Toc242173594 \h </w:instrText>
         </w:r>
         <w:r>
           <w:rPr>
@@ -5313,7 +5313,7 @@
           <w:sz w:val="24"/>
         </w:rPr>
       </w:pPr>
-      <w:hyperlink w:anchor="_Toc242172988" w:history="1">
+      <w:hyperlink w:anchor="_Toc242173595" w:history="1">
         <w:r>
           <w:rPr>
             <w:rStyle w:val="Hyperlink"/>
@@ -5340,7 +5340,7 @@
             <w:noProof/>
             <w:webHidden/>
           </w:rPr>
-          <w:instrText xml:space="preserve"> PAGEREF _Toc242172988 \h </w:instrText>
+          <w:instrText xml:space="preserve"> PAGEREF _Toc242173595 \h </w:instrText>
         </w:r>
         <w:r>
           <w:rPr>
@@ -5383,7 +5383,7 @@
           <w:sz w:val="24"/>
         </w:rPr>
       </w:pPr>
-      <w:hyperlink w:anchor="_Toc242172989" w:history="1">
+      <w:hyperlink w:anchor="_Toc242173596" w:history="1">
         <w:r>
           <w:rPr>
             <w:rStyle w:val="Hyperlink"/>
@@ -5410,7 +5410,7 @@
             <w:noProof/>
             <w:webHidden/>
           </w:rPr>
-          <w:instrText xml:space="preserve"> PAGEREF _Toc242172989 \h </w:instrText>
+          <w:instrText xml:space="preserve"> PAGEREF _Toc242173596 \h </w:instrText>
         </w:r>
         <w:r>
           <w:rPr>
@@ -5453,7 +5453,7 @@
           <w:sz w:val="24"/>
         </w:rPr>
       </w:pPr>
-      <w:hyperlink w:anchor="_Toc242172990" w:history="1">
+      <w:hyperlink w:anchor="_Toc242173597" w:history="1">
         <w:r>
           <w:rPr>
             <w:rStyle w:val="Hyperlink"/>
@@ -5480,7 +5480,7 @@
             <w:noProof/>
             <w:webHidden/>
           </w:rPr>
-          <w:instrText xml:space="preserve"> PAGEREF _Toc242172990 \h </w:instrText>
+          <w:instrText xml:space="preserve"> PAGEREF _Toc242173597 \h </w:instrText>
         </w:r>
         <w:r>
           <w:rPr>
@@ -5523,7 +5523,7 @@
           <w:sz w:val="24"/>
         </w:rPr>
       </w:pPr>
-      <w:hyperlink w:anchor="_Toc242172991" w:history="1">
+      <w:hyperlink w:anchor="_Toc242173598" w:history="1">
         <w:r>
           <w:rPr>
             <w:rStyle w:val="Hyperlink"/>
@@ -5550,7 +5550,7 @@
             <w:noProof/>
             <w:webHidden/>
           </w:rPr>
-          <w:instrText xml:space="preserve"> PAGEREF _Toc242172991 \h </w:instrText>
+          <w:instrText xml:space="preserve"> PAGEREF _Toc242173598 \h </w:instrText>
         </w:r>
         <w:r>
           <w:rPr>
@@ -5593,7 +5593,7 @@
           <w:sz w:val="24"/>
         </w:rPr>
       </w:pPr>
-      <w:hyperlink w:anchor="_Toc242172992" w:history="1">
+      <w:hyperlink w:anchor="_Toc242173599" w:history="1">
         <w:r>
           <w:rPr>
             <w:rStyle w:val="Hyperlink"/>
@@ -5620,7 +5620,7 @@
             <w:noProof/>
             <w:webHidden/>
           </w:rPr>
-          <w:instrText xml:space="preserve"> PAGEREF _Toc242172992 \h </w:instrText>
+          <w:instrText xml:space="preserve"> PAGEREF _Toc242173599 \h </w:instrText>
         </w:r>
         <w:r>
           <w:rPr>
@@ -5663,7 +5663,7 @@
           <w:sz w:val="24"/>
         </w:rPr>
       </w:pPr>
-      <w:hyperlink w:anchor="_Toc242172993" w:history="1">
+      <w:hyperlink w:anchor="_Toc242173600" w:history="1">
         <w:r>
           <w:rPr>
             <w:rStyle w:val="Hyperlink"/>
@@ -5690,7 +5690,7 @@
             <w:noProof/>
             <w:webHidden/>
           </w:rPr>
-          <w:instrText xml:space="preserve"> PAGEREF _Toc242172993 \h </w:instrText>
+          <w:instrText xml:space="preserve"> PAGEREF _Toc242173600 \h </w:instrText>
         </w:r>
         <w:r>
           <w:rPr>
@@ -5733,7 +5733,7 @@
           <w:sz w:val="24"/>
         </w:rPr>
       </w:pPr>
-      <w:hyperlink w:anchor="_Toc242172994" w:history="1">
+      <w:hyperlink w:anchor="_Toc242173601" w:history="1">
         <w:r>
           <w:rPr>
             <w:rStyle w:val="Hyperlink"/>
@@ -5760,7 +5760,7 @@
             <w:noProof/>
             <w:webHidden/>
           </w:rPr>
-          <w:instrText xml:space="preserve"> PAGEREF _Toc242172994 \h </w:instrText>
+          <w:instrText xml:space="preserve"> PAGEREF _Toc242173601 \h </w:instrText>
         </w:r>
         <w:r>
           <w:rPr>
@@ -5803,7 +5803,7 @@
           <w:sz w:val="24"/>
         </w:rPr>
       </w:pPr>
-      <w:hyperlink w:anchor="_Toc242172995" w:history="1">
+      <w:hyperlink w:anchor="_Toc242173602" w:history="1">
         <w:r>
           <w:rPr>
             <w:rStyle w:val="Hyperlink"/>
@@ -5830,7 +5830,7 @@
             <w:noProof/>
             <w:webHidden/>
           </w:rPr>
-          <w:instrText xml:space="preserve"> PAGEREF _Toc242172995 \h </w:instrText>
+          <w:instrText xml:space="preserve"> PAGEREF _Toc242173602 \h </w:instrText>
         </w:r>
         <w:r>
           <w:rPr>
@@ -5873,7 +5873,7 @@
           <w:sz w:val="24"/>
         </w:rPr>
       </w:pPr>
-      <w:hyperlink w:anchor="_Toc242172996" w:history="1">
+      <w:hyperlink w:anchor="_Toc242173603" w:history="1">
         <w:r>
           <w:rPr>
             <w:rStyle w:val="Hyperlink"/>
@@ -5900,7 +5900,7 @@
             <w:noProof/>
             <w:webHidden/>
           </w:rPr>
-          <w:instrText xml:space="preserve"> PAGEREF _Toc242172996 \h </w:instrText>
+          <w:instrText xml:space="preserve"> PAGEREF _Toc242173603 \h </w:instrText>
         </w:r>
         <w:r>
           <w:rPr>
@@ -5943,7 +5943,7 @@
           <w:sz w:val="24"/>
         </w:rPr>
       </w:pPr>
-      <w:hyperlink w:anchor="_Toc242172997" w:history="1">
+      <w:hyperlink w:anchor="_Toc242173604" w:history="1">
         <w:r>
           <w:rPr>
             <w:rStyle w:val="Hyperlink"/>
@@ -5970,7 +5970,7 @@
             <w:noProof/>
             <w:webHidden/>
           </w:rPr>
-          <w:instrText xml:space="preserve"> PAGEREF _Toc242172997 \h </w:instrText>
+          <w:instrText xml:space="preserve"> PAGEREF _Toc242173604 \h </w:instrText>
         </w:r>
         <w:r>
           <w:rPr>
@@ -6014,7 +6014,7 @@
           <w:sz w:val="24"/>
         </w:rPr>
       </w:pPr>
-      <w:hyperlink w:anchor="_Toc242172998" w:history="1">
+      <w:hyperlink w:anchor="_Toc242173605" w:history="1">
         <w:r>
           <w:rPr>
             <w:rStyle w:val="Hyperlink"/>
@@ -6041,7 +6041,7 @@
             <w:noProof/>
             <w:webHidden/>
           </w:rPr>
-          <w:instrText xml:space="preserve"> PAGEREF _Toc242172998 \h </w:instrText>
+          <w:instrText xml:space="preserve"> PAGEREF _Toc242173605 \h </w:instrText>
         </w:r>
         <w:r>
           <w:rPr>
@@ -6084,7 +6084,7 @@
           <w:sz w:val="24"/>
         </w:rPr>
       </w:pPr>
-      <w:hyperlink w:anchor="_Toc242172999" w:history="1">
+      <w:hyperlink w:anchor="_Toc242173606" w:history="1">
         <w:r>
           <w:rPr>
             <w:rStyle w:val="Hyperlink"/>
@@ -6111,7 +6111,7 @@
             <w:noProof/>
             <w:webHidden/>
           </w:rPr>
-          <w:instrText xml:space="preserve"> PAGEREF _Toc242172999 \h </w:instrText>
+          <w:instrText xml:space="preserve"> PAGEREF _Toc242173606 \h </w:instrText>
         </w:r>
         <w:r>
           <w:rPr>
@@ -6154,7 +6154,7 @@
           <w:sz w:val="24"/>
         </w:rPr>
       </w:pPr>
-      <w:hyperlink w:anchor="_Toc242173000" w:history="1">
+      <w:hyperlink w:anchor="_Toc242173607" w:history="1">
         <w:r>
           <w:rPr>
             <w:rStyle w:val="Hyperlink"/>
@@ -6181,7 +6181,7 @@
             <w:noProof/>
             <w:webHidden/>
           </w:rPr>
-          <w:instrText xml:space="preserve"> PAGEREF _Toc242173000 \h </w:instrText>
+          <w:instrText xml:space="preserve"> PAGEREF _Toc242173607 \h </w:instrText>
         </w:r>
         <w:r>
           <w:rPr>
@@ -6224,7 +6224,7 @@
           <w:sz w:val="24"/>
         </w:rPr>
       </w:pPr>
-      <w:hyperlink w:anchor="_Toc242173001" w:history="1">
+      <w:hyperlink w:anchor="_Toc242173608" w:history="1">
         <w:r>
           <w:rPr>
             <w:rStyle w:val="Hyperlink"/>
@@ -6251,7 +6251,7 @@
             <w:noProof/>
             <w:webHidden/>
           </w:rPr>
-          <w:instrText xml:space="preserve"> PAGEREF _Toc242173001 \h </w:instrText>
+          <w:instrText xml:space="preserve"> PAGEREF _Toc242173608 \h </w:instrText>
         </w:r>
         <w:r>
           <w:rPr>
@@ -6294,7 +6294,7 @@
           <w:sz w:val="24"/>
         </w:rPr>
       </w:pPr>
-      <w:hyperlink w:anchor="_Toc242173002" w:history="1">
+      <w:hyperlink w:anchor="_Toc242173609" w:history="1">
         <w:r>
           <w:rPr>
             <w:rStyle w:val="Hyperlink"/>
@@ -6321,7 +6321,7 @@
             <w:noProof/>
             <w:webHidden/>
           </w:rPr>
-          <w:instrText xml:space="preserve"> PAGEREF _Toc242173002 \h </w:instrText>
+          <w:instrText xml:space="preserve"> PAGEREF _Toc242173609 \h </w:instrText>
         </w:r>
         <w:r>
           <w:rPr>
@@ -6364,7 +6364,7 @@
           <w:sz w:val="24"/>
         </w:rPr>
       </w:pPr>
-      <w:hyperlink w:anchor="_Toc242173003" w:history="1">
+      <w:hyperlink w:anchor="_Toc242173610" w:history="1">
         <w:r>
           <w:rPr>
             <w:rStyle w:val="Hyperlink"/>
@@ -6391,7 +6391,7 @@
             <w:noProof/>
             <w:webHidden/>
           </w:rPr>
-          <w:instrText xml:space="preserve"> PAGEREF _Toc242173003 \h </w:instrText>
+          <w:instrText xml:space="preserve"> PAGEREF _Toc242173610 \h </w:instrText>
         </w:r>
         <w:r>
           <w:rPr>
@@ -6434,7 +6434,7 @@
           <w:sz w:val="24"/>
         </w:rPr>
       </w:pPr>
-      <w:hyperlink w:anchor="_Toc242173004" w:history="1">
+      <w:hyperlink w:anchor="_Toc242173611" w:history="1">
         <w:r>
           <w:rPr>
             <w:rStyle w:val="Hyperlink"/>
@@ -6461,7 +6461,7 @@
             <w:noProof/>
             <w:webHidden/>
           </w:rPr>
-          <w:instrText xml:space="preserve"> PAGEREF _Toc242173004 \h </w:instrText>
+          <w:instrText xml:space="preserve"> PAGEREF _Toc242173611 \h </w:instrText>
         </w:r>
         <w:r>
           <w:rPr>
@@ -6504,7 +6504,7 @@
           <w:sz w:val="24"/>
         </w:rPr>
       </w:pPr>
-      <w:hyperlink w:anchor="_Toc242173005" w:history="1">
+      <w:hyperlink w:anchor="_Toc242173612" w:history="1">
         <w:r>
           <w:rPr>
             <w:rStyle w:val="Hyperlink"/>
@@ -6531,7 +6531,7 @@
             <w:noProof/>
             <w:webHidden/>
           </w:rPr>
-          <w:instrText xml:space="preserve"> PAGEREF _Toc242173005 \h </w:instrText>
+          <w:instrText xml:space="preserve"> PAGEREF _Toc242173612 \h </w:instrText>
         </w:r>
         <w:r>
           <w:rPr>
@@ -6574,7 +6574,7 @@
           <w:sz w:val="24"/>
         </w:rPr>
       </w:pPr>
-      <w:hyperlink w:anchor="_Toc242173006" w:history="1">
+      <w:hyperlink w:anchor="_Toc242173613" w:history="1">
         <w:r>
           <w:rPr>
             <w:rStyle w:val="Hyperlink"/>
@@ -6601,7 +6601,7 @@
             <w:noProof/>
             <w:webHidden/>
           </w:rPr>
-          <w:instrText xml:space="preserve"> PAGEREF _Toc242173006 \h </w:instrText>
+          <w:instrText xml:space="preserve"> PAGEREF _Toc242173613 \h </w:instrText>
         </w:r>
         <w:r>
           <w:rPr>
@@ -6644,7 +6644,7 @@
           <w:sz w:val="24"/>
         </w:rPr>
       </w:pPr>
-      <w:hyperlink w:anchor="_Toc242173007" w:history="1">
+      <w:hyperlink w:anchor="_Toc242173614" w:history="1">
         <w:r>
           <w:rPr>
             <w:rStyle w:val="Hyperlink"/>
@@ -6671,7 +6671,7 @@
             <w:noProof/>
             <w:webHidden/>
           </w:rPr>
-          <w:instrText xml:space="preserve"> PAGEREF _Toc242173007 \h </w:instrText>
+          <w:instrText xml:space="preserve"> PAGEREF _Toc242173614 \h </w:instrText>
         </w:r>
         <w:r>
           <w:rPr>
@@ -6714,7 +6714,7 @@
           <w:sz w:val="24"/>
         </w:rPr>
       </w:pPr>
-      <w:hyperlink w:anchor="_Toc242173008" w:history="1">
+      <w:hyperlink w:anchor="_Toc242173615" w:history="1">
         <w:r>
           <w:rPr>
             <w:rStyle w:val="Hyperlink"/>
@@ -6741,7 +6741,7 @@
             <w:noProof/>
             <w:webHidden/>
           </w:rPr>
-          <w:instrText xml:space="preserve"> PAGEREF _Toc242173008 \h </w:instrText>
+          <w:instrText xml:space="preserve"> PAGEREF _Toc242173615 \h </w:instrText>
         </w:r>
         <w:r>
           <w:rPr>
@@ -6784,7 +6784,7 @@
           <w:sz w:val="24"/>
         </w:rPr>
       </w:pPr>
-      <w:hyperlink w:anchor="_Toc242173009" w:history="1">
+      <w:hyperlink w:anchor="_Toc242173616" w:history="1">
         <w:r>
           <w:rPr>
             <w:rStyle w:val="Hyperlink"/>
@@ -6811,7 +6811,7 @@
             <w:noProof/>
             <w:webHidden/>
           </w:rPr>
-          <w:instrText xml:space="preserve"> PAGEREF _Toc242173009 \h </w:instrText>
+          <w:instrText xml:space="preserve"> PAGEREF _Toc242173616 \h </w:instrText>
         </w:r>
         <w:r>
           <w:rPr>
@@ -6855,7 +6855,7 @@
           <w:sz w:val="24"/>
         </w:rPr>
       </w:pPr>
-      <w:hyperlink w:anchor="_Toc242173010" w:history="1">
+      <w:hyperlink w:anchor="_Toc242173617" w:history="1">
         <w:r>
           <w:rPr>
             <w:rStyle w:val="Hyperlink"/>
@@ -6882,7 +6882,7 @@
             <w:noProof/>
             <w:webHidden/>
           </w:rPr>
-          <w:instrText xml:space="preserve"> PAGEREF _Toc242173010 \h </w:instrText>
+          <w:instrText xml:space="preserve"> PAGEREF _Toc242173617 \h </w:instrText>
         </w:r>
         <w:r>
           <w:rPr>
@@ -6925,7 +6925,7 @@
           <w:sz w:val="24"/>
         </w:rPr>
       </w:pPr>
-      <w:hyperlink w:anchor="_Toc242173011" w:history="1">
+      <w:hyperlink w:anchor="_Toc242173618" w:history="1">
         <w:r>
           <w:rPr>
             <w:rStyle w:val="Hyperlink"/>
@@ -6952,7 +6952,7 @@
             <w:noProof/>
             <w:webHidden/>
           </w:rPr>
-          <w:instrText xml:space="preserve"> PAGEREF _Toc242173011 \h </w:instrText>
+          <w:instrText xml:space="preserve"> PAGEREF _Toc242173618 \h </w:instrText>
         </w:r>
         <w:r>
           <w:rPr>
@@ -6995,7 +6995,7 @@
           <w:sz w:val="24"/>
         </w:rPr>
       </w:pPr>
-      <w:hyperlink w:anchor="_Toc242173012" w:history="1">
+      <w:hyperlink w:anchor="_Toc242173619" w:history="1">
         <w:r>
           <w:rPr>
             <w:rStyle w:val="Hyperlink"/>
@@ -7022,7 +7022,7 @@
             <w:noProof/>
             <w:webHidden/>
           </w:rPr>
-          <w:instrText xml:space="preserve"> PAGEREF _Toc242173012 \h </w:instrText>
+          <w:instrText xml:space="preserve"> PAGEREF _Toc242173619 \h </w:instrText>
         </w:r>
         <w:r>
           <w:rPr>
@@ -7065,7 +7065,7 @@
           <w:sz w:val="24"/>
         </w:rPr>
       </w:pPr>
-      <w:hyperlink w:anchor="_Toc242173013" w:history="1">
+      <w:hyperlink w:anchor="_Toc242173620" w:history="1">
         <w:r>
           <w:rPr>
             <w:rStyle w:val="Hyperlink"/>
@@ -7092,7 +7092,7 @@
             <w:noProof/>
             <w:webHidden/>
           </w:rPr>
-          <w:instrText xml:space="preserve"> PAGEREF _Toc242173013 \h </w:instrText>
+          <w:instrText xml:space="preserve"> PAGEREF _Toc242173620 \h </w:instrText>
         </w:r>
         <w:r>
           <w:rPr>
@@ -7135,7 +7135,7 @@
           <w:sz w:val="24"/>
         </w:rPr>
       </w:pPr>
-      <w:hyperlink w:anchor="_Toc242173014" w:history="1">
+      <w:hyperlink w:anchor="_Toc242173621" w:history="1">
         <w:r>
           <w:rPr>
             <w:rStyle w:val="Hyperlink"/>
@@ -7162,7 +7162,7 @@
             <w:noProof/>
             <w:webHidden/>
           </w:rPr>
-          <w:instrText xml:space="preserve"> PAGEREF _Toc242173014 \h </w:instrText>
+          <w:instrText xml:space="preserve"> PAGEREF _Toc242173621 \h </w:instrText>
         </w:r>
         <w:r>
           <w:rPr>
@@ -7205,7 +7205,7 @@
           <w:sz w:val="24"/>
         </w:rPr>
       </w:pPr>
-      <w:hyperlink w:anchor="_Toc242173015" w:history="1">
+      <w:hyperlink w:anchor="_Toc242173622" w:history="1">
         <w:r>
           <w:rPr>
             <w:rStyle w:val="Hyperlink"/>
@@ -7232,7 +7232,7 @@
             <w:noProof/>
             <w:webHidden/>
           </w:rPr>
-          <w:instrText xml:space="preserve"> PAGEREF _Toc242173015 \h </w:instrText>
+          <w:instrText xml:space="preserve"> PAGEREF _Toc242173622 \h </w:instrText>
         </w:r>
         <w:r>
           <w:rPr>
@@ -7276,7 +7276,7 @@
           <w:sz w:val="24"/>
         </w:rPr>
       </w:pPr>
-      <w:hyperlink w:anchor="_Toc242173016" w:history="1">
+      <w:hyperlink w:anchor="_Toc242173623" w:history="1">
         <w:r>
           <w:rPr>
             <w:rStyle w:val="Hyperlink"/>
@@ -7303,7 +7303,7 @@
             <w:noProof/>
             <w:webHidden/>
           </w:rPr>
-          <w:instrText xml:space="preserve"> PAGEREF _Toc242173016 \h </w:instrText>
+          <w:instrText xml:space="preserve"> PAGEREF _Toc242173623 \h </w:instrText>
         </w:r>
         <w:r>
           <w:rPr>
@@ -7346,7 +7346,7 @@
           <w:sz w:val="24"/>
         </w:rPr>
       </w:pPr>
-      <w:hyperlink w:anchor="_Toc242173017" w:history="1">
+      <w:hyperlink w:anchor="_Toc242173624" w:history="1">
         <w:r>
           <w:rPr>
             <w:rStyle w:val="Hyperlink"/>
@@ -7373,7 +7373,7 @@
             <w:noProof/>
             <w:webHidden/>
           </w:rPr>
-          <w:instrText xml:space="preserve"> PAGEREF _Toc242173017 \h </w:instrText>
+          <w:instrText xml:space="preserve"> PAGEREF _Toc242173624 \h </w:instrText>
         </w:r>
         <w:r>
           <w:rPr>
@@ -7416,7 +7416,7 @@
           <w:sz w:val="24"/>
         </w:rPr>
       </w:pPr>
-      <w:hyperlink w:anchor="_Toc242173018" w:history="1">
+      <w:hyperlink w:anchor="_Toc242173625" w:history="1">
         <w:r>
           <w:rPr>
             <w:rStyle w:val="Hyperlink"/>
@@ -7443,7 +7443,7 @@
             <w:noProof/>
             <w:webHidden/>
           </w:rPr>
-          <w:instrText xml:space="preserve"> PAGEREF _Toc242173018 \h </w:instrText>
+          <w:instrText xml:space="preserve"> PAGEREF _Toc242173625 \h </w:instrText>
         </w:r>
         <w:r>
           <w:rPr>
@@ -7486,7 +7486,7 @@
           <w:sz w:val="24"/>
         </w:rPr>
       </w:pPr>
-      <w:hyperlink w:anchor="_Toc242173019" w:history="1">
+      <w:hyperlink w:anchor="_Toc242173626" w:history="1">
         <w:r>
           <w:rPr>
             <w:rStyle w:val="Hyperlink"/>
@@ -7513,7 +7513,7 @@
             <w:noProof/>
             <w:webHidden/>
           </w:rPr>
-          <w:instrText xml:space="preserve"> PAGEREF _Toc242173019 \h </w:instrText>
+          <w:instrText xml:space="preserve"> PAGEREF _Toc242173626 \h </w:instrText>
         </w:r>
         <w:r>
           <w:rPr>
@@ -7556,7 +7556,7 @@
           <w:sz w:val="24"/>
         </w:rPr>
       </w:pPr>
-      <w:hyperlink w:anchor="_Toc242173020" w:history="1">
+      <w:hyperlink w:anchor="_Toc242173627" w:history="1">
         <w:r>
           <w:rPr>
             <w:rStyle w:val="Hyperlink"/>
@@ -7583,7 +7583,7 @@
             <w:noProof/>
             <w:webHidden/>
           </w:rPr>
-          <w:instrText xml:space="preserve"> PAGEREF _Toc242173020 \h </w:instrText>
+          <w:instrText xml:space="preserve"> PAGEREF _Toc242173627 \h </w:instrText>
         </w:r>
         <w:r>
           <w:rPr>
@@ -7626,7 +7626,7 @@
           <w:sz w:val="24"/>
         </w:rPr>
       </w:pPr>
-      <w:hyperlink w:anchor="_Toc242173021" w:history="1">
+      <w:hyperlink w:anchor="_Toc242173628" w:history="1">
         <w:r>
           <w:rPr>
             <w:rStyle w:val="Hyperlink"/>
@@ -7653,7 +7653,7 @@
             <w:noProof/>
             <w:webHidden/>
           </w:rPr>
-          <w:instrText xml:space="preserve"> PAGEREF _Toc242173021 \h </w:instrText>
+          <w:instrText xml:space="preserve"> PAGEREF _Toc242173628 \h </w:instrText>
         </w:r>
         <w:r>
           <w:rPr>
@@ -7696,7 +7696,7 @@
           <w:sz w:val="24"/>
         </w:rPr>
       </w:pPr>
-      <w:hyperlink w:anchor="_Toc242173022" w:history="1">
+      <w:hyperlink w:anchor="_Toc242173629" w:history="1">
         <w:r>
           <w:rPr>
             <w:rStyle w:val="Hyperlink"/>
@@ -7723,7 +7723,7 @@
             <w:noProof/>
             <w:webHidden/>
           </w:rPr>
-          <w:instrText xml:space="preserve"> PAGEREF _Toc242173022 \h </w:instrText>
+          <w:instrText xml:space="preserve"> PAGEREF _Toc242173629 \h </w:instrText>
         </w:r>
         <w:r>
           <w:rPr>
@@ -7766,7 +7766,7 @@
           <w:sz w:val="24"/>
         </w:rPr>
       </w:pPr>
-      <w:hyperlink w:anchor="_Toc242173023" w:history="1">
+      <w:hyperlink w:anchor="_Toc242173630" w:history="1">
         <w:r>
           <w:rPr>
             <w:rStyle w:val="Hyperlink"/>
@@ -7793,7 +7793,7 @@
             <w:noProof/>
             <w:webHidden/>
           </w:rPr>
-          <w:instrText xml:space="preserve"> PAGEREF _Toc242173023 \h </w:instrText>
+          <w:instrText xml:space="preserve"> PAGEREF _Toc242173630 \h </w:instrText>
         </w:r>
         <w:r>
           <w:rPr>
@@ -7836,7 +7836,7 @@
           <w:sz w:val="24"/>
         </w:rPr>
       </w:pPr>
-      <w:hyperlink w:anchor="_Toc242173024" w:history="1">
+      <w:hyperlink w:anchor="_Toc242173631" w:history="1">
         <w:r>
           <w:rPr>
             <w:rStyle w:val="Hyperlink"/>
@@ -7863,7 +7863,7 @@
             <w:noProof/>
             <w:webHidden/>
           </w:rPr>
-          <w:instrText xml:space="preserve"> PAGEREF _Toc242173024 \h </w:instrText>
+          <w:instrText xml:space="preserve"> PAGEREF _Toc242173631 \h </w:instrText>
         </w:r>
         <w:r>
           <w:rPr>
@@ -7906,7 +7906,7 @@
           <w:sz w:val="24"/>
         </w:rPr>
       </w:pPr>
-      <w:hyperlink w:anchor="_Toc242173025" w:history="1">
+      <w:hyperlink w:anchor="_Toc242173632" w:history="1">
         <w:r>
           <w:rPr>
             <w:rStyle w:val="Hyperlink"/>
@@ -7933,7 +7933,7 @@
             <w:noProof/>
             <w:webHidden/>
           </w:rPr>
-          <w:instrText xml:space="preserve"> PAGEREF _Toc242173025 \h </w:instrText>
+          <w:instrText xml:space="preserve"> PAGEREF _Toc242173632 \h </w:instrText>
         </w:r>
         <w:r>
           <w:rPr>
@@ -7976,7 +7976,7 @@
           <w:sz w:val="24"/>
         </w:rPr>
       </w:pPr>
-      <w:hyperlink w:anchor="_Toc242173026" w:history="1">
+      <w:hyperlink w:anchor="_Toc242173633" w:history="1">
         <w:r>
           <w:rPr>
             <w:rStyle w:val="Hyperlink"/>
@@ -8003,7 +8003,7 @@
             <w:noProof/>
             <w:webHidden/>
           </w:rPr>
-          <w:instrText xml:space="preserve"> PAGEREF _Toc242173026 \h </w:instrText>
+          <w:instrText xml:space="preserve"> PAGEREF _Toc242173633 \h </w:instrText>
         </w:r>
         <w:r>
           <w:rPr>
@@ -8046,7 +8046,7 @@
           <w:sz w:val="24"/>
         </w:rPr>
       </w:pPr>
-      <w:hyperlink w:anchor="_Toc242173027" w:history="1">
+      <w:hyperlink w:anchor="_Toc242173634" w:history="1">
         <w:r>
           <w:rPr>
             <w:rStyle w:val="Hyperlink"/>
@@ -8073,7 +8073,7 @@
             <w:noProof/>
             <w:webHidden/>
           </w:rPr>
-          <w:instrText xml:space="preserve"> PAGEREF _Toc242173027 \h </w:instrText>
+          <w:instrText xml:space="preserve"> PAGEREF _Toc242173634 \h </w:instrText>
         </w:r>
         <w:r>
           <w:rPr>
@@ -8116,7 +8116,7 @@
           <w:sz w:val="24"/>
         </w:rPr>
       </w:pPr>
-      <w:hyperlink w:anchor="_Toc242173028" w:history="1">
+      <w:hyperlink w:anchor="_Toc242173635" w:history="1">
         <w:r>
           <w:rPr>
             <w:rStyle w:val="Hyperlink"/>
@@ -8143,7 +8143,7 @@
             <w:noProof/>
             <w:webHidden/>
           </w:rPr>
-          <w:instrText xml:space="preserve"> PAGEREF _Toc242173028 \h </w:instrText>
+          <w:instrText xml:space="preserve"> PAGEREF _Toc242173635 \h </w:instrText>
         </w:r>
         <w:r>
           <w:rPr>
@@ -8186,7 +8186,7 @@
           <w:sz w:val="24"/>
         </w:rPr>
       </w:pPr>
-      <w:hyperlink w:anchor="_Toc242173029" w:history="1">
+      <w:hyperlink w:anchor="_Toc242173636" w:history="1">
         <w:r>
           <w:rPr>
             <w:rStyle w:val="Hyperlink"/>
@@ -8213,7 +8213,7 @@
             <w:noProof/>
             <w:webHidden/>
           </w:rPr>
-          <w:instrText xml:space="preserve"> PAGEREF _Toc242173029 \h </w:instrText>
+          <w:instrText xml:space="preserve"> PAGEREF _Toc242173636 \h </w:instrText>
         </w:r>
         <w:r>
           <w:rPr>
@@ -8257,7 +8257,7 @@
           <w:sz w:val="24"/>
         </w:rPr>
       </w:pPr>
-      <w:hyperlink w:anchor="_Toc242173030" w:history="1">
+      <w:hyperlink w:anchor="_Toc242173637" w:history="1">
         <w:r>
           <w:rPr>
             <w:rStyle w:val="Hyperlink"/>
@@ -8284,7 +8284,7 @@
             <w:noProof/>
             <w:webHidden/>
           </w:rPr>
-          <w:instrText xml:space="preserve"> PAGEREF _Toc242173030 \h </w:instrText>
+          <w:instrText xml:space="preserve"> PAGEREF _Toc242173637 \h </w:instrText>
         </w:r>
         <w:r>
           <w:rPr>
@@ -8327,7 +8327,7 @@
           <w:sz w:val="24"/>
         </w:rPr>
       </w:pPr>
-      <w:hyperlink w:anchor="_Toc242173031" w:history="1">
+      <w:hyperlink w:anchor="_Toc242173638" w:history="1">
         <w:r>
           <w:rPr>
             <w:rStyle w:val="Hyperlink"/>
@@ -8354,7 +8354,7 @@
             <w:noProof/>
             <w:webHidden/>
           </w:rPr>
-          <w:instrText xml:space="preserve"> PAGEREF _Toc242173031 \h </w:instrText>
+          <w:instrText xml:space="preserve"> PAGEREF _Toc242173638 \h </w:instrText>
         </w:r>
         <w:r>
           <w:rPr>
@@ -8397,7 +8397,7 @@
           <w:sz w:val="24"/>
         </w:rPr>
       </w:pPr>
-      <w:hyperlink w:anchor="_Toc242173032" w:history="1">
+      <w:hyperlink w:anchor="_Toc242173639" w:history="1">
         <w:r>
           <w:rPr>
             <w:rStyle w:val="Hyperlink"/>
@@ -8424,7 +8424,7 @@
             <w:noProof/>
             <w:webHidden/>
           </w:rPr>
-          <w:instrText xml:space="preserve"> PAGEREF _Toc242173032 \h </w:instrText>
+          <w:instrText xml:space="preserve"> PAGEREF _Toc242173639 \h </w:instrText>
         </w:r>
         <w:r>
           <w:rPr>
@@ -8469,7 +8469,7 @@
       <w:pPr>
         <w:pStyle w:val="berschrift1"/>
       </w:pPr>
-      <w:bookmarkStart w:id="0" w:name="_Toc242172914"/>
+      <w:bookmarkStart w:id="0" w:name="_Toc242173521"/>
       <w:r>
         <w:t>Einleitung und Wegweiser</w:t>
       </w:r>
@@ -8498,7 +8498,7 @@
       <w:pPr>
         <w:pStyle w:val="berschrift2"/>
       </w:pPr>
-      <w:bookmarkStart w:id="1" w:name="_Toc242172915"/>
+      <w:bookmarkStart w:id="1" w:name="_Toc242173522"/>
       <w:r>
         <w:t>So ist jede Seite beschrieben</w:t>
       </w:r>
@@ -8608,7 +8608,7 @@
       <w:pPr>
         <w:pStyle w:val="berschrift2"/>
       </w:pPr>
-      <w:bookmarkStart w:id="2" w:name="_Toc242172916"/>
+      <w:bookmarkStart w:id="2" w:name="_Toc242173523"/>
       <w:r>
         <w:t>Wegweiser nach Rolle</w:t>
       </w:r>
@@ -9044,7 +9044,7 @@
       <w:pPr>
         <w:pStyle w:val="berschrift2"/>
       </w:pPr>
-      <w:bookmarkStart w:id="3" w:name="_Toc242172917"/>
+      <w:bookmarkStart w:id="3" w:name="_Toc242173524"/>
       <w:r>
         <w:t>Allgemeine Regeln für alle Zahlen</w:t>
       </w:r>
@@ -9084,7 +9084,7 @@
       <w:pPr>
         <w:pStyle w:val="berschrift1"/>
       </w:pPr>
-      <w:bookmarkStart w:id="4" w:name="_Toc242172918"/>
+      <w:bookmarkStart w:id="4" w:name="_Toc242173525"/>
       <w:r>
         <w:t>Finance und Management</w:t>
       </w:r>
@@ -9125,7 +9125,7 @@
       <w:pPr>
         <w:pStyle w:val="berschrift2"/>
       </w:pPr>
-      <w:bookmarkStart w:id="5" w:name="_Toc242172919"/>
+      <w:bookmarkStart w:id="5" w:name="_Toc242173526"/>
       <w:r>
         <w:t>Export Dashboard</w:t>
       </w:r>
@@ -9244,7 +9244,7 @@
       <w:pPr>
         <w:pStyle w:val="berschrift2"/>
       </w:pPr>
-      <w:bookmarkStart w:id="6" w:name="_Toc242172920"/>
+      <w:bookmarkStart w:id="6" w:name="_Toc242173527"/>
       <w:r>
         <w:t>Schnellübersicht</w:t>
       </w:r>
@@ -9349,7 +9349,7 @@
       <w:pPr>
         <w:pStyle w:val="berschrift2"/>
       </w:pPr>
-      <w:bookmarkStart w:id="7" w:name="_Toc242172921"/>
+      <w:bookmarkStart w:id="7" w:name="_Toc242173528"/>
       <w:r>
         <w:t>Management Entscheidungen</w:t>
       </w:r>
@@ -9458,7 +9458,7 @@
       <w:pPr>
         <w:pStyle w:val="berschrift2"/>
       </w:pPr>
-      <w:bookmarkStart w:id="8" w:name="_Toc242172922"/>
+      <w:bookmarkStart w:id="8" w:name="_Toc242173529"/>
       <w:r>
         <w:t>Finance Summary (Experten)</w:t>
       </w:r>
@@ -9550,7 +9550,7 @@
       <w:pPr>
         <w:pStyle w:val="berschrift2"/>
       </w:pPr>
-      <w:bookmarkStart w:id="9" w:name="_Toc242172923"/>
+      <w:bookmarkStart w:id="9" w:name="_Toc242173530"/>
       <w:r>
         <w:t>Länder Diagnose (Experten)</w:t>
       </w:r>
@@ -9642,7 +9642,7 @@
       <w:pPr>
         <w:pStyle w:val="berschrift2"/>
       </w:pPr>
-      <w:bookmarkStart w:id="10" w:name="_Toc242172924"/>
+      <w:bookmarkStart w:id="10" w:name="_Toc242173531"/>
       <w:r>
         <w:t>Datenstatus (Experten)</w:t>
       </w:r>
@@ -9734,7 +9734,7 @@
       <w:pPr>
         <w:pStyle w:val="berschrift2"/>
       </w:pPr>
-      <w:bookmarkStart w:id="11" w:name="_Toc242172925"/>
+      <w:bookmarkStart w:id="11" w:name="_Toc242173532"/>
       <w:r>
         <w:t>Abweichungen (Experten)</w:t>
       </w:r>
@@ -9815,7 +9815,7 @@
       <w:pPr>
         <w:pStyle w:val="berschrift2"/>
       </w:pPr>
-      <w:bookmarkStart w:id="12" w:name="_Toc242172926"/>
+      <w:bookmarkStart w:id="12" w:name="_Toc242173533"/>
       <w:r>
         <w:t>Gutschriften (Experten)</w:t>
       </w:r>
@@ -9896,7 +9896,7 @@
       <w:pPr>
         <w:pStyle w:val="berschrift2"/>
       </w:pPr>
-      <w:bookmarkStart w:id="13" w:name="_Toc242172927"/>
+      <w:bookmarkStart w:id="13" w:name="_Toc242173534"/>
       <w:r>
         <w:t>Datenqualität (Experten)</w:t>
       </w:r>
@@ -9977,7 +9977,7 @@
       <w:pPr>
         <w:pStyle w:val="berschrift2"/>
       </w:pPr>
-      <w:bookmarkStart w:id="14" w:name="_Toc242172928"/>
+      <w:bookmarkStart w:id="14" w:name="_Toc242173535"/>
       <w:r>
         <w:t>Finance Pivot (Experten)</w:t>
       </w:r>
@@ -10069,7 +10069,7 @@
       <w:pPr>
         <w:pStyle w:val="berschrift2"/>
       </w:pPr>
-      <w:bookmarkStart w:id="15" w:name="_Toc242172929"/>
+      <w:bookmarkStart w:id="15" w:name="_Toc242173536"/>
       <w:r>
         <w:t>Sparten-Finanzanalyse (Experten)</w:t>
       </w:r>
@@ -10161,7 +10161,7 @@
       <w:pPr>
         <w:pStyle w:val="berschrift2"/>
       </w:pPr>
-      <w:bookmarkStart w:id="16" w:name="_Toc242172930"/>
+      <w:bookmarkStart w:id="16" w:name="_Toc242173537"/>
       <w:r>
         <w:t>Zentrale Spartenzuordnung (Experten)</w:t>
       </w:r>
@@ -10242,7 +10242,7 @@
       <w:pPr>
         <w:pStyle w:val="berschrift2"/>
       </w:pPr>
-      <w:bookmarkStart w:id="17" w:name="_Toc242172931"/>
+      <w:bookmarkStart w:id="17" w:name="_Toc242173538"/>
       <w:r>
         <w:t>Finance Prüfbuch (Experten)</w:t>
       </w:r>
@@ -10334,7 +10334,7 @@
       <w:pPr>
         <w:pStyle w:val="berschrift2"/>
       </w:pPr>
-      <w:bookmarkStart w:id="18" w:name="_Toc242172932"/>
+      <w:bookmarkStart w:id="18" w:name="_Toc242173539"/>
       <w:r>
         <w:t>Gruppenmarge (Experten)</w:t>
       </w:r>
@@ -10440,7 +10440,7 @@
       <w:pPr>
         <w:pStyle w:val="berschrift2"/>
       </w:pPr>
-      <w:bookmarkStart w:id="19" w:name="_Toc242172933"/>
+      <w:bookmarkStart w:id="19" w:name="_Toc242173540"/>
       <w:r>
         <w:t>3D Datenanalyse (Experten)</w:t>
       </w:r>
@@ -10535,7 +10535,7 @@
       <w:pPr>
         <w:pStyle w:val="berschrift2"/>
       </w:pPr>
-      <w:bookmarkStart w:id="20" w:name="_Toc242172934"/>
+      <w:bookmarkStart w:id="20" w:name="_Toc242173541"/>
       <w:r>
         <w:t>Rohdaten Diagnose (Experten)</w:t>
       </w:r>
@@ -10630,7 +10630,7 @@
       <w:pPr>
         <w:pStyle w:val="berschrift2"/>
       </w:pPr>
-      <w:bookmarkStart w:id="21" w:name="_Toc242172935"/>
+      <w:bookmarkStart w:id="21" w:name="_Toc242173542"/>
       <w:r>
         <w:t>Daten-Heartbeat (Experten)</w:t>
       </w:r>
@@ -10725,7 +10725,7 @@
       <w:pPr>
         <w:pStyle w:val="berschrift2"/>
       </w:pPr>
-      <w:bookmarkStart w:id="22" w:name="_Toc242172936"/>
+      <w:bookmarkStart w:id="22" w:name="_Toc242173543"/>
       <w:r>
         <w:t>Soll/Ist Vergleich</w:t>
       </w:r>
@@ -10820,7 +10820,7 @@
       <w:pPr>
         <w:pStyle w:val="berschrift2"/>
       </w:pPr>
-      <w:bookmarkStart w:id="23" w:name="_Toc242172937"/>
+      <w:bookmarkStart w:id="23" w:name="_Toc242173544"/>
       <w:r>
         <w:t>Controlling</w:t>
       </w:r>
@@ -10932,7 +10932,7 @@
       <w:pPr>
         <w:pStyle w:val="berschrift2"/>
       </w:pPr>
-      <w:bookmarkStart w:id="24" w:name="_Toc242172938"/>
+      <w:bookmarkStart w:id="24" w:name="_Toc242173545"/>
       <w:r>
         <w:t>Finance Schulung</w:t>
       </w:r>
@@ -11027,7 +11027,7 @@
       <w:pPr>
         <w:pStyle w:val="berschrift2"/>
       </w:pPr>
-      <w:bookmarkStart w:id="25" w:name="_Toc242172939"/>
+      <w:bookmarkStart w:id="25" w:name="_Toc242173546"/>
       <w:r>
         <w:t>Manuelle Importe</w:t>
       </w:r>
@@ -11119,7 +11119,7 @@
       <w:pPr>
         <w:pStyle w:val="berschrift2"/>
       </w:pPr>
-      <w:bookmarkStart w:id="26" w:name="_Toc242172940"/>
+      <w:bookmarkStart w:id="26" w:name="_Toc242173547"/>
       <w:r>
         <w:t>Journal Import</w:t>
       </w:r>
@@ -11211,7 +11211,7 @@
       <w:pPr>
         <w:pStyle w:val="berschrift2"/>
       </w:pPr>
-      <w:bookmarkStart w:id="27" w:name="_Toc242172941"/>
+      <w:bookmarkStart w:id="27" w:name="_Toc242173548"/>
       <w:r>
         <w:t>Marktsegmente</w:t>
       </w:r>
@@ -11320,7 +11320,7 @@
       <w:pPr>
         <w:pStyle w:val="berschrift2"/>
       </w:pPr>
-      <w:bookmarkStart w:id="28" w:name="_Toc242172942"/>
+      <w:bookmarkStart w:id="28" w:name="_Toc242173549"/>
       <w:r>
         <w:t>Administration</w:t>
       </w:r>
@@ -11498,7 +11498,7 @@
       <w:pPr>
         <w:pStyle w:val="berschrift2"/>
       </w:pPr>
-      <w:bookmarkStart w:id="29" w:name="_Toc242172943"/>
+      <w:bookmarkStart w:id="29" w:name="_Toc242173550"/>
       <w:r>
         <w:t>Kennzahlen-Glossar</w:t>
       </w:r>
@@ -12407,7 +12407,7 @@
       <w:pPr>
         <w:pStyle w:val="berschrift1"/>
       </w:pPr>
-      <w:bookmarkStart w:id="30" w:name="_Toc242172944"/>
+      <w:bookmarkStart w:id="30" w:name="_Toc242173551"/>
       <w:r>
         <w:t>Einkauf</w:t>
       </w:r>
@@ -12474,7 +12474,7 @@
       <w:pPr>
         <w:pStyle w:val="berschrift2"/>
       </w:pPr>
-      <w:bookmarkStart w:id="31" w:name="_Toc242172945"/>
+      <w:bookmarkStart w:id="31" w:name="_Toc242173552"/>
       <w:r>
         <w:t>Einkauf Dashboard</w:t>
       </w:r>
@@ -12745,7 +12745,7 @@
       <w:pPr>
         <w:pStyle w:val="berschrift2"/>
       </w:pPr>
-      <w:bookmarkStart w:id="32" w:name="_Toc242172946"/>
+      <w:bookmarkStart w:id="32" w:name="_Toc242173553"/>
       <w:r>
         <w:t>Spend</w:t>
       </w:r>
@@ -12904,7 +12904,7 @@
       <w:pPr>
         <w:pStyle w:val="berschrift2"/>
       </w:pPr>
-      <w:bookmarkStart w:id="33" w:name="_Toc242172947"/>
+      <w:bookmarkStart w:id="33" w:name="_Toc242173554"/>
       <w:r>
         <w:t>Offene Bestellungen</w:t>
       </w:r>
@@ -13055,7 +13055,7 @@
       <w:pPr>
         <w:pStyle w:val="berschrift2"/>
       </w:pPr>
-      <w:bookmarkStart w:id="34" w:name="_Toc242172948"/>
+      <w:bookmarkStart w:id="34" w:name="_Toc242173555"/>
       <w:r>
         <w:t>Kontrakte</w:t>
       </w:r>
@@ -13178,7 +13178,7 @@
       <w:pPr>
         <w:pStyle w:val="berschrift2"/>
       </w:pPr>
-      <w:bookmarkStart w:id="35" w:name="_Toc242172949"/>
+      <w:bookmarkStart w:id="35" w:name="_Toc242173556"/>
       <w:r>
         <w:t>Lieferanten</w:t>
       </w:r>
@@ -13289,7 +13289,7 @@
       <w:pPr>
         <w:pStyle w:val="berschrift2"/>
       </w:pPr>
-      <w:bookmarkStart w:id="36" w:name="_Toc242172950"/>
+      <w:bookmarkStart w:id="36" w:name="_Toc242173557"/>
       <w:r>
         <w:t>Spend-Aufriss</w:t>
       </w:r>
@@ -13431,7 +13431,7 @@
       <w:pPr>
         <w:pStyle w:val="berschrift2"/>
       </w:pPr>
-      <w:bookmarkStart w:id="37" w:name="_Toc242172951"/>
+      <w:bookmarkStart w:id="37" w:name="_Toc242173558"/>
       <w:r>
         <w:t>Bestellbedarf &amp; Deckung</w:t>
       </w:r>
@@ -13634,7 +13634,7 @@
       <w:pPr>
         <w:pStyle w:val="berschrift2"/>
       </w:pPr>
-      <w:bookmarkStart w:id="38" w:name="_Toc242172952"/>
+      <w:bookmarkStart w:id="38" w:name="_Toc242173559"/>
       <w:r>
         <w:t>Materialabhängigkeit</w:t>
       </w:r>
@@ -13834,7 +13834,7 @@
       <w:pPr>
         <w:pStyle w:val="berschrift2"/>
       </w:pPr>
-      <w:bookmarkStart w:id="39" w:name="_Toc242172953"/>
+      <w:bookmarkStart w:id="39" w:name="_Toc242173560"/>
       <w:r>
         <w:t>Lieferperformance</w:t>
       </w:r>
@@ -13945,7 +13945,7 @@
       <w:pPr>
         <w:pStyle w:val="berschrift2"/>
       </w:pPr>
-      <w:bookmarkStart w:id="40" w:name="_Toc242172954"/>
+      <w:bookmarkStart w:id="40" w:name="_Toc242173561"/>
       <w:r>
         <w:t>Ideen: Übersicht</w:t>
       </w:r>
@@ -14059,7 +14059,7 @@
       <w:pPr>
         <w:pStyle w:val="berschrift2"/>
       </w:pPr>
-      <w:bookmarkStart w:id="41" w:name="_Toc242172955"/>
+      <w:bookmarkStart w:id="41" w:name="_Toc242173562"/>
       <w:r>
         <w:t>Ideen: Einkauf-Datenservice</w:t>
       </w:r>
@@ -14159,7 +14159,7 @@
       <w:pPr>
         <w:pStyle w:val="berschrift2"/>
       </w:pPr>
-      <w:bookmarkStart w:id="42" w:name="_Toc242172956"/>
+      <w:bookmarkStart w:id="42" w:name="_Toc242173563"/>
       <w:r>
         <w:t>Ideen: Liefertermin-Risiko</w:t>
       </w:r>
@@ -14270,7 +14270,7 @@
       <w:pPr>
         <w:pStyle w:val="berschrift2"/>
       </w:pPr>
-      <w:bookmarkStart w:id="43" w:name="_Toc242172957"/>
+      <w:bookmarkStart w:id="43" w:name="_Toc242173564"/>
       <w:r>
         <w:t>Ideen: Preisentwicklung</w:t>
       </w:r>
@@ -14362,7 +14362,25 @@
         </w:numPr>
       </w:pPr>
       <w:r>
-        <w:t>Das Diagramm ist mit «Min. Stückpreis nach Jahr» beschriftet, gerechnet wird aber der mengengewichtete Durchschnitt. Der Titel stammt aus der Anfangsfassung, die nach Power BI das Minimum zeigte, und ist überholt. Auch Hinweise wie «Min(Netwr CHF/Stk)» in den Kennzahlen meinen heute den Durchschnitt.</w:t>
+        <w:t xml:space="preserve">Das Diagramm zeigt den </w:t>
+      </w:r>
+      <w:r>
+        <w:rPr>
+          <w:b/>
+        </w:rPr>
+        <w:t>mengengewichteten Durchschnitt</w:t>
+      </w:r>
+      <w:r>
+        <w:t xml:space="preserve"> je Jahr («Ø Stückpreis nach Jahr»), die Hotlist dagegen das </w:t>
+      </w:r>
+      <w:r>
+        <w:rPr>
+          <w:b/>
+        </w:rPr>
+        <w:t>Minimum</w:t>
+      </w:r>
+      <w:r>
+        <w:t xml:space="preserve"> je Artikel und Jahr wie in Power BI. Beide Zahlen sind also nicht direkt vergleichbar. Ein steigender Durchschnitt kann auch daher kommen, dass mehr teure Artikel bestellt wurden (Mix), nicht nur von Preiserhöhungen.</w:t>
       </w:r>
     </w:p>
     <w:p>
@@ -14381,7 +14399,7 @@
       <w:pPr>
         <w:pStyle w:val="berschrift2"/>
       </w:pPr>
-      <w:bookmarkStart w:id="44" w:name="_Toc242172958"/>
+      <w:bookmarkStart w:id="44" w:name="_Toc242173565"/>
       <w:r>
         <w:t>Ideen: Spend-Konzentration</w:t>
       </w:r>
@@ -14492,7 +14510,7 @@
       <w:pPr>
         <w:pStyle w:val="berschrift2"/>
       </w:pPr>
-      <w:bookmarkStart w:id="45" w:name="_Toc242172959"/>
+      <w:bookmarkStart w:id="45" w:name="_Toc242173566"/>
       <w:r>
         <w:t>Ideen: Datenqualität</w:t>
       </w:r>
@@ -14603,7 +14621,7 @@
       <w:pPr>
         <w:pStyle w:val="berschrift2"/>
       </w:pPr>
-      <w:bookmarkStart w:id="46" w:name="_Toc242172960"/>
+      <w:bookmarkStart w:id="46" w:name="_Toc242173567"/>
       <w:r>
         <w:t>Kennzahlen-Katalog</w:t>
       </w:r>
@@ -14691,7 +14709,7 @@
       <w:pPr>
         <w:pStyle w:val="berschrift2"/>
       </w:pPr>
-      <w:bookmarkStart w:id="47" w:name="_Toc242172961"/>
+      <w:bookmarkStart w:id="47" w:name="_Toc242173568"/>
       <w:r>
         <w:t>PBIX Vorlage</w:t>
       </w:r>
@@ -14779,7 +14797,7 @@
       <w:pPr>
         <w:pStyle w:val="berschrift2"/>
       </w:pPr>
-      <w:bookmarkStart w:id="48" w:name="_Toc242172962"/>
+      <w:bookmarkStart w:id="48" w:name="_Toc242173569"/>
       <w:r>
         <w:t>3D Simulation</w:t>
       </w:r>
@@ -14902,7 +14920,7 @@
       <w:pPr>
         <w:pStyle w:val="berschrift2"/>
       </w:pPr>
-      <w:bookmarkStart w:id="49" w:name="_Toc242172963"/>
+      <w:bookmarkStart w:id="49" w:name="_Toc242173570"/>
       <w:r>
         <w:t>Interaktiv</w:t>
       </w:r>
@@ -15210,7 +15228,7 @@
       <w:pPr>
         <w:pStyle w:val="berschrift2"/>
       </w:pPr>
-      <w:bookmarkStart w:id="50" w:name="_Toc242172964"/>
+      <w:bookmarkStart w:id="50" w:name="_Toc242173571"/>
       <w:r>
         <w:t>Datenquellen</w:t>
       </w:r>
@@ -15310,7 +15328,7 @@
       <w:pPr>
         <w:pStyle w:val="berschrift2"/>
       </w:pPr>
-      <w:bookmarkStart w:id="51" w:name="_Toc242172965"/>
+      <w:bookmarkStart w:id="51" w:name="_Toc242173572"/>
       <w:r>
         <w:t>Kennzahlen-Glossar</w:t>
       </w:r>
@@ -16014,7 +16032,7 @@
       <w:pPr>
         <w:pStyle w:val="berschrift1"/>
       </w:pPr>
-      <w:bookmarkStart w:id="52" w:name="_Toc242172966"/>
+      <w:bookmarkStart w:id="52" w:name="_Toc242173573"/>
       <w:r>
         <w:t>Verkauf</w:t>
       </w:r>
@@ -16067,7 +16085,7 @@
       <w:pPr>
         <w:pStyle w:val="berschrift2"/>
       </w:pPr>
-      <w:bookmarkStart w:id="53" w:name="_Toc242172967"/>
+      <w:bookmarkStart w:id="53" w:name="_Toc242173574"/>
       <w:r>
         <w:t>Kunden</w:t>
       </w:r>
@@ -16178,7 +16196,7 @@
       <w:pPr>
         <w:pStyle w:val="berschrift2"/>
       </w:pPr>
-      <w:bookmarkStart w:id="54" w:name="_Toc242172968"/>
+      <w:bookmarkStart w:id="54" w:name="_Toc242173575"/>
       <w:r>
         <w:t>Rückgang</w:t>
       </w:r>
@@ -16284,7 +16302,7 @@
       <w:pPr>
         <w:pStyle w:val="berschrift2"/>
       </w:pPr>
-      <w:bookmarkStart w:id="55" w:name="_Toc242172969"/>
+      <w:bookmarkStart w:id="55" w:name="_Toc242173576"/>
       <w:r>
         <w:t>Neue und verlorene Kunden</w:t>
       </w:r>
@@ -16390,7 +16408,7 @@
       <w:pPr>
         <w:pStyle w:val="berschrift2"/>
       </w:pPr>
-      <w:bookmarkStart w:id="56" w:name="_Toc242172970"/>
+      <w:bookmarkStart w:id="56" w:name="_Toc242173577"/>
       <w:r>
         <w:t>Konzentration</w:t>
       </w:r>
@@ -16496,7 +16514,7 @@
       <w:pPr>
         <w:pStyle w:val="berschrift2"/>
       </w:pPr>
-      <w:bookmarkStart w:id="57" w:name="_Toc242172971"/>
+      <w:bookmarkStart w:id="57" w:name="_Toc242173578"/>
       <w:r>
         <w:t>Cross-Selling</w:t>
       </w:r>
@@ -16591,7 +16609,7 @@
       <w:pPr>
         <w:pStyle w:val="berschrift2"/>
       </w:pPr>
-      <w:bookmarkStart w:id="58" w:name="_Toc242172972"/>
+      <w:bookmarkStart w:id="58" w:name="_Toc242173579"/>
       <w:r>
         <w:t>Preisstreuung</w:t>
       </w:r>
@@ -16697,7 +16715,7 @@
       <w:pPr>
         <w:pStyle w:val="berschrift2"/>
       </w:pPr>
-      <w:bookmarkStart w:id="59" w:name="_Toc242172973"/>
+      <w:bookmarkStart w:id="59" w:name="_Toc242173580"/>
       <w:r>
         <w:t>Saison und Prognose</w:t>
       </w:r>
@@ -16803,7 +16821,7 @@
       <w:pPr>
         <w:pStyle w:val="berschrift2"/>
       </w:pPr>
-      <w:bookmarkStart w:id="60" w:name="_Toc242172974"/>
+      <w:bookmarkStart w:id="60" w:name="_Toc242173581"/>
       <w:r>
         <w:t>Weltkarte</w:t>
       </w:r>
@@ -16906,7 +16924,7 @@
       <w:pPr>
         <w:pStyle w:val="berschrift2"/>
       </w:pPr>
-      <w:bookmarkStart w:id="61" w:name="_Toc242172975"/>
+      <w:bookmarkStart w:id="61" w:name="_Toc242173582"/>
       <w:r>
         <w:t>Interaktiv</w:t>
       </w:r>
@@ -16998,7 +17016,7 @@
       <w:pPr>
         <w:pStyle w:val="berschrift2"/>
       </w:pPr>
-      <w:bookmarkStart w:id="62" w:name="_Toc242172976"/>
+      <w:bookmarkStart w:id="62" w:name="_Toc242173583"/>
       <w:r>
         <w:t>Kunden-Galaxie</w:t>
       </w:r>
@@ -17090,7 +17108,7 @@
       <w:pPr>
         <w:pStyle w:val="berschrift2"/>
       </w:pPr>
-      <w:bookmarkStart w:id="63" w:name="_Toc242172977"/>
+      <w:bookmarkStart w:id="63" w:name="_Toc242173584"/>
       <w:r>
         <w:t>Rennen</w:t>
       </w:r>
@@ -17182,7 +17200,7 @@
       <w:pPr>
         <w:pStyle w:val="berschrift2"/>
       </w:pPr>
-      <w:bookmarkStart w:id="64" w:name="_Toc242172978"/>
+      <w:bookmarkStart w:id="64" w:name="_Toc242173585"/>
       <w:r>
         <w:t>Umsatzfluss</w:t>
       </w:r>
@@ -17274,7 +17292,7 @@
       <w:pPr>
         <w:pStyle w:val="berschrift2"/>
       </w:pPr>
-      <w:bookmarkStart w:id="65" w:name="_Toc242172979"/>
+      <w:bookmarkStart w:id="65" w:name="_Toc242173586"/>
       <w:r>
         <w:t>Sonnenstrahl</w:t>
       </w:r>
@@ -17366,7 +17384,7 @@
       <w:pPr>
         <w:pStyle w:val="berschrift2"/>
       </w:pPr>
-      <w:bookmarkStart w:id="66" w:name="_Toc242172980"/>
+      <w:bookmarkStart w:id="66" w:name="_Toc242173587"/>
       <w:r>
         <w:t>Was wäre wenn</w:t>
       </w:r>
@@ -17475,7 +17493,7 @@
       <w:pPr>
         <w:pStyle w:val="berschrift2"/>
       </w:pPr>
-      <w:bookmarkStart w:id="67" w:name="_Toc242172981"/>
+      <w:bookmarkStart w:id="67" w:name="_Toc242173588"/>
       <w:r>
         <w:t>Bestellrhythmus</w:t>
       </w:r>
@@ -17570,7 +17588,7 @@
       <w:pPr>
         <w:pStyle w:val="berschrift2"/>
       </w:pPr>
-      <w:bookmarkStart w:id="68" w:name="_Toc242172982"/>
+      <w:bookmarkStart w:id="68" w:name="_Toc242173589"/>
       <w:r>
         <w:t>Kalender</w:t>
       </w:r>
@@ -17662,7 +17680,7 @@
       <w:pPr>
         <w:pStyle w:val="berschrift2"/>
       </w:pPr>
-      <w:bookmarkStart w:id="69" w:name="_Toc242172983"/>
+      <w:bookmarkStart w:id="69" w:name="_Toc242173590"/>
       <w:r>
         <w:t>Artikel-Netzwerk</w:t>
       </w:r>
@@ -17757,7 +17775,7 @@
       <w:pPr>
         <w:pStyle w:val="berschrift2"/>
       </w:pPr>
-      <w:bookmarkStart w:id="70" w:name="_Toc242172984"/>
+      <w:bookmarkStart w:id="70" w:name="_Toc242173591"/>
       <w:r>
         <w:t>3D-Landschaft</w:t>
       </w:r>
@@ -17849,7 +17867,7 @@
       <w:pPr>
         <w:pStyle w:val="berschrift2"/>
       </w:pPr>
-      <w:bookmarkStart w:id="71" w:name="_Toc242172985"/>
+      <w:bookmarkStart w:id="71" w:name="_Toc242173592"/>
       <w:r>
         <w:t>Kennzahlen-Glossar</w:t>
       </w:r>
@@ -18676,7 +18694,7 @@
       <w:pPr>
         <w:pStyle w:val="berschrift1"/>
       </w:pPr>
-      <w:bookmarkStart w:id="72" w:name="_Toc242172986"/>
+      <w:bookmarkStart w:id="72" w:name="_Toc242173593"/>
       <w:r>
         <w:t>Logistik</w:t>
       </w:r>
@@ -18696,7 +18714,7 @@
       <w:pPr>
         <w:pStyle w:val="berschrift2"/>
       </w:pPr>
-      <w:bookmarkStart w:id="73" w:name="_Toc242172987"/>
+      <w:bookmarkStart w:id="73" w:name="_Toc242173594"/>
       <w:r>
         <w:t>Stücklistenanalyse</w:t>
       </w:r>
@@ -18813,7 +18831,7 @@
       <w:pPr>
         <w:pStyle w:val="berschrift2"/>
       </w:pPr>
-      <w:bookmarkStart w:id="74" w:name="_Toc242172988"/>
+      <w:bookmarkStart w:id="74" w:name="_Toc242173595"/>
       <w:r>
         <w:t>Materialdisposition &amp; Fehlteile</w:t>
       </w:r>
@@ -18965,7 +18983,7 @@
       <w:pPr>
         <w:pStyle w:val="berschrift2"/>
       </w:pPr>
-      <w:bookmarkStart w:id="75" w:name="_Toc242172989"/>
+      <w:bookmarkStart w:id="75" w:name="_Toc242173596"/>
       <w:r>
         <w:t>Logistik live</w:t>
       </w:r>
@@ -19073,7 +19091,7 @@
       <w:pPr>
         <w:pStyle w:val="berschrift2"/>
       </w:pPr>
-      <w:bookmarkStart w:id="76" w:name="_Toc242172990"/>
+      <w:bookmarkStart w:id="76" w:name="_Toc242173597"/>
       <w:r>
         <w:t>Original- und Live-Übersicht</w:t>
       </w:r>
@@ -19166,7 +19184,7 @@
       <w:pPr>
         <w:pStyle w:val="berschrift2"/>
       </w:pPr>
-      <w:bookmarkStart w:id="77" w:name="_Toc242172991"/>
+      <w:bookmarkStart w:id="77" w:name="_Toc242173598"/>
       <w:r>
         <w:t>3D-Lager</w:t>
       </w:r>
@@ -19259,7 +19277,7 @@
       <w:pPr>
         <w:pStyle w:val="berschrift2"/>
       </w:pPr>
-      <w:bookmarkStart w:id="78" w:name="_Toc242172992"/>
+      <w:bookmarkStart w:id="78" w:name="_Toc242173599"/>
       <w:r>
         <w:t>Produktivität</w:t>
       </w:r>
@@ -19355,7 +19373,7 @@
       <w:pPr>
         <w:pStyle w:val="berschrift2"/>
       </w:pPr>
-      <w:bookmarkStart w:id="79" w:name="_Toc242172993"/>
+      <w:bookmarkStart w:id="79" w:name="_Toc242173600"/>
       <w:r>
         <w:t>Leistung je Person (nur nach Anmeldung)</w:t>
       </w:r>
@@ -19445,7 +19463,7 @@
       <w:pPr>
         <w:pStyle w:val="berschrift2"/>
       </w:pPr>
-      <w:bookmarkStart w:id="80" w:name="_Toc242172994"/>
+      <w:bookmarkStart w:id="80" w:name="_Toc242173601"/>
       <w:r>
         <w:t>Kapazität</w:t>
       </w:r>
@@ -19594,7 +19612,7 @@
       <w:pPr>
         <w:pStyle w:val="berschrift2"/>
       </w:pPr>
-      <w:bookmarkStart w:id="81" w:name="_Toc242172995"/>
+      <w:bookmarkStart w:id="81" w:name="_Toc242173602"/>
       <w:r>
         <w:t>Verwendung &amp; Risiko</w:t>
       </w:r>
@@ -19701,7 +19719,7 @@
       <w:pPr>
         <w:pStyle w:val="berschrift2"/>
       </w:pPr>
-      <w:bookmarkStart w:id="82" w:name="_Toc242172996"/>
+      <w:bookmarkStart w:id="82" w:name="_Toc242173603"/>
       <w:r>
         <w:t>Dispositionsprüfung</w:t>
       </w:r>
@@ -19872,7 +19890,7 @@
       <w:pPr>
         <w:pStyle w:val="berschrift2"/>
       </w:pPr>
-      <w:bookmarkStart w:id="83" w:name="_Toc242172997"/>
+      <w:bookmarkStart w:id="83" w:name="_Toc242173604"/>
       <w:r>
         <w:t>Kennzahlen-Glossar</w:t>
       </w:r>
@@ -20617,7 +20635,7 @@
       <w:pPr>
         <w:pStyle w:val="berschrift1"/>
       </w:pPr>
-      <w:bookmarkStart w:id="84" w:name="_Toc242172998"/>
+      <w:bookmarkStart w:id="84" w:name="_Toc242173605"/>
       <w:r>
         <w:t>HR</w:t>
       </w:r>
@@ -20640,7 +20658,7 @@
       <w:pPr>
         <w:pStyle w:val="berschrift2"/>
       </w:pPr>
-      <w:bookmarkStart w:id="85" w:name="_Toc242172999"/>
+      <w:bookmarkStart w:id="85" w:name="_Toc242173606"/>
       <w:r>
         <w:t>HR Dashboard</w:t>
       </w:r>
@@ -20835,7 +20853,7 @@
       <w:pPr>
         <w:pStyle w:val="berschrift2"/>
       </w:pPr>
-      <w:bookmarkStart w:id="86" w:name="_Toc242173000"/>
+      <w:bookmarkStart w:id="86" w:name="_Toc242173607"/>
       <w:r>
         <w:t>Überblick</w:t>
       </w:r>
@@ -20925,7 +20943,7 @@
       <w:pPr>
         <w:pStyle w:val="berschrift2"/>
       </w:pPr>
-      <w:bookmarkStart w:id="87" w:name="_Toc242173001"/>
+      <w:bookmarkStart w:id="87" w:name="_Toc242173608"/>
       <w:r>
         <w:t>Fluktuation</w:t>
       </w:r>
@@ -21114,7 +21132,7 @@
       <w:pPr>
         <w:pStyle w:val="berschrift2"/>
       </w:pPr>
-      <w:bookmarkStart w:id="88" w:name="_Toc242173002"/>
+      <w:bookmarkStart w:id="88" w:name="_Toc242173609"/>
       <w:r>
         <w:t>Ampel</w:t>
       </w:r>
@@ -21207,7 +21225,7 @@
       <w:pPr>
         <w:pStyle w:val="berschrift2"/>
       </w:pPr>
-      <w:bookmarkStart w:id="89" w:name="_Toc242173003"/>
+      <w:bookmarkStart w:id="89" w:name="_Toc242173610"/>
       <w:r>
         <w:t>Absenzen</w:t>
       </w:r>
@@ -21319,7 +21337,7 @@
       <w:pPr>
         <w:pStyle w:val="berschrift2"/>
       </w:pPr>
-      <w:bookmarkStart w:id="90" w:name="_Toc242173004"/>
+      <w:bookmarkStart w:id="90" w:name="_Toc242173611"/>
       <w:r>
         <w:t>Zeit / Ferien</w:t>
       </w:r>
@@ -21418,7 +21436,7 @@
       <w:pPr>
         <w:pStyle w:val="berschrift2"/>
       </w:pPr>
-      <w:bookmarkStart w:id="91" w:name="_Toc242173005"/>
+      <w:bookmarkStart w:id="91" w:name="_Toc242173612"/>
       <w:r>
         <w:t>Mitarbeitende</w:t>
       </w:r>
@@ -21508,7 +21526,7 @@
       <w:pPr>
         <w:pStyle w:val="berschrift2"/>
       </w:pPr>
-      <w:bookmarkStart w:id="92" w:name="_Toc242173006"/>
+      <w:bookmarkStart w:id="92" w:name="_Toc242173613"/>
       <w:r>
         <w:t>Datenstatus</w:t>
       </w:r>
@@ -21598,7 +21616,7 @@
       <w:pPr>
         <w:pStyle w:val="berschrift2"/>
       </w:pPr>
-      <w:bookmarkStart w:id="93" w:name="_Toc242173007"/>
+      <w:bookmarkStart w:id="93" w:name="_Toc242173614"/>
       <w:r>
         <w:t>Anleitung</w:t>
       </w:r>
@@ -21691,7 +21709,7 @@
       <w:pPr>
         <w:pStyle w:val="berschrift2"/>
       </w:pPr>
-      <w:bookmarkStart w:id="94" w:name="_Toc242173008"/>
+      <w:bookmarkStart w:id="94" w:name="_Toc242173615"/>
       <w:r>
         <w:t>HR KPI Schulung</w:t>
       </w:r>
@@ -21796,7 +21814,7 @@
       <w:pPr>
         <w:pStyle w:val="berschrift2"/>
       </w:pPr>
-      <w:bookmarkStart w:id="95" w:name="_Toc242173009"/>
+      <w:bookmarkStart w:id="95" w:name="_Toc242173616"/>
       <w:r>
         <w:t>Kennzahlen-Glossar</w:t>
       </w:r>
@@ -22582,7 +22600,7 @@
       <w:pPr>
         <w:pStyle w:val="berschrift1"/>
       </w:pPr>
-      <w:bookmarkStart w:id="96" w:name="_Toc242173010"/>
+      <w:bookmarkStart w:id="96" w:name="_Toc242173617"/>
       <w:r>
         <w:t>Weltlage</w:t>
       </w:r>
@@ -22625,7 +22643,7 @@
       <w:pPr>
         <w:pStyle w:val="berschrift2"/>
       </w:pPr>
-      <w:bookmarkStart w:id="97" w:name="_Toc242173011"/>
+      <w:bookmarkStart w:id="97" w:name="_Toc242173618"/>
       <w:r>
         <w:t>Radar</w:t>
       </w:r>
@@ -22788,7 +22806,7 @@
     </w:p>
     <w:p>
       <w:r>
-        <w:t>Die Zahl je Abteilung fasst die Punkte der Themen der Abteilung zusammen: Je Thema (Land, Rohstoff, Währung) werden die Wirkungen summiert, anschliessend wird über die Themen der Abteilung gemittelt. So entsteht ein Wert zwischen minus 100 und plus 100. Hinweis: Die Beschriftung auf der Seite spricht von „Summe der Punkte“; die Rechnung im Programm mittelt über die Themen. Dieser Widerspruch ist im Handbuch nicht geklärt.</w:t>
+        <w:t>Die Zahl je Abteilung fasst die Punkte der Themen der Abteilung zusammen: Je Thema (Land, Rohstoff, Währung) werden die Wirkungen summiert, anschliessend wird über die Themen der Abteilung gemittelt. So entsteht ein Wert zwischen minus 100 und plus 100.</w:t>
       </w:r>
     </w:p>
     <w:p>
@@ -22943,7 +22961,7 @@
       <w:pPr>
         <w:pStyle w:val="berschrift2"/>
       </w:pPr>
-      <w:bookmarkStart w:id="98" w:name="_Toc242173012"/>
+      <w:bookmarkStart w:id="98" w:name="_Toc242173619"/>
       <w:r>
         <w:t>Länder</w:t>
       </w:r>
@@ -23070,7 +23088,7 @@
       <w:pPr>
         <w:pStyle w:val="berschrift2"/>
       </w:pPr>
-      <w:bookmarkStart w:id="99" w:name="_Toc242173013"/>
+      <w:bookmarkStart w:id="99" w:name="_Toc242173620"/>
       <w:r>
         <w:t>Rohstoffe und Währungen</w:t>
       </w:r>
@@ -23330,7 +23348,7 @@
       <w:pPr>
         <w:pStyle w:val="berschrift2"/>
       </w:pPr>
-      <w:bookmarkStart w:id="100" w:name="_Toc242173014"/>
+      <w:bookmarkStart w:id="100" w:name="_Toc242173621"/>
       <w:r>
         <w:t>Ereignisse</w:t>
       </w:r>
@@ -23454,7 +23472,7 @@
       <w:pPr>
         <w:pStyle w:val="berschrift2"/>
       </w:pPr>
-      <w:bookmarkStart w:id="101" w:name="_Toc242173015"/>
+      <w:bookmarkStart w:id="101" w:name="_Toc242173622"/>
       <w:r>
         <w:t>Kennzahlen-Glossar</w:t>
       </w:r>
@@ -23994,7 +24012,7 @@
       <w:pPr>
         <w:pStyle w:val="berschrift1"/>
       </w:pPr>
-      <w:bookmarkStart w:id="102" w:name="_Toc242173016"/>
+      <w:bookmarkStart w:id="102" w:name="_Toc242173623"/>
       <w:r>
         <w:t>Netzwerk und IT-Infrastruktur</w:t>
       </w:r>
@@ -24031,7 +24049,7 @@
       <w:pPr>
         <w:pStyle w:val="berschrift2"/>
       </w:pPr>
-      <w:bookmarkStart w:id="103" w:name="_Toc242173017"/>
+      <w:bookmarkStart w:id="103" w:name="_Toc242173624"/>
       <w:r>
         <w:t>Übersicht</w:t>
       </w:r>
@@ -24140,7 +24158,7 @@
       <w:pPr>
         <w:pStyle w:val="berschrift2"/>
       </w:pPr>
-      <w:bookmarkStart w:id="104" w:name="_Toc242173018"/>
+      <w:bookmarkStart w:id="104" w:name="_Toc242173625"/>
       <w:r>
         <w:t>Verfügbarkeit</w:t>
       </w:r>
@@ -24264,7 +24282,7 @@
       <w:pPr>
         <w:pStyle w:val="berschrift2"/>
       </w:pPr>
-      <w:bookmarkStart w:id="105" w:name="_Toc242173019"/>
+      <w:bookmarkStart w:id="105" w:name="_Toc242173626"/>
       <w:r>
         <w:t>Netz oder Daten</w:t>
       </w:r>
@@ -24388,7 +24406,7 @@
       <w:pPr>
         <w:pStyle w:val="berschrift2"/>
       </w:pPr>
-      <w:bookmarkStart w:id="106" w:name="_Toc242173020"/>
+      <w:bookmarkStart w:id="106" w:name="_Toc242173627"/>
       <w:r>
         <w:t>Sicherheit</w:t>
       </w:r>
@@ -24494,7 +24512,7 @@
       <w:pPr>
         <w:pStyle w:val="berschrift2"/>
       </w:pPr>
-      <w:bookmarkStart w:id="107" w:name="_Toc242173021"/>
+      <w:bookmarkStart w:id="107" w:name="_Toc242173628"/>
       <w:r>
         <w:t>Active Directory</w:t>
       </w:r>
@@ -24603,7 +24621,7 @@
       <w:pPr>
         <w:pStyle w:val="berschrift2"/>
       </w:pPr>
-      <w:bookmarkStart w:id="108" w:name="_Toc242173022"/>
+      <w:bookmarkStart w:id="108" w:name="_Toc242173629"/>
       <w:r>
         <w:t>AD-Infrastruktur</w:t>
       </w:r>
@@ -24683,7 +24701,7 @@
       <w:pPr>
         <w:pStyle w:val="berschrift2"/>
       </w:pPr>
-      <w:bookmarkStart w:id="109" w:name="_Toc242173023"/>
+      <w:bookmarkStart w:id="109" w:name="_Toc242173630"/>
       <w:r>
         <w:t>Gruppenrichtlinien</w:t>
       </w:r>
@@ -24763,7 +24781,7 @@
       <w:pPr>
         <w:pStyle w:val="berschrift2"/>
       </w:pPr>
-      <w:bookmarkStart w:id="110" w:name="_Toc242173024"/>
+      <w:bookmarkStart w:id="110" w:name="_Toc242173631"/>
       <w:r>
         <w:t>DNS</w:t>
       </w:r>
@@ -24825,7 +24843,7 @@
       <w:pPr>
         <w:pStyle w:val="berschrift2"/>
       </w:pPr>
-      <w:bookmarkStart w:id="111" w:name="_Toc242173025"/>
+      <w:bookmarkStart w:id="111" w:name="_Toc242173632"/>
       <w:r>
         <w:t>Verlauf</w:t>
       </w:r>
@@ -24918,7 +24936,7 @@
       <w:pPr>
         <w:pStyle w:val="berschrift2"/>
       </w:pPr>
-      <w:bookmarkStart w:id="112" w:name="_Toc242173026"/>
+      <w:bookmarkStart w:id="112" w:name="_Toc242173633"/>
       <w:r>
         <w:t>Migration</w:t>
       </w:r>
@@ -25091,7 +25109,7 @@
       <w:pPr>
         <w:pStyle w:val="berschrift2"/>
       </w:pPr>
-      <w:bookmarkStart w:id="113" w:name="_Toc242173027"/>
+      <w:bookmarkStart w:id="113" w:name="_Toc242173634"/>
       <w:r>
         <w:t>Bericht</w:t>
       </w:r>
@@ -25200,7 +25218,7 @@
       <w:pPr>
         <w:pStyle w:val="berschrift2"/>
       </w:pPr>
-      <w:bookmarkStart w:id="114" w:name="_Toc242173028"/>
+      <w:bookmarkStart w:id="114" w:name="_Toc242173635"/>
       <w:r>
         <w:t>Arbeitsplätze</w:t>
       </w:r>
@@ -25306,7 +25324,7 @@
       <w:pPr>
         <w:pStyle w:val="berschrift2"/>
       </w:pPr>
-      <w:bookmarkStart w:id="115" w:name="_Toc242173029"/>
+      <w:bookmarkStart w:id="115" w:name="_Toc242173636"/>
       <w:r>
         <w:t>Kennzahlen-Glossar</w:t>
       </w:r>
@@ -25887,7 +25905,7 @@
       <w:pPr>
         <w:pStyle w:val="berschrift1"/>
       </w:pPr>
-      <w:bookmarkStart w:id="116" w:name="_Toc242173030"/>
+      <w:bookmarkStart w:id="116" w:name="_Toc242173637"/>
       <w:r>
         <w:t>Projekte</w:t>
       </w:r>
@@ -25905,7 +25923,7 @@
       <w:pPr>
         <w:pStyle w:val="berschrift2"/>
       </w:pPr>
-      <w:bookmarkStart w:id="117" w:name="_Toc242173031"/>
+      <w:bookmarkStart w:id="117" w:name="_Toc242173638"/>
       <w:r>
         <w:t>Projekte</w:t>
       </w:r>
@@ -26099,7 +26117,7 @@
       <w:pPr>
         <w:pStyle w:val="berschrift2"/>
       </w:pPr>
-      <w:bookmarkStart w:id="118" w:name="_Toc242173032"/>
+      <w:bookmarkStart w:id="118" w:name="_Toc242173639"/>
       <w:r>
         <w:t>Kennzahlen-Glossar</w:t>
       </w:r>
@@ -26514,7 +26532,7 @@
         <w:noProof/>
       </w:rPr>
       <w:drawing>
-        <wp:inline distT="0" distB="0" distL="0" distR="0" wp14:anchorId="161BE750" wp14:editId="47859D43">
+        <wp:inline distT="0" distB="0" distL="0" distR="0" wp14:anchorId="6E0427D8" wp14:editId="30797C09">
           <wp:extent cx="720000" cy="349200"/>
           <wp:effectExtent l="0" t="0" r="0" b="0"/>
           <wp:docPr id="10" name="Trafag Logo Kopf"/>
@@ -26564,9 +26582,9 @@
 <file path=word/numbering.xml><?xml version="1.0" encoding="utf-8"?>
 <w:numbering xmlns:wpc="http://schemas.microsoft.com/office/word/2010/wordprocessingCanvas" xmlns:cx="http://schemas.microsoft.com/office/drawing/2014/chartex" xmlns:cx1="http://schemas.microsoft.com/office/drawing/2015/9/8/chartex" xmlns:cx2="http://schemas.microsoft.com/office/drawing/2015/10/21/chartex" xmlns:cx3="http://schemas.microsoft.com/office/drawing/2016/5/9/chartex" xmlns:cx4="http://schemas.microsoft.com/office/drawing/2016/5/10/chartex" xmlns:cx5="http://schemas.microsoft.com/office/drawing/2016/5/11/chartex" xmlns:cx6="http://schemas.microsoft.com/office/drawing/2016/5/12/chartex" xmlns:cx7="http://schemas.microsoft.com/office/drawing/2016/5/13/chartex" xmlns:cx8="http://schemas.microsoft.com/office/drawing/2016/5/14/chartex" xmlns:mc="http://schemas.openxmlformats.org/markup-compatibility/2006" xmlns:aink="http://schemas.microsoft.com/office/drawing/2016/ink" xmlns:am3d="http://schemas.microsoft.com/office/drawing/2017/model3d" xmlns:o="urn:schemas-microsoft-com:office:office" xmlns:oel="http://schemas.microsoft.com/office/2019/extlst" xmlns:r="http://schemas.openxmlformats.org/officeDocument/2006/relationships" xmlns:m="http://schemas.openxmlformats.org/officeDocument/2006/math" xmlns:v="urn:schemas-microsoft-com:vml" xmlns:wp14="http://schemas.microsoft.com/office/word/2010/wordprocessingDrawing" xmlns:wp="http://schemas.openxmlformats.org/drawingml/2006/wordprocessingDrawing" xmlns:w10="urn:schemas-microsoft-com:office:word" xmlns:w="http://schemas.openxmlformats.org/wordprocessingml/2006/main" xmlns:w14="http://schemas.microsoft.com/office/word/2010/wordml" xmlns:w15="http://schemas.microsoft.com/office/word/2012/wordml" xmlns:w16cex="http://schemas.microsoft.com/office/word/2018/wordml/cex" xmlns:w16cid="http://schemas.microsoft.com/office/word/2016/wordml/cid" xmlns:w16="http://schemas.microsoft.com/office/word/2018/wordml" xmlns:w16du="http://schemas.microsoft.com/office/word/2023/wordml/word16du" xmlns:w16sdtdh="http://schemas.microsoft.com/office/word/2020/wordml/sdtdatahash" xmlns:w16sdtfl="http://schemas.microsoft.com/office/word/2024/wordml/sdtformatlock" xmlns:w16se="http://schemas.microsoft.com/office/word/2015/wordml/symex" xmlns:wpg="http://schemas.microsoft.com/office/word/2010/wordprocessingGroup" xmlns:wpi="http://schemas.microsoft.com/office/word/2010/wordprocessingInk" xmlns:wne="http://schemas.microsoft.com/office/word/2006/wordml" xmlns:wps="http://schemas.microsoft.com/office/word/2010/wordprocessingShape" mc:Ignorable="w14 w15 w16se w16cid w16 w16cex w16sdtdh w16sdtfl w16du wp14">
   <w:abstractNum w:abstractNumId="0" w15:restartNumberingAfterBreak="0">
-    <w:nsid w:val="5F0E548D"/>
+    <w:nsid w:val="79DA6B40"/>
     <w:multiLevelType w:val="multilevel"/>
-    <w:tmpl w:val="DA9C4C80"/>
+    <w:tmpl w:val="75547D40"/>
     <w:lvl w:ilvl="0">
       <w:numFmt w:val="bullet"/>
       <w:lvlText w:val="•"/>
@@ -26620,7 +26638,7 @@
       <w:lvlJc w:val="left"/>
     </w:lvl>
   </w:abstractNum>
-  <w:num w:numId="1" w16cid:durableId="1556576909">
+  <w:num w:numId="1" w16cid:durableId="1987471567">
     <w:abstractNumId w:val="0"/>
   </w:num>
 </w:numbering>
@@ -27240,7 +27258,7 @@
     <w:autoRedefine/>
     <w:uiPriority w:val="39"/>
     <w:unhideWhenUsed/>
-    <w:rsid w:val="001B3B3A"/>
+    <w:rsid w:val="00D6584B"/>
     <w:pPr>
       <w:spacing w:after="100" w:line="278" w:lineRule="auto"/>
       <w:ind w:left="480"/>
@@ -27257,7 +27275,7 @@
     <w:autoRedefine/>
     <w:uiPriority w:val="39"/>
     <w:unhideWhenUsed/>
-    <w:rsid w:val="001B3B3A"/>
+    <w:rsid w:val="00D6584B"/>
     <w:pPr>
       <w:spacing w:after="100" w:line="278" w:lineRule="auto"/>
       <w:ind w:left="720"/>
@@ -27274,7 +27292,7 @@
     <w:autoRedefine/>
     <w:uiPriority w:val="39"/>
     <w:unhideWhenUsed/>
-    <w:rsid w:val="001B3B3A"/>
+    <w:rsid w:val="00D6584B"/>
     <w:pPr>
       <w:spacing w:after="100" w:line="278" w:lineRule="auto"/>
       <w:ind w:left="960"/>
@@ -27291,7 +27309,7 @@
     <w:autoRedefine/>
     <w:uiPriority w:val="39"/>
     <w:unhideWhenUsed/>
-    <w:rsid w:val="001B3B3A"/>
+    <w:rsid w:val="00D6584B"/>
     <w:pPr>
       <w:spacing w:after="100" w:line="278" w:lineRule="auto"/>
       <w:ind w:left="1200"/>
@@ -27308,7 +27326,7 @@
     <w:autoRedefine/>
     <w:uiPriority w:val="39"/>
     <w:unhideWhenUsed/>
-    <w:rsid w:val="001B3B3A"/>
+    <w:rsid w:val="00D6584B"/>
     <w:pPr>
       <w:spacing w:after="100" w:line="278" w:lineRule="auto"/>
       <w:ind w:left="1440"/>
@@ -27325,7 +27343,7 @@
     <w:autoRedefine/>
     <w:uiPriority w:val="39"/>
     <w:unhideWhenUsed/>
-    <w:rsid w:val="001B3B3A"/>
+    <w:rsid w:val="00D6584B"/>
     <w:pPr>
       <w:spacing w:after="100" w:line="278" w:lineRule="auto"/>
       <w:ind w:left="1680"/>
@@ -27342,7 +27360,7 @@
     <w:autoRedefine/>
     <w:uiPriority w:val="39"/>
     <w:unhideWhenUsed/>
-    <w:rsid w:val="001B3B3A"/>
+    <w:rsid w:val="00D6584B"/>
     <w:pPr>
       <w:spacing w:after="100" w:line="278" w:lineRule="auto"/>
       <w:ind w:left="1920"/>
@@ -27357,7 +27375,7 @@
     <w:basedOn w:val="Absatz-Standardschriftart"/>
     <w:uiPriority w:val="99"/>
     <w:unhideWhenUsed/>
-    <w:rsid w:val="001B3B3A"/>
+    <w:rsid w:val="00D6584B"/>
     <w:rPr>
       <w:color w:val="467886" w:themeColor="hyperlink"/>
       <w:u w:val="single"/>
@@ -27369,7 +27387,7 @@
     <w:uiPriority w:val="99"/>
     <w:semiHidden/>
     <w:unhideWhenUsed/>
-    <w:rsid w:val="001B3B3A"/>
+    <w:rsid w:val="00D6584B"/>
     <w:rPr>
       <w:color w:val="605E5C"/>
       <w:shd w:val="clear" w:color="auto" w:fill="E1DFDD"/>

</xml_diff>

<commit_message>
Weltlage moved under Finance Cockpit and behind the finance password; existing menus migrated; docs and manual updated
Co-Authored-By: Claude Opus 5.5 (1M context) <noreply@anthropic.com>
</commit_message>
<xml_diff>
--- a/TrafagSalesExporter/wwwroot/handbuch/Trafag_Cockpit_Handbuch.docx
+++ b/TrafagSalesExporter/wwwroot/handbuch/Trafag_Cockpit_Handbuch.docx
@@ -13,7 +13,7 @@
           <w:noProof/>
         </w:rPr>
         <w:drawing>
-          <wp:inline distT="0" distB="0" distL="0" distR="0" wp14:anchorId="61371D34" wp14:editId="1A684F4D">
+          <wp:inline distT="0" distB="0" distL="0" distR="0" wp14:anchorId="3D7C4853" wp14:editId="63EF6C85">
             <wp:extent cx="1655999" cy="803159"/>
             <wp:effectExtent l="0" t="0" r="0" b="0"/>
             <wp:docPr id="1" name="Trafag Logo"/>
@@ -129,7 +129,7 @@
       <w:r>
         <w:fldChar w:fldCharType="separate"/>
       </w:r>
-      <w:hyperlink w:anchor="_Toc242173521" w:history="1">
+      <w:hyperlink w:anchor="_Toc242189104" w:history="1">
         <w:r>
           <w:rPr>
             <w:rStyle w:val="Hyperlink"/>
@@ -156,7 +156,7 @@
             <w:noProof/>
             <w:webHidden/>
           </w:rPr>
-          <w:instrText xml:space="preserve"> PAGEREF _Toc242173521 \h </w:instrText>
+          <w:instrText xml:space="preserve"> PAGEREF _Toc242189104 \h </w:instrText>
         </w:r>
         <w:r>
           <w:rPr>
@@ -199,7 +199,7 @@
           <w:sz w:val="24"/>
         </w:rPr>
       </w:pPr>
-      <w:hyperlink w:anchor="_Toc242173522" w:history="1">
+      <w:hyperlink w:anchor="_Toc242189105" w:history="1">
         <w:r>
           <w:rPr>
             <w:rStyle w:val="Hyperlink"/>
@@ -226,7 +226,7 @@
             <w:noProof/>
             <w:webHidden/>
           </w:rPr>
-          <w:instrText xml:space="preserve"> PAGEREF _Toc242173522 \h </w:instrText>
+          <w:instrText xml:space="preserve"> PAGEREF _Toc242189105 \h </w:instrText>
         </w:r>
         <w:r>
           <w:rPr>
@@ -269,7 +269,7 @@
           <w:sz w:val="24"/>
         </w:rPr>
       </w:pPr>
-      <w:hyperlink w:anchor="_Toc242173523" w:history="1">
+      <w:hyperlink w:anchor="_Toc242189106" w:history="1">
         <w:r>
           <w:rPr>
             <w:rStyle w:val="Hyperlink"/>
@@ -296,7 +296,7 @@
             <w:noProof/>
             <w:webHidden/>
           </w:rPr>
-          <w:instrText xml:space="preserve"> PAGEREF _Toc242173523 \h </w:instrText>
+          <w:instrText xml:space="preserve"> PAGEREF _Toc242189106 \h </w:instrText>
         </w:r>
         <w:r>
           <w:rPr>
@@ -339,7 +339,7 @@
           <w:sz w:val="24"/>
         </w:rPr>
       </w:pPr>
-      <w:hyperlink w:anchor="_Toc242173524" w:history="1">
+      <w:hyperlink w:anchor="_Toc242189107" w:history="1">
         <w:r>
           <w:rPr>
             <w:rStyle w:val="Hyperlink"/>
@@ -366,7 +366,7 @@
             <w:noProof/>
             <w:webHidden/>
           </w:rPr>
-          <w:instrText xml:space="preserve"> PAGEREF _Toc242173524 \h </w:instrText>
+          <w:instrText xml:space="preserve"> PAGEREF _Toc242189107 \h </w:instrText>
         </w:r>
         <w:r>
           <w:rPr>
@@ -410,7 +410,7 @@
           <w:sz w:val="24"/>
         </w:rPr>
       </w:pPr>
-      <w:hyperlink w:anchor="_Toc242173525" w:history="1">
+      <w:hyperlink w:anchor="_Toc242189108" w:history="1">
         <w:r>
           <w:rPr>
             <w:rStyle w:val="Hyperlink"/>
@@ -437,7 +437,7 @@
             <w:noProof/>
             <w:webHidden/>
           </w:rPr>
-          <w:instrText xml:space="preserve"> PAGEREF _Toc242173525 \h </w:instrText>
+          <w:instrText xml:space="preserve"> PAGEREF _Toc242189108 \h </w:instrText>
         </w:r>
         <w:r>
           <w:rPr>
@@ -480,7 +480,7 @@
           <w:sz w:val="24"/>
         </w:rPr>
       </w:pPr>
-      <w:hyperlink w:anchor="_Toc242173526" w:history="1">
+      <w:hyperlink w:anchor="_Toc242189109" w:history="1">
         <w:r>
           <w:rPr>
             <w:rStyle w:val="Hyperlink"/>
@@ -507,7 +507,7 @@
             <w:noProof/>
             <w:webHidden/>
           </w:rPr>
-          <w:instrText xml:space="preserve"> PAGEREF _Toc242173526 \h </w:instrText>
+          <w:instrText xml:space="preserve"> PAGEREF _Toc242189109 \h </w:instrText>
         </w:r>
         <w:r>
           <w:rPr>
@@ -550,7 +550,7 @@
           <w:sz w:val="24"/>
         </w:rPr>
       </w:pPr>
-      <w:hyperlink w:anchor="_Toc242173527" w:history="1">
+      <w:hyperlink w:anchor="_Toc242189110" w:history="1">
         <w:r>
           <w:rPr>
             <w:rStyle w:val="Hyperlink"/>
@@ -577,7 +577,7 @@
             <w:noProof/>
             <w:webHidden/>
           </w:rPr>
-          <w:instrText xml:space="preserve"> PAGEREF _Toc242173527 \h </w:instrText>
+          <w:instrText xml:space="preserve"> PAGEREF _Toc242189110 \h </w:instrText>
         </w:r>
         <w:r>
           <w:rPr>
@@ -620,7 +620,7 @@
           <w:sz w:val="24"/>
         </w:rPr>
       </w:pPr>
-      <w:hyperlink w:anchor="_Toc242173528" w:history="1">
+      <w:hyperlink w:anchor="_Toc242189111" w:history="1">
         <w:r>
           <w:rPr>
             <w:rStyle w:val="Hyperlink"/>
@@ -647,7 +647,7 @@
             <w:noProof/>
             <w:webHidden/>
           </w:rPr>
-          <w:instrText xml:space="preserve"> PAGEREF _Toc242173528 \h </w:instrText>
+          <w:instrText xml:space="preserve"> PAGEREF _Toc242189111 \h </w:instrText>
         </w:r>
         <w:r>
           <w:rPr>
@@ -690,7 +690,7 @@
           <w:sz w:val="24"/>
         </w:rPr>
       </w:pPr>
-      <w:hyperlink w:anchor="_Toc242173529" w:history="1">
+      <w:hyperlink w:anchor="_Toc242189112" w:history="1">
         <w:r>
           <w:rPr>
             <w:rStyle w:val="Hyperlink"/>
@@ -717,7 +717,7 @@
             <w:noProof/>
             <w:webHidden/>
           </w:rPr>
-          <w:instrText xml:space="preserve"> PAGEREF _Toc242173529 \h </w:instrText>
+          <w:instrText xml:space="preserve"> PAGEREF _Toc242189112 \h </w:instrText>
         </w:r>
         <w:r>
           <w:rPr>
@@ -760,7 +760,7 @@
           <w:sz w:val="24"/>
         </w:rPr>
       </w:pPr>
-      <w:hyperlink w:anchor="_Toc242173530" w:history="1">
+      <w:hyperlink w:anchor="_Toc242189113" w:history="1">
         <w:r>
           <w:rPr>
             <w:rStyle w:val="Hyperlink"/>
@@ -787,7 +787,7 @@
             <w:noProof/>
             <w:webHidden/>
           </w:rPr>
-          <w:instrText xml:space="preserve"> PAGEREF _Toc242173530 \h </w:instrText>
+          <w:instrText xml:space="preserve"> PAGEREF _Toc242189113 \h </w:instrText>
         </w:r>
         <w:r>
           <w:rPr>
@@ -830,7 +830,7 @@
           <w:sz w:val="24"/>
         </w:rPr>
       </w:pPr>
-      <w:hyperlink w:anchor="_Toc242173531" w:history="1">
+      <w:hyperlink w:anchor="_Toc242189114" w:history="1">
         <w:r>
           <w:rPr>
             <w:rStyle w:val="Hyperlink"/>
@@ -857,7 +857,7 @@
             <w:noProof/>
             <w:webHidden/>
           </w:rPr>
-          <w:instrText xml:space="preserve"> PAGEREF _Toc242173531 \h </w:instrText>
+          <w:instrText xml:space="preserve"> PAGEREF _Toc242189114 \h </w:instrText>
         </w:r>
         <w:r>
           <w:rPr>
@@ -900,7 +900,7 @@
           <w:sz w:val="24"/>
         </w:rPr>
       </w:pPr>
-      <w:hyperlink w:anchor="_Toc242173532" w:history="1">
+      <w:hyperlink w:anchor="_Toc242189115" w:history="1">
         <w:r>
           <w:rPr>
             <w:rStyle w:val="Hyperlink"/>
@@ -927,7 +927,7 @@
             <w:noProof/>
             <w:webHidden/>
           </w:rPr>
-          <w:instrText xml:space="preserve"> PAGEREF _Toc242173532 \h </w:instrText>
+          <w:instrText xml:space="preserve"> PAGEREF _Toc242189115 \h </w:instrText>
         </w:r>
         <w:r>
           <w:rPr>
@@ -970,7 +970,7 @@
           <w:sz w:val="24"/>
         </w:rPr>
       </w:pPr>
-      <w:hyperlink w:anchor="_Toc242173533" w:history="1">
+      <w:hyperlink w:anchor="_Toc242189116" w:history="1">
         <w:r>
           <w:rPr>
             <w:rStyle w:val="Hyperlink"/>
@@ -997,7 +997,7 @@
             <w:noProof/>
             <w:webHidden/>
           </w:rPr>
-          <w:instrText xml:space="preserve"> PAGEREF _Toc242173533 \h </w:instrText>
+          <w:instrText xml:space="preserve"> PAGEREF _Toc242189116 \h </w:instrText>
         </w:r>
         <w:r>
           <w:rPr>
@@ -1040,7 +1040,7 @@
           <w:sz w:val="24"/>
         </w:rPr>
       </w:pPr>
-      <w:hyperlink w:anchor="_Toc242173534" w:history="1">
+      <w:hyperlink w:anchor="_Toc242189117" w:history="1">
         <w:r>
           <w:rPr>
             <w:rStyle w:val="Hyperlink"/>
@@ -1067,7 +1067,7 @@
             <w:noProof/>
             <w:webHidden/>
           </w:rPr>
-          <w:instrText xml:space="preserve"> PAGEREF _Toc242173534 \h </w:instrText>
+          <w:instrText xml:space="preserve"> PAGEREF _Toc242189117 \h </w:instrText>
         </w:r>
         <w:r>
           <w:rPr>
@@ -1110,7 +1110,7 @@
           <w:sz w:val="24"/>
         </w:rPr>
       </w:pPr>
-      <w:hyperlink w:anchor="_Toc242173535" w:history="1">
+      <w:hyperlink w:anchor="_Toc242189118" w:history="1">
         <w:r>
           <w:rPr>
             <w:rStyle w:val="Hyperlink"/>
@@ -1137,7 +1137,7 @@
             <w:noProof/>
             <w:webHidden/>
           </w:rPr>
-          <w:instrText xml:space="preserve"> PAGEREF _Toc242173535 \h </w:instrText>
+          <w:instrText xml:space="preserve"> PAGEREF _Toc242189118 \h </w:instrText>
         </w:r>
         <w:r>
           <w:rPr>
@@ -1180,7 +1180,7 @@
           <w:sz w:val="24"/>
         </w:rPr>
       </w:pPr>
-      <w:hyperlink w:anchor="_Toc242173536" w:history="1">
+      <w:hyperlink w:anchor="_Toc242189119" w:history="1">
         <w:r>
           <w:rPr>
             <w:rStyle w:val="Hyperlink"/>
@@ -1207,7 +1207,7 @@
             <w:noProof/>
             <w:webHidden/>
           </w:rPr>
-          <w:instrText xml:space="preserve"> PAGEREF _Toc242173536 \h </w:instrText>
+          <w:instrText xml:space="preserve"> PAGEREF _Toc242189119 \h </w:instrText>
         </w:r>
         <w:r>
           <w:rPr>
@@ -1250,7 +1250,7 @@
           <w:sz w:val="24"/>
         </w:rPr>
       </w:pPr>
-      <w:hyperlink w:anchor="_Toc242173537" w:history="1">
+      <w:hyperlink w:anchor="_Toc242189120" w:history="1">
         <w:r>
           <w:rPr>
             <w:rStyle w:val="Hyperlink"/>
@@ -1277,7 +1277,7 @@
             <w:noProof/>
             <w:webHidden/>
           </w:rPr>
-          <w:instrText xml:space="preserve"> PAGEREF _Toc242173537 \h </w:instrText>
+          <w:instrText xml:space="preserve"> PAGEREF _Toc242189120 \h </w:instrText>
         </w:r>
         <w:r>
           <w:rPr>
@@ -1320,7 +1320,7 @@
           <w:sz w:val="24"/>
         </w:rPr>
       </w:pPr>
-      <w:hyperlink w:anchor="_Toc242173538" w:history="1">
+      <w:hyperlink w:anchor="_Toc242189121" w:history="1">
         <w:r>
           <w:rPr>
             <w:rStyle w:val="Hyperlink"/>
@@ -1347,7 +1347,7 @@
             <w:noProof/>
             <w:webHidden/>
           </w:rPr>
-          <w:instrText xml:space="preserve"> PAGEREF _Toc242173538 \h </w:instrText>
+          <w:instrText xml:space="preserve"> PAGEREF _Toc242189121 \h </w:instrText>
         </w:r>
         <w:r>
           <w:rPr>
@@ -1390,7 +1390,7 @@
           <w:sz w:val="24"/>
         </w:rPr>
       </w:pPr>
-      <w:hyperlink w:anchor="_Toc242173539" w:history="1">
+      <w:hyperlink w:anchor="_Toc242189122" w:history="1">
         <w:r>
           <w:rPr>
             <w:rStyle w:val="Hyperlink"/>
@@ -1417,7 +1417,7 @@
             <w:noProof/>
             <w:webHidden/>
           </w:rPr>
-          <w:instrText xml:space="preserve"> PAGEREF _Toc242173539 \h </w:instrText>
+          <w:instrText xml:space="preserve"> PAGEREF _Toc242189122 \h </w:instrText>
         </w:r>
         <w:r>
           <w:rPr>
@@ -1460,7 +1460,7 @@
           <w:sz w:val="24"/>
         </w:rPr>
       </w:pPr>
-      <w:hyperlink w:anchor="_Toc242173540" w:history="1">
+      <w:hyperlink w:anchor="_Toc242189123" w:history="1">
         <w:r>
           <w:rPr>
             <w:rStyle w:val="Hyperlink"/>
@@ -1487,7 +1487,7 @@
             <w:noProof/>
             <w:webHidden/>
           </w:rPr>
-          <w:instrText xml:space="preserve"> PAGEREF _Toc242173540 \h </w:instrText>
+          <w:instrText xml:space="preserve"> PAGEREF _Toc242189123 \h </w:instrText>
         </w:r>
         <w:r>
           <w:rPr>
@@ -1530,7 +1530,7 @@
           <w:sz w:val="24"/>
         </w:rPr>
       </w:pPr>
-      <w:hyperlink w:anchor="_Toc242173541" w:history="1">
+      <w:hyperlink w:anchor="_Toc242189124" w:history="1">
         <w:r>
           <w:rPr>
             <w:rStyle w:val="Hyperlink"/>
@@ -1557,7 +1557,7 @@
             <w:noProof/>
             <w:webHidden/>
           </w:rPr>
-          <w:instrText xml:space="preserve"> PAGEREF _Toc242173541 \h </w:instrText>
+          <w:instrText xml:space="preserve"> PAGEREF _Toc242189124 \h </w:instrText>
         </w:r>
         <w:r>
           <w:rPr>
@@ -1600,7 +1600,7 @@
           <w:sz w:val="24"/>
         </w:rPr>
       </w:pPr>
-      <w:hyperlink w:anchor="_Toc242173542" w:history="1">
+      <w:hyperlink w:anchor="_Toc242189125" w:history="1">
         <w:r>
           <w:rPr>
             <w:rStyle w:val="Hyperlink"/>
@@ -1627,7 +1627,7 @@
             <w:noProof/>
             <w:webHidden/>
           </w:rPr>
-          <w:instrText xml:space="preserve"> PAGEREF _Toc242173542 \h </w:instrText>
+          <w:instrText xml:space="preserve"> PAGEREF _Toc242189125 \h </w:instrText>
         </w:r>
         <w:r>
           <w:rPr>
@@ -1670,7 +1670,7 @@
           <w:sz w:val="24"/>
         </w:rPr>
       </w:pPr>
-      <w:hyperlink w:anchor="_Toc242173543" w:history="1">
+      <w:hyperlink w:anchor="_Toc242189126" w:history="1">
         <w:r>
           <w:rPr>
             <w:rStyle w:val="Hyperlink"/>
@@ -1697,7 +1697,7 @@
             <w:noProof/>
             <w:webHidden/>
           </w:rPr>
-          <w:instrText xml:space="preserve"> PAGEREF _Toc242173543 \h </w:instrText>
+          <w:instrText xml:space="preserve"> PAGEREF _Toc242189126 \h </w:instrText>
         </w:r>
         <w:r>
           <w:rPr>
@@ -1740,7 +1740,7 @@
           <w:sz w:val="24"/>
         </w:rPr>
       </w:pPr>
-      <w:hyperlink w:anchor="_Toc242173544" w:history="1">
+      <w:hyperlink w:anchor="_Toc242189127" w:history="1">
         <w:r>
           <w:rPr>
             <w:rStyle w:val="Hyperlink"/>
@@ -1767,7 +1767,7 @@
             <w:noProof/>
             <w:webHidden/>
           </w:rPr>
-          <w:instrText xml:space="preserve"> PAGEREF _Toc242173544 \h </w:instrText>
+          <w:instrText xml:space="preserve"> PAGEREF _Toc242189127 \h </w:instrText>
         </w:r>
         <w:r>
           <w:rPr>
@@ -1810,7 +1810,7 @@
           <w:sz w:val="24"/>
         </w:rPr>
       </w:pPr>
-      <w:hyperlink w:anchor="_Toc242173545" w:history="1">
+      <w:hyperlink w:anchor="_Toc242189128" w:history="1">
         <w:r>
           <w:rPr>
             <w:rStyle w:val="Hyperlink"/>
@@ -1837,7 +1837,7 @@
             <w:noProof/>
             <w:webHidden/>
           </w:rPr>
-          <w:instrText xml:space="preserve"> PAGEREF _Toc242173545 \h </w:instrText>
+          <w:instrText xml:space="preserve"> PAGEREF _Toc242189128 \h </w:instrText>
         </w:r>
         <w:r>
           <w:rPr>
@@ -1880,7 +1880,7 @@
           <w:sz w:val="24"/>
         </w:rPr>
       </w:pPr>
-      <w:hyperlink w:anchor="_Toc242173546" w:history="1">
+      <w:hyperlink w:anchor="_Toc242189129" w:history="1">
         <w:r>
           <w:rPr>
             <w:rStyle w:val="Hyperlink"/>
@@ -1907,7 +1907,7 @@
             <w:noProof/>
             <w:webHidden/>
           </w:rPr>
-          <w:instrText xml:space="preserve"> PAGEREF _Toc242173546 \h </w:instrText>
+          <w:instrText xml:space="preserve"> PAGEREF _Toc242189129 \h </w:instrText>
         </w:r>
         <w:r>
           <w:rPr>
@@ -1950,7 +1950,7 @@
           <w:sz w:val="24"/>
         </w:rPr>
       </w:pPr>
-      <w:hyperlink w:anchor="_Toc242173547" w:history="1">
+      <w:hyperlink w:anchor="_Toc242189130" w:history="1">
         <w:r>
           <w:rPr>
             <w:rStyle w:val="Hyperlink"/>
@@ -1977,7 +1977,7 @@
             <w:noProof/>
             <w:webHidden/>
           </w:rPr>
-          <w:instrText xml:space="preserve"> PAGEREF _Toc242173547 \h </w:instrText>
+          <w:instrText xml:space="preserve"> PAGEREF _Toc242189130 \h </w:instrText>
         </w:r>
         <w:r>
           <w:rPr>
@@ -2020,7 +2020,7 @@
           <w:sz w:val="24"/>
         </w:rPr>
       </w:pPr>
-      <w:hyperlink w:anchor="_Toc242173548" w:history="1">
+      <w:hyperlink w:anchor="_Toc242189131" w:history="1">
         <w:r>
           <w:rPr>
             <w:rStyle w:val="Hyperlink"/>
@@ -2047,7 +2047,7 @@
             <w:noProof/>
             <w:webHidden/>
           </w:rPr>
-          <w:instrText xml:space="preserve"> PAGEREF _Toc242173548 \h </w:instrText>
+          <w:instrText xml:space="preserve"> PAGEREF _Toc242189131 \h </w:instrText>
         </w:r>
         <w:r>
           <w:rPr>
@@ -2090,7 +2090,7 @@
           <w:sz w:val="24"/>
         </w:rPr>
       </w:pPr>
-      <w:hyperlink w:anchor="_Toc242173549" w:history="1">
+      <w:hyperlink w:anchor="_Toc242189132" w:history="1">
         <w:r>
           <w:rPr>
             <w:rStyle w:val="Hyperlink"/>
@@ -2117,7 +2117,7 @@
             <w:noProof/>
             <w:webHidden/>
           </w:rPr>
-          <w:instrText xml:space="preserve"> PAGEREF _Toc242173549 \h </w:instrText>
+          <w:instrText xml:space="preserve"> PAGEREF _Toc242189132 \h </w:instrText>
         </w:r>
         <w:r>
           <w:rPr>
@@ -2160,7 +2160,7 @@
           <w:sz w:val="24"/>
         </w:rPr>
       </w:pPr>
-      <w:hyperlink w:anchor="_Toc242173550" w:history="1">
+      <w:hyperlink w:anchor="_Toc242189133" w:history="1">
         <w:r>
           <w:rPr>
             <w:rStyle w:val="Hyperlink"/>
@@ -2187,7 +2187,7 @@
             <w:noProof/>
             <w:webHidden/>
           </w:rPr>
-          <w:instrText xml:space="preserve"> PAGEREF _Toc242173550 \h </w:instrText>
+          <w:instrText xml:space="preserve"> PAGEREF _Toc242189133 \h </w:instrText>
         </w:r>
         <w:r>
           <w:rPr>
@@ -2231,7 +2231,7 @@
           <w:sz w:val="24"/>
         </w:rPr>
       </w:pPr>
-      <w:hyperlink w:anchor="_Toc242173551" w:history="1">
+      <w:hyperlink w:anchor="_Toc242189134" w:history="1">
         <w:r>
           <w:rPr>
             <w:rStyle w:val="Hyperlink"/>
@@ -2258,7 +2258,7 @@
             <w:noProof/>
             <w:webHidden/>
           </w:rPr>
-          <w:instrText xml:space="preserve"> PAGEREF _Toc242173551 \h </w:instrText>
+          <w:instrText xml:space="preserve"> PAGEREF _Toc242189134 \h </w:instrText>
         </w:r>
         <w:r>
           <w:rPr>
@@ -2301,7 +2301,7 @@
           <w:sz w:val="24"/>
         </w:rPr>
       </w:pPr>
-      <w:hyperlink w:anchor="_Toc242173552" w:history="1">
+      <w:hyperlink w:anchor="_Toc242189135" w:history="1">
         <w:r>
           <w:rPr>
             <w:rStyle w:val="Hyperlink"/>
@@ -2328,7 +2328,7 @@
             <w:noProof/>
             <w:webHidden/>
           </w:rPr>
-          <w:instrText xml:space="preserve"> PAGEREF _Toc242173552 \h </w:instrText>
+          <w:instrText xml:space="preserve"> PAGEREF _Toc242189135 \h </w:instrText>
         </w:r>
         <w:r>
           <w:rPr>
@@ -2371,7 +2371,7 @@
           <w:sz w:val="24"/>
         </w:rPr>
       </w:pPr>
-      <w:hyperlink w:anchor="_Toc242173553" w:history="1">
+      <w:hyperlink w:anchor="_Toc242189136" w:history="1">
         <w:r>
           <w:rPr>
             <w:rStyle w:val="Hyperlink"/>
@@ -2398,7 +2398,7 @@
             <w:noProof/>
             <w:webHidden/>
           </w:rPr>
-          <w:instrText xml:space="preserve"> PAGEREF _Toc242173553 \h </w:instrText>
+          <w:instrText xml:space="preserve"> PAGEREF _Toc242189136 \h </w:instrText>
         </w:r>
         <w:r>
           <w:rPr>
@@ -2441,7 +2441,7 @@
           <w:sz w:val="24"/>
         </w:rPr>
       </w:pPr>
-      <w:hyperlink w:anchor="_Toc242173554" w:history="1">
+      <w:hyperlink w:anchor="_Toc242189137" w:history="1">
         <w:r>
           <w:rPr>
             <w:rStyle w:val="Hyperlink"/>
@@ -2468,7 +2468,7 @@
             <w:noProof/>
             <w:webHidden/>
           </w:rPr>
-          <w:instrText xml:space="preserve"> PAGEREF _Toc242173554 \h </w:instrText>
+          <w:instrText xml:space="preserve"> PAGEREF _Toc242189137 \h </w:instrText>
         </w:r>
         <w:r>
           <w:rPr>
@@ -2511,7 +2511,7 @@
           <w:sz w:val="24"/>
         </w:rPr>
       </w:pPr>
-      <w:hyperlink w:anchor="_Toc242173555" w:history="1">
+      <w:hyperlink w:anchor="_Toc242189138" w:history="1">
         <w:r>
           <w:rPr>
             <w:rStyle w:val="Hyperlink"/>
@@ -2538,7 +2538,7 @@
             <w:noProof/>
             <w:webHidden/>
           </w:rPr>
-          <w:instrText xml:space="preserve"> PAGEREF _Toc242173555 \h </w:instrText>
+          <w:instrText xml:space="preserve"> PAGEREF _Toc242189138 \h </w:instrText>
         </w:r>
         <w:r>
           <w:rPr>
@@ -2581,7 +2581,7 @@
           <w:sz w:val="24"/>
         </w:rPr>
       </w:pPr>
-      <w:hyperlink w:anchor="_Toc242173556" w:history="1">
+      <w:hyperlink w:anchor="_Toc242189139" w:history="1">
         <w:r>
           <w:rPr>
             <w:rStyle w:val="Hyperlink"/>
@@ -2608,7 +2608,7 @@
             <w:noProof/>
             <w:webHidden/>
           </w:rPr>
-          <w:instrText xml:space="preserve"> PAGEREF _Toc242173556 \h </w:instrText>
+          <w:instrText xml:space="preserve"> PAGEREF _Toc242189139 \h </w:instrText>
         </w:r>
         <w:r>
           <w:rPr>
@@ -2651,7 +2651,7 @@
           <w:sz w:val="24"/>
         </w:rPr>
       </w:pPr>
-      <w:hyperlink w:anchor="_Toc242173557" w:history="1">
+      <w:hyperlink w:anchor="_Toc242189140" w:history="1">
         <w:r>
           <w:rPr>
             <w:rStyle w:val="Hyperlink"/>
@@ -2678,7 +2678,7 @@
             <w:noProof/>
             <w:webHidden/>
           </w:rPr>
-          <w:instrText xml:space="preserve"> PAGEREF _Toc242173557 \h </w:instrText>
+          <w:instrText xml:space="preserve"> PAGEREF _Toc242189140 \h </w:instrText>
         </w:r>
         <w:r>
           <w:rPr>
@@ -2721,7 +2721,7 @@
           <w:sz w:val="24"/>
         </w:rPr>
       </w:pPr>
-      <w:hyperlink w:anchor="_Toc242173558" w:history="1">
+      <w:hyperlink w:anchor="_Toc242189141" w:history="1">
         <w:r>
           <w:rPr>
             <w:rStyle w:val="Hyperlink"/>
@@ -2748,7 +2748,7 @@
             <w:noProof/>
             <w:webHidden/>
           </w:rPr>
-          <w:instrText xml:space="preserve"> PAGEREF _Toc242173558 \h </w:instrText>
+          <w:instrText xml:space="preserve"> PAGEREF _Toc242189141 \h </w:instrText>
         </w:r>
         <w:r>
           <w:rPr>
@@ -2791,7 +2791,7 @@
           <w:sz w:val="24"/>
         </w:rPr>
       </w:pPr>
-      <w:hyperlink w:anchor="_Toc242173559" w:history="1">
+      <w:hyperlink w:anchor="_Toc242189142" w:history="1">
         <w:r>
           <w:rPr>
             <w:rStyle w:val="Hyperlink"/>
@@ -2818,7 +2818,7 @@
             <w:noProof/>
             <w:webHidden/>
           </w:rPr>
-          <w:instrText xml:space="preserve"> PAGEREF _Toc242173559 \h </w:instrText>
+          <w:instrText xml:space="preserve"> PAGEREF _Toc242189142 \h </w:instrText>
         </w:r>
         <w:r>
           <w:rPr>
@@ -2861,7 +2861,7 @@
           <w:sz w:val="24"/>
         </w:rPr>
       </w:pPr>
-      <w:hyperlink w:anchor="_Toc242173560" w:history="1">
+      <w:hyperlink w:anchor="_Toc242189143" w:history="1">
         <w:r>
           <w:rPr>
             <w:rStyle w:val="Hyperlink"/>
@@ -2888,7 +2888,7 @@
             <w:noProof/>
             <w:webHidden/>
           </w:rPr>
-          <w:instrText xml:space="preserve"> PAGEREF _Toc242173560 \h </w:instrText>
+          <w:instrText xml:space="preserve"> PAGEREF _Toc242189143 \h </w:instrText>
         </w:r>
         <w:r>
           <w:rPr>
@@ -2931,7 +2931,7 @@
           <w:sz w:val="24"/>
         </w:rPr>
       </w:pPr>
-      <w:hyperlink w:anchor="_Toc242173561" w:history="1">
+      <w:hyperlink w:anchor="_Toc242189144" w:history="1">
         <w:r>
           <w:rPr>
             <w:rStyle w:val="Hyperlink"/>
@@ -2958,7 +2958,7 @@
             <w:noProof/>
             <w:webHidden/>
           </w:rPr>
-          <w:instrText xml:space="preserve"> PAGEREF _Toc242173561 \h </w:instrText>
+          <w:instrText xml:space="preserve"> PAGEREF _Toc242189144 \h </w:instrText>
         </w:r>
         <w:r>
           <w:rPr>
@@ -3001,7 +3001,7 @@
           <w:sz w:val="24"/>
         </w:rPr>
       </w:pPr>
-      <w:hyperlink w:anchor="_Toc242173562" w:history="1">
+      <w:hyperlink w:anchor="_Toc242189145" w:history="1">
         <w:r>
           <w:rPr>
             <w:rStyle w:val="Hyperlink"/>
@@ -3028,7 +3028,7 @@
             <w:noProof/>
             <w:webHidden/>
           </w:rPr>
-          <w:instrText xml:space="preserve"> PAGEREF _Toc242173562 \h </w:instrText>
+          <w:instrText xml:space="preserve"> PAGEREF _Toc242189145 \h </w:instrText>
         </w:r>
         <w:r>
           <w:rPr>
@@ -3071,7 +3071,7 @@
           <w:sz w:val="24"/>
         </w:rPr>
       </w:pPr>
-      <w:hyperlink w:anchor="_Toc242173563" w:history="1">
+      <w:hyperlink w:anchor="_Toc242189146" w:history="1">
         <w:r>
           <w:rPr>
             <w:rStyle w:val="Hyperlink"/>
@@ -3098,7 +3098,7 @@
             <w:noProof/>
             <w:webHidden/>
           </w:rPr>
-          <w:instrText xml:space="preserve"> PAGEREF _Toc242173563 \h </w:instrText>
+          <w:instrText xml:space="preserve"> PAGEREF _Toc242189146 \h </w:instrText>
         </w:r>
         <w:r>
           <w:rPr>
@@ -3141,7 +3141,7 @@
           <w:sz w:val="24"/>
         </w:rPr>
       </w:pPr>
-      <w:hyperlink w:anchor="_Toc242173564" w:history="1">
+      <w:hyperlink w:anchor="_Toc242189147" w:history="1">
         <w:r>
           <w:rPr>
             <w:rStyle w:val="Hyperlink"/>
@@ -3168,7 +3168,7 @@
             <w:noProof/>
             <w:webHidden/>
           </w:rPr>
-          <w:instrText xml:space="preserve"> PAGEREF _Toc242173564 \h </w:instrText>
+          <w:instrText xml:space="preserve"> PAGEREF _Toc242189147 \h </w:instrText>
         </w:r>
         <w:r>
           <w:rPr>
@@ -3211,7 +3211,7 @@
           <w:sz w:val="24"/>
         </w:rPr>
       </w:pPr>
-      <w:hyperlink w:anchor="_Toc242173565" w:history="1">
+      <w:hyperlink w:anchor="_Toc242189148" w:history="1">
         <w:r>
           <w:rPr>
             <w:rStyle w:val="Hyperlink"/>
@@ -3238,7 +3238,7 @@
             <w:noProof/>
             <w:webHidden/>
           </w:rPr>
-          <w:instrText xml:space="preserve"> PAGEREF _Toc242173565 \h </w:instrText>
+          <w:instrText xml:space="preserve"> PAGEREF _Toc242189148 \h </w:instrText>
         </w:r>
         <w:r>
           <w:rPr>
@@ -3281,7 +3281,7 @@
           <w:sz w:val="24"/>
         </w:rPr>
       </w:pPr>
-      <w:hyperlink w:anchor="_Toc242173566" w:history="1">
+      <w:hyperlink w:anchor="_Toc242189149" w:history="1">
         <w:r>
           <w:rPr>
             <w:rStyle w:val="Hyperlink"/>
@@ -3308,7 +3308,7 @@
             <w:noProof/>
             <w:webHidden/>
           </w:rPr>
-          <w:instrText xml:space="preserve"> PAGEREF _Toc242173566 \h </w:instrText>
+          <w:instrText xml:space="preserve"> PAGEREF _Toc242189149 \h </w:instrText>
         </w:r>
         <w:r>
           <w:rPr>
@@ -3351,7 +3351,7 @@
           <w:sz w:val="24"/>
         </w:rPr>
       </w:pPr>
-      <w:hyperlink w:anchor="_Toc242173567" w:history="1">
+      <w:hyperlink w:anchor="_Toc242189150" w:history="1">
         <w:r>
           <w:rPr>
             <w:rStyle w:val="Hyperlink"/>
@@ -3378,7 +3378,7 @@
             <w:noProof/>
             <w:webHidden/>
           </w:rPr>
-          <w:instrText xml:space="preserve"> PAGEREF _Toc242173567 \h </w:instrText>
+          <w:instrText xml:space="preserve"> PAGEREF _Toc242189150 \h </w:instrText>
         </w:r>
         <w:r>
           <w:rPr>
@@ -3421,7 +3421,7 @@
           <w:sz w:val="24"/>
         </w:rPr>
       </w:pPr>
-      <w:hyperlink w:anchor="_Toc242173568" w:history="1">
+      <w:hyperlink w:anchor="_Toc242189151" w:history="1">
         <w:r>
           <w:rPr>
             <w:rStyle w:val="Hyperlink"/>
@@ -3448,7 +3448,7 @@
             <w:noProof/>
             <w:webHidden/>
           </w:rPr>
-          <w:instrText xml:space="preserve"> PAGEREF _Toc242173568 \h </w:instrText>
+          <w:instrText xml:space="preserve"> PAGEREF _Toc242189151 \h </w:instrText>
         </w:r>
         <w:r>
           <w:rPr>
@@ -3491,7 +3491,7 @@
           <w:sz w:val="24"/>
         </w:rPr>
       </w:pPr>
-      <w:hyperlink w:anchor="_Toc242173569" w:history="1">
+      <w:hyperlink w:anchor="_Toc242189152" w:history="1">
         <w:r>
           <w:rPr>
             <w:rStyle w:val="Hyperlink"/>
@@ -3518,7 +3518,7 @@
             <w:noProof/>
             <w:webHidden/>
           </w:rPr>
-          <w:instrText xml:space="preserve"> PAGEREF _Toc242173569 \h </w:instrText>
+          <w:instrText xml:space="preserve"> PAGEREF _Toc242189152 \h </w:instrText>
         </w:r>
         <w:r>
           <w:rPr>
@@ -3561,7 +3561,7 @@
           <w:sz w:val="24"/>
         </w:rPr>
       </w:pPr>
-      <w:hyperlink w:anchor="_Toc242173570" w:history="1">
+      <w:hyperlink w:anchor="_Toc242189153" w:history="1">
         <w:r>
           <w:rPr>
             <w:rStyle w:val="Hyperlink"/>
@@ -3588,7 +3588,7 @@
             <w:noProof/>
             <w:webHidden/>
           </w:rPr>
-          <w:instrText xml:space="preserve"> PAGEREF _Toc242173570 \h </w:instrText>
+          <w:instrText xml:space="preserve"> PAGEREF _Toc242189153 \h </w:instrText>
         </w:r>
         <w:r>
           <w:rPr>
@@ -3631,7 +3631,7 @@
           <w:sz w:val="24"/>
         </w:rPr>
       </w:pPr>
-      <w:hyperlink w:anchor="_Toc242173571" w:history="1">
+      <w:hyperlink w:anchor="_Toc242189154" w:history="1">
         <w:r>
           <w:rPr>
             <w:rStyle w:val="Hyperlink"/>
@@ -3658,7 +3658,7 @@
             <w:noProof/>
             <w:webHidden/>
           </w:rPr>
-          <w:instrText xml:space="preserve"> PAGEREF _Toc242173571 \h </w:instrText>
+          <w:instrText xml:space="preserve"> PAGEREF _Toc242189154 \h </w:instrText>
         </w:r>
         <w:r>
           <w:rPr>
@@ -3701,7 +3701,7 @@
           <w:sz w:val="24"/>
         </w:rPr>
       </w:pPr>
-      <w:hyperlink w:anchor="_Toc242173572" w:history="1">
+      <w:hyperlink w:anchor="_Toc242189155" w:history="1">
         <w:r>
           <w:rPr>
             <w:rStyle w:val="Hyperlink"/>
@@ -3728,7 +3728,7 @@
             <w:noProof/>
             <w:webHidden/>
           </w:rPr>
-          <w:instrText xml:space="preserve"> PAGEREF _Toc242173572 \h </w:instrText>
+          <w:instrText xml:space="preserve"> PAGEREF _Toc242189155 \h </w:instrText>
         </w:r>
         <w:r>
           <w:rPr>
@@ -3772,7 +3772,7 @@
           <w:sz w:val="24"/>
         </w:rPr>
       </w:pPr>
-      <w:hyperlink w:anchor="_Toc242173573" w:history="1">
+      <w:hyperlink w:anchor="_Toc242189156" w:history="1">
         <w:r>
           <w:rPr>
             <w:rStyle w:val="Hyperlink"/>
@@ -3799,7 +3799,7 @@
             <w:noProof/>
             <w:webHidden/>
           </w:rPr>
-          <w:instrText xml:space="preserve"> PAGEREF _Toc242173573 \h </w:instrText>
+          <w:instrText xml:space="preserve"> PAGEREF _Toc242189156 \h </w:instrText>
         </w:r>
         <w:r>
           <w:rPr>
@@ -3842,7 +3842,7 @@
           <w:sz w:val="24"/>
         </w:rPr>
       </w:pPr>
-      <w:hyperlink w:anchor="_Toc242173574" w:history="1">
+      <w:hyperlink w:anchor="_Toc242189157" w:history="1">
         <w:r>
           <w:rPr>
             <w:rStyle w:val="Hyperlink"/>
@@ -3869,7 +3869,7 @@
             <w:noProof/>
             <w:webHidden/>
           </w:rPr>
-          <w:instrText xml:space="preserve"> PAGEREF _Toc242173574 \h </w:instrText>
+          <w:instrText xml:space="preserve"> PAGEREF _Toc242189157 \h </w:instrText>
         </w:r>
         <w:r>
           <w:rPr>
@@ -3912,7 +3912,7 @@
           <w:sz w:val="24"/>
         </w:rPr>
       </w:pPr>
-      <w:hyperlink w:anchor="_Toc242173575" w:history="1">
+      <w:hyperlink w:anchor="_Toc242189158" w:history="1">
         <w:r>
           <w:rPr>
             <w:rStyle w:val="Hyperlink"/>
@@ -3939,7 +3939,7 @@
             <w:noProof/>
             <w:webHidden/>
           </w:rPr>
-          <w:instrText xml:space="preserve"> PAGEREF _Toc242173575 \h </w:instrText>
+          <w:instrText xml:space="preserve"> PAGEREF _Toc242189158 \h </w:instrText>
         </w:r>
         <w:r>
           <w:rPr>
@@ -3982,7 +3982,7 @@
           <w:sz w:val="24"/>
         </w:rPr>
       </w:pPr>
-      <w:hyperlink w:anchor="_Toc242173576" w:history="1">
+      <w:hyperlink w:anchor="_Toc242189159" w:history="1">
         <w:r>
           <w:rPr>
             <w:rStyle w:val="Hyperlink"/>
@@ -4009,7 +4009,7 @@
             <w:noProof/>
             <w:webHidden/>
           </w:rPr>
-          <w:instrText xml:space="preserve"> PAGEREF _Toc242173576 \h </w:instrText>
+          <w:instrText xml:space="preserve"> PAGEREF _Toc242189159 \h </w:instrText>
         </w:r>
         <w:r>
           <w:rPr>
@@ -4052,7 +4052,7 @@
           <w:sz w:val="24"/>
         </w:rPr>
       </w:pPr>
-      <w:hyperlink w:anchor="_Toc242173577" w:history="1">
+      <w:hyperlink w:anchor="_Toc242189160" w:history="1">
         <w:r>
           <w:rPr>
             <w:rStyle w:val="Hyperlink"/>
@@ -4079,7 +4079,7 @@
             <w:noProof/>
             <w:webHidden/>
           </w:rPr>
-          <w:instrText xml:space="preserve"> PAGEREF _Toc242173577 \h </w:instrText>
+          <w:instrText xml:space="preserve"> PAGEREF _Toc242189160 \h </w:instrText>
         </w:r>
         <w:r>
           <w:rPr>
@@ -4122,7 +4122,7 @@
           <w:sz w:val="24"/>
         </w:rPr>
       </w:pPr>
-      <w:hyperlink w:anchor="_Toc242173578" w:history="1">
+      <w:hyperlink w:anchor="_Toc242189161" w:history="1">
         <w:r>
           <w:rPr>
             <w:rStyle w:val="Hyperlink"/>
@@ -4149,7 +4149,7 @@
             <w:noProof/>
             <w:webHidden/>
           </w:rPr>
-          <w:instrText xml:space="preserve"> PAGEREF _Toc242173578 \h </w:instrText>
+          <w:instrText xml:space="preserve"> PAGEREF _Toc242189161 \h </w:instrText>
         </w:r>
         <w:r>
           <w:rPr>
@@ -4192,7 +4192,7 @@
           <w:sz w:val="24"/>
         </w:rPr>
       </w:pPr>
-      <w:hyperlink w:anchor="_Toc242173579" w:history="1">
+      <w:hyperlink w:anchor="_Toc242189162" w:history="1">
         <w:r>
           <w:rPr>
             <w:rStyle w:val="Hyperlink"/>
@@ -4219,7 +4219,7 @@
             <w:noProof/>
             <w:webHidden/>
           </w:rPr>
-          <w:instrText xml:space="preserve"> PAGEREF _Toc242173579 \h </w:instrText>
+          <w:instrText xml:space="preserve"> PAGEREF _Toc242189162 \h </w:instrText>
         </w:r>
         <w:r>
           <w:rPr>
@@ -4262,7 +4262,7 @@
           <w:sz w:val="24"/>
         </w:rPr>
       </w:pPr>
-      <w:hyperlink w:anchor="_Toc242173580" w:history="1">
+      <w:hyperlink w:anchor="_Toc242189163" w:history="1">
         <w:r>
           <w:rPr>
             <w:rStyle w:val="Hyperlink"/>
@@ -4289,7 +4289,7 @@
             <w:noProof/>
             <w:webHidden/>
           </w:rPr>
-          <w:instrText xml:space="preserve"> PAGEREF _Toc242173580 \h </w:instrText>
+          <w:instrText xml:space="preserve"> PAGEREF _Toc242189163 \h </w:instrText>
         </w:r>
         <w:r>
           <w:rPr>
@@ -4332,7 +4332,7 @@
           <w:sz w:val="24"/>
         </w:rPr>
       </w:pPr>
-      <w:hyperlink w:anchor="_Toc242173581" w:history="1">
+      <w:hyperlink w:anchor="_Toc242189164" w:history="1">
         <w:r>
           <w:rPr>
             <w:rStyle w:val="Hyperlink"/>
@@ -4359,7 +4359,7 @@
             <w:noProof/>
             <w:webHidden/>
           </w:rPr>
-          <w:instrText xml:space="preserve"> PAGEREF _Toc242173581 \h </w:instrText>
+          <w:instrText xml:space="preserve"> PAGEREF _Toc242189164 \h </w:instrText>
         </w:r>
         <w:r>
           <w:rPr>
@@ -4402,7 +4402,7 @@
           <w:sz w:val="24"/>
         </w:rPr>
       </w:pPr>
-      <w:hyperlink w:anchor="_Toc242173582" w:history="1">
+      <w:hyperlink w:anchor="_Toc242189165" w:history="1">
         <w:r>
           <w:rPr>
             <w:rStyle w:val="Hyperlink"/>
@@ -4429,7 +4429,7 @@
             <w:noProof/>
             <w:webHidden/>
           </w:rPr>
-          <w:instrText xml:space="preserve"> PAGEREF _Toc242173582 \h </w:instrText>
+          <w:instrText xml:space="preserve"> PAGEREF _Toc242189165 \h </w:instrText>
         </w:r>
         <w:r>
           <w:rPr>
@@ -4472,7 +4472,7 @@
           <w:sz w:val="24"/>
         </w:rPr>
       </w:pPr>
-      <w:hyperlink w:anchor="_Toc242173583" w:history="1">
+      <w:hyperlink w:anchor="_Toc242189166" w:history="1">
         <w:r>
           <w:rPr>
             <w:rStyle w:val="Hyperlink"/>
@@ -4499,7 +4499,7 @@
             <w:noProof/>
             <w:webHidden/>
           </w:rPr>
-          <w:instrText xml:space="preserve"> PAGEREF _Toc242173583 \h </w:instrText>
+          <w:instrText xml:space="preserve"> PAGEREF _Toc242189166 \h </w:instrText>
         </w:r>
         <w:r>
           <w:rPr>
@@ -4542,7 +4542,7 @@
           <w:sz w:val="24"/>
         </w:rPr>
       </w:pPr>
-      <w:hyperlink w:anchor="_Toc242173584" w:history="1">
+      <w:hyperlink w:anchor="_Toc242189167" w:history="1">
         <w:r>
           <w:rPr>
             <w:rStyle w:val="Hyperlink"/>
@@ -4569,7 +4569,7 @@
             <w:noProof/>
             <w:webHidden/>
           </w:rPr>
-          <w:instrText xml:space="preserve"> PAGEREF _Toc242173584 \h </w:instrText>
+          <w:instrText xml:space="preserve"> PAGEREF _Toc242189167 \h </w:instrText>
         </w:r>
         <w:r>
           <w:rPr>
@@ -4612,7 +4612,7 @@
           <w:sz w:val="24"/>
         </w:rPr>
       </w:pPr>
-      <w:hyperlink w:anchor="_Toc242173585" w:history="1">
+      <w:hyperlink w:anchor="_Toc242189168" w:history="1">
         <w:r>
           <w:rPr>
             <w:rStyle w:val="Hyperlink"/>
@@ -4639,7 +4639,7 @@
             <w:noProof/>
             <w:webHidden/>
           </w:rPr>
-          <w:instrText xml:space="preserve"> PAGEREF _Toc242173585 \h </w:instrText>
+          <w:instrText xml:space="preserve"> PAGEREF _Toc242189168 \h </w:instrText>
         </w:r>
         <w:r>
           <w:rPr>
@@ -4682,7 +4682,7 @@
           <w:sz w:val="24"/>
         </w:rPr>
       </w:pPr>
-      <w:hyperlink w:anchor="_Toc242173586" w:history="1">
+      <w:hyperlink w:anchor="_Toc242189169" w:history="1">
         <w:r>
           <w:rPr>
             <w:rStyle w:val="Hyperlink"/>
@@ -4709,7 +4709,7 @@
             <w:noProof/>
             <w:webHidden/>
           </w:rPr>
-          <w:instrText xml:space="preserve"> PAGEREF _Toc242173586 \h </w:instrText>
+          <w:instrText xml:space="preserve"> PAGEREF _Toc242189169 \h </w:instrText>
         </w:r>
         <w:r>
           <w:rPr>
@@ -4752,7 +4752,7 @@
           <w:sz w:val="24"/>
         </w:rPr>
       </w:pPr>
-      <w:hyperlink w:anchor="_Toc242173587" w:history="1">
+      <w:hyperlink w:anchor="_Toc242189170" w:history="1">
         <w:r>
           <w:rPr>
             <w:rStyle w:val="Hyperlink"/>
@@ -4779,7 +4779,7 @@
             <w:noProof/>
             <w:webHidden/>
           </w:rPr>
-          <w:instrText xml:space="preserve"> PAGEREF _Toc242173587 \h </w:instrText>
+          <w:instrText xml:space="preserve"> PAGEREF _Toc242189170 \h </w:instrText>
         </w:r>
         <w:r>
           <w:rPr>
@@ -4822,7 +4822,7 @@
           <w:sz w:val="24"/>
         </w:rPr>
       </w:pPr>
-      <w:hyperlink w:anchor="_Toc242173588" w:history="1">
+      <w:hyperlink w:anchor="_Toc242189171" w:history="1">
         <w:r>
           <w:rPr>
             <w:rStyle w:val="Hyperlink"/>
@@ -4849,7 +4849,7 @@
             <w:noProof/>
             <w:webHidden/>
           </w:rPr>
-          <w:instrText xml:space="preserve"> PAGEREF _Toc242173588 \h </w:instrText>
+          <w:instrText xml:space="preserve"> PAGEREF _Toc242189171 \h </w:instrText>
         </w:r>
         <w:r>
           <w:rPr>
@@ -4892,7 +4892,7 @@
           <w:sz w:val="24"/>
         </w:rPr>
       </w:pPr>
-      <w:hyperlink w:anchor="_Toc242173589" w:history="1">
+      <w:hyperlink w:anchor="_Toc242189172" w:history="1">
         <w:r>
           <w:rPr>
             <w:rStyle w:val="Hyperlink"/>
@@ -4919,7 +4919,7 @@
             <w:noProof/>
             <w:webHidden/>
           </w:rPr>
-          <w:instrText xml:space="preserve"> PAGEREF _Toc242173589 \h </w:instrText>
+          <w:instrText xml:space="preserve"> PAGEREF _Toc242189172 \h </w:instrText>
         </w:r>
         <w:r>
           <w:rPr>
@@ -4962,7 +4962,7 @@
           <w:sz w:val="24"/>
         </w:rPr>
       </w:pPr>
-      <w:hyperlink w:anchor="_Toc242173590" w:history="1">
+      <w:hyperlink w:anchor="_Toc242189173" w:history="1">
         <w:r>
           <w:rPr>
             <w:rStyle w:val="Hyperlink"/>
@@ -4989,7 +4989,7 @@
             <w:noProof/>
             <w:webHidden/>
           </w:rPr>
-          <w:instrText xml:space="preserve"> PAGEREF _Toc242173590 \h </w:instrText>
+          <w:instrText xml:space="preserve"> PAGEREF _Toc242189173 \h </w:instrText>
         </w:r>
         <w:r>
           <w:rPr>
@@ -5032,7 +5032,7 @@
           <w:sz w:val="24"/>
         </w:rPr>
       </w:pPr>
-      <w:hyperlink w:anchor="_Toc242173591" w:history="1">
+      <w:hyperlink w:anchor="_Toc242189174" w:history="1">
         <w:r>
           <w:rPr>
             <w:rStyle w:val="Hyperlink"/>
@@ -5059,7 +5059,7 @@
             <w:noProof/>
             <w:webHidden/>
           </w:rPr>
-          <w:instrText xml:space="preserve"> PAGEREF _Toc242173591 \h </w:instrText>
+          <w:instrText xml:space="preserve"> PAGEREF _Toc242189174 \h </w:instrText>
         </w:r>
         <w:r>
           <w:rPr>
@@ -5102,7 +5102,7 @@
           <w:sz w:val="24"/>
         </w:rPr>
       </w:pPr>
-      <w:hyperlink w:anchor="_Toc242173592" w:history="1">
+      <w:hyperlink w:anchor="_Toc242189175" w:history="1">
         <w:r>
           <w:rPr>
             <w:rStyle w:val="Hyperlink"/>
@@ -5129,7 +5129,7 @@
             <w:noProof/>
             <w:webHidden/>
           </w:rPr>
-          <w:instrText xml:space="preserve"> PAGEREF _Toc242173592 \h </w:instrText>
+          <w:instrText xml:space="preserve"> PAGEREF _Toc242189175 \h </w:instrText>
         </w:r>
         <w:r>
           <w:rPr>
@@ -5173,7 +5173,7 @@
           <w:sz w:val="24"/>
         </w:rPr>
       </w:pPr>
-      <w:hyperlink w:anchor="_Toc242173593" w:history="1">
+      <w:hyperlink w:anchor="_Toc242189176" w:history="1">
         <w:r>
           <w:rPr>
             <w:rStyle w:val="Hyperlink"/>
@@ -5200,7 +5200,7 @@
             <w:noProof/>
             <w:webHidden/>
           </w:rPr>
-          <w:instrText xml:space="preserve"> PAGEREF _Toc242173593 \h </w:instrText>
+          <w:instrText xml:space="preserve"> PAGEREF _Toc242189176 \h </w:instrText>
         </w:r>
         <w:r>
           <w:rPr>
@@ -5243,7 +5243,7 @@
           <w:sz w:val="24"/>
         </w:rPr>
       </w:pPr>
-      <w:hyperlink w:anchor="_Toc242173594" w:history="1">
+      <w:hyperlink w:anchor="_Toc242189177" w:history="1">
         <w:r>
           <w:rPr>
             <w:rStyle w:val="Hyperlink"/>
@@ -5270,7 +5270,7 @@
             <w:noProof/>
             <w:webHidden/>
           </w:rPr>
-          <w:instrText xml:space="preserve"> PAGEREF _Toc242173594 \h </w:instrText>
+          <w:instrText xml:space="preserve"> PAGEREF _Toc242189177 \h </w:instrText>
         </w:r>
         <w:r>
           <w:rPr>
@@ -5313,7 +5313,7 @@
           <w:sz w:val="24"/>
         </w:rPr>
       </w:pPr>
-      <w:hyperlink w:anchor="_Toc242173595" w:history="1">
+      <w:hyperlink w:anchor="_Toc242189178" w:history="1">
         <w:r>
           <w:rPr>
             <w:rStyle w:val="Hyperlink"/>
@@ -5340,7 +5340,7 @@
             <w:noProof/>
             <w:webHidden/>
           </w:rPr>
-          <w:instrText xml:space="preserve"> PAGEREF _Toc242173595 \h </w:instrText>
+          <w:instrText xml:space="preserve"> PAGEREF _Toc242189178 \h </w:instrText>
         </w:r>
         <w:r>
           <w:rPr>
@@ -5383,7 +5383,7 @@
           <w:sz w:val="24"/>
         </w:rPr>
       </w:pPr>
-      <w:hyperlink w:anchor="_Toc242173596" w:history="1">
+      <w:hyperlink w:anchor="_Toc242189179" w:history="1">
         <w:r>
           <w:rPr>
             <w:rStyle w:val="Hyperlink"/>
@@ -5410,7 +5410,7 @@
             <w:noProof/>
             <w:webHidden/>
           </w:rPr>
-          <w:instrText xml:space="preserve"> PAGEREF _Toc242173596 \h </w:instrText>
+          <w:instrText xml:space="preserve"> PAGEREF _Toc242189179 \h </w:instrText>
         </w:r>
         <w:r>
           <w:rPr>
@@ -5453,7 +5453,7 @@
           <w:sz w:val="24"/>
         </w:rPr>
       </w:pPr>
-      <w:hyperlink w:anchor="_Toc242173597" w:history="1">
+      <w:hyperlink w:anchor="_Toc242189180" w:history="1">
         <w:r>
           <w:rPr>
             <w:rStyle w:val="Hyperlink"/>
@@ -5480,7 +5480,7 @@
             <w:noProof/>
             <w:webHidden/>
           </w:rPr>
-          <w:instrText xml:space="preserve"> PAGEREF _Toc242173597 \h </w:instrText>
+          <w:instrText xml:space="preserve"> PAGEREF _Toc242189180 \h </w:instrText>
         </w:r>
         <w:r>
           <w:rPr>
@@ -5523,7 +5523,7 @@
           <w:sz w:val="24"/>
         </w:rPr>
       </w:pPr>
-      <w:hyperlink w:anchor="_Toc242173598" w:history="1">
+      <w:hyperlink w:anchor="_Toc242189181" w:history="1">
         <w:r>
           <w:rPr>
             <w:rStyle w:val="Hyperlink"/>
@@ -5550,7 +5550,7 @@
             <w:noProof/>
             <w:webHidden/>
           </w:rPr>
-          <w:instrText xml:space="preserve"> PAGEREF _Toc242173598 \h </w:instrText>
+          <w:instrText xml:space="preserve"> PAGEREF _Toc242189181 \h </w:instrText>
         </w:r>
         <w:r>
           <w:rPr>
@@ -5593,7 +5593,7 @@
           <w:sz w:val="24"/>
         </w:rPr>
       </w:pPr>
-      <w:hyperlink w:anchor="_Toc242173599" w:history="1">
+      <w:hyperlink w:anchor="_Toc242189182" w:history="1">
         <w:r>
           <w:rPr>
             <w:rStyle w:val="Hyperlink"/>
@@ -5620,7 +5620,7 @@
             <w:noProof/>
             <w:webHidden/>
           </w:rPr>
-          <w:instrText xml:space="preserve"> PAGEREF _Toc242173599 \h </w:instrText>
+          <w:instrText xml:space="preserve"> PAGEREF _Toc242189182 \h </w:instrText>
         </w:r>
         <w:r>
           <w:rPr>
@@ -5663,7 +5663,7 @@
           <w:sz w:val="24"/>
         </w:rPr>
       </w:pPr>
-      <w:hyperlink w:anchor="_Toc242173600" w:history="1">
+      <w:hyperlink w:anchor="_Toc242189183" w:history="1">
         <w:r>
           <w:rPr>
             <w:rStyle w:val="Hyperlink"/>
@@ -5690,7 +5690,7 @@
             <w:noProof/>
             <w:webHidden/>
           </w:rPr>
-          <w:instrText xml:space="preserve"> PAGEREF _Toc242173600 \h </w:instrText>
+          <w:instrText xml:space="preserve"> PAGEREF _Toc242189183 \h </w:instrText>
         </w:r>
         <w:r>
           <w:rPr>
@@ -5733,7 +5733,7 @@
           <w:sz w:val="24"/>
         </w:rPr>
       </w:pPr>
-      <w:hyperlink w:anchor="_Toc242173601" w:history="1">
+      <w:hyperlink w:anchor="_Toc242189184" w:history="1">
         <w:r>
           <w:rPr>
             <w:rStyle w:val="Hyperlink"/>
@@ -5760,7 +5760,7 @@
             <w:noProof/>
             <w:webHidden/>
           </w:rPr>
-          <w:instrText xml:space="preserve"> PAGEREF _Toc242173601 \h </w:instrText>
+          <w:instrText xml:space="preserve"> PAGEREF _Toc242189184 \h </w:instrText>
         </w:r>
         <w:r>
           <w:rPr>
@@ -5803,7 +5803,7 @@
           <w:sz w:val="24"/>
         </w:rPr>
       </w:pPr>
-      <w:hyperlink w:anchor="_Toc242173602" w:history="1">
+      <w:hyperlink w:anchor="_Toc242189185" w:history="1">
         <w:r>
           <w:rPr>
             <w:rStyle w:val="Hyperlink"/>
@@ -5830,7 +5830,7 @@
             <w:noProof/>
             <w:webHidden/>
           </w:rPr>
-          <w:instrText xml:space="preserve"> PAGEREF _Toc242173602 \h </w:instrText>
+          <w:instrText xml:space="preserve"> PAGEREF _Toc242189185 \h </w:instrText>
         </w:r>
         <w:r>
           <w:rPr>
@@ -5873,7 +5873,7 @@
           <w:sz w:val="24"/>
         </w:rPr>
       </w:pPr>
-      <w:hyperlink w:anchor="_Toc242173603" w:history="1">
+      <w:hyperlink w:anchor="_Toc242189186" w:history="1">
         <w:r>
           <w:rPr>
             <w:rStyle w:val="Hyperlink"/>
@@ -5900,7 +5900,7 @@
             <w:noProof/>
             <w:webHidden/>
           </w:rPr>
-          <w:instrText xml:space="preserve"> PAGEREF _Toc242173603 \h </w:instrText>
+          <w:instrText xml:space="preserve"> PAGEREF _Toc242189186 \h </w:instrText>
         </w:r>
         <w:r>
           <w:rPr>
@@ -5943,7 +5943,7 @@
           <w:sz w:val="24"/>
         </w:rPr>
       </w:pPr>
-      <w:hyperlink w:anchor="_Toc242173604" w:history="1">
+      <w:hyperlink w:anchor="_Toc242189187" w:history="1">
         <w:r>
           <w:rPr>
             <w:rStyle w:val="Hyperlink"/>
@@ -5970,7 +5970,7 @@
             <w:noProof/>
             <w:webHidden/>
           </w:rPr>
-          <w:instrText xml:space="preserve"> PAGEREF _Toc242173604 \h </w:instrText>
+          <w:instrText xml:space="preserve"> PAGEREF _Toc242189187 \h </w:instrText>
         </w:r>
         <w:r>
           <w:rPr>
@@ -6014,7 +6014,7 @@
           <w:sz w:val="24"/>
         </w:rPr>
       </w:pPr>
-      <w:hyperlink w:anchor="_Toc242173605" w:history="1">
+      <w:hyperlink w:anchor="_Toc242189188" w:history="1">
         <w:r>
           <w:rPr>
             <w:rStyle w:val="Hyperlink"/>
@@ -6041,7 +6041,7 @@
             <w:noProof/>
             <w:webHidden/>
           </w:rPr>
-          <w:instrText xml:space="preserve"> PAGEREF _Toc242173605 \h </w:instrText>
+          <w:instrText xml:space="preserve"> PAGEREF _Toc242189188 \h </w:instrText>
         </w:r>
         <w:r>
           <w:rPr>
@@ -6084,7 +6084,7 @@
           <w:sz w:val="24"/>
         </w:rPr>
       </w:pPr>
-      <w:hyperlink w:anchor="_Toc242173606" w:history="1">
+      <w:hyperlink w:anchor="_Toc242189189" w:history="1">
         <w:r>
           <w:rPr>
             <w:rStyle w:val="Hyperlink"/>
@@ -6111,7 +6111,7 @@
             <w:noProof/>
             <w:webHidden/>
           </w:rPr>
-          <w:instrText xml:space="preserve"> PAGEREF _Toc242173606 \h </w:instrText>
+          <w:instrText xml:space="preserve"> PAGEREF _Toc242189189 \h </w:instrText>
         </w:r>
         <w:r>
           <w:rPr>
@@ -6154,7 +6154,7 @@
           <w:sz w:val="24"/>
         </w:rPr>
       </w:pPr>
-      <w:hyperlink w:anchor="_Toc242173607" w:history="1">
+      <w:hyperlink w:anchor="_Toc242189190" w:history="1">
         <w:r>
           <w:rPr>
             <w:rStyle w:val="Hyperlink"/>
@@ -6181,7 +6181,7 @@
             <w:noProof/>
             <w:webHidden/>
           </w:rPr>
-          <w:instrText xml:space="preserve"> PAGEREF _Toc242173607 \h </w:instrText>
+          <w:instrText xml:space="preserve"> PAGEREF _Toc242189190 \h </w:instrText>
         </w:r>
         <w:r>
           <w:rPr>
@@ -6224,7 +6224,7 @@
           <w:sz w:val="24"/>
         </w:rPr>
       </w:pPr>
-      <w:hyperlink w:anchor="_Toc242173608" w:history="1">
+      <w:hyperlink w:anchor="_Toc242189191" w:history="1">
         <w:r>
           <w:rPr>
             <w:rStyle w:val="Hyperlink"/>
@@ -6251,7 +6251,7 @@
             <w:noProof/>
             <w:webHidden/>
           </w:rPr>
-          <w:instrText xml:space="preserve"> PAGEREF _Toc242173608 \h </w:instrText>
+          <w:instrText xml:space="preserve"> PAGEREF _Toc242189191 \h </w:instrText>
         </w:r>
         <w:r>
           <w:rPr>
@@ -6294,7 +6294,7 @@
           <w:sz w:val="24"/>
         </w:rPr>
       </w:pPr>
-      <w:hyperlink w:anchor="_Toc242173609" w:history="1">
+      <w:hyperlink w:anchor="_Toc242189192" w:history="1">
         <w:r>
           <w:rPr>
             <w:rStyle w:val="Hyperlink"/>
@@ -6321,7 +6321,7 @@
             <w:noProof/>
             <w:webHidden/>
           </w:rPr>
-          <w:instrText xml:space="preserve"> PAGEREF _Toc242173609 \h </w:instrText>
+          <w:instrText xml:space="preserve"> PAGEREF _Toc242189192 \h </w:instrText>
         </w:r>
         <w:r>
           <w:rPr>
@@ -6364,7 +6364,7 @@
           <w:sz w:val="24"/>
         </w:rPr>
       </w:pPr>
-      <w:hyperlink w:anchor="_Toc242173610" w:history="1">
+      <w:hyperlink w:anchor="_Toc242189193" w:history="1">
         <w:r>
           <w:rPr>
             <w:rStyle w:val="Hyperlink"/>
@@ -6391,7 +6391,7 @@
             <w:noProof/>
             <w:webHidden/>
           </w:rPr>
-          <w:instrText xml:space="preserve"> PAGEREF _Toc242173610 \h </w:instrText>
+          <w:instrText xml:space="preserve"> PAGEREF _Toc242189193 \h </w:instrText>
         </w:r>
         <w:r>
           <w:rPr>
@@ -6434,7 +6434,7 @@
           <w:sz w:val="24"/>
         </w:rPr>
       </w:pPr>
-      <w:hyperlink w:anchor="_Toc242173611" w:history="1">
+      <w:hyperlink w:anchor="_Toc242189194" w:history="1">
         <w:r>
           <w:rPr>
             <w:rStyle w:val="Hyperlink"/>
@@ -6461,7 +6461,7 @@
             <w:noProof/>
             <w:webHidden/>
           </w:rPr>
-          <w:instrText xml:space="preserve"> PAGEREF _Toc242173611 \h </w:instrText>
+          <w:instrText xml:space="preserve"> PAGEREF _Toc242189194 \h </w:instrText>
         </w:r>
         <w:r>
           <w:rPr>
@@ -6504,7 +6504,7 @@
           <w:sz w:val="24"/>
         </w:rPr>
       </w:pPr>
-      <w:hyperlink w:anchor="_Toc242173612" w:history="1">
+      <w:hyperlink w:anchor="_Toc242189195" w:history="1">
         <w:r>
           <w:rPr>
             <w:rStyle w:val="Hyperlink"/>
@@ -6531,7 +6531,7 @@
             <w:noProof/>
             <w:webHidden/>
           </w:rPr>
-          <w:instrText xml:space="preserve"> PAGEREF _Toc242173612 \h </w:instrText>
+          <w:instrText xml:space="preserve"> PAGEREF _Toc242189195 \h </w:instrText>
         </w:r>
         <w:r>
           <w:rPr>
@@ -6574,7 +6574,7 @@
           <w:sz w:val="24"/>
         </w:rPr>
       </w:pPr>
-      <w:hyperlink w:anchor="_Toc242173613" w:history="1">
+      <w:hyperlink w:anchor="_Toc242189196" w:history="1">
         <w:r>
           <w:rPr>
             <w:rStyle w:val="Hyperlink"/>
@@ -6601,7 +6601,7 @@
             <w:noProof/>
             <w:webHidden/>
           </w:rPr>
-          <w:instrText xml:space="preserve"> PAGEREF _Toc242173613 \h </w:instrText>
+          <w:instrText xml:space="preserve"> PAGEREF _Toc242189196 \h </w:instrText>
         </w:r>
         <w:r>
           <w:rPr>
@@ -6644,7 +6644,7 @@
           <w:sz w:val="24"/>
         </w:rPr>
       </w:pPr>
-      <w:hyperlink w:anchor="_Toc242173614" w:history="1">
+      <w:hyperlink w:anchor="_Toc242189197" w:history="1">
         <w:r>
           <w:rPr>
             <w:rStyle w:val="Hyperlink"/>
@@ -6671,7 +6671,7 @@
             <w:noProof/>
             <w:webHidden/>
           </w:rPr>
-          <w:instrText xml:space="preserve"> PAGEREF _Toc242173614 \h </w:instrText>
+          <w:instrText xml:space="preserve"> PAGEREF _Toc242189197 \h </w:instrText>
         </w:r>
         <w:r>
           <w:rPr>
@@ -6714,7 +6714,7 @@
           <w:sz w:val="24"/>
         </w:rPr>
       </w:pPr>
-      <w:hyperlink w:anchor="_Toc242173615" w:history="1">
+      <w:hyperlink w:anchor="_Toc242189198" w:history="1">
         <w:r>
           <w:rPr>
             <w:rStyle w:val="Hyperlink"/>
@@ -6741,7 +6741,7 @@
             <w:noProof/>
             <w:webHidden/>
           </w:rPr>
-          <w:instrText xml:space="preserve"> PAGEREF _Toc242173615 \h </w:instrText>
+          <w:instrText xml:space="preserve"> PAGEREF _Toc242189198 \h </w:instrText>
         </w:r>
         <w:r>
           <w:rPr>
@@ -6784,7 +6784,7 @@
           <w:sz w:val="24"/>
         </w:rPr>
       </w:pPr>
-      <w:hyperlink w:anchor="_Toc242173616" w:history="1">
+      <w:hyperlink w:anchor="_Toc242189199" w:history="1">
         <w:r>
           <w:rPr>
             <w:rStyle w:val="Hyperlink"/>
@@ -6811,7 +6811,7 @@
             <w:noProof/>
             <w:webHidden/>
           </w:rPr>
-          <w:instrText xml:space="preserve"> PAGEREF _Toc242173616 \h </w:instrText>
+          <w:instrText xml:space="preserve"> PAGEREF _Toc242189199 \h </w:instrText>
         </w:r>
         <w:r>
           <w:rPr>
@@ -6855,7 +6855,7 @@
           <w:sz w:val="24"/>
         </w:rPr>
       </w:pPr>
-      <w:hyperlink w:anchor="_Toc242173617" w:history="1">
+      <w:hyperlink w:anchor="_Toc242189200" w:history="1">
         <w:r>
           <w:rPr>
             <w:rStyle w:val="Hyperlink"/>
@@ -6882,7 +6882,7 @@
             <w:noProof/>
             <w:webHidden/>
           </w:rPr>
-          <w:instrText xml:space="preserve"> PAGEREF _Toc242173617 \h </w:instrText>
+          <w:instrText xml:space="preserve"> PAGEREF _Toc242189200 \h </w:instrText>
         </w:r>
         <w:r>
           <w:rPr>
@@ -6925,7 +6925,7 @@
           <w:sz w:val="24"/>
         </w:rPr>
       </w:pPr>
-      <w:hyperlink w:anchor="_Toc242173618" w:history="1">
+      <w:hyperlink w:anchor="_Toc242189201" w:history="1">
         <w:r>
           <w:rPr>
             <w:rStyle w:val="Hyperlink"/>
@@ -6952,7 +6952,7 @@
             <w:noProof/>
             <w:webHidden/>
           </w:rPr>
-          <w:instrText xml:space="preserve"> PAGEREF _Toc242173618 \h </w:instrText>
+          <w:instrText xml:space="preserve"> PAGEREF _Toc242189201 \h </w:instrText>
         </w:r>
         <w:r>
           <w:rPr>
@@ -6995,7 +6995,7 @@
           <w:sz w:val="24"/>
         </w:rPr>
       </w:pPr>
-      <w:hyperlink w:anchor="_Toc242173619" w:history="1">
+      <w:hyperlink w:anchor="_Toc242189202" w:history="1">
         <w:r>
           <w:rPr>
             <w:rStyle w:val="Hyperlink"/>
@@ -7022,7 +7022,7 @@
             <w:noProof/>
             <w:webHidden/>
           </w:rPr>
-          <w:instrText xml:space="preserve"> PAGEREF _Toc242173619 \h </w:instrText>
+          <w:instrText xml:space="preserve"> PAGEREF _Toc242189202 \h </w:instrText>
         </w:r>
         <w:r>
           <w:rPr>
@@ -7065,7 +7065,7 @@
           <w:sz w:val="24"/>
         </w:rPr>
       </w:pPr>
-      <w:hyperlink w:anchor="_Toc242173620" w:history="1">
+      <w:hyperlink w:anchor="_Toc242189203" w:history="1">
         <w:r>
           <w:rPr>
             <w:rStyle w:val="Hyperlink"/>
@@ -7092,7 +7092,7 @@
             <w:noProof/>
             <w:webHidden/>
           </w:rPr>
-          <w:instrText xml:space="preserve"> PAGEREF _Toc242173620 \h </w:instrText>
+          <w:instrText xml:space="preserve"> PAGEREF _Toc242189203 \h </w:instrText>
         </w:r>
         <w:r>
           <w:rPr>
@@ -7135,7 +7135,7 @@
           <w:sz w:val="24"/>
         </w:rPr>
       </w:pPr>
-      <w:hyperlink w:anchor="_Toc242173621" w:history="1">
+      <w:hyperlink w:anchor="_Toc242189204" w:history="1">
         <w:r>
           <w:rPr>
             <w:rStyle w:val="Hyperlink"/>
@@ -7162,7 +7162,7 @@
             <w:noProof/>
             <w:webHidden/>
           </w:rPr>
-          <w:instrText xml:space="preserve"> PAGEREF _Toc242173621 \h </w:instrText>
+          <w:instrText xml:space="preserve"> PAGEREF _Toc242189204 \h </w:instrText>
         </w:r>
         <w:r>
           <w:rPr>
@@ -7205,7 +7205,7 @@
           <w:sz w:val="24"/>
         </w:rPr>
       </w:pPr>
-      <w:hyperlink w:anchor="_Toc242173622" w:history="1">
+      <w:hyperlink w:anchor="_Toc242189205" w:history="1">
         <w:r>
           <w:rPr>
             <w:rStyle w:val="Hyperlink"/>
@@ -7232,7 +7232,7 @@
             <w:noProof/>
             <w:webHidden/>
           </w:rPr>
-          <w:instrText xml:space="preserve"> PAGEREF _Toc242173622 \h </w:instrText>
+          <w:instrText xml:space="preserve"> PAGEREF _Toc242189205 \h </w:instrText>
         </w:r>
         <w:r>
           <w:rPr>
@@ -7276,7 +7276,7 @@
           <w:sz w:val="24"/>
         </w:rPr>
       </w:pPr>
-      <w:hyperlink w:anchor="_Toc242173623" w:history="1">
+      <w:hyperlink w:anchor="_Toc242189206" w:history="1">
         <w:r>
           <w:rPr>
             <w:rStyle w:val="Hyperlink"/>
@@ -7303,7 +7303,7 @@
             <w:noProof/>
             <w:webHidden/>
           </w:rPr>
-          <w:instrText xml:space="preserve"> PAGEREF _Toc242173623 \h </w:instrText>
+          <w:instrText xml:space="preserve"> PAGEREF _Toc242189206 \h </w:instrText>
         </w:r>
         <w:r>
           <w:rPr>
@@ -7346,7 +7346,7 @@
           <w:sz w:val="24"/>
         </w:rPr>
       </w:pPr>
-      <w:hyperlink w:anchor="_Toc242173624" w:history="1">
+      <w:hyperlink w:anchor="_Toc242189207" w:history="1">
         <w:r>
           <w:rPr>
             <w:rStyle w:val="Hyperlink"/>
@@ -7373,7 +7373,7 @@
             <w:noProof/>
             <w:webHidden/>
           </w:rPr>
-          <w:instrText xml:space="preserve"> PAGEREF _Toc242173624 \h </w:instrText>
+          <w:instrText xml:space="preserve"> PAGEREF _Toc242189207 \h </w:instrText>
         </w:r>
         <w:r>
           <w:rPr>
@@ -7416,7 +7416,7 @@
           <w:sz w:val="24"/>
         </w:rPr>
       </w:pPr>
-      <w:hyperlink w:anchor="_Toc242173625" w:history="1">
+      <w:hyperlink w:anchor="_Toc242189208" w:history="1">
         <w:r>
           <w:rPr>
             <w:rStyle w:val="Hyperlink"/>
@@ -7443,7 +7443,7 @@
             <w:noProof/>
             <w:webHidden/>
           </w:rPr>
-          <w:instrText xml:space="preserve"> PAGEREF _Toc242173625 \h </w:instrText>
+          <w:instrText xml:space="preserve"> PAGEREF _Toc242189208 \h </w:instrText>
         </w:r>
         <w:r>
           <w:rPr>
@@ -7486,7 +7486,7 @@
           <w:sz w:val="24"/>
         </w:rPr>
       </w:pPr>
-      <w:hyperlink w:anchor="_Toc242173626" w:history="1">
+      <w:hyperlink w:anchor="_Toc242189209" w:history="1">
         <w:r>
           <w:rPr>
             <w:rStyle w:val="Hyperlink"/>
@@ -7513,7 +7513,7 @@
             <w:noProof/>
             <w:webHidden/>
           </w:rPr>
-          <w:instrText xml:space="preserve"> PAGEREF _Toc242173626 \h </w:instrText>
+          <w:instrText xml:space="preserve"> PAGEREF _Toc242189209 \h </w:instrText>
         </w:r>
         <w:r>
           <w:rPr>
@@ -7556,7 +7556,7 @@
           <w:sz w:val="24"/>
         </w:rPr>
       </w:pPr>
-      <w:hyperlink w:anchor="_Toc242173627" w:history="1">
+      <w:hyperlink w:anchor="_Toc242189210" w:history="1">
         <w:r>
           <w:rPr>
             <w:rStyle w:val="Hyperlink"/>
@@ -7583,7 +7583,7 @@
             <w:noProof/>
             <w:webHidden/>
           </w:rPr>
-          <w:instrText xml:space="preserve"> PAGEREF _Toc242173627 \h </w:instrText>
+          <w:instrText xml:space="preserve"> PAGEREF _Toc242189210 \h </w:instrText>
         </w:r>
         <w:r>
           <w:rPr>
@@ -7626,7 +7626,7 @@
           <w:sz w:val="24"/>
         </w:rPr>
       </w:pPr>
-      <w:hyperlink w:anchor="_Toc242173628" w:history="1">
+      <w:hyperlink w:anchor="_Toc242189211" w:history="1">
         <w:r>
           <w:rPr>
             <w:rStyle w:val="Hyperlink"/>
@@ -7653,7 +7653,7 @@
             <w:noProof/>
             <w:webHidden/>
           </w:rPr>
-          <w:instrText xml:space="preserve"> PAGEREF _Toc242173628 \h </w:instrText>
+          <w:instrText xml:space="preserve"> PAGEREF _Toc242189211 \h </w:instrText>
         </w:r>
         <w:r>
           <w:rPr>
@@ -7696,7 +7696,7 @@
           <w:sz w:val="24"/>
         </w:rPr>
       </w:pPr>
-      <w:hyperlink w:anchor="_Toc242173629" w:history="1">
+      <w:hyperlink w:anchor="_Toc242189212" w:history="1">
         <w:r>
           <w:rPr>
             <w:rStyle w:val="Hyperlink"/>
@@ -7723,7 +7723,7 @@
             <w:noProof/>
             <w:webHidden/>
           </w:rPr>
-          <w:instrText xml:space="preserve"> PAGEREF _Toc242173629 \h </w:instrText>
+          <w:instrText xml:space="preserve"> PAGEREF _Toc242189212 \h </w:instrText>
         </w:r>
         <w:r>
           <w:rPr>
@@ -7766,7 +7766,7 @@
           <w:sz w:val="24"/>
         </w:rPr>
       </w:pPr>
-      <w:hyperlink w:anchor="_Toc242173630" w:history="1">
+      <w:hyperlink w:anchor="_Toc242189213" w:history="1">
         <w:r>
           <w:rPr>
             <w:rStyle w:val="Hyperlink"/>
@@ -7793,7 +7793,7 @@
             <w:noProof/>
             <w:webHidden/>
           </w:rPr>
-          <w:instrText xml:space="preserve"> PAGEREF _Toc242173630 \h </w:instrText>
+          <w:instrText xml:space="preserve"> PAGEREF _Toc242189213 \h </w:instrText>
         </w:r>
         <w:r>
           <w:rPr>
@@ -7836,7 +7836,7 @@
           <w:sz w:val="24"/>
         </w:rPr>
       </w:pPr>
-      <w:hyperlink w:anchor="_Toc242173631" w:history="1">
+      <w:hyperlink w:anchor="_Toc242189214" w:history="1">
         <w:r>
           <w:rPr>
             <w:rStyle w:val="Hyperlink"/>
@@ -7863,7 +7863,7 @@
             <w:noProof/>
             <w:webHidden/>
           </w:rPr>
-          <w:instrText xml:space="preserve"> PAGEREF _Toc242173631 \h </w:instrText>
+          <w:instrText xml:space="preserve"> PAGEREF _Toc242189214 \h </w:instrText>
         </w:r>
         <w:r>
           <w:rPr>
@@ -7906,7 +7906,7 @@
           <w:sz w:val="24"/>
         </w:rPr>
       </w:pPr>
-      <w:hyperlink w:anchor="_Toc242173632" w:history="1">
+      <w:hyperlink w:anchor="_Toc242189215" w:history="1">
         <w:r>
           <w:rPr>
             <w:rStyle w:val="Hyperlink"/>
@@ -7933,7 +7933,7 @@
             <w:noProof/>
             <w:webHidden/>
           </w:rPr>
-          <w:instrText xml:space="preserve"> PAGEREF _Toc242173632 \h </w:instrText>
+          <w:instrText xml:space="preserve"> PAGEREF _Toc242189215 \h </w:instrText>
         </w:r>
         <w:r>
           <w:rPr>
@@ -7976,7 +7976,7 @@
           <w:sz w:val="24"/>
         </w:rPr>
       </w:pPr>
-      <w:hyperlink w:anchor="_Toc242173633" w:history="1">
+      <w:hyperlink w:anchor="_Toc242189216" w:history="1">
         <w:r>
           <w:rPr>
             <w:rStyle w:val="Hyperlink"/>
@@ -8003,7 +8003,7 @@
             <w:noProof/>
             <w:webHidden/>
           </w:rPr>
-          <w:instrText xml:space="preserve"> PAGEREF _Toc242173633 \h </w:instrText>
+          <w:instrText xml:space="preserve"> PAGEREF _Toc242189216 \h </w:instrText>
         </w:r>
         <w:r>
           <w:rPr>
@@ -8046,7 +8046,7 @@
           <w:sz w:val="24"/>
         </w:rPr>
       </w:pPr>
-      <w:hyperlink w:anchor="_Toc242173634" w:history="1">
+      <w:hyperlink w:anchor="_Toc242189217" w:history="1">
         <w:r>
           <w:rPr>
             <w:rStyle w:val="Hyperlink"/>
@@ -8073,7 +8073,7 @@
             <w:noProof/>
             <w:webHidden/>
           </w:rPr>
-          <w:instrText xml:space="preserve"> PAGEREF _Toc242173634 \h </w:instrText>
+          <w:instrText xml:space="preserve"> PAGEREF _Toc242189217 \h </w:instrText>
         </w:r>
         <w:r>
           <w:rPr>
@@ -8116,7 +8116,7 @@
           <w:sz w:val="24"/>
         </w:rPr>
       </w:pPr>
-      <w:hyperlink w:anchor="_Toc242173635" w:history="1">
+      <w:hyperlink w:anchor="_Toc242189218" w:history="1">
         <w:r>
           <w:rPr>
             <w:rStyle w:val="Hyperlink"/>
@@ -8143,7 +8143,7 @@
             <w:noProof/>
             <w:webHidden/>
           </w:rPr>
-          <w:instrText xml:space="preserve"> PAGEREF _Toc242173635 \h </w:instrText>
+          <w:instrText xml:space="preserve"> PAGEREF _Toc242189218 \h </w:instrText>
         </w:r>
         <w:r>
           <w:rPr>
@@ -8186,7 +8186,7 @@
           <w:sz w:val="24"/>
         </w:rPr>
       </w:pPr>
-      <w:hyperlink w:anchor="_Toc242173636" w:history="1">
+      <w:hyperlink w:anchor="_Toc242189219" w:history="1">
         <w:r>
           <w:rPr>
             <w:rStyle w:val="Hyperlink"/>
@@ -8213,7 +8213,7 @@
             <w:noProof/>
             <w:webHidden/>
           </w:rPr>
-          <w:instrText xml:space="preserve"> PAGEREF _Toc242173636 \h </w:instrText>
+          <w:instrText xml:space="preserve"> PAGEREF _Toc242189219 \h </w:instrText>
         </w:r>
         <w:r>
           <w:rPr>
@@ -8257,7 +8257,7 @@
           <w:sz w:val="24"/>
         </w:rPr>
       </w:pPr>
-      <w:hyperlink w:anchor="_Toc242173637" w:history="1">
+      <w:hyperlink w:anchor="_Toc242189220" w:history="1">
         <w:r>
           <w:rPr>
             <w:rStyle w:val="Hyperlink"/>
@@ -8284,7 +8284,7 @@
             <w:noProof/>
             <w:webHidden/>
           </w:rPr>
-          <w:instrText xml:space="preserve"> PAGEREF _Toc242173637 \h </w:instrText>
+          <w:instrText xml:space="preserve"> PAGEREF _Toc242189220 \h </w:instrText>
         </w:r>
         <w:r>
           <w:rPr>
@@ -8327,7 +8327,7 @@
           <w:sz w:val="24"/>
         </w:rPr>
       </w:pPr>
-      <w:hyperlink w:anchor="_Toc242173638" w:history="1">
+      <w:hyperlink w:anchor="_Toc242189221" w:history="1">
         <w:r>
           <w:rPr>
             <w:rStyle w:val="Hyperlink"/>
@@ -8354,7 +8354,7 @@
             <w:noProof/>
             <w:webHidden/>
           </w:rPr>
-          <w:instrText xml:space="preserve"> PAGEREF _Toc242173638 \h </w:instrText>
+          <w:instrText xml:space="preserve"> PAGEREF _Toc242189221 \h </w:instrText>
         </w:r>
         <w:r>
           <w:rPr>
@@ -8397,7 +8397,7 @@
           <w:sz w:val="24"/>
         </w:rPr>
       </w:pPr>
-      <w:hyperlink w:anchor="_Toc242173639" w:history="1">
+      <w:hyperlink w:anchor="_Toc242189222" w:history="1">
         <w:r>
           <w:rPr>
             <w:rStyle w:val="Hyperlink"/>
@@ -8424,7 +8424,7 @@
             <w:noProof/>
             <w:webHidden/>
           </w:rPr>
-          <w:instrText xml:space="preserve"> PAGEREF _Toc242173639 \h </w:instrText>
+          <w:instrText xml:space="preserve"> PAGEREF _Toc242189222 \h </w:instrText>
         </w:r>
         <w:r>
           <w:rPr>
@@ -8469,7 +8469,7 @@
       <w:pPr>
         <w:pStyle w:val="berschrift1"/>
       </w:pPr>
-      <w:bookmarkStart w:id="0" w:name="_Toc242173521"/>
+      <w:bookmarkStart w:id="0" w:name="_Toc242189104"/>
       <w:r>
         <w:t>Einleitung und Wegweiser</w:t>
       </w:r>
@@ -8498,7 +8498,7 @@
       <w:pPr>
         <w:pStyle w:val="berschrift2"/>
       </w:pPr>
-      <w:bookmarkStart w:id="1" w:name="_Toc242173522"/>
+      <w:bookmarkStart w:id="1" w:name="_Toc242189105"/>
       <w:r>
         <w:t>So ist jede Seite beschrieben</w:t>
       </w:r>
@@ -8608,7 +8608,7 @@
       <w:pPr>
         <w:pStyle w:val="berschrift2"/>
       </w:pPr>
-      <w:bookmarkStart w:id="2" w:name="_Toc242173523"/>
+      <w:bookmarkStart w:id="2" w:name="_Toc242189106"/>
       <w:r>
         <w:t>Wegweiser nach Rolle</w:t>
       </w:r>
@@ -9044,7 +9044,7 @@
       <w:pPr>
         <w:pStyle w:val="berschrift2"/>
       </w:pPr>
-      <w:bookmarkStart w:id="3" w:name="_Toc242173524"/>
+      <w:bookmarkStart w:id="3" w:name="_Toc242189107"/>
       <w:r>
         <w:t>Allgemeine Regeln für alle Zahlen</w:t>
       </w:r>
@@ -9084,7 +9084,7 @@
       <w:pPr>
         <w:pStyle w:val="berschrift1"/>
       </w:pPr>
-      <w:bookmarkStart w:id="4" w:name="_Toc242173525"/>
+      <w:bookmarkStart w:id="4" w:name="_Toc242189108"/>
       <w:r>
         <w:t>Finance und Management</w:t>
       </w:r>
@@ -9125,7 +9125,7 @@
       <w:pPr>
         <w:pStyle w:val="berschrift2"/>
       </w:pPr>
-      <w:bookmarkStart w:id="5" w:name="_Toc242173526"/>
+      <w:bookmarkStart w:id="5" w:name="_Toc242189109"/>
       <w:r>
         <w:t>Export Dashboard</w:t>
       </w:r>
@@ -9244,7 +9244,7 @@
       <w:pPr>
         <w:pStyle w:val="berschrift2"/>
       </w:pPr>
-      <w:bookmarkStart w:id="6" w:name="_Toc242173527"/>
+      <w:bookmarkStart w:id="6" w:name="_Toc242189110"/>
       <w:r>
         <w:t>Schnellübersicht</w:t>
       </w:r>
@@ -9349,7 +9349,7 @@
       <w:pPr>
         <w:pStyle w:val="berschrift2"/>
       </w:pPr>
-      <w:bookmarkStart w:id="7" w:name="_Toc242173528"/>
+      <w:bookmarkStart w:id="7" w:name="_Toc242189111"/>
       <w:r>
         <w:t>Management Entscheidungen</w:t>
       </w:r>
@@ -9458,7 +9458,7 @@
       <w:pPr>
         <w:pStyle w:val="berschrift2"/>
       </w:pPr>
-      <w:bookmarkStart w:id="8" w:name="_Toc242173529"/>
+      <w:bookmarkStart w:id="8" w:name="_Toc242189112"/>
       <w:r>
         <w:t>Finance Summary (Experten)</w:t>
       </w:r>
@@ -9550,7 +9550,7 @@
       <w:pPr>
         <w:pStyle w:val="berschrift2"/>
       </w:pPr>
-      <w:bookmarkStart w:id="9" w:name="_Toc242173530"/>
+      <w:bookmarkStart w:id="9" w:name="_Toc242189113"/>
       <w:r>
         <w:t>Länder Diagnose (Experten)</w:t>
       </w:r>
@@ -9642,7 +9642,7 @@
       <w:pPr>
         <w:pStyle w:val="berschrift2"/>
       </w:pPr>
-      <w:bookmarkStart w:id="10" w:name="_Toc242173531"/>
+      <w:bookmarkStart w:id="10" w:name="_Toc242189114"/>
       <w:r>
         <w:t>Datenstatus (Experten)</w:t>
       </w:r>
@@ -9734,7 +9734,7 @@
       <w:pPr>
         <w:pStyle w:val="berschrift2"/>
       </w:pPr>
-      <w:bookmarkStart w:id="11" w:name="_Toc242173532"/>
+      <w:bookmarkStart w:id="11" w:name="_Toc242189115"/>
       <w:r>
         <w:t>Abweichungen (Experten)</w:t>
       </w:r>
@@ -9815,7 +9815,7 @@
       <w:pPr>
         <w:pStyle w:val="berschrift2"/>
       </w:pPr>
-      <w:bookmarkStart w:id="12" w:name="_Toc242173533"/>
+      <w:bookmarkStart w:id="12" w:name="_Toc242189116"/>
       <w:r>
         <w:t>Gutschriften (Experten)</w:t>
       </w:r>
@@ -9896,7 +9896,7 @@
       <w:pPr>
         <w:pStyle w:val="berschrift2"/>
       </w:pPr>
-      <w:bookmarkStart w:id="13" w:name="_Toc242173534"/>
+      <w:bookmarkStart w:id="13" w:name="_Toc242189117"/>
       <w:r>
         <w:t>Datenqualität (Experten)</w:t>
       </w:r>
@@ -9977,7 +9977,7 @@
       <w:pPr>
         <w:pStyle w:val="berschrift2"/>
       </w:pPr>
-      <w:bookmarkStart w:id="14" w:name="_Toc242173535"/>
+      <w:bookmarkStart w:id="14" w:name="_Toc242189118"/>
       <w:r>
         <w:t>Finance Pivot (Experten)</w:t>
       </w:r>
@@ -10069,7 +10069,7 @@
       <w:pPr>
         <w:pStyle w:val="berschrift2"/>
       </w:pPr>
-      <w:bookmarkStart w:id="15" w:name="_Toc242173536"/>
+      <w:bookmarkStart w:id="15" w:name="_Toc242189119"/>
       <w:r>
         <w:t>Sparten-Finanzanalyse (Experten)</w:t>
       </w:r>
@@ -10161,7 +10161,7 @@
       <w:pPr>
         <w:pStyle w:val="berschrift2"/>
       </w:pPr>
-      <w:bookmarkStart w:id="16" w:name="_Toc242173537"/>
+      <w:bookmarkStart w:id="16" w:name="_Toc242189120"/>
       <w:r>
         <w:t>Zentrale Spartenzuordnung (Experten)</w:t>
       </w:r>
@@ -10242,7 +10242,7 @@
       <w:pPr>
         <w:pStyle w:val="berschrift2"/>
       </w:pPr>
-      <w:bookmarkStart w:id="17" w:name="_Toc242173538"/>
+      <w:bookmarkStart w:id="17" w:name="_Toc242189121"/>
       <w:r>
         <w:t>Finance Prüfbuch (Experten)</w:t>
       </w:r>
@@ -10334,7 +10334,7 @@
       <w:pPr>
         <w:pStyle w:val="berschrift2"/>
       </w:pPr>
-      <w:bookmarkStart w:id="18" w:name="_Toc242173539"/>
+      <w:bookmarkStart w:id="18" w:name="_Toc242189122"/>
       <w:r>
         <w:t>Gruppenmarge (Experten)</w:t>
       </w:r>
@@ -10440,7 +10440,7 @@
       <w:pPr>
         <w:pStyle w:val="berschrift2"/>
       </w:pPr>
-      <w:bookmarkStart w:id="19" w:name="_Toc242173540"/>
+      <w:bookmarkStart w:id="19" w:name="_Toc242189123"/>
       <w:r>
         <w:t>3D Datenanalyse (Experten)</w:t>
       </w:r>
@@ -10535,7 +10535,7 @@
       <w:pPr>
         <w:pStyle w:val="berschrift2"/>
       </w:pPr>
-      <w:bookmarkStart w:id="20" w:name="_Toc242173541"/>
+      <w:bookmarkStart w:id="20" w:name="_Toc242189124"/>
       <w:r>
         <w:t>Rohdaten Diagnose (Experten)</w:t>
       </w:r>
@@ -10630,7 +10630,7 @@
       <w:pPr>
         <w:pStyle w:val="berschrift2"/>
       </w:pPr>
-      <w:bookmarkStart w:id="21" w:name="_Toc242173542"/>
+      <w:bookmarkStart w:id="21" w:name="_Toc242189125"/>
       <w:r>
         <w:t>Daten-Heartbeat (Experten)</w:t>
       </w:r>
@@ -10725,7 +10725,7 @@
       <w:pPr>
         <w:pStyle w:val="berschrift2"/>
       </w:pPr>
-      <w:bookmarkStart w:id="22" w:name="_Toc242173543"/>
+      <w:bookmarkStart w:id="22" w:name="_Toc242189126"/>
       <w:r>
         <w:t>Soll/Ist Vergleich</w:t>
       </w:r>
@@ -10820,7 +10820,7 @@
       <w:pPr>
         <w:pStyle w:val="berschrift2"/>
       </w:pPr>
-      <w:bookmarkStart w:id="23" w:name="_Toc242173544"/>
+      <w:bookmarkStart w:id="23" w:name="_Toc242189127"/>
       <w:r>
         <w:t>Controlling</w:t>
       </w:r>
@@ -10932,7 +10932,7 @@
       <w:pPr>
         <w:pStyle w:val="berschrift2"/>
       </w:pPr>
-      <w:bookmarkStart w:id="24" w:name="_Toc242173545"/>
+      <w:bookmarkStart w:id="24" w:name="_Toc242189128"/>
       <w:r>
         <w:t>Finance Schulung</w:t>
       </w:r>
@@ -11027,7 +11027,7 @@
       <w:pPr>
         <w:pStyle w:val="berschrift2"/>
       </w:pPr>
-      <w:bookmarkStart w:id="25" w:name="_Toc242173546"/>
+      <w:bookmarkStart w:id="25" w:name="_Toc242189129"/>
       <w:r>
         <w:t>Manuelle Importe</w:t>
       </w:r>
@@ -11119,7 +11119,7 @@
       <w:pPr>
         <w:pStyle w:val="berschrift2"/>
       </w:pPr>
-      <w:bookmarkStart w:id="26" w:name="_Toc242173547"/>
+      <w:bookmarkStart w:id="26" w:name="_Toc242189130"/>
       <w:r>
         <w:t>Journal Import</w:t>
       </w:r>
@@ -11211,7 +11211,7 @@
       <w:pPr>
         <w:pStyle w:val="berschrift2"/>
       </w:pPr>
-      <w:bookmarkStart w:id="27" w:name="_Toc242173548"/>
+      <w:bookmarkStart w:id="27" w:name="_Toc242189131"/>
       <w:r>
         <w:t>Marktsegmente</w:t>
       </w:r>
@@ -11320,7 +11320,7 @@
       <w:pPr>
         <w:pStyle w:val="berschrift2"/>
       </w:pPr>
-      <w:bookmarkStart w:id="28" w:name="_Toc242173549"/>
+      <w:bookmarkStart w:id="28" w:name="_Toc242189132"/>
       <w:r>
         <w:t>Administration</w:t>
       </w:r>
@@ -11498,7 +11498,7 @@
       <w:pPr>
         <w:pStyle w:val="berschrift2"/>
       </w:pPr>
-      <w:bookmarkStart w:id="29" w:name="_Toc242173550"/>
+      <w:bookmarkStart w:id="29" w:name="_Toc242189133"/>
       <w:r>
         <w:t>Kennzahlen-Glossar</w:t>
       </w:r>
@@ -12407,7 +12407,7 @@
       <w:pPr>
         <w:pStyle w:val="berschrift1"/>
       </w:pPr>
-      <w:bookmarkStart w:id="30" w:name="_Toc242173551"/>
+      <w:bookmarkStart w:id="30" w:name="_Toc242189134"/>
       <w:r>
         <w:t>Einkauf</w:t>
       </w:r>
@@ -12474,7 +12474,7 @@
       <w:pPr>
         <w:pStyle w:val="berschrift2"/>
       </w:pPr>
-      <w:bookmarkStart w:id="31" w:name="_Toc242173552"/>
+      <w:bookmarkStart w:id="31" w:name="_Toc242189135"/>
       <w:r>
         <w:t>Einkauf Dashboard</w:t>
       </w:r>
@@ -12745,7 +12745,7 @@
       <w:pPr>
         <w:pStyle w:val="berschrift2"/>
       </w:pPr>
-      <w:bookmarkStart w:id="32" w:name="_Toc242173553"/>
+      <w:bookmarkStart w:id="32" w:name="_Toc242189136"/>
       <w:r>
         <w:t>Spend</w:t>
       </w:r>
@@ -12904,7 +12904,7 @@
       <w:pPr>
         <w:pStyle w:val="berschrift2"/>
       </w:pPr>
-      <w:bookmarkStart w:id="33" w:name="_Toc242173554"/>
+      <w:bookmarkStart w:id="33" w:name="_Toc242189137"/>
       <w:r>
         <w:t>Offene Bestellungen</w:t>
       </w:r>
@@ -13055,7 +13055,7 @@
       <w:pPr>
         <w:pStyle w:val="berschrift2"/>
       </w:pPr>
-      <w:bookmarkStart w:id="34" w:name="_Toc242173555"/>
+      <w:bookmarkStart w:id="34" w:name="_Toc242189138"/>
       <w:r>
         <w:t>Kontrakte</w:t>
       </w:r>
@@ -13178,7 +13178,7 @@
       <w:pPr>
         <w:pStyle w:val="berschrift2"/>
       </w:pPr>
-      <w:bookmarkStart w:id="35" w:name="_Toc242173556"/>
+      <w:bookmarkStart w:id="35" w:name="_Toc242189139"/>
       <w:r>
         <w:t>Lieferanten</w:t>
       </w:r>
@@ -13289,7 +13289,7 @@
       <w:pPr>
         <w:pStyle w:val="berschrift2"/>
       </w:pPr>
-      <w:bookmarkStart w:id="36" w:name="_Toc242173557"/>
+      <w:bookmarkStart w:id="36" w:name="_Toc242189140"/>
       <w:r>
         <w:t>Spend-Aufriss</w:t>
       </w:r>
@@ -13431,7 +13431,7 @@
       <w:pPr>
         <w:pStyle w:val="berschrift2"/>
       </w:pPr>
-      <w:bookmarkStart w:id="37" w:name="_Toc242173558"/>
+      <w:bookmarkStart w:id="37" w:name="_Toc242189141"/>
       <w:r>
         <w:t>Bestellbedarf &amp; Deckung</w:t>
       </w:r>
@@ -13634,7 +13634,7 @@
       <w:pPr>
         <w:pStyle w:val="berschrift2"/>
       </w:pPr>
-      <w:bookmarkStart w:id="38" w:name="_Toc242173559"/>
+      <w:bookmarkStart w:id="38" w:name="_Toc242189142"/>
       <w:r>
         <w:t>Materialabhängigkeit</w:t>
       </w:r>
@@ -13834,7 +13834,7 @@
       <w:pPr>
         <w:pStyle w:val="berschrift2"/>
       </w:pPr>
-      <w:bookmarkStart w:id="39" w:name="_Toc242173560"/>
+      <w:bookmarkStart w:id="39" w:name="_Toc242189143"/>
       <w:r>
         <w:t>Lieferperformance</w:t>
       </w:r>
@@ -13945,7 +13945,7 @@
       <w:pPr>
         <w:pStyle w:val="berschrift2"/>
       </w:pPr>
-      <w:bookmarkStart w:id="40" w:name="_Toc242173561"/>
+      <w:bookmarkStart w:id="40" w:name="_Toc242189144"/>
       <w:r>
         <w:t>Ideen: Übersicht</w:t>
       </w:r>
@@ -14059,7 +14059,7 @@
       <w:pPr>
         <w:pStyle w:val="berschrift2"/>
       </w:pPr>
-      <w:bookmarkStart w:id="41" w:name="_Toc242173562"/>
+      <w:bookmarkStart w:id="41" w:name="_Toc242189145"/>
       <w:r>
         <w:t>Ideen: Einkauf-Datenservice</w:t>
       </w:r>
@@ -14159,7 +14159,7 @@
       <w:pPr>
         <w:pStyle w:val="berschrift2"/>
       </w:pPr>
-      <w:bookmarkStart w:id="42" w:name="_Toc242173563"/>
+      <w:bookmarkStart w:id="42" w:name="_Toc242189146"/>
       <w:r>
         <w:t>Ideen: Liefertermin-Risiko</w:t>
       </w:r>
@@ -14270,7 +14270,7 @@
       <w:pPr>
         <w:pStyle w:val="berschrift2"/>
       </w:pPr>
-      <w:bookmarkStart w:id="43" w:name="_Toc242173564"/>
+      <w:bookmarkStart w:id="43" w:name="_Toc242189147"/>
       <w:r>
         <w:t>Ideen: Preisentwicklung</w:t>
       </w:r>
@@ -14399,7 +14399,7 @@
       <w:pPr>
         <w:pStyle w:val="berschrift2"/>
       </w:pPr>
-      <w:bookmarkStart w:id="44" w:name="_Toc242173565"/>
+      <w:bookmarkStart w:id="44" w:name="_Toc242189148"/>
       <w:r>
         <w:t>Ideen: Spend-Konzentration</w:t>
       </w:r>
@@ -14510,7 +14510,7 @@
       <w:pPr>
         <w:pStyle w:val="berschrift2"/>
       </w:pPr>
-      <w:bookmarkStart w:id="45" w:name="_Toc242173566"/>
+      <w:bookmarkStart w:id="45" w:name="_Toc242189149"/>
       <w:r>
         <w:t>Ideen: Datenqualität</w:t>
       </w:r>
@@ -14621,7 +14621,7 @@
       <w:pPr>
         <w:pStyle w:val="berschrift2"/>
       </w:pPr>
-      <w:bookmarkStart w:id="46" w:name="_Toc242173567"/>
+      <w:bookmarkStart w:id="46" w:name="_Toc242189150"/>
       <w:r>
         <w:t>Kennzahlen-Katalog</w:t>
       </w:r>
@@ -14709,7 +14709,7 @@
       <w:pPr>
         <w:pStyle w:val="berschrift2"/>
       </w:pPr>
-      <w:bookmarkStart w:id="47" w:name="_Toc242173568"/>
+      <w:bookmarkStart w:id="47" w:name="_Toc242189151"/>
       <w:r>
         <w:t>PBIX Vorlage</w:t>
       </w:r>
@@ -14797,7 +14797,7 @@
       <w:pPr>
         <w:pStyle w:val="berschrift2"/>
       </w:pPr>
-      <w:bookmarkStart w:id="48" w:name="_Toc242173569"/>
+      <w:bookmarkStart w:id="48" w:name="_Toc242189152"/>
       <w:r>
         <w:t>3D Simulation</w:t>
       </w:r>
@@ -14920,7 +14920,7 @@
       <w:pPr>
         <w:pStyle w:val="berschrift2"/>
       </w:pPr>
-      <w:bookmarkStart w:id="49" w:name="_Toc242173570"/>
+      <w:bookmarkStart w:id="49" w:name="_Toc242189153"/>
       <w:r>
         <w:t>Interaktiv</w:t>
       </w:r>
@@ -15228,7 +15228,7 @@
       <w:pPr>
         <w:pStyle w:val="berschrift2"/>
       </w:pPr>
-      <w:bookmarkStart w:id="50" w:name="_Toc242173571"/>
+      <w:bookmarkStart w:id="50" w:name="_Toc242189154"/>
       <w:r>
         <w:t>Datenquellen</w:t>
       </w:r>
@@ -15328,7 +15328,7 @@
       <w:pPr>
         <w:pStyle w:val="berschrift2"/>
       </w:pPr>
-      <w:bookmarkStart w:id="51" w:name="_Toc242173572"/>
+      <w:bookmarkStart w:id="51" w:name="_Toc242189155"/>
       <w:r>
         <w:t>Kennzahlen-Glossar</w:t>
       </w:r>
@@ -16032,7 +16032,7 @@
       <w:pPr>
         <w:pStyle w:val="berschrift1"/>
       </w:pPr>
-      <w:bookmarkStart w:id="52" w:name="_Toc242173573"/>
+      <w:bookmarkStart w:id="52" w:name="_Toc242189156"/>
       <w:r>
         <w:t>Verkauf</w:t>
       </w:r>
@@ -16085,7 +16085,7 @@
       <w:pPr>
         <w:pStyle w:val="berschrift2"/>
       </w:pPr>
-      <w:bookmarkStart w:id="53" w:name="_Toc242173574"/>
+      <w:bookmarkStart w:id="53" w:name="_Toc242189157"/>
       <w:r>
         <w:t>Kunden</w:t>
       </w:r>
@@ -16196,7 +16196,7 @@
       <w:pPr>
         <w:pStyle w:val="berschrift2"/>
       </w:pPr>
-      <w:bookmarkStart w:id="54" w:name="_Toc242173575"/>
+      <w:bookmarkStart w:id="54" w:name="_Toc242189158"/>
       <w:r>
         <w:t>Rückgang</w:t>
       </w:r>
@@ -16302,7 +16302,7 @@
       <w:pPr>
         <w:pStyle w:val="berschrift2"/>
       </w:pPr>
-      <w:bookmarkStart w:id="55" w:name="_Toc242173576"/>
+      <w:bookmarkStart w:id="55" w:name="_Toc242189159"/>
       <w:r>
         <w:t>Neue und verlorene Kunden</w:t>
       </w:r>
@@ -16408,7 +16408,7 @@
       <w:pPr>
         <w:pStyle w:val="berschrift2"/>
       </w:pPr>
-      <w:bookmarkStart w:id="56" w:name="_Toc242173577"/>
+      <w:bookmarkStart w:id="56" w:name="_Toc242189160"/>
       <w:r>
         <w:t>Konzentration</w:t>
       </w:r>
@@ -16514,7 +16514,7 @@
       <w:pPr>
         <w:pStyle w:val="berschrift2"/>
       </w:pPr>
-      <w:bookmarkStart w:id="57" w:name="_Toc242173578"/>
+      <w:bookmarkStart w:id="57" w:name="_Toc242189161"/>
       <w:r>
         <w:t>Cross-Selling</w:t>
       </w:r>
@@ -16609,7 +16609,7 @@
       <w:pPr>
         <w:pStyle w:val="berschrift2"/>
       </w:pPr>
-      <w:bookmarkStart w:id="58" w:name="_Toc242173579"/>
+      <w:bookmarkStart w:id="58" w:name="_Toc242189162"/>
       <w:r>
         <w:t>Preisstreuung</w:t>
       </w:r>
@@ -16715,7 +16715,7 @@
       <w:pPr>
         <w:pStyle w:val="berschrift2"/>
       </w:pPr>
-      <w:bookmarkStart w:id="59" w:name="_Toc242173580"/>
+      <w:bookmarkStart w:id="59" w:name="_Toc242189163"/>
       <w:r>
         <w:t>Saison und Prognose</w:t>
       </w:r>
@@ -16821,7 +16821,7 @@
       <w:pPr>
         <w:pStyle w:val="berschrift2"/>
       </w:pPr>
-      <w:bookmarkStart w:id="60" w:name="_Toc242173581"/>
+      <w:bookmarkStart w:id="60" w:name="_Toc242189164"/>
       <w:r>
         <w:t>Weltkarte</w:t>
       </w:r>
@@ -16924,7 +16924,7 @@
       <w:pPr>
         <w:pStyle w:val="berschrift2"/>
       </w:pPr>
-      <w:bookmarkStart w:id="61" w:name="_Toc242173582"/>
+      <w:bookmarkStart w:id="61" w:name="_Toc242189165"/>
       <w:r>
         <w:t>Interaktiv</w:t>
       </w:r>
@@ -17016,7 +17016,7 @@
       <w:pPr>
         <w:pStyle w:val="berschrift2"/>
       </w:pPr>
-      <w:bookmarkStart w:id="62" w:name="_Toc242173583"/>
+      <w:bookmarkStart w:id="62" w:name="_Toc242189166"/>
       <w:r>
         <w:t>Kunden-Galaxie</w:t>
       </w:r>
@@ -17108,7 +17108,7 @@
       <w:pPr>
         <w:pStyle w:val="berschrift2"/>
       </w:pPr>
-      <w:bookmarkStart w:id="63" w:name="_Toc242173584"/>
+      <w:bookmarkStart w:id="63" w:name="_Toc242189167"/>
       <w:r>
         <w:t>Rennen</w:t>
       </w:r>
@@ -17200,7 +17200,7 @@
       <w:pPr>
         <w:pStyle w:val="berschrift2"/>
       </w:pPr>
-      <w:bookmarkStart w:id="64" w:name="_Toc242173585"/>
+      <w:bookmarkStart w:id="64" w:name="_Toc242189168"/>
       <w:r>
         <w:t>Umsatzfluss</w:t>
       </w:r>
@@ -17292,7 +17292,7 @@
       <w:pPr>
         <w:pStyle w:val="berschrift2"/>
       </w:pPr>
-      <w:bookmarkStart w:id="65" w:name="_Toc242173586"/>
+      <w:bookmarkStart w:id="65" w:name="_Toc242189169"/>
       <w:r>
         <w:t>Sonnenstrahl</w:t>
       </w:r>
@@ -17384,7 +17384,7 @@
       <w:pPr>
         <w:pStyle w:val="berschrift2"/>
       </w:pPr>
-      <w:bookmarkStart w:id="66" w:name="_Toc242173587"/>
+      <w:bookmarkStart w:id="66" w:name="_Toc242189170"/>
       <w:r>
         <w:t>Was wäre wenn</w:t>
       </w:r>
@@ -17493,7 +17493,7 @@
       <w:pPr>
         <w:pStyle w:val="berschrift2"/>
       </w:pPr>
-      <w:bookmarkStart w:id="67" w:name="_Toc242173588"/>
+      <w:bookmarkStart w:id="67" w:name="_Toc242189171"/>
       <w:r>
         <w:t>Bestellrhythmus</w:t>
       </w:r>
@@ -17588,7 +17588,7 @@
       <w:pPr>
         <w:pStyle w:val="berschrift2"/>
       </w:pPr>
-      <w:bookmarkStart w:id="68" w:name="_Toc242173589"/>
+      <w:bookmarkStart w:id="68" w:name="_Toc242189172"/>
       <w:r>
         <w:t>Kalender</w:t>
       </w:r>
@@ -17680,7 +17680,7 @@
       <w:pPr>
         <w:pStyle w:val="berschrift2"/>
       </w:pPr>
-      <w:bookmarkStart w:id="69" w:name="_Toc242173590"/>
+      <w:bookmarkStart w:id="69" w:name="_Toc242189173"/>
       <w:r>
         <w:t>Artikel-Netzwerk</w:t>
       </w:r>
@@ -17775,7 +17775,7 @@
       <w:pPr>
         <w:pStyle w:val="berschrift2"/>
       </w:pPr>
-      <w:bookmarkStart w:id="70" w:name="_Toc242173591"/>
+      <w:bookmarkStart w:id="70" w:name="_Toc242189174"/>
       <w:r>
         <w:t>3D-Landschaft</w:t>
       </w:r>
@@ -17867,7 +17867,7 @@
       <w:pPr>
         <w:pStyle w:val="berschrift2"/>
       </w:pPr>
-      <w:bookmarkStart w:id="71" w:name="_Toc242173592"/>
+      <w:bookmarkStart w:id="71" w:name="_Toc242189175"/>
       <w:r>
         <w:t>Kennzahlen-Glossar</w:t>
       </w:r>
@@ -18694,7 +18694,7 @@
       <w:pPr>
         <w:pStyle w:val="berschrift1"/>
       </w:pPr>
-      <w:bookmarkStart w:id="72" w:name="_Toc242173593"/>
+      <w:bookmarkStart w:id="72" w:name="_Toc242189176"/>
       <w:r>
         <w:t>Logistik</w:t>
       </w:r>
@@ -18714,7 +18714,7 @@
       <w:pPr>
         <w:pStyle w:val="berschrift2"/>
       </w:pPr>
-      <w:bookmarkStart w:id="73" w:name="_Toc242173594"/>
+      <w:bookmarkStart w:id="73" w:name="_Toc242189177"/>
       <w:r>
         <w:t>Stücklistenanalyse</w:t>
       </w:r>
@@ -18831,7 +18831,7 @@
       <w:pPr>
         <w:pStyle w:val="berschrift2"/>
       </w:pPr>
-      <w:bookmarkStart w:id="74" w:name="_Toc242173595"/>
+      <w:bookmarkStart w:id="74" w:name="_Toc242189178"/>
       <w:r>
         <w:t>Materialdisposition &amp; Fehlteile</w:t>
       </w:r>
@@ -18983,7 +18983,7 @@
       <w:pPr>
         <w:pStyle w:val="berschrift2"/>
       </w:pPr>
-      <w:bookmarkStart w:id="75" w:name="_Toc242173596"/>
+      <w:bookmarkStart w:id="75" w:name="_Toc242189179"/>
       <w:r>
         <w:t>Logistik live</w:t>
       </w:r>
@@ -19091,7 +19091,7 @@
       <w:pPr>
         <w:pStyle w:val="berschrift2"/>
       </w:pPr>
-      <w:bookmarkStart w:id="76" w:name="_Toc242173597"/>
+      <w:bookmarkStart w:id="76" w:name="_Toc242189180"/>
       <w:r>
         <w:t>Original- und Live-Übersicht</w:t>
       </w:r>
@@ -19184,7 +19184,7 @@
       <w:pPr>
         <w:pStyle w:val="berschrift2"/>
       </w:pPr>
-      <w:bookmarkStart w:id="77" w:name="_Toc242173598"/>
+      <w:bookmarkStart w:id="77" w:name="_Toc242189181"/>
       <w:r>
         <w:t>3D-Lager</w:t>
       </w:r>
@@ -19277,7 +19277,7 @@
       <w:pPr>
         <w:pStyle w:val="berschrift2"/>
       </w:pPr>
-      <w:bookmarkStart w:id="78" w:name="_Toc242173599"/>
+      <w:bookmarkStart w:id="78" w:name="_Toc242189182"/>
       <w:r>
         <w:t>Produktivität</w:t>
       </w:r>
@@ -19373,7 +19373,7 @@
       <w:pPr>
         <w:pStyle w:val="berschrift2"/>
       </w:pPr>
-      <w:bookmarkStart w:id="79" w:name="_Toc242173600"/>
+      <w:bookmarkStart w:id="79" w:name="_Toc242189183"/>
       <w:r>
         <w:t>Leistung je Person (nur nach Anmeldung)</w:t>
       </w:r>
@@ -19463,7 +19463,7 @@
       <w:pPr>
         <w:pStyle w:val="berschrift2"/>
       </w:pPr>
-      <w:bookmarkStart w:id="80" w:name="_Toc242173601"/>
+      <w:bookmarkStart w:id="80" w:name="_Toc242189184"/>
       <w:r>
         <w:t>Kapazität</w:t>
       </w:r>
@@ -19612,7 +19612,7 @@
       <w:pPr>
         <w:pStyle w:val="berschrift2"/>
       </w:pPr>
-      <w:bookmarkStart w:id="81" w:name="_Toc242173602"/>
+      <w:bookmarkStart w:id="81" w:name="_Toc242189185"/>
       <w:r>
         <w:t>Verwendung &amp; Risiko</w:t>
       </w:r>
@@ -19719,7 +19719,7 @@
       <w:pPr>
         <w:pStyle w:val="berschrift2"/>
       </w:pPr>
-      <w:bookmarkStart w:id="82" w:name="_Toc242173603"/>
+      <w:bookmarkStart w:id="82" w:name="_Toc242189186"/>
       <w:r>
         <w:t>Dispositionsprüfung</w:t>
       </w:r>
@@ -19890,7 +19890,7 @@
       <w:pPr>
         <w:pStyle w:val="berschrift2"/>
       </w:pPr>
-      <w:bookmarkStart w:id="83" w:name="_Toc242173604"/>
+      <w:bookmarkStart w:id="83" w:name="_Toc242189187"/>
       <w:r>
         <w:t>Kennzahlen-Glossar</w:t>
       </w:r>
@@ -20635,7 +20635,7 @@
       <w:pPr>
         <w:pStyle w:val="berschrift1"/>
       </w:pPr>
-      <w:bookmarkStart w:id="84" w:name="_Toc242173605"/>
+      <w:bookmarkStart w:id="84" w:name="_Toc242189188"/>
       <w:r>
         <w:t>HR</w:t>
       </w:r>
@@ -20658,7 +20658,7 @@
       <w:pPr>
         <w:pStyle w:val="berschrift2"/>
       </w:pPr>
-      <w:bookmarkStart w:id="85" w:name="_Toc242173606"/>
+      <w:bookmarkStart w:id="85" w:name="_Toc242189189"/>
       <w:r>
         <w:t>HR Dashboard</w:t>
       </w:r>
@@ -20853,7 +20853,7 @@
       <w:pPr>
         <w:pStyle w:val="berschrift2"/>
       </w:pPr>
-      <w:bookmarkStart w:id="86" w:name="_Toc242173607"/>
+      <w:bookmarkStart w:id="86" w:name="_Toc242189190"/>
       <w:r>
         <w:t>Überblick</w:t>
       </w:r>
@@ -20943,7 +20943,7 @@
       <w:pPr>
         <w:pStyle w:val="berschrift2"/>
       </w:pPr>
-      <w:bookmarkStart w:id="87" w:name="_Toc242173608"/>
+      <w:bookmarkStart w:id="87" w:name="_Toc242189191"/>
       <w:r>
         <w:t>Fluktuation</w:t>
       </w:r>
@@ -21132,7 +21132,7 @@
       <w:pPr>
         <w:pStyle w:val="berschrift2"/>
       </w:pPr>
-      <w:bookmarkStart w:id="88" w:name="_Toc242173609"/>
+      <w:bookmarkStart w:id="88" w:name="_Toc242189192"/>
       <w:r>
         <w:t>Ampel</w:t>
       </w:r>
@@ -21225,7 +21225,7 @@
       <w:pPr>
         <w:pStyle w:val="berschrift2"/>
       </w:pPr>
-      <w:bookmarkStart w:id="89" w:name="_Toc242173610"/>
+      <w:bookmarkStart w:id="89" w:name="_Toc242189193"/>
       <w:r>
         <w:t>Absenzen</w:t>
       </w:r>
@@ -21337,7 +21337,7 @@
       <w:pPr>
         <w:pStyle w:val="berschrift2"/>
       </w:pPr>
-      <w:bookmarkStart w:id="90" w:name="_Toc242173611"/>
+      <w:bookmarkStart w:id="90" w:name="_Toc242189194"/>
       <w:r>
         <w:t>Zeit / Ferien</w:t>
       </w:r>
@@ -21436,7 +21436,7 @@
       <w:pPr>
         <w:pStyle w:val="berschrift2"/>
       </w:pPr>
-      <w:bookmarkStart w:id="91" w:name="_Toc242173612"/>
+      <w:bookmarkStart w:id="91" w:name="_Toc242189195"/>
       <w:r>
         <w:t>Mitarbeitende</w:t>
       </w:r>
@@ -21526,7 +21526,7 @@
       <w:pPr>
         <w:pStyle w:val="berschrift2"/>
       </w:pPr>
-      <w:bookmarkStart w:id="92" w:name="_Toc242173613"/>
+      <w:bookmarkStart w:id="92" w:name="_Toc242189196"/>
       <w:r>
         <w:t>Datenstatus</w:t>
       </w:r>
@@ -21616,7 +21616,7 @@
       <w:pPr>
         <w:pStyle w:val="berschrift2"/>
       </w:pPr>
-      <w:bookmarkStart w:id="93" w:name="_Toc242173614"/>
+      <w:bookmarkStart w:id="93" w:name="_Toc242189197"/>
       <w:r>
         <w:t>Anleitung</w:t>
       </w:r>
@@ -21709,7 +21709,7 @@
       <w:pPr>
         <w:pStyle w:val="berschrift2"/>
       </w:pPr>
-      <w:bookmarkStart w:id="94" w:name="_Toc242173615"/>
+      <w:bookmarkStart w:id="94" w:name="_Toc242189198"/>
       <w:r>
         <w:t>HR KPI Schulung</w:t>
       </w:r>
@@ -21814,7 +21814,7 @@
       <w:pPr>
         <w:pStyle w:val="berschrift2"/>
       </w:pPr>
-      <w:bookmarkStart w:id="95" w:name="_Toc242173616"/>
+      <w:bookmarkStart w:id="95" w:name="_Toc242189199"/>
       <w:r>
         <w:t>Kennzahlen-Glossar</w:t>
       </w:r>
@@ -22600,7 +22600,7 @@
       <w:pPr>
         <w:pStyle w:val="berschrift1"/>
       </w:pPr>
-      <w:bookmarkStart w:id="96" w:name="_Toc242173617"/>
+      <w:bookmarkStart w:id="96" w:name="_Toc242189200"/>
       <w:r>
         <w:t>Weltlage</w:t>
       </w:r>
@@ -22617,10 +22617,10 @@
         <w:rPr>
           <w:b/>
         </w:rPr>
-        <w:t>Weltlage</w:t>
-      </w:r>
-      <w:r>
-        <w:t xml:space="preserve"> mit den vier Unterseiten Radar, Länder, Rohstoffe und Währungen sowie Ereignisse und ist ohne Passwort für alle offen.</w:t>
+        <w:t>Finance Cockpit → Weltlage</w:t>
+      </w:r>
+      <w:r>
+        <w:t xml:space="preserve"> mit den vier Unterseiten Radar, Länder, Rohstoffe und Währungen sowie Ereignisse und ist wie die übrigen Finance-Auswertungen durch das Finance-Passwort geschützt. Auftraggeber ist Ingo Kohler (Eigeninitiative), Fragen gehen an ihn.</w:t>
       </w:r>
     </w:p>
     <w:p>
@@ -22643,7 +22643,7 @@
       <w:pPr>
         <w:pStyle w:val="berschrift2"/>
       </w:pPr>
-      <w:bookmarkStart w:id="97" w:name="_Toc242173618"/>
+      <w:bookmarkStart w:id="97" w:name="_Toc242189201"/>
       <w:r>
         <w:t>Radar</w:t>
       </w:r>
@@ -22961,7 +22961,7 @@
       <w:pPr>
         <w:pStyle w:val="berschrift2"/>
       </w:pPr>
-      <w:bookmarkStart w:id="98" w:name="_Toc242173619"/>
+      <w:bookmarkStart w:id="98" w:name="_Toc242189202"/>
       <w:r>
         <w:t>Länder</w:t>
       </w:r>
@@ -23088,7 +23088,7 @@
       <w:pPr>
         <w:pStyle w:val="berschrift2"/>
       </w:pPr>
-      <w:bookmarkStart w:id="99" w:name="_Toc242173620"/>
+      <w:bookmarkStart w:id="99" w:name="_Toc242189203"/>
       <w:r>
         <w:t>Rohstoffe und Währungen</w:t>
       </w:r>
@@ -23348,7 +23348,7 @@
       <w:pPr>
         <w:pStyle w:val="berschrift2"/>
       </w:pPr>
-      <w:bookmarkStart w:id="100" w:name="_Toc242173621"/>
+      <w:bookmarkStart w:id="100" w:name="_Toc242189204"/>
       <w:r>
         <w:t>Ereignisse</w:t>
       </w:r>
@@ -23472,7 +23472,7 @@
       <w:pPr>
         <w:pStyle w:val="berschrift2"/>
       </w:pPr>
-      <w:bookmarkStart w:id="101" w:name="_Toc242173622"/>
+      <w:bookmarkStart w:id="101" w:name="_Toc242189205"/>
       <w:r>
         <w:t>Kennzahlen-Glossar</w:t>
       </w:r>
@@ -24012,7 +24012,7 @@
       <w:pPr>
         <w:pStyle w:val="berschrift1"/>
       </w:pPr>
-      <w:bookmarkStart w:id="102" w:name="_Toc242173623"/>
+      <w:bookmarkStart w:id="102" w:name="_Toc242189206"/>
       <w:r>
         <w:t>Netzwerk und IT-Infrastruktur</w:t>
       </w:r>
@@ -24049,7 +24049,7 @@
       <w:pPr>
         <w:pStyle w:val="berschrift2"/>
       </w:pPr>
-      <w:bookmarkStart w:id="103" w:name="_Toc242173624"/>
+      <w:bookmarkStart w:id="103" w:name="_Toc242189207"/>
       <w:r>
         <w:t>Übersicht</w:t>
       </w:r>
@@ -24158,7 +24158,7 @@
       <w:pPr>
         <w:pStyle w:val="berschrift2"/>
       </w:pPr>
-      <w:bookmarkStart w:id="104" w:name="_Toc242173625"/>
+      <w:bookmarkStart w:id="104" w:name="_Toc242189208"/>
       <w:r>
         <w:t>Verfügbarkeit</w:t>
       </w:r>
@@ -24282,7 +24282,7 @@
       <w:pPr>
         <w:pStyle w:val="berschrift2"/>
       </w:pPr>
-      <w:bookmarkStart w:id="105" w:name="_Toc242173626"/>
+      <w:bookmarkStart w:id="105" w:name="_Toc242189209"/>
       <w:r>
         <w:t>Netz oder Daten</w:t>
       </w:r>
@@ -24406,7 +24406,7 @@
       <w:pPr>
         <w:pStyle w:val="berschrift2"/>
       </w:pPr>
-      <w:bookmarkStart w:id="106" w:name="_Toc242173627"/>
+      <w:bookmarkStart w:id="106" w:name="_Toc242189210"/>
       <w:r>
         <w:t>Sicherheit</w:t>
       </w:r>
@@ -24512,7 +24512,7 @@
       <w:pPr>
         <w:pStyle w:val="berschrift2"/>
       </w:pPr>
-      <w:bookmarkStart w:id="107" w:name="_Toc242173628"/>
+      <w:bookmarkStart w:id="107" w:name="_Toc242189211"/>
       <w:r>
         <w:t>Active Directory</w:t>
       </w:r>
@@ -24621,7 +24621,7 @@
       <w:pPr>
         <w:pStyle w:val="berschrift2"/>
       </w:pPr>
-      <w:bookmarkStart w:id="108" w:name="_Toc242173629"/>
+      <w:bookmarkStart w:id="108" w:name="_Toc242189212"/>
       <w:r>
         <w:t>AD-Infrastruktur</w:t>
       </w:r>
@@ -24701,7 +24701,7 @@
       <w:pPr>
         <w:pStyle w:val="berschrift2"/>
       </w:pPr>
-      <w:bookmarkStart w:id="109" w:name="_Toc242173630"/>
+      <w:bookmarkStart w:id="109" w:name="_Toc242189213"/>
       <w:r>
         <w:t>Gruppenrichtlinien</w:t>
       </w:r>
@@ -24781,7 +24781,7 @@
       <w:pPr>
         <w:pStyle w:val="berschrift2"/>
       </w:pPr>
-      <w:bookmarkStart w:id="110" w:name="_Toc242173631"/>
+      <w:bookmarkStart w:id="110" w:name="_Toc242189214"/>
       <w:r>
         <w:t>DNS</w:t>
       </w:r>
@@ -24843,7 +24843,7 @@
       <w:pPr>
         <w:pStyle w:val="berschrift2"/>
       </w:pPr>
-      <w:bookmarkStart w:id="111" w:name="_Toc242173632"/>
+      <w:bookmarkStart w:id="111" w:name="_Toc242189215"/>
       <w:r>
         <w:t>Verlauf</w:t>
       </w:r>
@@ -24936,7 +24936,7 @@
       <w:pPr>
         <w:pStyle w:val="berschrift2"/>
       </w:pPr>
-      <w:bookmarkStart w:id="112" w:name="_Toc242173633"/>
+      <w:bookmarkStart w:id="112" w:name="_Toc242189216"/>
       <w:r>
         <w:t>Migration</w:t>
       </w:r>
@@ -25109,7 +25109,7 @@
       <w:pPr>
         <w:pStyle w:val="berschrift2"/>
       </w:pPr>
-      <w:bookmarkStart w:id="113" w:name="_Toc242173634"/>
+      <w:bookmarkStart w:id="113" w:name="_Toc242189217"/>
       <w:r>
         <w:t>Bericht</w:t>
       </w:r>
@@ -25218,7 +25218,7 @@
       <w:pPr>
         <w:pStyle w:val="berschrift2"/>
       </w:pPr>
-      <w:bookmarkStart w:id="114" w:name="_Toc242173635"/>
+      <w:bookmarkStart w:id="114" w:name="_Toc242189218"/>
       <w:r>
         <w:t>Arbeitsplätze</w:t>
       </w:r>
@@ -25324,7 +25324,7 @@
       <w:pPr>
         <w:pStyle w:val="berschrift2"/>
       </w:pPr>
-      <w:bookmarkStart w:id="115" w:name="_Toc242173636"/>
+      <w:bookmarkStart w:id="115" w:name="_Toc242189219"/>
       <w:r>
         <w:t>Kennzahlen-Glossar</w:t>
       </w:r>
@@ -25905,7 +25905,7 @@
       <w:pPr>
         <w:pStyle w:val="berschrift1"/>
       </w:pPr>
-      <w:bookmarkStart w:id="116" w:name="_Toc242173637"/>
+      <w:bookmarkStart w:id="116" w:name="_Toc242189220"/>
       <w:r>
         <w:t>Projekte</w:t>
       </w:r>
@@ -25923,7 +25923,7 @@
       <w:pPr>
         <w:pStyle w:val="berschrift2"/>
       </w:pPr>
-      <w:bookmarkStart w:id="117" w:name="_Toc242173638"/>
+      <w:bookmarkStart w:id="117" w:name="_Toc242189221"/>
       <w:r>
         <w:t>Projekte</w:t>
       </w:r>
@@ -26117,7 +26117,7 @@
       <w:pPr>
         <w:pStyle w:val="berschrift2"/>
       </w:pPr>
-      <w:bookmarkStart w:id="118" w:name="_Toc242173639"/>
+      <w:bookmarkStart w:id="118" w:name="_Toc242189222"/>
       <w:r>
         <w:t>Kennzahlen-Glossar</w:t>
       </w:r>
@@ -26532,7 +26532,7 @@
         <w:noProof/>
       </w:rPr>
       <w:drawing>
-        <wp:inline distT="0" distB="0" distL="0" distR="0" wp14:anchorId="6E0427D8" wp14:editId="30797C09">
+        <wp:inline distT="0" distB="0" distL="0" distR="0" wp14:anchorId="7F187E9E" wp14:editId="69BE64D6">
           <wp:extent cx="720000" cy="349200"/>
           <wp:effectExtent l="0" t="0" r="0" b="0"/>
           <wp:docPr id="10" name="Trafag Logo Kopf"/>
@@ -26582,9 +26582,9 @@
 <file path=word/numbering.xml><?xml version="1.0" encoding="utf-8"?>
 <w:numbering xmlns:wpc="http://schemas.microsoft.com/office/word/2010/wordprocessingCanvas" xmlns:cx="http://schemas.microsoft.com/office/drawing/2014/chartex" xmlns:cx1="http://schemas.microsoft.com/office/drawing/2015/9/8/chartex" xmlns:cx2="http://schemas.microsoft.com/office/drawing/2015/10/21/chartex" xmlns:cx3="http://schemas.microsoft.com/office/drawing/2016/5/9/chartex" xmlns:cx4="http://schemas.microsoft.com/office/drawing/2016/5/10/chartex" xmlns:cx5="http://schemas.microsoft.com/office/drawing/2016/5/11/chartex" xmlns:cx6="http://schemas.microsoft.com/office/drawing/2016/5/12/chartex" xmlns:cx7="http://schemas.microsoft.com/office/drawing/2016/5/13/chartex" xmlns:cx8="http://schemas.microsoft.com/office/drawing/2016/5/14/chartex" xmlns:mc="http://schemas.openxmlformats.org/markup-compatibility/2006" xmlns:aink="http://schemas.microsoft.com/office/drawing/2016/ink" xmlns:am3d="http://schemas.microsoft.com/office/drawing/2017/model3d" xmlns:o="urn:schemas-microsoft-com:office:office" xmlns:oel="http://schemas.microsoft.com/office/2019/extlst" xmlns:r="http://schemas.openxmlformats.org/officeDocument/2006/relationships" xmlns:m="http://schemas.openxmlformats.org/officeDocument/2006/math" xmlns:v="urn:schemas-microsoft-com:vml" xmlns:wp14="http://schemas.microsoft.com/office/word/2010/wordprocessingDrawing" xmlns:wp="http://schemas.openxmlformats.org/drawingml/2006/wordprocessingDrawing" xmlns:w10="urn:schemas-microsoft-com:office:word" xmlns:w="http://schemas.openxmlformats.org/wordprocessingml/2006/main" xmlns:w14="http://schemas.microsoft.com/office/word/2010/wordml" xmlns:w15="http://schemas.microsoft.com/office/word/2012/wordml" xmlns:w16cex="http://schemas.microsoft.com/office/word/2018/wordml/cex" xmlns:w16cid="http://schemas.microsoft.com/office/word/2016/wordml/cid" xmlns:w16="http://schemas.microsoft.com/office/word/2018/wordml" xmlns:w16du="http://schemas.microsoft.com/office/word/2023/wordml/word16du" xmlns:w16sdtdh="http://schemas.microsoft.com/office/word/2020/wordml/sdtdatahash" xmlns:w16sdtfl="http://schemas.microsoft.com/office/word/2024/wordml/sdtformatlock" xmlns:w16se="http://schemas.microsoft.com/office/word/2015/wordml/symex" xmlns:wpg="http://schemas.microsoft.com/office/word/2010/wordprocessingGroup" xmlns:wpi="http://schemas.microsoft.com/office/word/2010/wordprocessingInk" xmlns:wne="http://schemas.microsoft.com/office/word/2006/wordml" xmlns:wps="http://schemas.microsoft.com/office/word/2010/wordprocessingShape" mc:Ignorable="w14 w15 w16se w16cid w16 w16cex w16sdtdh w16sdtfl w16du wp14">
   <w:abstractNum w:abstractNumId="0" w15:restartNumberingAfterBreak="0">
-    <w:nsid w:val="79DA6B40"/>
+    <w:nsid w:val="0B921FE0"/>
     <w:multiLevelType w:val="multilevel"/>
-    <w:tmpl w:val="75547D40"/>
+    <w:tmpl w:val="02667B88"/>
     <w:lvl w:ilvl="0">
       <w:numFmt w:val="bullet"/>
       <w:lvlText w:val="•"/>
@@ -26638,7 +26638,7 @@
       <w:lvlJc w:val="left"/>
     </w:lvl>
   </w:abstractNum>
-  <w:num w:numId="1" w16cid:durableId="1987471567">
+  <w:num w:numId="1" w16cid:durableId="1463965173">
     <w:abstractNumId w:val="0"/>
   </w:num>
 </w:numbering>
@@ -27258,7 +27258,7 @@
     <w:autoRedefine/>
     <w:uiPriority w:val="39"/>
     <w:unhideWhenUsed/>
-    <w:rsid w:val="00D6584B"/>
+    <w:rsid w:val="00A74826"/>
     <w:pPr>
       <w:spacing w:after="100" w:line="278" w:lineRule="auto"/>
       <w:ind w:left="480"/>
@@ -27275,7 +27275,7 @@
     <w:autoRedefine/>
     <w:uiPriority w:val="39"/>
     <w:unhideWhenUsed/>
-    <w:rsid w:val="00D6584B"/>
+    <w:rsid w:val="00A74826"/>
     <w:pPr>
       <w:spacing w:after="100" w:line="278" w:lineRule="auto"/>
       <w:ind w:left="720"/>
@@ -27292,7 +27292,7 @@
     <w:autoRedefine/>
     <w:uiPriority w:val="39"/>
     <w:unhideWhenUsed/>
-    <w:rsid w:val="00D6584B"/>
+    <w:rsid w:val="00A74826"/>
     <w:pPr>
       <w:spacing w:after="100" w:line="278" w:lineRule="auto"/>
       <w:ind w:left="960"/>
@@ -27309,7 +27309,7 @@
     <w:autoRedefine/>
     <w:uiPriority w:val="39"/>
     <w:unhideWhenUsed/>
-    <w:rsid w:val="00D6584B"/>
+    <w:rsid w:val="00A74826"/>
     <w:pPr>
       <w:spacing w:after="100" w:line="278" w:lineRule="auto"/>
       <w:ind w:left="1200"/>
@@ -27326,7 +27326,7 @@
     <w:autoRedefine/>
     <w:uiPriority w:val="39"/>
     <w:unhideWhenUsed/>
-    <w:rsid w:val="00D6584B"/>
+    <w:rsid w:val="00A74826"/>
     <w:pPr>
       <w:spacing w:after="100" w:line="278" w:lineRule="auto"/>
       <w:ind w:left="1440"/>
@@ -27343,7 +27343,7 @@
     <w:autoRedefine/>
     <w:uiPriority w:val="39"/>
     <w:unhideWhenUsed/>
-    <w:rsid w:val="00D6584B"/>
+    <w:rsid w:val="00A74826"/>
     <w:pPr>
       <w:spacing w:after="100" w:line="278" w:lineRule="auto"/>
       <w:ind w:left="1680"/>
@@ -27360,7 +27360,7 @@
     <w:autoRedefine/>
     <w:uiPriority w:val="39"/>
     <w:unhideWhenUsed/>
-    <w:rsid w:val="00D6584B"/>
+    <w:rsid w:val="00A74826"/>
     <w:pPr>
       <w:spacing w:after="100" w:line="278" w:lineRule="auto"/>
       <w:ind w:left="1920"/>
@@ -27375,7 +27375,7 @@
     <w:basedOn w:val="Absatz-Standardschriftart"/>
     <w:uiPriority w:val="99"/>
     <w:unhideWhenUsed/>
-    <w:rsid w:val="00D6584B"/>
+    <w:rsid w:val="00A74826"/>
     <w:rPr>
       <w:color w:val="467886" w:themeColor="hyperlink"/>
       <w:u w:val="single"/>
@@ -27387,7 +27387,7 @@
     <w:uiPriority w:val="99"/>
     <w:semiHidden/>
     <w:unhideWhenUsed/>
-    <w:rsid w:val="00D6584B"/>
+    <w:rsid w:val="00A74826"/>
     <w:rPr>
       <w:color w:val="605E5C"/>
       <w:shd w:val="clear" w:color="auto" w:fill="E1DFDD"/>

</xml_diff>

<commit_message>
Finance CHF on budget rate per finance year (decision: always budget rates), CHF switch follows the profile; standard cost columns coloured in Sales_All
Co-Authored-By: Claude Opus 5.5 (1M context) <noreply@anthropic.com>
</commit_message>
<xml_diff>
--- a/TrafagSalesExporter/wwwroot/handbuch/Trafag_Cockpit_Handbuch.docx
+++ b/TrafagSalesExporter/wwwroot/handbuch/Trafag_Cockpit_Handbuch.docx
@@ -13,7 +13,7 @@
           <w:noProof/>
         </w:rPr>
         <w:drawing>
-          <wp:inline distT="0" distB="0" distL="0" distR="0" wp14:anchorId="3D7C4853" wp14:editId="63EF6C85">
+          <wp:inline distT="0" distB="0" distL="0" distR="0" wp14:anchorId="134ED2E7" wp14:editId="51FD9DA4">
             <wp:extent cx="1655999" cy="803159"/>
             <wp:effectExtent l="0" t="0" r="0" b="0"/>
             <wp:docPr id="1" name="Trafag Logo"/>
@@ -83,7 +83,7 @@
         <w:pStyle w:val="Meta"/>
       </w:pPr>
       <w:r>
-        <w:t>Stand der Software: Commit 3ad0dae vom 5. Oktober 2026 · Ausgabe 06.10.2026</w:t>
+        <w:t>Stand der Software: Commit 3ad0dae vom 5. Oktober 2026 · Ausgabe 07.10.2026</w:t>
       </w:r>
     </w:p>
     <w:p>
@@ -129,7 +129,7 @@
       <w:r>
         <w:fldChar w:fldCharType="separate"/>
       </w:r>
-      <w:hyperlink w:anchor="_Toc242189104" w:history="1">
+      <w:hyperlink w:anchor="_Toc242259310" w:history="1">
         <w:r>
           <w:rPr>
             <w:rStyle w:val="Hyperlink"/>
@@ -156,7 +156,7 @@
             <w:noProof/>
             <w:webHidden/>
           </w:rPr>
-          <w:instrText xml:space="preserve"> PAGEREF _Toc242189104 \h </w:instrText>
+          <w:instrText xml:space="preserve"> PAGEREF _Toc242259310 \h </w:instrText>
         </w:r>
         <w:r>
           <w:rPr>
@@ -199,7 +199,7 @@
           <w:sz w:val="24"/>
         </w:rPr>
       </w:pPr>
-      <w:hyperlink w:anchor="_Toc242189105" w:history="1">
+      <w:hyperlink w:anchor="_Toc242259311" w:history="1">
         <w:r>
           <w:rPr>
             <w:rStyle w:val="Hyperlink"/>
@@ -226,7 +226,7 @@
             <w:noProof/>
             <w:webHidden/>
           </w:rPr>
-          <w:instrText xml:space="preserve"> PAGEREF _Toc242189105 \h </w:instrText>
+          <w:instrText xml:space="preserve"> PAGEREF _Toc242259311 \h </w:instrText>
         </w:r>
         <w:r>
           <w:rPr>
@@ -269,7 +269,7 @@
           <w:sz w:val="24"/>
         </w:rPr>
       </w:pPr>
-      <w:hyperlink w:anchor="_Toc242189106" w:history="1">
+      <w:hyperlink w:anchor="_Toc242259312" w:history="1">
         <w:r>
           <w:rPr>
             <w:rStyle w:val="Hyperlink"/>
@@ -296,7 +296,7 @@
             <w:noProof/>
             <w:webHidden/>
           </w:rPr>
-          <w:instrText xml:space="preserve"> PAGEREF _Toc242189106 \h </w:instrText>
+          <w:instrText xml:space="preserve"> PAGEREF _Toc242259312 \h </w:instrText>
         </w:r>
         <w:r>
           <w:rPr>
@@ -339,7 +339,7 @@
           <w:sz w:val="24"/>
         </w:rPr>
       </w:pPr>
-      <w:hyperlink w:anchor="_Toc242189107" w:history="1">
+      <w:hyperlink w:anchor="_Toc242259313" w:history="1">
         <w:r>
           <w:rPr>
             <w:rStyle w:val="Hyperlink"/>
@@ -366,7 +366,7 @@
             <w:noProof/>
             <w:webHidden/>
           </w:rPr>
-          <w:instrText xml:space="preserve"> PAGEREF _Toc242189107 \h </w:instrText>
+          <w:instrText xml:space="preserve"> PAGEREF _Toc242259313 \h </w:instrText>
         </w:r>
         <w:r>
           <w:rPr>
@@ -410,7 +410,7 @@
           <w:sz w:val="24"/>
         </w:rPr>
       </w:pPr>
-      <w:hyperlink w:anchor="_Toc242189108" w:history="1">
+      <w:hyperlink w:anchor="_Toc242259314" w:history="1">
         <w:r>
           <w:rPr>
             <w:rStyle w:val="Hyperlink"/>
@@ -437,7 +437,7 @@
             <w:noProof/>
             <w:webHidden/>
           </w:rPr>
-          <w:instrText xml:space="preserve"> PAGEREF _Toc242189108 \h </w:instrText>
+          <w:instrText xml:space="preserve"> PAGEREF _Toc242259314 \h </w:instrText>
         </w:r>
         <w:r>
           <w:rPr>
@@ -480,7 +480,7 @@
           <w:sz w:val="24"/>
         </w:rPr>
       </w:pPr>
-      <w:hyperlink w:anchor="_Toc242189109" w:history="1">
+      <w:hyperlink w:anchor="_Toc242259315" w:history="1">
         <w:r>
           <w:rPr>
             <w:rStyle w:val="Hyperlink"/>
@@ -507,7 +507,7 @@
             <w:noProof/>
             <w:webHidden/>
           </w:rPr>
-          <w:instrText xml:space="preserve"> PAGEREF _Toc242189109 \h </w:instrText>
+          <w:instrText xml:space="preserve"> PAGEREF _Toc242259315 \h </w:instrText>
         </w:r>
         <w:r>
           <w:rPr>
@@ -550,7 +550,7 @@
           <w:sz w:val="24"/>
         </w:rPr>
       </w:pPr>
-      <w:hyperlink w:anchor="_Toc242189110" w:history="1">
+      <w:hyperlink w:anchor="_Toc242259316" w:history="1">
         <w:r>
           <w:rPr>
             <w:rStyle w:val="Hyperlink"/>
@@ -577,7 +577,7 @@
             <w:noProof/>
             <w:webHidden/>
           </w:rPr>
-          <w:instrText xml:space="preserve"> PAGEREF _Toc242189110 \h </w:instrText>
+          <w:instrText xml:space="preserve"> PAGEREF _Toc242259316 \h </w:instrText>
         </w:r>
         <w:r>
           <w:rPr>
@@ -620,7 +620,7 @@
           <w:sz w:val="24"/>
         </w:rPr>
       </w:pPr>
-      <w:hyperlink w:anchor="_Toc242189111" w:history="1">
+      <w:hyperlink w:anchor="_Toc242259317" w:history="1">
         <w:r>
           <w:rPr>
             <w:rStyle w:val="Hyperlink"/>
@@ -647,7 +647,7 @@
             <w:noProof/>
             <w:webHidden/>
           </w:rPr>
-          <w:instrText xml:space="preserve"> PAGEREF _Toc242189111 \h </w:instrText>
+          <w:instrText xml:space="preserve"> PAGEREF _Toc242259317 \h </w:instrText>
         </w:r>
         <w:r>
           <w:rPr>
@@ -690,7 +690,7 @@
           <w:sz w:val="24"/>
         </w:rPr>
       </w:pPr>
-      <w:hyperlink w:anchor="_Toc242189112" w:history="1">
+      <w:hyperlink w:anchor="_Toc242259318" w:history="1">
         <w:r>
           <w:rPr>
             <w:rStyle w:val="Hyperlink"/>
@@ -717,7 +717,7 @@
             <w:noProof/>
             <w:webHidden/>
           </w:rPr>
-          <w:instrText xml:space="preserve"> PAGEREF _Toc242189112 \h </w:instrText>
+          <w:instrText xml:space="preserve"> PAGEREF _Toc242259318 \h </w:instrText>
         </w:r>
         <w:r>
           <w:rPr>
@@ -760,7 +760,7 @@
           <w:sz w:val="24"/>
         </w:rPr>
       </w:pPr>
-      <w:hyperlink w:anchor="_Toc242189113" w:history="1">
+      <w:hyperlink w:anchor="_Toc242259319" w:history="1">
         <w:r>
           <w:rPr>
             <w:rStyle w:val="Hyperlink"/>
@@ -787,7 +787,7 @@
             <w:noProof/>
             <w:webHidden/>
           </w:rPr>
-          <w:instrText xml:space="preserve"> PAGEREF _Toc242189113 \h </w:instrText>
+          <w:instrText xml:space="preserve"> PAGEREF _Toc242259319 \h </w:instrText>
         </w:r>
         <w:r>
           <w:rPr>
@@ -830,7 +830,7 @@
           <w:sz w:val="24"/>
         </w:rPr>
       </w:pPr>
-      <w:hyperlink w:anchor="_Toc242189114" w:history="1">
+      <w:hyperlink w:anchor="_Toc242259320" w:history="1">
         <w:r>
           <w:rPr>
             <w:rStyle w:val="Hyperlink"/>
@@ -857,7 +857,7 @@
             <w:noProof/>
             <w:webHidden/>
           </w:rPr>
-          <w:instrText xml:space="preserve"> PAGEREF _Toc242189114 \h </w:instrText>
+          <w:instrText xml:space="preserve"> PAGEREF _Toc242259320 \h </w:instrText>
         </w:r>
         <w:r>
           <w:rPr>
@@ -900,7 +900,7 @@
           <w:sz w:val="24"/>
         </w:rPr>
       </w:pPr>
-      <w:hyperlink w:anchor="_Toc242189115" w:history="1">
+      <w:hyperlink w:anchor="_Toc242259321" w:history="1">
         <w:r>
           <w:rPr>
             <w:rStyle w:val="Hyperlink"/>
@@ -927,7 +927,7 @@
             <w:noProof/>
             <w:webHidden/>
           </w:rPr>
-          <w:instrText xml:space="preserve"> PAGEREF _Toc242189115 \h </w:instrText>
+          <w:instrText xml:space="preserve"> PAGEREF _Toc242259321 \h </w:instrText>
         </w:r>
         <w:r>
           <w:rPr>
@@ -970,7 +970,7 @@
           <w:sz w:val="24"/>
         </w:rPr>
       </w:pPr>
-      <w:hyperlink w:anchor="_Toc242189116" w:history="1">
+      <w:hyperlink w:anchor="_Toc242259322" w:history="1">
         <w:r>
           <w:rPr>
             <w:rStyle w:val="Hyperlink"/>
@@ -997,7 +997,7 @@
             <w:noProof/>
             <w:webHidden/>
           </w:rPr>
-          <w:instrText xml:space="preserve"> PAGEREF _Toc242189116 \h </w:instrText>
+          <w:instrText xml:space="preserve"> PAGEREF _Toc242259322 \h </w:instrText>
         </w:r>
         <w:r>
           <w:rPr>
@@ -1040,7 +1040,7 @@
           <w:sz w:val="24"/>
         </w:rPr>
       </w:pPr>
-      <w:hyperlink w:anchor="_Toc242189117" w:history="1">
+      <w:hyperlink w:anchor="_Toc242259323" w:history="1">
         <w:r>
           <w:rPr>
             <w:rStyle w:val="Hyperlink"/>
@@ -1067,7 +1067,7 @@
             <w:noProof/>
             <w:webHidden/>
           </w:rPr>
-          <w:instrText xml:space="preserve"> PAGEREF _Toc242189117 \h </w:instrText>
+          <w:instrText xml:space="preserve"> PAGEREF _Toc242259323 \h </w:instrText>
         </w:r>
         <w:r>
           <w:rPr>
@@ -1110,7 +1110,7 @@
           <w:sz w:val="24"/>
         </w:rPr>
       </w:pPr>
-      <w:hyperlink w:anchor="_Toc242189118" w:history="1">
+      <w:hyperlink w:anchor="_Toc242259324" w:history="1">
         <w:r>
           <w:rPr>
             <w:rStyle w:val="Hyperlink"/>
@@ -1137,7 +1137,7 @@
             <w:noProof/>
             <w:webHidden/>
           </w:rPr>
-          <w:instrText xml:space="preserve"> PAGEREF _Toc242189118 \h </w:instrText>
+          <w:instrText xml:space="preserve"> PAGEREF _Toc242259324 \h </w:instrText>
         </w:r>
         <w:r>
           <w:rPr>
@@ -1180,7 +1180,7 @@
           <w:sz w:val="24"/>
         </w:rPr>
       </w:pPr>
-      <w:hyperlink w:anchor="_Toc242189119" w:history="1">
+      <w:hyperlink w:anchor="_Toc242259325" w:history="1">
         <w:r>
           <w:rPr>
             <w:rStyle w:val="Hyperlink"/>
@@ -1207,7 +1207,7 @@
             <w:noProof/>
             <w:webHidden/>
           </w:rPr>
-          <w:instrText xml:space="preserve"> PAGEREF _Toc242189119 \h </w:instrText>
+          <w:instrText xml:space="preserve"> PAGEREF _Toc242259325 \h </w:instrText>
         </w:r>
         <w:r>
           <w:rPr>
@@ -1250,7 +1250,7 @@
           <w:sz w:val="24"/>
         </w:rPr>
       </w:pPr>
-      <w:hyperlink w:anchor="_Toc242189120" w:history="1">
+      <w:hyperlink w:anchor="_Toc242259326" w:history="1">
         <w:r>
           <w:rPr>
             <w:rStyle w:val="Hyperlink"/>
@@ -1277,7 +1277,7 @@
             <w:noProof/>
             <w:webHidden/>
           </w:rPr>
-          <w:instrText xml:space="preserve"> PAGEREF _Toc242189120 \h </w:instrText>
+          <w:instrText xml:space="preserve"> PAGEREF _Toc242259326 \h </w:instrText>
         </w:r>
         <w:r>
           <w:rPr>
@@ -1320,7 +1320,7 @@
           <w:sz w:val="24"/>
         </w:rPr>
       </w:pPr>
-      <w:hyperlink w:anchor="_Toc242189121" w:history="1">
+      <w:hyperlink w:anchor="_Toc242259327" w:history="1">
         <w:r>
           <w:rPr>
             <w:rStyle w:val="Hyperlink"/>
@@ -1347,7 +1347,7 @@
             <w:noProof/>
             <w:webHidden/>
           </w:rPr>
-          <w:instrText xml:space="preserve"> PAGEREF _Toc242189121 \h </w:instrText>
+          <w:instrText xml:space="preserve"> PAGEREF _Toc242259327 \h </w:instrText>
         </w:r>
         <w:r>
           <w:rPr>
@@ -1390,7 +1390,7 @@
           <w:sz w:val="24"/>
         </w:rPr>
       </w:pPr>
-      <w:hyperlink w:anchor="_Toc242189122" w:history="1">
+      <w:hyperlink w:anchor="_Toc242259328" w:history="1">
         <w:r>
           <w:rPr>
             <w:rStyle w:val="Hyperlink"/>
@@ -1417,7 +1417,7 @@
             <w:noProof/>
             <w:webHidden/>
           </w:rPr>
-          <w:instrText xml:space="preserve"> PAGEREF _Toc242189122 \h </w:instrText>
+          <w:instrText xml:space="preserve"> PAGEREF _Toc242259328 \h </w:instrText>
         </w:r>
         <w:r>
           <w:rPr>
@@ -1460,7 +1460,7 @@
           <w:sz w:val="24"/>
         </w:rPr>
       </w:pPr>
-      <w:hyperlink w:anchor="_Toc242189123" w:history="1">
+      <w:hyperlink w:anchor="_Toc242259329" w:history="1">
         <w:r>
           <w:rPr>
             <w:rStyle w:val="Hyperlink"/>
@@ -1487,7 +1487,7 @@
             <w:noProof/>
             <w:webHidden/>
           </w:rPr>
-          <w:instrText xml:space="preserve"> PAGEREF _Toc242189123 \h </w:instrText>
+          <w:instrText xml:space="preserve"> PAGEREF _Toc242259329 \h </w:instrText>
         </w:r>
         <w:r>
           <w:rPr>
@@ -1530,7 +1530,7 @@
           <w:sz w:val="24"/>
         </w:rPr>
       </w:pPr>
-      <w:hyperlink w:anchor="_Toc242189124" w:history="1">
+      <w:hyperlink w:anchor="_Toc242259330" w:history="1">
         <w:r>
           <w:rPr>
             <w:rStyle w:val="Hyperlink"/>
@@ -1557,7 +1557,7 @@
             <w:noProof/>
             <w:webHidden/>
           </w:rPr>
-          <w:instrText xml:space="preserve"> PAGEREF _Toc242189124 \h </w:instrText>
+          <w:instrText xml:space="preserve"> PAGEREF _Toc242259330 \h </w:instrText>
         </w:r>
         <w:r>
           <w:rPr>
@@ -1600,7 +1600,7 @@
           <w:sz w:val="24"/>
         </w:rPr>
       </w:pPr>
-      <w:hyperlink w:anchor="_Toc242189125" w:history="1">
+      <w:hyperlink w:anchor="_Toc242259331" w:history="1">
         <w:r>
           <w:rPr>
             <w:rStyle w:val="Hyperlink"/>
@@ -1627,7 +1627,7 @@
             <w:noProof/>
             <w:webHidden/>
           </w:rPr>
-          <w:instrText xml:space="preserve"> PAGEREF _Toc242189125 \h </w:instrText>
+          <w:instrText xml:space="preserve"> PAGEREF _Toc242259331 \h </w:instrText>
         </w:r>
         <w:r>
           <w:rPr>
@@ -1670,7 +1670,7 @@
           <w:sz w:val="24"/>
         </w:rPr>
       </w:pPr>
-      <w:hyperlink w:anchor="_Toc242189126" w:history="1">
+      <w:hyperlink w:anchor="_Toc242259332" w:history="1">
         <w:r>
           <w:rPr>
             <w:rStyle w:val="Hyperlink"/>
@@ -1697,7 +1697,7 @@
             <w:noProof/>
             <w:webHidden/>
           </w:rPr>
-          <w:instrText xml:space="preserve"> PAGEREF _Toc242189126 \h </w:instrText>
+          <w:instrText xml:space="preserve"> PAGEREF _Toc242259332 \h </w:instrText>
         </w:r>
         <w:r>
           <w:rPr>
@@ -1740,7 +1740,7 @@
           <w:sz w:val="24"/>
         </w:rPr>
       </w:pPr>
-      <w:hyperlink w:anchor="_Toc242189127" w:history="1">
+      <w:hyperlink w:anchor="_Toc242259333" w:history="1">
         <w:r>
           <w:rPr>
             <w:rStyle w:val="Hyperlink"/>
@@ -1767,7 +1767,7 @@
             <w:noProof/>
             <w:webHidden/>
           </w:rPr>
-          <w:instrText xml:space="preserve"> PAGEREF _Toc242189127 \h </w:instrText>
+          <w:instrText xml:space="preserve"> PAGEREF _Toc242259333 \h </w:instrText>
         </w:r>
         <w:r>
           <w:rPr>
@@ -1810,7 +1810,7 @@
           <w:sz w:val="24"/>
         </w:rPr>
       </w:pPr>
-      <w:hyperlink w:anchor="_Toc242189128" w:history="1">
+      <w:hyperlink w:anchor="_Toc242259334" w:history="1">
         <w:r>
           <w:rPr>
             <w:rStyle w:val="Hyperlink"/>
@@ -1837,7 +1837,7 @@
             <w:noProof/>
             <w:webHidden/>
           </w:rPr>
-          <w:instrText xml:space="preserve"> PAGEREF _Toc242189128 \h </w:instrText>
+          <w:instrText xml:space="preserve"> PAGEREF _Toc242259334 \h </w:instrText>
         </w:r>
         <w:r>
           <w:rPr>
@@ -1880,7 +1880,7 @@
           <w:sz w:val="24"/>
         </w:rPr>
       </w:pPr>
-      <w:hyperlink w:anchor="_Toc242189129" w:history="1">
+      <w:hyperlink w:anchor="_Toc242259335" w:history="1">
         <w:r>
           <w:rPr>
             <w:rStyle w:val="Hyperlink"/>
@@ -1907,7 +1907,7 @@
             <w:noProof/>
             <w:webHidden/>
           </w:rPr>
-          <w:instrText xml:space="preserve"> PAGEREF _Toc242189129 \h </w:instrText>
+          <w:instrText xml:space="preserve"> PAGEREF _Toc242259335 \h </w:instrText>
         </w:r>
         <w:r>
           <w:rPr>
@@ -1950,7 +1950,7 @@
           <w:sz w:val="24"/>
         </w:rPr>
       </w:pPr>
-      <w:hyperlink w:anchor="_Toc242189130" w:history="1">
+      <w:hyperlink w:anchor="_Toc242259336" w:history="1">
         <w:r>
           <w:rPr>
             <w:rStyle w:val="Hyperlink"/>
@@ -1977,7 +1977,7 @@
             <w:noProof/>
             <w:webHidden/>
           </w:rPr>
-          <w:instrText xml:space="preserve"> PAGEREF _Toc242189130 \h </w:instrText>
+          <w:instrText xml:space="preserve"> PAGEREF _Toc242259336 \h </w:instrText>
         </w:r>
         <w:r>
           <w:rPr>
@@ -2020,7 +2020,7 @@
           <w:sz w:val="24"/>
         </w:rPr>
       </w:pPr>
-      <w:hyperlink w:anchor="_Toc242189131" w:history="1">
+      <w:hyperlink w:anchor="_Toc242259337" w:history="1">
         <w:r>
           <w:rPr>
             <w:rStyle w:val="Hyperlink"/>
@@ -2047,7 +2047,7 @@
             <w:noProof/>
             <w:webHidden/>
           </w:rPr>
-          <w:instrText xml:space="preserve"> PAGEREF _Toc242189131 \h </w:instrText>
+          <w:instrText xml:space="preserve"> PAGEREF _Toc242259337 \h </w:instrText>
         </w:r>
         <w:r>
           <w:rPr>
@@ -2090,7 +2090,7 @@
           <w:sz w:val="24"/>
         </w:rPr>
       </w:pPr>
-      <w:hyperlink w:anchor="_Toc242189132" w:history="1">
+      <w:hyperlink w:anchor="_Toc242259338" w:history="1">
         <w:r>
           <w:rPr>
             <w:rStyle w:val="Hyperlink"/>
@@ -2117,7 +2117,7 @@
             <w:noProof/>
             <w:webHidden/>
           </w:rPr>
-          <w:instrText xml:space="preserve"> PAGEREF _Toc242189132 \h </w:instrText>
+          <w:instrText xml:space="preserve"> PAGEREF _Toc242259338 \h </w:instrText>
         </w:r>
         <w:r>
           <w:rPr>
@@ -2160,7 +2160,7 @@
           <w:sz w:val="24"/>
         </w:rPr>
       </w:pPr>
-      <w:hyperlink w:anchor="_Toc242189133" w:history="1">
+      <w:hyperlink w:anchor="_Toc242259339" w:history="1">
         <w:r>
           <w:rPr>
             <w:rStyle w:val="Hyperlink"/>
@@ -2187,7 +2187,7 @@
             <w:noProof/>
             <w:webHidden/>
           </w:rPr>
-          <w:instrText xml:space="preserve"> PAGEREF _Toc242189133 \h </w:instrText>
+          <w:instrText xml:space="preserve"> PAGEREF _Toc242259339 \h </w:instrText>
         </w:r>
         <w:r>
           <w:rPr>
@@ -2231,7 +2231,7 @@
           <w:sz w:val="24"/>
         </w:rPr>
       </w:pPr>
-      <w:hyperlink w:anchor="_Toc242189134" w:history="1">
+      <w:hyperlink w:anchor="_Toc242259340" w:history="1">
         <w:r>
           <w:rPr>
             <w:rStyle w:val="Hyperlink"/>
@@ -2258,7 +2258,7 @@
             <w:noProof/>
             <w:webHidden/>
           </w:rPr>
-          <w:instrText xml:space="preserve"> PAGEREF _Toc242189134 \h </w:instrText>
+          <w:instrText xml:space="preserve"> PAGEREF _Toc242259340 \h </w:instrText>
         </w:r>
         <w:r>
           <w:rPr>
@@ -2301,7 +2301,7 @@
           <w:sz w:val="24"/>
         </w:rPr>
       </w:pPr>
-      <w:hyperlink w:anchor="_Toc242189135" w:history="1">
+      <w:hyperlink w:anchor="_Toc242259341" w:history="1">
         <w:r>
           <w:rPr>
             <w:rStyle w:val="Hyperlink"/>
@@ -2328,7 +2328,7 @@
             <w:noProof/>
             <w:webHidden/>
           </w:rPr>
-          <w:instrText xml:space="preserve"> PAGEREF _Toc242189135 \h </w:instrText>
+          <w:instrText xml:space="preserve"> PAGEREF _Toc242259341 \h </w:instrText>
         </w:r>
         <w:r>
           <w:rPr>
@@ -2371,7 +2371,7 @@
           <w:sz w:val="24"/>
         </w:rPr>
       </w:pPr>
-      <w:hyperlink w:anchor="_Toc242189136" w:history="1">
+      <w:hyperlink w:anchor="_Toc242259342" w:history="1">
         <w:r>
           <w:rPr>
             <w:rStyle w:val="Hyperlink"/>
@@ -2398,7 +2398,7 @@
             <w:noProof/>
             <w:webHidden/>
           </w:rPr>
-          <w:instrText xml:space="preserve"> PAGEREF _Toc242189136 \h </w:instrText>
+          <w:instrText xml:space="preserve"> PAGEREF _Toc242259342 \h </w:instrText>
         </w:r>
         <w:r>
           <w:rPr>
@@ -2441,7 +2441,7 @@
           <w:sz w:val="24"/>
         </w:rPr>
       </w:pPr>
-      <w:hyperlink w:anchor="_Toc242189137" w:history="1">
+      <w:hyperlink w:anchor="_Toc242259343" w:history="1">
         <w:r>
           <w:rPr>
             <w:rStyle w:val="Hyperlink"/>
@@ -2468,7 +2468,7 @@
             <w:noProof/>
             <w:webHidden/>
           </w:rPr>
-          <w:instrText xml:space="preserve"> PAGEREF _Toc242189137 \h </w:instrText>
+          <w:instrText xml:space="preserve"> PAGEREF _Toc242259343 \h </w:instrText>
         </w:r>
         <w:r>
           <w:rPr>
@@ -2511,7 +2511,7 @@
           <w:sz w:val="24"/>
         </w:rPr>
       </w:pPr>
-      <w:hyperlink w:anchor="_Toc242189138" w:history="1">
+      <w:hyperlink w:anchor="_Toc242259344" w:history="1">
         <w:r>
           <w:rPr>
             <w:rStyle w:val="Hyperlink"/>
@@ -2538,7 +2538,7 @@
             <w:noProof/>
             <w:webHidden/>
           </w:rPr>
-          <w:instrText xml:space="preserve"> PAGEREF _Toc242189138 \h </w:instrText>
+          <w:instrText xml:space="preserve"> PAGEREF _Toc242259344 \h </w:instrText>
         </w:r>
         <w:r>
           <w:rPr>
@@ -2581,7 +2581,7 @@
           <w:sz w:val="24"/>
         </w:rPr>
       </w:pPr>
-      <w:hyperlink w:anchor="_Toc242189139" w:history="1">
+      <w:hyperlink w:anchor="_Toc242259345" w:history="1">
         <w:r>
           <w:rPr>
             <w:rStyle w:val="Hyperlink"/>
@@ -2608,7 +2608,7 @@
             <w:noProof/>
             <w:webHidden/>
           </w:rPr>
-          <w:instrText xml:space="preserve"> PAGEREF _Toc242189139 \h </w:instrText>
+          <w:instrText xml:space="preserve"> PAGEREF _Toc242259345 \h </w:instrText>
         </w:r>
         <w:r>
           <w:rPr>
@@ -2651,7 +2651,7 @@
           <w:sz w:val="24"/>
         </w:rPr>
       </w:pPr>
-      <w:hyperlink w:anchor="_Toc242189140" w:history="1">
+      <w:hyperlink w:anchor="_Toc242259346" w:history="1">
         <w:r>
           <w:rPr>
             <w:rStyle w:val="Hyperlink"/>
@@ -2678,7 +2678,7 @@
             <w:noProof/>
             <w:webHidden/>
           </w:rPr>
-          <w:instrText xml:space="preserve"> PAGEREF _Toc242189140 \h </w:instrText>
+          <w:instrText xml:space="preserve"> PAGEREF _Toc242259346 \h </w:instrText>
         </w:r>
         <w:r>
           <w:rPr>
@@ -2721,7 +2721,7 @@
           <w:sz w:val="24"/>
         </w:rPr>
       </w:pPr>
-      <w:hyperlink w:anchor="_Toc242189141" w:history="1">
+      <w:hyperlink w:anchor="_Toc242259347" w:history="1">
         <w:r>
           <w:rPr>
             <w:rStyle w:val="Hyperlink"/>
@@ -2748,7 +2748,7 @@
             <w:noProof/>
             <w:webHidden/>
           </w:rPr>
-          <w:instrText xml:space="preserve"> PAGEREF _Toc242189141 \h </w:instrText>
+          <w:instrText xml:space="preserve"> PAGEREF _Toc242259347 \h </w:instrText>
         </w:r>
         <w:r>
           <w:rPr>
@@ -2791,7 +2791,7 @@
           <w:sz w:val="24"/>
         </w:rPr>
       </w:pPr>
-      <w:hyperlink w:anchor="_Toc242189142" w:history="1">
+      <w:hyperlink w:anchor="_Toc242259348" w:history="1">
         <w:r>
           <w:rPr>
             <w:rStyle w:val="Hyperlink"/>
@@ -2818,7 +2818,7 @@
             <w:noProof/>
             <w:webHidden/>
           </w:rPr>
-          <w:instrText xml:space="preserve"> PAGEREF _Toc242189142 \h </w:instrText>
+          <w:instrText xml:space="preserve"> PAGEREF _Toc242259348 \h </w:instrText>
         </w:r>
         <w:r>
           <w:rPr>
@@ -2861,7 +2861,7 @@
           <w:sz w:val="24"/>
         </w:rPr>
       </w:pPr>
-      <w:hyperlink w:anchor="_Toc242189143" w:history="1">
+      <w:hyperlink w:anchor="_Toc242259349" w:history="1">
         <w:r>
           <w:rPr>
             <w:rStyle w:val="Hyperlink"/>
@@ -2888,7 +2888,7 @@
             <w:noProof/>
             <w:webHidden/>
           </w:rPr>
-          <w:instrText xml:space="preserve"> PAGEREF _Toc242189143 \h </w:instrText>
+          <w:instrText xml:space="preserve"> PAGEREF _Toc242259349 \h </w:instrText>
         </w:r>
         <w:r>
           <w:rPr>
@@ -2931,7 +2931,7 @@
           <w:sz w:val="24"/>
         </w:rPr>
       </w:pPr>
-      <w:hyperlink w:anchor="_Toc242189144" w:history="1">
+      <w:hyperlink w:anchor="_Toc242259350" w:history="1">
         <w:r>
           <w:rPr>
             <w:rStyle w:val="Hyperlink"/>
@@ -2958,7 +2958,7 @@
             <w:noProof/>
             <w:webHidden/>
           </w:rPr>
-          <w:instrText xml:space="preserve"> PAGEREF _Toc242189144 \h </w:instrText>
+          <w:instrText xml:space="preserve"> PAGEREF _Toc242259350 \h </w:instrText>
         </w:r>
         <w:r>
           <w:rPr>
@@ -3001,7 +3001,7 @@
           <w:sz w:val="24"/>
         </w:rPr>
       </w:pPr>
-      <w:hyperlink w:anchor="_Toc242189145" w:history="1">
+      <w:hyperlink w:anchor="_Toc242259351" w:history="1">
         <w:r>
           <w:rPr>
             <w:rStyle w:val="Hyperlink"/>
@@ -3028,7 +3028,7 @@
             <w:noProof/>
             <w:webHidden/>
           </w:rPr>
-          <w:instrText xml:space="preserve"> PAGEREF _Toc242189145 \h </w:instrText>
+          <w:instrText xml:space="preserve"> PAGEREF _Toc242259351 \h </w:instrText>
         </w:r>
         <w:r>
           <w:rPr>
@@ -3071,7 +3071,7 @@
           <w:sz w:val="24"/>
         </w:rPr>
       </w:pPr>
-      <w:hyperlink w:anchor="_Toc242189146" w:history="1">
+      <w:hyperlink w:anchor="_Toc242259352" w:history="1">
         <w:r>
           <w:rPr>
             <w:rStyle w:val="Hyperlink"/>
@@ -3098,7 +3098,7 @@
             <w:noProof/>
             <w:webHidden/>
           </w:rPr>
-          <w:instrText xml:space="preserve"> PAGEREF _Toc242189146 \h </w:instrText>
+          <w:instrText xml:space="preserve"> PAGEREF _Toc242259352 \h </w:instrText>
         </w:r>
         <w:r>
           <w:rPr>
@@ -3141,7 +3141,7 @@
           <w:sz w:val="24"/>
         </w:rPr>
       </w:pPr>
-      <w:hyperlink w:anchor="_Toc242189147" w:history="1">
+      <w:hyperlink w:anchor="_Toc242259353" w:history="1">
         <w:r>
           <w:rPr>
             <w:rStyle w:val="Hyperlink"/>
@@ -3168,7 +3168,7 @@
             <w:noProof/>
             <w:webHidden/>
           </w:rPr>
-          <w:instrText xml:space="preserve"> PAGEREF _Toc242189147 \h </w:instrText>
+          <w:instrText xml:space="preserve"> PAGEREF _Toc242259353 \h </w:instrText>
         </w:r>
         <w:r>
           <w:rPr>
@@ -3211,7 +3211,7 @@
           <w:sz w:val="24"/>
         </w:rPr>
       </w:pPr>
-      <w:hyperlink w:anchor="_Toc242189148" w:history="1">
+      <w:hyperlink w:anchor="_Toc242259354" w:history="1">
         <w:r>
           <w:rPr>
             <w:rStyle w:val="Hyperlink"/>
@@ -3238,7 +3238,7 @@
             <w:noProof/>
             <w:webHidden/>
           </w:rPr>
-          <w:instrText xml:space="preserve"> PAGEREF _Toc242189148 \h </w:instrText>
+          <w:instrText xml:space="preserve"> PAGEREF _Toc242259354 \h </w:instrText>
         </w:r>
         <w:r>
           <w:rPr>
@@ -3281,7 +3281,7 @@
           <w:sz w:val="24"/>
         </w:rPr>
       </w:pPr>
-      <w:hyperlink w:anchor="_Toc242189149" w:history="1">
+      <w:hyperlink w:anchor="_Toc242259355" w:history="1">
         <w:r>
           <w:rPr>
             <w:rStyle w:val="Hyperlink"/>
@@ -3308,7 +3308,7 @@
             <w:noProof/>
             <w:webHidden/>
           </w:rPr>
-          <w:instrText xml:space="preserve"> PAGEREF _Toc242189149 \h </w:instrText>
+          <w:instrText xml:space="preserve"> PAGEREF _Toc242259355 \h </w:instrText>
         </w:r>
         <w:r>
           <w:rPr>
@@ -3351,7 +3351,7 @@
           <w:sz w:val="24"/>
         </w:rPr>
       </w:pPr>
-      <w:hyperlink w:anchor="_Toc242189150" w:history="1">
+      <w:hyperlink w:anchor="_Toc242259356" w:history="1">
         <w:r>
           <w:rPr>
             <w:rStyle w:val="Hyperlink"/>
@@ -3378,7 +3378,7 @@
             <w:noProof/>
             <w:webHidden/>
           </w:rPr>
-          <w:instrText xml:space="preserve"> PAGEREF _Toc242189150 \h </w:instrText>
+          <w:instrText xml:space="preserve"> PAGEREF _Toc242259356 \h </w:instrText>
         </w:r>
         <w:r>
           <w:rPr>
@@ -3421,7 +3421,7 @@
           <w:sz w:val="24"/>
         </w:rPr>
       </w:pPr>
-      <w:hyperlink w:anchor="_Toc242189151" w:history="1">
+      <w:hyperlink w:anchor="_Toc242259357" w:history="1">
         <w:r>
           <w:rPr>
             <w:rStyle w:val="Hyperlink"/>
@@ -3448,7 +3448,7 @@
             <w:noProof/>
             <w:webHidden/>
           </w:rPr>
-          <w:instrText xml:space="preserve"> PAGEREF _Toc242189151 \h </w:instrText>
+          <w:instrText xml:space="preserve"> PAGEREF _Toc242259357 \h </w:instrText>
         </w:r>
         <w:r>
           <w:rPr>
@@ -3491,7 +3491,7 @@
           <w:sz w:val="24"/>
         </w:rPr>
       </w:pPr>
-      <w:hyperlink w:anchor="_Toc242189152" w:history="1">
+      <w:hyperlink w:anchor="_Toc242259358" w:history="1">
         <w:r>
           <w:rPr>
             <w:rStyle w:val="Hyperlink"/>
@@ -3518,7 +3518,7 @@
             <w:noProof/>
             <w:webHidden/>
           </w:rPr>
-          <w:instrText xml:space="preserve"> PAGEREF _Toc242189152 \h </w:instrText>
+          <w:instrText xml:space="preserve"> PAGEREF _Toc242259358 \h </w:instrText>
         </w:r>
         <w:r>
           <w:rPr>
@@ -3561,7 +3561,7 @@
           <w:sz w:val="24"/>
         </w:rPr>
       </w:pPr>
-      <w:hyperlink w:anchor="_Toc242189153" w:history="1">
+      <w:hyperlink w:anchor="_Toc242259359" w:history="1">
         <w:r>
           <w:rPr>
             <w:rStyle w:val="Hyperlink"/>
@@ -3588,7 +3588,7 @@
             <w:noProof/>
             <w:webHidden/>
           </w:rPr>
-          <w:instrText xml:space="preserve"> PAGEREF _Toc242189153 \h </w:instrText>
+          <w:instrText xml:space="preserve"> PAGEREF _Toc242259359 \h </w:instrText>
         </w:r>
         <w:r>
           <w:rPr>
@@ -3631,7 +3631,7 @@
           <w:sz w:val="24"/>
         </w:rPr>
       </w:pPr>
-      <w:hyperlink w:anchor="_Toc242189154" w:history="1">
+      <w:hyperlink w:anchor="_Toc242259360" w:history="1">
         <w:r>
           <w:rPr>
             <w:rStyle w:val="Hyperlink"/>
@@ -3658,7 +3658,7 @@
             <w:noProof/>
             <w:webHidden/>
           </w:rPr>
-          <w:instrText xml:space="preserve"> PAGEREF _Toc242189154 \h </w:instrText>
+          <w:instrText xml:space="preserve"> PAGEREF _Toc242259360 \h </w:instrText>
         </w:r>
         <w:r>
           <w:rPr>
@@ -3701,7 +3701,7 @@
           <w:sz w:val="24"/>
         </w:rPr>
       </w:pPr>
-      <w:hyperlink w:anchor="_Toc242189155" w:history="1">
+      <w:hyperlink w:anchor="_Toc242259361" w:history="1">
         <w:r>
           <w:rPr>
             <w:rStyle w:val="Hyperlink"/>
@@ -3728,7 +3728,7 @@
             <w:noProof/>
             <w:webHidden/>
           </w:rPr>
-          <w:instrText xml:space="preserve"> PAGEREF _Toc242189155 \h </w:instrText>
+          <w:instrText xml:space="preserve"> PAGEREF _Toc242259361 \h </w:instrText>
         </w:r>
         <w:r>
           <w:rPr>
@@ -3772,7 +3772,7 @@
           <w:sz w:val="24"/>
         </w:rPr>
       </w:pPr>
-      <w:hyperlink w:anchor="_Toc242189156" w:history="1">
+      <w:hyperlink w:anchor="_Toc242259362" w:history="1">
         <w:r>
           <w:rPr>
             <w:rStyle w:val="Hyperlink"/>
@@ -3799,7 +3799,7 @@
             <w:noProof/>
             <w:webHidden/>
           </w:rPr>
-          <w:instrText xml:space="preserve"> PAGEREF _Toc242189156 \h </w:instrText>
+          <w:instrText xml:space="preserve"> PAGEREF _Toc242259362 \h </w:instrText>
         </w:r>
         <w:r>
           <w:rPr>
@@ -3842,7 +3842,7 @@
           <w:sz w:val="24"/>
         </w:rPr>
       </w:pPr>
-      <w:hyperlink w:anchor="_Toc242189157" w:history="1">
+      <w:hyperlink w:anchor="_Toc242259363" w:history="1">
         <w:r>
           <w:rPr>
             <w:rStyle w:val="Hyperlink"/>
@@ -3869,7 +3869,7 @@
             <w:noProof/>
             <w:webHidden/>
           </w:rPr>
-          <w:instrText xml:space="preserve"> PAGEREF _Toc242189157 \h </w:instrText>
+          <w:instrText xml:space="preserve"> PAGEREF _Toc242259363 \h </w:instrText>
         </w:r>
         <w:r>
           <w:rPr>
@@ -3912,7 +3912,7 @@
           <w:sz w:val="24"/>
         </w:rPr>
       </w:pPr>
-      <w:hyperlink w:anchor="_Toc242189158" w:history="1">
+      <w:hyperlink w:anchor="_Toc242259364" w:history="1">
         <w:r>
           <w:rPr>
             <w:rStyle w:val="Hyperlink"/>
@@ -3939,7 +3939,7 @@
             <w:noProof/>
             <w:webHidden/>
           </w:rPr>
-          <w:instrText xml:space="preserve"> PAGEREF _Toc242189158 \h </w:instrText>
+          <w:instrText xml:space="preserve"> PAGEREF _Toc242259364 \h </w:instrText>
         </w:r>
         <w:r>
           <w:rPr>
@@ -3982,7 +3982,7 @@
           <w:sz w:val="24"/>
         </w:rPr>
       </w:pPr>
-      <w:hyperlink w:anchor="_Toc242189159" w:history="1">
+      <w:hyperlink w:anchor="_Toc242259365" w:history="1">
         <w:r>
           <w:rPr>
             <w:rStyle w:val="Hyperlink"/>
@@ -4009,7 +4009,7 @@
             <w:noProof/>
             <w:webHidden/>
           </w:rPr>
-          <w:instrText xml:space="preserve"> PAGEREF _Toc242189159 \h </w:instrText>
+          <w:instrText xml:space="preserve"> PAGEREF _Toc242259365 \h </w:instrText>
         </w:r>
         <w:r>
           <w:rPr>
@@ -4052,7 +4052,7 @@
           <w:sz w:val="24"/>
         </w:rPr>
       </w:pPr>
-      <w:hyperlink w:anchor="_Toc242189160" w:history="1">
+      <w:hyperlink w:anchor="_Toc242259366" w:history="1">
         <w:r>
           <w:rPr>
             <w:rStyle w:val="Hyperlink"/>
@@ -4079,7 +4079,7 @@
             <w:noProof/>
             <w:webHidden/>
           </w:rPr>
-          <w:instrText xml:space="preserve"> PAGEREF _Toc242189160 \h </w:instrText>
+          <w:instrText xml:space="preserve"> PAGEREF _Toc242259366 \h </w:instrText>
         </w:r>
         <w:r>
           <w:rPr>
@@ -4122,7 +4122,7 @@
           <w:sz w:val="24"/>
         </w:rPr>
       </w:pPr>
-      <w:hyperlink w:anchor="_Toc242189161" w:history="1">
+      <w:hyperlink w:anchor="_Toc242259367" w:history="1">
         <w:r>
           <w:rPr>
             <w:rStyle w:val="Hyperlink"/>
@@ -4149,7 +4149,7 @@
             <w:noProof/>
             <w:webHidden/>
           </w:rPr>
-          <w:instrText xml:space="preserve"> PAGEREF _Toc242189161 \h </w:instrText>
+          <w:instrText xml:space="preserve"> PAGEREF _Toc242259367 \h </w:instrText>
         </w:r>
         <w:r>
           <w:rPr>
@@ -4192,7 +4192,7 @@
           <w:sz w:val="24"/>
         </w:rPr>
       </w:pPr>
-      <w:hyperlink w:anchor="_Toc242189162" w:history="1">
+      <w:hyperlink w:anchor="_Toc242259368" w:history="1">
         <w:r>
           <w:rPr>
             <w:rStyle w:val="Hyperlink"/>
@@ -4219,7 +4219,7 @@
             <w:noProof/>
             <w:webHidden/>
           </w:rPr>
-          <w:instrText xml:space="preserve"> PAGEREF _Toc242189162 \h </w:instrText>
+          <w:instrText xml:space="preserve"> PAGEREF _Toc242259368 \h </w:instrText>
         </w:r>
         <w:r>
           <w:rPr>
@@ -4262,7 +4262,7 @@
           <w:sz w:val="24"/>
         </w:rPr>
       </w:pPr>
-      <w:hyperlink w:anchor="_Toc242189163" w:history="1">
+      <w:hyperlink w:anchor="_Toc242259369" w:history="1">
         <w:r>
           <w:rPr>
             <w:rStyle w:val="Hyperlink"/>
@@ -4289,7 +4289,7 @@
             <w:noProof/>
             <w:webHidden/>
           </w:rPr>
-          <w:instrText xml:space="preserve"> PAGEREF _Toc242189163 \h </w:instrText>
+          <w:instrText xml:space="preserve"> PAGEREF _Toc242259369 \h </w:instrText>
         </w:r>
         <w:r>
           <w:rPr>
@@ -4332,7 +4332,7 @@
           <w:sz w:val="24"/>
         </w:rPr>
       </w:pPr>
-      <w:hyperlink w:anchor="_Toc242189164" w:history="1">
+      <w:hyperlink w:anchor="_Toc242259370" w:history="1">
         <w:r>
           <w:rPr>
             <w:rStyle w:val="Hyperlink"/>
@@ -4359,7 +4359,7 @@
             <w:noProof/>
             <w:webHidden/>
           </w:rPr>
-          <w:instrText xml:space="preserve"> PAGEREF _Toc242189164 \h </w:instrText>
+          <w:instrText xml:space="preserve"> PAGEREF _Toc242259370 \h </w:instrText>
         </w:r>
         <w:r>
           <w:rPr>
@@ -4402,7 +4402,7 @@
           <w:sz w:val="24"/>
         </w:rPr>
       </w:pPr>
-      <w:hyperlink w:anchor="_Toc242189165" w:history="1">
+      <w:hyperlink w:anchor="_Toc242259371" w:history="1">
         <w:r>
           <w:rPr>
             <w:rStyle w:val="Hyperlink"/>
@@ -4429,7 +4429,7 @@
             <w:noProof/>
             <w:webHidden/>
           </w:rPr>
-          <w:instrText xml:space="preserve"> PAGEREF _Toc242189165 \h </w:instrText>
+          <w:instrText xml:space="preserve"> PAGEREF _Toc242259371 \h </w:instrText>
         </w:r>
         <w:r>
           <w:rPr>
@@ -4472,7 +4472,7 @@
           <w:sz w:val="24"/>
         </w:rPr>
       </w:pPr>
-      <w:hyperlink w:anchor="_Toc242189166" w:history="1">
+      <w:hyperlink w:anchor="_Toc242259372" w:history="1">
         <w:r>
           <w:rPr>
             <w:rStyle w:val="Hyperlink"/>
@@ -4499,7 +4499,7 @@
             <w:noProof/>
             <w:webHidden/>
           </w:rPr>
-          <w:instrText xml:space="preserve"> PAGEREF _Toc242189166 \h </w:instrText>
+          <w:instrText xml:space="preserve"> PAGEREF _Toc242259372 \h </w:instrText>
         </w:r>
         <w:r>
           <w:rPr>
@@ -4542,7 +4542,7 @@
           <w:sz w:val="24"/>
         </w:rPr>
       </w:pPr>
-      <w:hyperlink w:anchor="_Toc242189167" w:history="1">
+      <w:hyperlink w:anchor="_Toc242259373" w:history="1">
         <w:r>
           <w:rPr>
             <w:rStyle w:val="Hyperlink"/>
@@ -4569,7 +4569,7 @@
             <w:noProof/>
             <w:webHidden/>
           </w:rPr>
-          <w:instrText xml:space="preserve"> PAGEREF _Toc242189167 \h </w:instrText>
+          <w:instrText xml:space="preserve"> PAGEREF _Toc242259373 \h </w:instrText>
         </w:r>
         <w:r>
           <w:rPr>
@@ -4612,7 +4612,7 @@
           <w:sz w:val="24"/>
         </w:rPr>
       </w:pPr>
-      <w:hyperlink w:anchor="_Toc242189168" w:history="1">
+      <w:hyperlink w:anchor="_Toc242259374" w:history="1">
         <w:r>
           <w:rPr>
             <w:rStyle w:val="Hyperlink"/>
@@ -4639,7 +4639,7 @@
             <w:noProof/>
             <w:webHidden/>
           </w:rPr>
-          <w:instrText xml:space="preserve"> PAGEREF _Toc242189168 \h </w:instrText>
+          <w:instrText xml:space="preserve"> PAGEREF _Toc242259374 \h </w:instrText>
         </w:r>
         <w:r>
           <w:rPr>
@@ -4682,7 +4682,7 @@
           <w:sz w:val="24"/>
         </w:rPr>
       </w:pPr>
-      <w:hyperlink w:anchor="_Toc242189169" w:history="1">
+      <w:hyperlink w:anchor="_Toc242259375" w:history="1">
         <w:r>
           <w:rPr>
             <w:rStyle w:val="Hyperlink"/>
@@ -4709,7 +4709,7 @@
             <w:noProof/>
             <w:webHidden/>
           </w:rPr>
-          <w:instrText xml:space="preserve"> PAGEREF _Toc242189169 \h </w:instrText>
+          <w:instrText xml:space="preserve"> PAGEREF _Toc242259375 \h </w:instrText>
         </w:r>
         <w:r>
           <w:rPr>
@@ -4752,7 +4752,7 @@
           <w:sz w:val="24"/>
         </w:rPr>
       </w:pPr>
-      <w:hyperlink w:anchor="_Toc242189170" w:history="1">
+      <w:hyperlink w:anchor="_Toc242259376" w:history="1">
         <w:r>
           <w:rPr>
             <w:rStyle w:val="Hyperlink"/>
@@ -4779,7 +4779,7 @@
             <w:noProof/>
             <w:webHidden/>
           </w:rPr>
-          <w:instrText xml:space="preserve"> PAGEREF _Toc242189170 \h </w:instrText>
+          <w:instrText xml:space="preserve"> PAGEREF _Toc242259376 \h </w:instrText>
         </w:r>
         <w:r>
           <w:rPr>
@@ -4822,7 +4822,7 @@
           <w:sz w:val="24"/>
         </w:rPr>
       </w:pPr>
-      <w:hyperlink w:anchor="_Toc242189171" w:history="1">
+      <w:hyperlink w:anchor="_Toc242259377" w:history="1">
         <w:r>
           <w:rPr>
             <w:rStyle w:val="Hyperlink"/>
@@ -4849,7 +4849,7 @@
             <w:noProof/>
             <w:webHidden/>
           </w:rPr>
-          <w:instrText xml:space="preserve"> PAGEREF _Toc242189171 \h </w:instrText>
+          <w:instrText xml:space="preserve"> PAGEREF _Toc242259377 \h </w:instrText>
         </w:r>
         <w:r>
           <w:rPr>
@@ -4892,7 +4892,7 @@
           <w:sz w:val="24"/>
         </w:rPr>
       </w:pPr>
-      <w:hyperlink w:anchor="_Toc242189172" w:history="1">
+      <w:hyperlink w:anchor="_Toc242259378" w:history="1">
         <w:r>
           <w:rPr>
             <w:rStyle w:val="Hyperlink"/>
@@ -4919,7 +4919,7 @@
             <w:noProof/>
             <w:webHidden/>
           </w:rPr>
-          <w:instrText xml:space="preserve"> PAGEREF _Toc242189172 \h </w:instrText>
+          <w:instrText xml:space="preserve"> PAGEREF _Toc242259378 \h </w:instrText>
         </w:r>
         <w:r>
           <w:rPr>
@@ -4962,7 +4962,7 @@
           <w:sz w:val="24"/>
         </w:rPr>
       </w:pPr>
-      <w:hyperlink w:anchor="_Toc242189173" w:history="1">
+      <w:hyperlink w:anchor="_Toc242259379" w:history="1">
         <w:r>
           <w:rPr>
             <w:rStyle w:val="Hyperlink"/>
@@ -4989,7 +4989,7 @@
             <w:noProof/>
             <w:webHidden/>
           </w:rPr>
-          <w:instrText xml:space="preserve"> PAGEREF _Toc242189173 \h </w:instrText>
+          <w:instrText xml:space="preserve"> PAGEREF _Toc242259379 \h </w:instrText>
         </w:r>
         <w:r>
           <w:rPr>
@@ -5032,7 +5032,7 @@
           <w:sz w:val="24"/>
         </w:rPr>
       </w:pPr>
-      <w:hyperlink w:anchor="_Toc242189174" w:history="1">
+      <w:hyperlink w:anchor="_Toc242259380" w:history="1">
         <w:r>
           <w:rPr>
             <w:rStyle w:val="Hyperlink"/>
@@ -5059,7 +5059,7 @@
             <w:noProof/>
             <w:webHidden/>
           </w:rPr>
-          <w:instrText xml:space="preserve"> PAGEREF _Toc242189174 \h </w:instrText>
+          <w:instrText xml:space="preserve"> PAGEREF _Toc242259380 \h </w:instrText>
         </w:r>
         <w:r>
           <w:rPr>
@@ -5102,7 +5102,7 @@
           <w:sz w:val="24"/>
         </w:rPr>
       </w:pPr>
-      <w:hyperlink w:anchor="_Toc242189175" w:history="1">
+      <w:hyperlink w:anchor="_Toc242259381" w:history="1">
         <w:r>
           <w:rPr>
             <w:rStyle w:val="Hyperlink"/>
@@ -5129,7 +5129,7 @@
             <w:noProof/>
             <w:webHidden/>
           </w:rPr>
-          <w:instrText xml:space="preserve"> PAGEREF _Toc242189175 \h </w:instrText>
+          <w:instrText xml:space="preserve"> PAGEREF _Toc242259381 \h </w:instrText>
         </w:r>
         <w:r>
           <w:rPr>
@@ -5173,7 +5173,7 @@
           <w:sz w:val="24"/>
         </w:rPr>
       </w:pPr>
-      <w:hyperlink w:anchor="_Toc242189176" w:history="1">
+      <w:hyperlink w:anchor="_Toc242259382" w:history="1">
         <w:r>
           <w:rPr>
             <w:rStyle w:val="Hyperlink"/>
@@ -5200,7 +5200,7 @@
             <w:noProof/>
             <w:webHidden/>
           </w:rPr>
-          <w:instrText xml:space="preserve"> PAGEREF _Toc242189176 \h </w:instrText>
+          <w:instrText xml:space="preserve"> PAGEREF _Toc242259382 \h </w:instrText>
         </w:r>
         <w:r>
           <w:rPr>
@@ -5243,7 +5243,7 @@
           <w:sz w:val="24"/>
         </w:rPr>
       </w:pPr>
-      <w:hyperlink w:anchor="_Toc242189177" w:history="1">
+      <w:hyperlink w:anchor="_Toc242259383" w:history="1">
         <w:r>
           <w:rPr>
             <w:rStyle w:val="Hyperlink"/>
@@ -5270,7 +5270,7 @@
             <w:noProof/>
             <w:webHidden/>
           </w:rPr>
-          <w:instrText xml:space="preserve"> PAGEREF _Toc242189177 \h </w:instrText>
+          <w:instrText xml:space="preserve"> PAGEREF _Toc242259383 \h </w:instrText>
         </w:r>
         <w:r>
           <w:rPr>
@@ -5313,7 +5313,7 @@
           <w:sz w:val="24"/>
         </w:rPr>
       </w:pPr>
-      <w:hyperlink w:anchor="_Toc242189178" w:history="1">
+      <w:hyperlink w:anchor="_Toc242259384" w:history="1">
         <w:r>
           <w:rPr>
             <w:rStyle w:val="Hyperlink"/>
@@ -5340,7 +5340,7 @@
             <w:noProof/>
             <w:webHidden/>
           </w:rPr>
-          <w:instrText xml:space="preserve"> PAGEREF _Toc242189178 \h </w:instrText>
+          <w:instrText xml:space="preserve"> PAGEREF _Toc242259384 \h </w:instrText>
         </w:r>
         <w:r>
           <w:rPr>
@@ -5383,7 +5383,7 @@
           <w:sz w:val="24"/>
         </w:rPr>
       </w:pPr>
-      <w:hyperlink w:anchor="_Toc242189179" w:history="1">
+      <w:hyperlink w:anchor="_Toc242259385" w:history="1">
         <w:r>
           <w:rPr>
             <w:rStyle w:val="Hyperlink"/>
@@ -5410,7 +5410,7 @@
             <w:noProof/>
             <w:webHidden/>
           </w:rPr>
-          <w:instrText xml:space="preserve"> PAGEREF _Toc242189179 \h </w:instrText>
+          <w:instrText xml:space="preserve"> PAGEREF _Toc242259385 \h </w:instrText>
         </w:r>
         <w:r>
           <w:rPr>
@@ -5453,7 +5453,7 @@
           <w:sz w:val="24"/>
         </w:rPr>
       </w:pPr>
-      <w:hyperlink w:anchor="_Toc242189180" w:history="1">
+      <w:hyperlink w:anchor="_Toc242259386" w:history="1">
         <w:r>
           <w:rPr>
             <w:rStyle w:val="Hyperlink"/>
@@ -5480,7 +5480,7 @@
             <w:noProof/>
             <w:webHidden/>
           </w:rPr>
-          <w:instrText xml:space="preserve"> PAGEREF _Toc242189180 \h </w:instrText>
+          <w:instrText xml:space="preserve"> PAGEREF _Toc242259386 \h </w:instrText>
         </w:r>
         <w:r>
           <w:rPr>
@@ -5523,7 +5523,7 @@
           <w:sz w:val="24"/>
         </w:rPr>
       </w:pPr>
-      <w:hyperlink w:anchor="_Toc242189181" w:history="1">
+      <w:hyperlink w:anchor="_Toc242259387" w:history="1">
         <w:r>
           <w:rPr>
             <w:rStyle w:val="Hyperlink"/>
@@ -5550,7 +5550,7 @@
             <w:noProof/>
             <w:webHidden/>
           </w:rPr>
-          <w:instrText xml:space="preserve"> PAGEREF _Toc242189181 \h </w:instrText>
+          <w:instrText xml:space="preserve"> PAGEREF _Toc242259387 \h </w:instrText>
         </w:r>
         <w:r>
           <w:rPr>
@@ -5593,7 +5593,7 @@
           <w:sz w:val="24"/>
         </w:rPr>
       </w:pPr>
-      <w:hyperlink w:anchor="_Toc242189182" w:history="1">
+      <w:hyperlink w:anchor="_Toc242259388" w:history="1">
         <w:r>
           <w:rPr>
             <w:rStyle w:val="Hyperlink"/>
@@ -5620,7 +5620,7 @@
             <w:noProof/>
             <w:webHidden/>
           </w:rPr>
-          <w:instrText xml:space="preserve"> PAGEREF _Toc242189182 \h </w:instrText>
+          <w:instrText xml:space="preserve"> PAGEREF _Toc242259388 \h </w:instrText>
         </w:r>
         <w:r>
           <w:rPr>
@@ -5663,7 +5663,7 @@
           <w:sz w:val="24"/>
         </w:rPr>
       </w:pPr>
-      <w:hyperlink w:anchor="_Toc242189183" w:history="1">
+      <w:hyperlink w:anchor="_Toc242259389" w:history="1">
         <w:r>
           <w:rPr>
             <w:rStyle w:val="Hyperlink"/>
@@ -5690,7 +5690,7 @@
             <w:noProof/>
             <w:webHidden/>
           </w:rPr>
-          <w:instrText xml:space="preserve"> PAGEREF _Toc242189183 \h </w:instrText>
+          <w:instrText xml:space="preserve"> PAGEREF _Toc242259389 \h </w:instrText>
         </w:r>
         <w:r>
           <w:rPr>
@@ -5733,7 +5733,7 @@
           <w:sz w:val="24"/>
         </w:rPr>
       </w:pPr>
-      <w:hyperlink w:anchor="_Toc242189184" w:history="1">
+      <w:hyperlink w:anchor="_Toc242259390" w:history="1">
         <w:r>
           <w:rPr>
             <w:rStyle w:val="Hyperlink"/>
@@ -5760,7 +5760,7 @@
             <w:noProof/>
             <w:webHidden/>
           </w:rPr>
-          <w:instrText xml:space="preserve"> PAGEREF _Toc242189184 \h </w:instrText>
+          <w:instrText xml:space="preserve"> PAGEREF _Toc242259390 \h </w:instrText>
         </w:r>
         <w:r>
           <w:rPr>
@@ -5803,7 +5803,7 @@
           <w:sz w:val="24"/>
         </w:rPr>
       </w:pPr>
-      <w:hyperlink w:anchor="_Toc242189185" w:history="1">
+      <w:hyperlink w:anchor="_Toc242259391" w:history="1">
         <w:r>
           <w:rPr>
             <w:rStyle w:val="Hyperlink"/>
@@ -5830,7 +5830,7 @@
             <w:noProof/>
             <w:webHidden/>
           </w:rPr>
-          <w:instrText xml:space="preserve"> PAGEREF _Toc242189185 \h </w:instrText>
+          <w:instrText xml:space="preserve"> PAGEREF _Toc242259391 \h </w:instrText>
         </w:r>
         <w:r>
           <w:rPr>
@@ -5873,7 +5873,7 @@
           <w:sz w:val="24"/>
         </w:rPr>
       </w:pPr>
-      <w:hyperlink w:anchor="_Toc242189186" w:history="1">
+      <w:hyperlink w:anchor="_Toc242259392" w:history="1">
         <w:r>
           <w:rPr>
             <w:rStyle w:val="Hyperlink"/>
@@ -5900,7 +5900,7 @@
             <w:noProof/>
             <w:webHidden/>
           </w:rPr>
-          <w:instrText xml:space="preserve"> PAGEREF _Toc242189186 \h </w:instrText>
+          <w:instrText xml:space="preserve"> PAGEREF _Toc242259392 \h </w:instrText>
         </w:r>
         <w:r>
           <w:rPr>
@@ -5943,7 +5943,7 @@
           <w:sz w:val="24"/>
         </w:rPr>
       </w:pPr>
-      <w:hyperlink w:anchor="_Toc242189187" w:history="1">
+      <w:hyperlink w:anchor="_Toc242259393" w:history="1">
         <w:r>
           <w:rPr>
             <w:rStyle w:val="Hyperlink"/>
@@ -5970,7 +5970,7 @@
             <w:noProof/>
             <w:webHidden/>
           </w:rPr>
-          <w:instrText xml:space="preserve"> PAGEREF _Toc242189187 \h </w:instrText>
+          <w:instrText xml:space="preserve"> PAGEREF _Toc242259393 \h </w:instrText>
         </w:r>
         <w:r>
           <w:rPr>
@@ -6014,7 +6014,7 @@
           <w:sz w:val="24"/>
         </w:rPr>
       </w:pPr>
-      <w:hyperlink w:anchor="_Toc242189188" w:history="1">
+      <w:hyperlink w:anchor="_Toc242259394" w:history="1">
         <w:r>
           <w:rPr>
             <w:rStyle w:val="Hyperlink"/>
@@ -6041,7 +6041,7 @@
             <w:noProof/>
             <w:webHidden/>
           </w:rPr>
-          <w:instrText xml:space="preserve"> PAGEREF _Toc242189188 \h </w:instrText>
+          <w:instrText xml:space="preserve"> PAGEREF _Toc242259394 \h </w:instrText>
         </w:r>
         <w:r>
           <w:rPr>
@@ -6084,7 +6084,7 @@
           <w:sz w:val="24"/>
         </w:rPr>
       </w:pPr>
-      <w:hyperlink w:anchor="_Toc242189189" w:history="1">
+      <w:hyperlink w:anchor="_Toc242259395" w:history="1">
         <w:r>
           <w:rPr>
             <w:rStyle w:val="Hyperlink"/>
@@ -6111,7 +6111,7 @@
             <w:noProof/>
             <w:webHidden/>
           </w:rPr>
-          <w:instrText xml:space="preserve"> PAGEREF _Toc242189189 \h </w:instrText>
+          <w:instrText xml:space="preserve"> PAGEREF _Toc242259395 \h </w:instrText>
         </w:r>
         <w:r>
           <w:rPr>
@@ -6154,7 +6154,7 @@
           <w:sz w:val="24"/>
         </w:rPr>
       </w:pPr>
-      <w:hyperlink w:anchor="_Toc242189190" w:history="1">
+      <w:hyperlink w:anchor="_Toc242259396" w:history="1">
         <w:r>
           <w:rPr>
             <w:rStyle w:val="Hyperlink"/>
@@ -6181,7 +6181,7 @@
             <w:noProof/>
             <w:webHidden/>
           </w:rPr>
-          <w:instrText xml:space="preserve"> PAGEREF _Toc242189190 \h </w:instrText>
+          <w:instrText xml:space="preserve"> PAGEREF _Toc242259396 \h </w:instrText>
         </w:r>
         <w:r>
           <w:rPr>
@@ -6224,7 +6224,7 @@
           <w:sz w:val="24"/>
         </w:rPr>
       </w:pPr>
-      <w:hyperlink w:anchor="_Toc242189191" w:history="1">
+      <w:hyperlink w:anchor="_Toc242259397" w:history="1">
         <w:r>
           <w:rPr>
             <w:rStyle w:val="Hyperlink"/>
@@ -6251,7 +6251,7 @@
             <w:noProof/>
             <w:webHidden/>
           </w:rPr>
-          <w:instrText xml:space="preserve"> PAGEREF _Toc242189191 \h </w:instrText>
+          <w:instrText xml:space="preserve"> PAGEREF _Toc242259397 \h </w:instrText>
         </w:r>
         <w:r>
           <w:rPr>
@@ -6294,7 +6294,7 @@
           <w:sz w:val="24"/>
         </w:rPr>
       </w:pPr>
-      <w:hyperlink w:anchor="_Toc242189192" w:history="1">
+      <w:hyperlink w:anchor="_Toc242259398" w:history="1">
         <w:r>
           <w:rPr>
             <w:rStyle w:val="Hyperlink"/>
@@ -6321,7 +6321,7 @@
             <w:noProof/>
             <w:webHidden/>
           </w:rPr>
-          <w:instrText xml:space="preserve"> PAGEREF _Toc242189192 \h </w:instrText>
+          <w:instrText xml:space="preserve"> PAGEREF _Toc242259398 \h </w:instrText>
         </w:r>
         <w:r>
           <w:rPr>
@@ -6364,7 +6364,7 @@
           <w:sz w:val="24"/>
         </w:rPr>
       </w:pPr>
-      <w:hyperlink w:anchor="_Toc242189193" w:history="1">
+      <w:hyperlink w:anchor="_Toc242259399" w:history="1">
         <w:r>
           <w:rPr>
             <w:rStyle w:val="Hyperlink"/>
@@ -6391,7 +6391,7 @@
             <w:noProof/>
             <w:webHidden/>
           </w:rPr>
-          <w:instrText xml:space="preserve"> PAGEREF _Toc242189193 \h </w:instrText>
+          <w:instrText xml:space="preserve"> PAGEREF _Toc242259399 \h </w:instrText>
         </w:r>
         <w:r>
           <w:rPr>
@@ -6434,7 +6434,7 @@
           <w:sz w:val="24"/>
         </w:rPr>
       </w:pPr>
-      <w:hyperlink w:anchor="_Toc242189194" w:history="1">
+      <w:hyperlink w:anchor="_Toc242259400" w:history="1">
         <w:r>
           <w:rPr>
             <w:rStyle w:val="Hyperlink"/>
@@ -6461,7 +6461,7 @@
             <w:noProof/>
             <w:webHidden/>
           </w:rPr>
-          <w:instrText xml:space="preserve"> PAGEREF _Toc242189194 \h </w:instrText>
+          <w:instrText xml:space="preserve"> PAGEREF _Toc242259400 \h </w:instrText>
         </w:r>
         <w:r>
           <w:rPr>
@@ -6504,7 +6504,7 @@
           <w:sz w:val="24"/>
         </w:rPr>
       </w:pPr>
-      <w:hyperlink w:anchor="_Toc242189195" w:history="1">
+      <w:hyperlink w:anchor="_Toc242259401" w:history="1">
         <w:r>
           <w:rPr>
             <w:rStyle w:val="Hyperlink"/>
@@ -6531,7 +6531,7 @@
             <w:noProof/>
             <w:webHidden/>
           </w:rPr>
-          <w:instrText xml:space="preserve"> PAGEREF _Toc242189195 \h </w:instrText>
+          <w:instrText xml:space="preserve"> PAGEREF _Toc242259401 \h </w:instrText>
         </w:r>
         <w:r>
           <w:rPr>
@@ -6574,7 +6574,7 @@
           <w:sz w:val="24"/>
         </w:rPr>
       </w:pPr>
-      <w:hyperlink w:anchor="_Toc242189196" w:history="1">
+      <w:hyperlink w:anchor="_Toc242259402" w:history="1">
         <w:r>
           <w:rPr>
             <w:rStyle w:val="Hyperlink"/>
@@ -6601,7 +6601,7 @@
             <w:noProof/>
             <w:webHidden/>
           </w:rPr>
-          <w:instrText xml:space="preserve"> PAGEREF _Toc242189196 \h </w:instrText>
+          <w:instrText xml:space="preserve"> PAGEREF _Toc242259402 \h </w:instrText>
         </w:r>
         <w:r>
           <w:rPr>
@@ -6644,7 +6644,7 @@
           <w:sz w:val="24"/>
         </w:rPr>
       </w:pPr>
-      <w:hyperlink w:anchor="_Toc242189197" w:history="1">
+      <w:hyperlink w:anchor="_Toc242259403" w:history="1">
         <w:r>
           <w:rPr>
             <w:rStyle w:val="Hyperlink"/>
@@ -6671,7 +6671,7 @@
             <w:noProof/>
             <w:webHidden/>
           </w:rPr>
-          <w:instrText xml:space="preserve"> PAGEREF _Toc242189197 \h </w:instrText>
+          <w:instrText xml:space="preserve"> PAGEREF _Toc242259403 \h </w:instrText>
         </w:r>
         <w:r>
           <w:rPr>
@@ -6714,7 +6714,7 @@
           <w:sz w:val="24"/>
         </w:rPr>
       </w:pPr>
-      <w:hyperlink w:anchor="_Toc242189198" w:history="1">
+      <w:hyperlink w:anchor="_Toc242259404" w:history="1">
         <w:r>
           <w:rPr>
             <w:rStyle w:val="Hyperlink"/>
@@ -6741,7 +6741,7 @@
             <w:noProof/>
             <w:webHidden/>
           </w:rPr>
-          <w:instrText xml:space="preserve"> PAGEREF _Toc242189198 \h </w:instrText>
+          <w:instrText xml:space="preserve"> PAGEREF _Toc242259404 \h </w:instrText>
         </w:r>
         <w:r>
           <w:rPr>
@@ -6784,7 +6784,7 @@
           <w:sz w:val="24"/>
         </w:rPr>
       </w:pPr>
-      <w:hyperlink w:anchor="_Toc242189199" w:history="1">
+      <w:hyperlink w:anchor="_Toc242259405" w:history="1">
         <w:r>
           <w:rPr>
             <w:rStyle w:val="Hyperlink"/>
@@ -6811,7 +6811,7 @@
             <w:noProof/>
             <w:webHidden/>
           </w:rPr>
-          <w:instrText xml:space="preserve"> PAGEREF _Toc242189199 \h </w:instrText>
+          <w:instrText xml:space="preserve"> PAGEREF _Toc242259405 \h </w:instrText>
         </w:r>
         <w:r>
           <w:rPr>
@@ -6855,7 +6855,7 @@
           <w:sz w:val="24"/>
         </w:rPr>
       </w:pPr>
-      <w:hyperlink w:anchor="_Toc242189200" w:history="1">
+      <w:hyperlink w:anchor="_Toc242259406" w:history="1">
         <w:r>
           <w:rPr>
             <w:rStyle w:val="Hyperlink"/>
@@ -6882,7 +6882,7 @@
             <w:noProof/>
             <w:webHidden/>
           </w:rPr>
-          <w:instrText xml:space="preserve"> PAGEREF _Toc242189200 \h </w:instrText>
+          <w:instrText xml:space="preserve"> PAGEREF _Toc242259406 \h </w:instrText>
         </w:r>
         <w:r>
           <w:rPr>
@@ -6925,7 +6925,7 @@
           <w:sz w:val="24"/>
         </w:rPr>
       </w:pPr>
-      <w:hyperlink w:anchor="_Toc242189201" w:history="1">
+      <w:hyperlink w:anchor="_Toc242259407" w:history="1">
         <w:r>
           <w:rPr>
             <w:rStyle w:val="Hyperlink"/>
@@ -6952,7 +6952,7 @@
             <w:noProof/>
             <w:webHidden/>
           </w:rPr>
-          <w:instrText xml:space="preserve"> PAGEREF _Toc242189201 \h </w:instrText>
+          <w:instrText xml:space="preserve"> PAGEREF _Toc242259407 \h </w:instrText>
         </w:r>
         <w:r>
           <w:rPr>
@@ -6995,7 +6995,7 @@
           <w:sz w:val="24"/>
         </w:rPr>
       </w:pPr>
-      <w:hyperlink w:anchor="_Toc242189202" w:history="1">
+      <w:hyperlink w:anchor="_Toc242259408" w:history="1">
         <w:r>
           <w:rPr>
             <w:rStyle w:val="Hyperlink"/>
@@ -7022,7 +7022,7 @@
             <w:noProof/>
             <w:webHidden/>
           </w:rPr>
-          <w:instrText xml:space="preserve"> PAGEREF _Toc242189202 \h </w:instrText>
+          <w:instrText xml:space="preserve"> PAGEREF _Toc242259408 \h </w:instrText>
         </w:r>
         <w:r>
           <w:rPr>
@@ -7065,7 +7065,7 @@
           <w:sz w:val="24"/>
         </w:rPr>
       </w:pPr>
-      <w:hyperlink w:anchor="_Toc242189203" w:history="1">
+      <w:hyperlink w:anchor="_Toc242259409" w:history="1">
         <w:r>
           <w:rPr>
             <w:rStyle w:val="Hyperlink"/>
@@ -7092,7 +7092,7 @@
             <w:noProof/>
             <w:webHidden/>
           </w:rPr>
-          <w:instrText xml:space="preserve"> PAGEREF _Toc242189203 \h </w:instrText>
+          <w:instrText xml:space="preserve"> PAGEREF _Toc242259409 \h </w:instrText>
         </w:r>
         <w:r>
           <w:rPr>
@@ -7135,7 +7135,7 @@
           <w:sz w:val="24"/>
         </w:rPr>
       </w:pPr>
-      <w:hyperlink w:anchor="_Toc242189204" w:history="1">
+      <w:hyperlink w:anchor="_Toc242259410" w:history="1">
         <w:r>
           <w:rPr>
             <w:rStyle w:val="Hyperlink"/>
@@ -7162,7 +7162,7 @@
             <w:noProof/>
             <w:webHidden/>
           </w:rPr>
-          <w:instrText xml:space="preserve"> PAGEREF _Toc242189204 \h </w:instrText>
+          <w:instrText xml:space="preserve"> PAGEREF _Toc242259410 \h </w:instrText>
         </w:r>
         <w:r>
           <w:rPr>
@@ -7205,7 +7205,7 @@
           <w:sz w:val="24"/>
         </w:rPr>
       </w:pPr>
-      <w:hyperlink w:anchor="_Toc242189205" w:history="1">
+      <w:hyperlink w:anchor="_Toc242259411" w:history="1">
         <w:r>
           <w:rPr>
             <w:rStyle w:val="Hyperlink"/>
@@ -7232,7 +7232,7 @@
             <w:noProof/>
             <w:webHidden/>
           </w:rPr>
-          <w:instrText xml:space="preserve"> PAGEREF _Toc242189205 \h </w:instrText>
+          <w:instrText xml:space="preserve"> PAGEREF _Toc242259411 \h </w:instrText>
         </w:r>
         <w:r>
           <w:rPr>
@@ -7276,7 +7276,7 @@
           <w:sz w:val="24"/>
         </w:rPr>
       </w:pPr>
-      <w:hyperlink w:anchor="_Toc242189206" w:history="1">
+      <w:hyperlink w:anchor="_Toc242259412" w:history="1">
         <w:r>
           <w:rPr>
             <w:rStyle w:val="Hyperlink"/>
@@ -7303,7 +7303,7 @@
             <w:noProof/>
             <w:webHidden/>
           </w:rPr>
-          <w:instrText xml:space="preserve"> PAGEREF _Toc242189206 \h </w:instrText>
+          <w:instrText xml:space="preserve"> PAGEREF _Toc242259412 \h </w:instrText>
         </w:r>
         <w:r>
           <w:rPr>
@@ -7346,7 +7346,7 @@
           <w:sz w:val="24"/>
         </w:rPr>
       </w:pPr>
-      <w:hyperlink w:anchor="_Toc242189207" w:history="1">
+      <w:hyperlink w:anchor="_Toc242259413" w:history="1">
         <w:r>
           <w:rPr>
             <w:rStyle w:val="Hyperlink"/>
@@ -7373,7 +7373,7 @@
             <w:noProof/>
             <w:webHidden/>
           </w:rPr>
-          <w:instrText xml:space="preserve"> PAGEREF _Toc242189207 \h </w:instrText>
+          <w:instrText xml:space="preserve"> PAGEREF _Toc242259413 \h </w:instrText>
         </w:r>
         <w:r>
           <w:rPr>
@@ -7416,7 +7416,7 @@
           <w:sz w:val="24"/>
         </w:rPr>
       </w:pPr>
-      <w:hyperlink w:anchor="_Toc242189208" w:history="1">
+      <w:hyperlink w:anchor="_Toc242259414" w:history="1">
         <w:r>
           <w:rPr>
             <w:rStyle w:val="Hyperlink"/>
@@ -7443,7 +7443,7 @@
             <w:noProof/>
             <w:webHidden/>
           </w:rPr>
-          <w:instrText xml:space="preserve"> PAGEREF _Toc242189208 \h </w:instrText>
+          <w:instrText xml:space="preserve"> PAGEREF _Toc242259414 \h </w:instrText>
         </w:r>
         <w:r>
           <w:rPr>
@@ -7486,7 +7486,7 @@
           <w:sz w:val="24"/>
         </w:rPr>
       </w:pPr>
-      <w:hyperlink w:anchor="_Toc242189209" w:history="1">
+      <w:hyperlink w:anchor="_Toc242259415" w:history="1">
         <w:r>
           <w:rPr>
             <w:rStyle w:val="Hyperlink"/>
@@ -7513,7 +7513,7 @@
             <w:noProof/>
             <w:webHidden/>
           </w:rPr>
-          <w:instrText xml:space="preserve"> PAGEREF _Toc242189209 \h </w:instrText>
+          <w:instrText xml:space="preserve"> PAGEREF _Toc242259415 \h </w:instrText>
         </w:r>
         <w:r>
           <w:rPr>
@@ -7556,7 +7556,7 @@
           <w:sz w:val="24"/>
         </w:rPr>
       </w:pPr>
-      <w:hyperlink w:anchor="_Toc242189210" w:history="1">
+      <w:hyperlink w:anchor="_Toc242259416" w:history="1">
         <w:r>
           <w:rPr>
             <w:rStyle w:val="Hyperlink"/>
@@ -7583,7 +7583,7 @@
             <w:noProof/>
             <w:webHidden/>
           </w:rPr>
-          <w:instrText xml:space="preserve"> PAGEREF _Toc242189210 \h </w:instrText>
+          <w:instrText xml:space="preserve"> PAGEREF _Toc242259416 \h </w:instrText>
         </w:r>
         <w:r>
           <w:rPr>
@@ -7626,7 +7626,7 @@
           <w:sz w:val="24"/>
         </w:rPr>
       </w:pPr>
-      <w:hyperlink w:anchor="_Toc242189211" w:history="1">
+      <w:hyperlink w:anchor="_Toc242259417" w:history="1">
         <w:r>
           <w:rPr>
             <w:rStyle w:val="Hyperlink"/>
@@ -7653,7 +7653,7 @@
             <w:noProof/>
             <w:webHidden/>
           </w:rPr>
-          <w:instrText xml:space="preserve"> PAGEREF _Toc242189211 \h </w:instrText>
+          <w:instrText xml:space="preserve"> PAGEREF _Toc242259417 \h </w:instrText>
         </w:r>
         <w:r>
           <w:rPr>
@@ -7696,7 +7696,7 @@
           <w:sz w:val="24"/>
         </w:rPr>
       </w:pPr>
-      <w:hyperlink w:anchor="_Toc242189212" w:history="1">
+      <w:hyperlink w:anchor="_Toc242259418" w:history="1">
         <w:r>
           <w:rPr>
             <w:rStyle w:val="Hyperlink"/>
@@ -7723,7 +7723,7 @@
             <w:noProof/>
             <w:webHidden/>
           </w:rPr>
-          <w:instrText xml:space="preserve"> PAGEREF _Toc242189212 \h </w:instrText>
+          <w:instrText xml:space="preserve"> PAGEREF _Toc242259418 \h </w:instrText>
         </w:r>
         <w:r>
           <w:rPr>
@@ -7766,7 +7766,7 @@
           <w:sz w:val="24"/>
         </w:rPr>
       </w:pPr>
-      <w:hyperlink w:anchor="_Toc242189213" w:history="1">
+      <w:hyperlink w:anchor="_Toc242259419" w:history="1">
         <w:r>
           <w:rPr>
             <w:rStyle w:val="Hyperlink"/>
@@ -7793,7 +7793,7 @@
             <w:noProof/>
             <w:webHidden/>
           </w:rPr>
-          <w:instrText xml:space="preserve"> PAGEREF _Toc242189213 \h </w:instrText>
+          <w:instrText xml:space="preserve"> PAGEREF _Toc242259419 \h </w:instrText>
         </w:r>
         <w:r>
           <w:rPr>
@@ -7836,7 +7836,7 @@
           <w:sz w:val="24"/>
         </w:rPr>
       </w:pPr>
-      <w:hyperlink w:anchor="_Toc242189214" w:history="1">
+      <w:hyperlink w:anchor="_Toc242259420" w:history="1">
         <w:r>
           <w:rPr>
             <w:rStyle w:val="Hyperlink"/>
@@ -7863,7 +7863,7 @@
             <w:noProof/>
             <w:webHidden/>
           </w:rPr>
-          <w:instrText xml:space="preserve"> PAGEREF _Toc242189214 \h </w:instrText>
+          <w:instrText xml:space="preserve"> PAGEREF _Toc242259420 \h </w:instrText>
         </w:r>
         <w:r>
           <w:rPr>
@@ -7906,7 +7906,7 @@
           <w:sz w:val="24"/>
         </w:rPr>
       </w:pPr>
-      <w:hyperlink w:anchor="_Toc242189215" w:history="1">
+      <w:hyperlink w:anchor="_Toc242259421" w:history="1">
         <w:r>
           <w:rPr>
             <w:rStyle w:val="Hyperlink"/>
@@ -7933,7 +7933,7 @@
             <w:noProof/>
             <w:webHidden/>
           </w:rPr>
-          <w:instrText xml:space="preserve"> PAGEREF _Toc242189215 \h </w:instrText>
+          <w:instrText xml:space="preserve"> PAGEREF _Toc242259421 \h </w:instrText>
         </w:r>
         <w:r>
           <w:rPr>
@@ -7976,7 +7976,7 @@
           <w:sz w:val="24"/>
         </w:rPr>
       </w:pPr>
-      <w:hyperlink w:anchor="_Toc242189216" w:history="1">
+      <w:hyperlink w:anchor="_Toc242259422" w:history="1">
         <w:r>
           <w:rPr>
             <w:rStyle w:val="Hyperlink"/>
@@ -8003,7 +8003,7 @@
             <w:noProof/>
             <w:webHidden/>
           </w:rPr>
-          <w:instrText xml:space="preserve"> PAGEREF _Toc242189216 \h </w:instrText>
+          <w:instrText xml:space="preserve"> PAGEREF _Toc242259422 \h </w:instrText>
         </w:r>
         <w:r>
           <w:rPr>
@@ -8046,7 +8046,7 @@
           <w:sz w:val="24"/>
         </w:rPr>
       </w:pPr>
-      <w:hyperlink w:anchor="_Toc242189217" w:history="1">
+      <w:hyperlink w:anchor="_Toc242259423" w:history="1">
         <w:r>
           <w:rPr>
             <w:rStyle w:val="Hyperlink"/>
@@ -8073,7 +8073,7 @@
             <w:noProof/>
             <w:webHidden/>
           </w:rPr>
-          <w:instrText xml:space="preserve"> PAGEREF _Toc242189217 \h </w:instrText>
+          <w:instrText xml:space="preserve"> PAGEREF _Toc242259423 \h </w:instrText>
         </w:r>
         <w:r>
           <w:rPr>
@@ -8116,7 +8116,7 @@
           <w:sz w:val="24"/>
         </w:rPr>
       </w:pPr>
-      <w:hyperlink w:anchor="_Toc242189218" w:history="1">
+      <w:hyperlink w:anchor="_Toc242259424" w:history="1">
         <w:r>
           <w:rPr>
             <w:rStyle w:val="Hyperlink"/>
@@ -8143,7 +8143,7 @@
             <w:noProof/>
             <w:webHidden/>
           </w:rPr>
-          <w:instrText xml:space="preserve"> PAGEREF _Toc242189218 \h </w:instrText>
+          <w:instrText xml:space="preserve"> PAGEREF _Toc242259424 \h </w:instrText>
         </w:r>
         <w:r>
           <w:rPr>
@@ -8186,7 +8186,7 @@
           <w:sz w:val="24"/>
         </w:rPr>
       </w:pPr>
-      <w:hyperlink w:anchor="_Toc242189219" w:history="1">
+      <w:hyperlink w:anchor="_Toc242259425" w:history="1">
         <w:r>
           <w:rPr>
             <w:rStyle w:val="Hyperlink"/>
@@ -8213,7 +8213,7 @@
             <w:noProof/>
             <w:webHidden/>
           </w:rPr>
-          <w:instrText xml:space="preserve"> PAGEREF _Toc242189219 \h </w:instrText>
+          <w:instrText xml:space="preserve"> PAGEREF _Toc242259425 \h </w:instrText>
         </w:r>
         <w:r>
           <w:rPr>
@@ -8257,7 +8257,7 @@
           <w:sz w:val="24"/>
         </w:rPr>
       </w:pPr>
-      <w:hyperlink w:anchor="_Toc242189220" w:history="1">
+      <w:hyperlink w:anchor="_Toc242259426" w:history="1">
         <w:r>
           <w:rPr>
             <w:rStyle w:val="Hyperlink"/>
@@ -8284,7 +8284,7 @@
             <w:noProof/>
             <w:webHidden/>
           </w:rPr>
-          <w:instrText xml:space="preserve"> PAGEREF _Toc242189220 \h </w:instrText>
+          <w:instrText xml:space="preserve"> PAGEREF _Toc242259426 \h </w:instrText>
         </w:r>
         <w:r>
           <w:rPr>
@@ -8327,7 +8327,7 @@
           <w:sz w:val="24"/>
         </w:rPr>
       </w:pPr>
-      <w:hyperlink w:anchor="_Toc242189221" w:history="1">
+      <w:hyperlink w:anchor="_Toc242259427" w:history="1">
         <w:r>
           <w:rPr>
             <w:rStyle w:val="Hyperlink"/>
@@ -8354,7 +8354,7 @@
             <w:noProof/>
             <w:webHidden/>
           </w:rPr>
-          <w:instrText xml:space="preserve"> PAGEREF _Toc242189221 \h </w:instrText>
+          <w:instrText xml:space="preserve"> PAGEREF _Toc242259427 \h </w:instrText>
         </w:r>
         <w:r>
           <w:rPr>
@@ -8397,7 +8397,7 @@
           <w:sz w:val="24"/>
         </w:rPr>
       </w:pPr>
-      <w:hyperlink w:anchor="_Toc242189222" w:history="1">
+      <w:hyperlink w:anchor="_Toc242259428" w:history="1">
         <w:r>
           <w:rPr>
             <w:rStyle w:val="Hyperlink"/>
@@ -8424,7 +8424,7 @@
             <w:noProof/>
             <w:webHidden/>
           </w:rPr>
-          <w:instrText xml:space="preserve"> PAGEREF _Toc242189222 \h </w:instrText>
+          <w:instrText xml:space="preserve"> PAGEREF _Toc242259428 \h </w:instrText>
         </w:r>
         <w:r>
           <w:rPr>
@@ -8469,7 +8469,7 @@
       <w:pPr>
         <w:pStyle w:val="berschrift1"/>
       </w:pPr>
-      <w:bookmarkStart w:id="0" w:name="_Toc242189104"/>
+      <w:bookmarkStart w:id="0" w:name="_Toc242259310"/>
       <w:r>
         <w:t>Einleitung und Wegweiser</w:t>
       </w:r>
@@ -8498,7 +8498,7 @@
       <w:pPr>
         <w:pStyle w:val="berschrift2"/>
       </w:pPr>
-      <w:bookmarkStart w:id="1" w:name="_Toc242189105"/>
+      <w:bookmarkStart w:id="1" w:name="_Toc242259311"/>
       <w:r>
         <w:t>So ist jede Seite beschrieben</w:t>
       </w:r>
@@ -8608,7 +8608,7 @@
       <w:pPr>
         <w:pStyle w:val="berschrift2"/>
       </w:pPr>
-      <w:bookmarkStart w:id="2" w:name="_Toc242189106"/>
+      <w:bookmarkStart w:id="2" w:name="_Toc242259312"/>
       <w:r>
         <w:t>Wegweiser nach Rolle</w:t>
       </w:r>
@@ -9044,7 +9044,7 @@
       <w:pPr>
         <w:pStyle w:val="berschrift2"/>
       </w:pPr>
-      <w:bookmarkStart w:id="3" w:name="_Toc242189107"/>
+      <w:bookmarkStart w:id="3" w:name="_Toc242259313"/>
       <w:r>
         <w:t>Allgemeine Regeln für alle Zahlen</w:t>
       </w:r>
@@ -9084,7 +9084,7 @@
       <w:pPr>
         <w:pStyle w:val="berschrift1"/>
       </w:pPr>
-      <w:bookmarkStart w:id="4" w:name="_Toc242189108"/>
+      <w:bookmarkStart w:id="4" w:name="_Toc242259314"/>
       <w:r>
         <w:t>Finance und Management</w:t>
       </w:r>
@@ -9125,7 +9125,7 @@
       <w:pPr>
         <w:pStyle w:val="berschrift2"/>
       </w:pPr>
-      <w:bookmarkStart w:id="5" w:name="_Toc242189109"/>
+      <w:bookmarkStart w:id="5" w:name="_Toc242259315"/>
       <w:r>
         <w:t>Export Dashboard</w:t>
       </w:r>
@@ -9244,7 +9244,7 @@
       <w:pPr>
         <w:pStyle w:val="berschrift2"/>
       </w:pPr>
-      <w:bookmarkStart w:id="6" w:name="_Toc242189110"/>
+      <w:bookmarkStart w:id="6" w:name="_Toc242259316"/>
       <w:r>
         <w:t>Schnellübersicht</w:t>
       </w:r>
@@ -9349,7 +9349,7 @@
       <w:pPr>
         <w:pStyle w:val="berschrift2"/>
       </w:pPr>
-      <w:bookmarkStart w:id="7" w:name="_Toc242189111"/>
+      <w:bookmarkStart w:id="7" w:name="_Toc242259317"/>
       <w:r>
         <w:t>Management Entscheidungen</w:t>
       </w:r>
@@ -9458,7 +9458,7 @@
       <w:pPr>
         <w:pStyle w:val="berschrift2"/>
       </w:pPr>
-      <w:bookmarkStart w:id="8" w:name="_Toc242189112"/>
+      <w:bookmarkStart w:id="8" w:name="_Toc242259318"/>
       <w:r>
         <w:t>Finance Summary (Experten)</w:t>
       </w:r>
@@ -9550,7 +9550,7 @@
       <w:pPr>
         <w:pStyle w:val="berschrift2"/>
       </w:pPr>
-      <w:bookmarkStart w:id="9" w:name="_Toc242189113"/>
+      <w:bookmarkStart w:id="9" w:name="_Toc242259319"/>
       <w:r>
         <w:t>Länder Diagnose (Experten)</w:t>
       </w:r>
@@ -9642,7 +9642,7 @@
       <w:pPr>
         <w:pStyle w:val="berschrift2"/>
       </w:pPr>
-      <w:bookmarkStart w:id="10" w:name="_Toc242189114"/>
+      <w:bookmarkStart w:id="10" w:name="_Toc242259320"/>
       <w:r>
         <w:t>Datenstatus (Experten)</w:t>
       </w:r>
@@ -9734,7 +9734,7 @@
       <w:pPr>
         <w:pStyle w:val="berschrift2"/>
       </w:pPr>
-      <w:bookmarkStart w:id="11" w:name="_Toc242189115"/>
+      <w:bookmarkStart w:id="11" w:name="_Toc242259321"/>
       <w:r>
         <w:t>Abweichungen (Experten)</w:t>
       </w:r>
@@ -9815,7 +9815,7 @@
       <w:pPr>
         <w:pStyle w:val="berschrift2"/>
       </w:pPr>
-      <w:bookmarkStart w:id="12" w:name="_Toc242189116"/>
+      <w:bookmarkStart w:id="12" w:name="_Toc242259322"/>
       <w:r>
         <w:t>Gutschriften (Experten)</w:t>
       </w:r>
@@ -9896,7 +9896,7 @@
       <w:pPr>
         <w:pStyle w:val="berschrift2"/>
       </w:pPr>
-      <w:bookmarkStart w:id="13" w:name="_Toc242189117"/>
+      <w:bookmarkStart w:id="13" w:name="_Toc242259323"/>
       <w:r>
         <w:t>Datenqualität (Experten)</w:t>
       </w:r>
@@ -9977,7 +9977,7 @@
       <w:pPr>
         <w:pStyle w:val="berschrift2"/>
       </w:pPr>
-      <w:bookmarkStart w:id="14" w:name="_Toc242189118"/>
+      <w:bookmarkStart w:id="14" w:name="_Toc242259324"/>
       <w:r>
         <w:t>Finance Pivot (Experten)</w:t>
       </w:r>
@@ -10019,7 +10019,7 @@
     </w:p>
     <w:p>
       <w:r>
-        <w:t>Alle Beträge sind in CHF. Das Kursprofil in den Settings bestimmt, ob zum aktuellen Tageskurs oder zum Jahresendkurs des Finance-Jahres umgerechnet wird. „Jahresumsatz" summiert alle Monate des Jahres, bei einem abgeschlossenen Jahr ist das der Jahreswert.</w:t>
+        <w:t>Alle Beträge sind in CHF. Umgerechnet wird mit dem Budgetkurs des Finance-Jahres (Standard seit 7. Oktober 2026, Kursprofil in den Settings); 2025 also mit Budget 2025, 2026 mit Budget 2026. „Jahresumsatz" summiert alle Monate des Jahres, bei einem abgeschlossenen Jahr ist das der Jahreswert.</w:t>
       </w:r>
     </w:p>
     <w:p>
@@ -10069,7 +10069,7 @@
       <w:pPr>
         <w:pStyle w:val="berschrift2"/>
       </w:pPr>
-      <w:bookmarkStart w:id="15" w:name="_Toc242189119"/>
+      <w:bookmarkStart w:id="15" w:name="_Toc242259325"/>
       <w:r>
         <w:t>Sparten-Finanzanalyse (Experten)</w:t>
       </w:r>
@@ -10161,7 +10161,7 @@
       <w:pPr>
         <w:pStyle w:val="berschrift2"/>
       </w:pPr>
-      <w:bookmarkStart w:id="16" w:name="_Toc242189120"/>
+      <w:bookmarkStart w:id="16" w:name="_Toc242259326"/>
       <w:r>
         <w:t>Zentrale Spartenzuordnung (Experten)</w:t>
       </w:r>
@@ -10242,7 +10242,7 @@
       <w:pPr>
         <w:pStyle w:val="berschrift2"/>
       </w:pPr>
-      <w:bookmarkStart w:id="17" w:name="_Toc242189121"/>
+      <w:bookmarkStart w:id="17" w:name="_Toc242259327"/>
       <w:r>
         <w:t>Finance Prüfbuch (Experten)</w:t>
       </w:r>
@@ -10334,7 +10334,7 @@
       <w:pPr>
         <w:pStyle w:val="berschrift2"/>
       </w:pPr>
-      <w:bookmarkStart w:id="18" w:name="_Toc242189122"/>
+      <w:bookmarkStart w:id="18" w:name="_Toc242259328"/>
       <w:r>
         <w:t>Gruppenmarge (Experten)</w:t>
       </w:r>
@@ -10440,7 +10440,7 @@
       <w:pPr>
         <w:pStyle w:val="berschrift2"/>
       </w:pPr>
-      <w:bookmarkStart w:id="19" w:name="_Toc242189123"/>
+      <w:bookmarkStart w:id="19" w:name="_Toc242259329"/>
       <w:r>
         <w:t>3D Datenanalyse (Experten)</w:t>
       </w:r>
@@ -10535,7 +10535,7 @@
       <w:pPr>
         <w:pStyle w:val="berschrift2"/>
       </w:pPr>
-      <w:bookmarkStart w:id="20" w:name="_Toc242189124"/>
+      <w:bookmarkStart w:id="20" w:name="_Toc242259330"/>
       <w:r>
         <w:t>Rohdaten Diagnose (Experten)</w:t>
       </w:r>
@@ -10630,7 +10630,7 @@
       <w:pPr>
         <w:pStyle w:val="berschrift2"/>
       </w:pPr>
-      <w:bookmarkStart w:id="21" w:name="_Toc242189125"/>
+      <w:bookmarkStart w:id="21" w:name="_Toc242259331"/>
       <w:r>
         <w:t>Daten-Heartbeat (Experten)</w:t>
       </w:r>
@@ -10725,7 +10725,7 @@
       <w:pPr>
         <w:pStyle w:val="berschrift2"/>
       </w:pPr>
-      <w:bookmarkStart w:id="22" w:name="_Toc242189126"/>
+      <w:bookmarkStart w:id="22" w:name="_Toc242259332"/>
       <w:r>
         <w:t>Soll/Ist Vergleich</w:t>
       </w:r>
@@ -10820,7 +10820,7 @@
       <w:pPr>
         <w:pStyle w:val="berschrift2"/>
       </w:pPr>
-      <w:bookmarkStart w:id="23" w:name="_Toc242189127"/>
+      <w:bookmarkStart w:id="23" w:name="_Toc242259333"/>
       <w:r>
         <w:t>Controlling</w:t>
       </w:r>
@@ -10932,7 +10932,7 @@
       <w:pPr>
         <w:pStyle w:val="berschrift2"/>
       </w:pPr>
-      <w:bookmarkStart w:id="24" w:name="_Toc242189128"/>
+      <w:bookmarkStart w:id="24" w:name="_Toc242259334"/>
       <w:r>
         <w:t>Finance Schulung</w:t>
       </w:r>
@@ -11027,7 +11027,7 @@
       <w:pPr>
         <w:pStyle w:val="berschrift2"/>
       </w:pPr>
-      <w:bookmarkStart w:id="25" w:name="_Toc242189129"/>
+      <w:bookmarkStart w:id="25" w:name="_Toc242259335"/>
       <w:r>
         <w:t>Manuelle Importe</w:t>
       </w:r>
@@ -11119,7 +11119,7 @@
       <w:pPr>
         <w:pStyle w:val="berschrift2"/>
       </w:pPr>
-      <w:bookmarkStart w:id="26" w:name="_Toc242189130"/>
+      <w:bookmarkStart w:id="26" w:name="_Toc242259336"/>
       <w:r>
         <w:t>Journal Import</w:t>
       </w:r>
@@ -11211,7 +11211,7 @@
       <w:pPr>
         <w:pStyle w:val="berschrift2"/>
       </w:pPr>
-      <w:bookmarkStart w:id="27" w:name="_Toc242189131"/>
+      <w:bookmarkStart w:id="27" w:name="_Toc242259337"/>
       <w:r>
         <w:t>Marktsegmente</w:t>
       </w:r>
@@ -11320,7 +11320,7 @@
       <w:pPr>
         <w:pStyle w:val="berschrift2"/>
       </w:pPr>
-      <w:bookmarkStart w:id="28" w:name="_Toc242189132"/>
+      <w:bookmarkStart w:id="28" w:name="_Toc242259338"/>
       <w:r>
         <w:t>Administration</w:t>
       </w:r>
@@ -11498,7 +11498,7 @@
       <w:pPr>
         <w:pStyle w:val="berschrift2"/>
       </w:pPr>
-      <w:bookmarkStart w:id="29" w:name="_Toc242189133"/>
+      <w:bookmarkStart w:id="29" w:name="_Toc242259339"/>
       <w:r>
         <w:t>Kennzahlen-Glossar</w:t>
       </w:r>
@@ -12407,7 +12407,7 @@
       <w:pPr>
         <w:pStyle w:val="berschrift1"/>
       </w:pPr>
-      <w:bookmarkStart w:id="30" w:name="_Toc242189134"/>
+      <w:bookmarkStart w:id="30" w:name="_Toc242259340"/>
       <w:r>
         <w:t>Einkauf</w:t>
       </w:r>
@@ -12474,7 +12474,7 @@
       <w:pPr>
         <w:pStyle w:val="berschrift2"/>
       </w:pPr>
-      <w:bookmarkStart w:id="31" w:name="_Toc242189135"/>
+      <w:bookmarkStart w:id="31" w:name="_Toc242259341"/>
       <w:r>
         <w:t>Einkauf Dashboard</w:t>
       </w:r>
@@ -12745,7 +12745,7 @@
       <w:pPr>
         <w:pStyle w:val="berschrift2"/>
       </w:pPr>
-      <w:bookmarkStart w:id="32" w:name="_Toc242189136"/>
+      <w:bookmarkStart w:id="32" w:name="_Toc242259342"/>
       <w:r>
         <w:t>Spend</w:t>
       </w:r>
@@ -12904,7 +12904,7 @@
       <w:pPr>
         <w:pStyle w:val="berschrift2"/>
       </w:pPr>
-      <w:bookmarkStart w:id="33" w:name="_Toc242189137"/>
+      <w:bookmarkStart w:id="33" w:name="_Toc242259343"/>
       <w:r>
         <w:t>Offene Bestellungen</w:t>
       </w:r>
@@ -13055,7 +13055,7 @@
       <w:pPr>
         <w:pStyle w:val="berschrift2"/>
       </w:pPr>
-      <w:bookmarkStart w:id="34" w:name="_Toc242189138"/>
+      <w:bookmarkStart w:id="34" w:name="_Toc242259344"/>
       <w:r>
         <w:t>Kontrakte</w:t>
       </w:r>
@@ -13178,7 +13178,7 @@
       <w:pPr>
         <w:pStyle w:val="berschrift2"/>
       </w:pPr>
-      <w:bookmarkStart w:id="35" w:name="_Toc242189139"/>
+      <w:bookmarkStart w:id="35" w:name="_Toc242259345"/>
       <w:r>
         <w:t>Lieferanten</w:t>
       </w:r>
@@ -13289,7 +13289,7 @@
       <w:pPr>
         <w:pStyle w:val="berschrift2"/>
       </w:pPr>
-      <w:bookmarkStart w:id="36" w:name="_Toc242189140"/>
+      <w:bookmarkStart w:id="36" w:name="_Toc242259346"/>
       <w:r>
         <w:t>Spend-Aufriss</w:t>
       </w:r>
@@ -13431,7 +13431,7 @@
       <w:pPr>
         <w:pStyle w:val="berschrift2"/>
       </w:pPr>
-      <w:bookmarkStart w:id="37" w:name="_Toc242189141"/>
+      <w:bookmarkStart w:id="37" w:name="_Toc242259347"/>
       <w:r>
         <w:t>Bestellbedarf &amp; Deckung</w:t>
       </w:r>
@@ -13634,7 +13634,7 @@
       <w:pPr>
         <w:pStyle w:val="berschrift2"/>
       </w:pPr>
-      <w:bookmarkStart w:id="38" w:name="_Toc242189142"/>
+      <w:bookmarkStart w:id="38" w:name="_Toc242259348"/>
       <w:r>
         <w:t>Materialabhängigkeit</w:t>
       </w:r>
@@ -13834,7 +13834,7 @@
       <w:pPr>
         <w:pStyle w:val="berschrift2"/>
       </w:pPr>
-      <w:bookmarkStart w:id="39" w:name="_Toc242189143"/>
+      <w:bookmarkStart w:id="39" w:name="_Toc242259349"/>
       <w:r>
         <w:t>Lieferperformance</w:t>
       </w:r>
@@ -13945,7 +13945,7 @@
       <w:pPr>
         <w:pStyle w:val="berschrift2"/>
       </w:pPr>
-      <w:bookmarkStart w:id="40" w:name="_Toc242189144"/>
+      <w:bookmarkStart w:id="40" w:name="_Toc242259350"/>
       <w:r>
         <w:t>Ideen: Übersicht</w:t>
       </w:r>
@@ -14059,7 +14059,7 @@
       <w:pPr>
         <w:pStyle w:val="berschrift2"/>
       </w:pPr>
-      <w:bookmarkStart w:id="41" w:name="_Toc242189145"/>
+      <w:bookmarkStart w:id="41" w:name="_Toc242259351"/>
       <w:r>
         <w:t>Ideen: Einkauf-Datenservice</w:t>
       </w:r>
@@ -14159,7 +14159,7 @@
       <w:pPr>
         <w:pStyle w:val="berschrift2"/>
       </w:pPr>
-      <w:bookmarkStart w:id="42" w:name="_Toc242189146"/>
+      <w:bookmarkStart w:id="42" w:name="_Toc242259352"/>
       <w:r>
         <w:t>Ideen: Liefertermin-Risiko</w:t>
       </w:r>
@@ -14270,7 +14270,7 @@
       <w:pPr>
         <w:pStyle w:val="berschrift2"/>
       </w:pPr>
-      <w:bookmarkStart w:id="43" w:name="_Toc242189147"/>
+      <w:bookmarkStart w:id="43" w:name="_Toc242259353"/>
       <w:r>
         <w:t>Ideen: Preisentwicklung</w:t>
       </w:r>
@@ -14399,7 +14399,7 @@
       <w:pPr>
         <w:pStyle w:val="berschrift2"/>
       </w:pPr>
-      <w:bookmarkStart w:id="44" w:name="_Toc242189148"/>
+      <w:bookmarkStart w:id="44" w:name="_Toc242259354"/>
       <w:r>
         <w:t>Ideen: Spend-Konzentration</w:t>
       </w:r>
@@ -14510,7 +14510,7 @@
       <w:pPr>
         <w:pStyle w:val="berschrift2"/>
       </w:pPr>
-      <w:bookmarkStart w:id="45" w:name="_Toc242189149"/>
+      <w:bookmarkStart w:id="45" w:name="_Toc242259355"/>
       <w:r>
         <w:t>Ideen: Datenqualität</w:t>
       </w:r>
@@ -14621,7 +14621,7 @@
       <w:pPr>
         <w:pStyle w:val="berschrift2"/>
       </w:pPr>
-      <w:bookmarkStart w:id="46" w:name="_Toc242189150"/>
+      <w:bookmarkStart w:id="46" w:name="_Toc242259356"/>
       <w:r>
         <w:t>Kennzahlen-Katalog</w:t>
       </w:r>
@@ -14709,7 +14709,7 @@
       <w:pPr>
         <w:pStyle w:val="berschrift2"/>
       </w:pPr>
-      <w:bookmarkStart w:id="47" w:name="_Toc242189151"/>
+      <w:bookmarkStart w:id="47" w:name="_Toc242259357"/>
       <w:r>
         <w:t>PBIX Vorlage</w:t>
       </w:r>
@@ -14797,7 +14797,7 @@
       <w:pPr>
         <w:pStyle w:val="berschrift2"/>
       </w:pPr>
-      <w:bookmarkStart w:id="48" w:name="_Toc242189152"/>
+      <w:bookmarkStart w:id="48" w:name="_Toc242259358"/>
       <w:r>
         <w:t>3D Simulation</w:t>
       </w:r>
@@ -14920,7 +14920,7 @@
       <w:pPr>
         <w:pStyle w:val="berschrift2"/>
       </w:pPr>
-      <w:bookmarkStart w:id="49" w:name="_Toc242189153"/>
+      <w:bookmarkStart w:id="49" w:name="_Toc242259359"/>
       <w:r>
         <w:t>Interaktiv</w:t>
       </w:r>
@@ -15228,7 +15228,7 @@
       <w:pPr>
         <w:pStyle w:val="berschrift2"/>
       </w:pPr>
-      <w:bookmarkStart w:id="50" w:name="_Toc242189154"/>
+      <w:bookmarkStart w:id="50" w:name="_Toc242259360"/>
       <w:r>
         <w:t>Datenquellen</w:t>
       </w:r>
@@ -15328,7 +15328,7 @@
       <w:pPr>
         <w:pStyle w:val="berschrift2"/>
       </w:pPr>
-      <w:bookmarkStart w:id="51" w:name="_Toc242189155"/>
+      <w:bookmarkStart w:id="51" w:name="_Toc242259361"/>
       <w:r>
         <w:t>Kennzahlen-Glossar</w:t>
       </w:r>
@@ -16032,7 +16032,7 @@
       <w:pPr>
         <w:pStyle w:val="berschrift1"/>
       </w:pPr>
-      <w:bookmarkStart w:id="52" w:name="_Toc242189156"/>
+      <w:bookmarkStart w:id="52" w:name="_Toc242259362"/>
       <w:r>
         <w:t>Verkauf</w:t>
       </w:r>
@@ -16085,7 +16085,7 @@
       <w:pPr>
         <w:pStyle w:val="berschrift2"/>
       </w:pPr>
-      <w:bookmarkStart w:id="53" w:name="_Toc242189157"/>
+      <w:bookmarkStart w:id="53" w:name="_Toc242259363"/>
       <w:r>
         <w:t>Kunden</w:t>
       </w:r>
@@ -16196,7 +16196,7 @@
       <w:pPr>
         <w:pStyle w:val="berschrift2"/>
       </w:pPr>
-      <w:bookmarkStart w:id="54" w:name="_Toc242189158"/>
+      <w:bookmarkStart w:id="54" w:name="_Toc242259364"/>
       <w:r>
         <w:t>Rückgang</w:t>
       </w:r>
@@ -16302,7 +16302,7 @@
       <w:pPr>
         <w:pStyle w:val="berschrift2"/>
       </w:pPr>
-      <w:bookmarkStart w:id="55" w:name="_Toc242189159"/>
+      <w:bookmarkStart w:id="55" w:name="_Toc242259365"/>
       <w:r>
         <w:t>Neue und verlorene Kunden</w:t>
       </w:r>
@@ -16408,7 +16408,7 @@
       <w:pPr>
         <w:pStyle w:val="berschrift2"/>
       </w:pPr>
-      <w:bookmarkStart w:id="56" w:name="_Toc242189160"/>
+      <w:bookmarkStart w:id="56" w:name="_Toc242259366"/>
       <w:r>
         <w:t>Konzentration</w:t>
       </w:r>
@@ -16514,7 +16514,7 @@
       <w:pPr>
         <w:pStyle w:val="berschrift2"/>
       </w:pPr>
-      <w:bookmarkStart w:id="57" w:name="_Toc242189161"/>
+      <w:bookmarkStart w:id="57" w:name="_Toc242259367"/>
       <w:r>
         <w:t>Cross-Selling</w:t>
       </w:r>
@@ -16609,7 +16609,7 @@
       <w:pPr>
         <w:pStyle w:val="berschrift2"/>
       </w:pPr>
-      <w:bookmarkStart w:id="58" w:name="_Toc242189162"/>
+      <w:bookmarkStart w:id="58" w:name="_Toc242259368"/>
       <w:r>
         <w:t>Preisstreuung</w:t>
       </w:r>
@@ -16715,7 +16715,7 @@
       <w:pPr>
         <w:pStyle w:val="berschrift2"/>
       </w:pPr>
-      <w:bookmarkStart w:id="59" w:name="_Toc242189163"/>
+      <w:bookmarkStart w:id="59" w:name="_Toc242259369"/>
       <w:r>
         <w:t>Saison und Prognose</w:t>
       </w:r>
@@ -16821,7 +16821,7 @@
       <w:pPr>
         <w:pStyle w:val="berschrift2"/>
       </w:pPr>
-      <w:bookmarkStart w:id="60" w:name="_Toc242189164"/>
+      <w:bookmarkStart w:id="60" w:name="_Toc242259370"/>
       <w:r>
         <w:t>Weltkarte</w:t>
       </w:r>
@@ -16924,7 +16924,7 @@
       <w:pPr>
         <w:pStyle w:val="berschrift2"/>
       </w:pPr>
-      <w:bookmarkStart w:id="61" w:name="_Toc242189165"/>
+      <w:bookmarkStart w:id="61" w:name="_Toc242259371"/>
       <w:r>
         <w:t>Interaktiv</w:t>
       </w:r>
@@ -17016,7 +17016,7 @@
       <w:pPr>
         <w:pStyle w:val="berschrift2"/>
       </w:pPr>
-      <w:bookmarkStart w:id="62" w:name="_Toc242189166"/>
+      <w:bookmarkStart w:id="62" w:name="_Toc242259372"/>
       <w:r>
         <w:t>Kunden-Galaxie</w:t>
       </w:r>
@@ -17108,7 +17108,7 @@
       <w:pPr>
         <w:pStyle w:val="berschrift2"/>
       </w:pPr>
-      <w:bookmarkStart w:id="63" w:name="_Toc242189167"/>
+      <w:bookmarkStart w:id="63" w:name="_Toc242259373"/>
       <w:r>
         <w:t>Rennen</w:t>
       </w:r>
@@ -17200,7 +17200,7 @@
       <w:pPr>
         <w:pStyle w:val="berschrift2"/>
       </w:pPr>
-      <w:bookmarkStart w:id="64" w:name="_Toc242189168"/>
+      <w:bookmarkStart w:id="64" w:name="_Toc242259374"/>
       <w:r>
         <w:t>Umsatzfluss</w:t>
       </w:r>
@@ -17292,7 +17292,7 @@
       <w:pPr>
         <w:pStyle w:val="berschrift2"/>
       </w:pPr>
-      <w:bookmarkStart w:id="65" w:name="_Toc242189169"/>
+      <w:bookmarkStart w:id="65" w:name="_Toc242259375"/>
       <w:r>
         <w:t>Sonnenstrahl</w:t>
       </w:r>
@@ -17384,7 +17384,7 @@
       <w:pPr>
         <w:pStyle w:val="berschrift2"/>
       </w:pPr>
-      <w:bookmarkStart w:id="66" w:name="_Toc242189170"/>
+      <w:bookmarkStart w:id="66" w:name="_Toc242259376"/>
       <w:r>
         <w:t>Was wäre wenn</w:t>
       </w:r>
@@ -17493,7 +17493,7 @@
       <w:pPr>
         <w:pStyle w:val="berschrift2"/>
       </w:pPr>
-      <w:bookmarkStart w:id="67" w:name="_Toc242189171"/>
+      <w:bookmarkStart w:id="67" w:name="_Toc242259377"/>
       <w:r>
         <w:t>Bestellrhythmus</w:t>
       </w:r>
@@ -17588,7 +17588,7 @@
       <w:pPr>
         <w:pStyle w:val="berschrift2"/>
       </w:pPr>
-      <w:bookmarkStart w:id="68" w:name="_Toc242189172"/>
+      <w:bookmarkStart w:id="68" w:name="_Toc242259378"/>
       <w:r>
         <w:t>Kalender</w:t>
       </w:r>
@@ -17680,7 +17680,7 @@
       <w:pPr>
         <w:pStyle w:val="berschrift2"/>
       </w:pPr>
-      <w:bookmarkStart w:id="69" w:name="_Toc242189173"/>
+      <w:bookmarkStart w:id="69" w:name="_Toc242259379"/>
       <w:r>
         <w:t>Artikel-Netzwerk</w:t>
       </w:r>
@@ -17775,7 +17775,7 @@
       <w:pPr>
         <w:pStyle w:val="berschrift2"/>
       </w:pPr>
-      <w:bookmarkStart w:id="70" w:name="_Toc242189174"/>
+      <w:bookmarkStart w:id="70" w:name="_Toc242259380"/>
       <w:r>
         <w:t>3D-Landschaft</w:t>
       </w:r>
@@ -17867,7 +17867,7 @@
       <w:pPr>
         <w:pStyle w:val="berschrift2"/>
       </w:pPr>
-      <w:bookmarkStart w:id="71" w:name="_Toc242189175"/>
+      <w:bookmarkStart w:id="71" w:name="_Toc242259381"/>
       <w:r>
         <w:t>Kennzahlen-Glossar</w:t>
       </w:r>
@@ -18694,7 +18694,7 @@
       <w:pPr>
         <w:pStyle w:val="berschrift1"/>
       </w:pPr>
-      <w:bookmarkStart w:id="72" w:name="_Toc242189176"/>
+      <w:bookmarkStart w:id="72" w:name="_Toc242259382"/>
       <w:r>
         <w:t>Logistik</w:t>
       </w:r>
@@ -18714,7 +18714,7 @@
       <w:pPr>
         <w:pStyle w:val="berschrift2"/>
       </w:pPr>
-      <w:bookmarkStart w:id="73" w:name="_Toc242189177"/>
+      <w:bookmarkStart w:id="73" w:name="_Toc242259383"/>
       <w:r>
         <w:t>Stücklistenanalyse</w:t>
       </w:r>
@@ -18831,7 +18831,7 @@
       <w:pPr>
         <w:pStyle w:val="berschrift2"/>
       </w:pPr>
-      <w:bookmarkStart w:id="74" w:name="_Toc242189178"/>
+      <w:bookmarkStart w:id="74" w:name="_Toc242259384"/>
       <w:r>
         <w:t>Materialdisposition &amp; Fehlteile</w:t>
       </w:r>
@@ -18983,7 +18983,7 @@
       <w:pPr>
         <w:pStyle w:val="berschrift2"/>
       </w:pPr>
-      <w:bookmarkStart w:id="75" w:name="_Toc242189179"/>
+      <w:bookmarkStart w:id="75" w:name="_Toc242259385"/>
       <w:r>
         <w:t>Logistik live</w:t>
       </w:r>
@@ -19091,7 +19091,7 @@
       <w:pPr>
         <w:pStyle w:val="berschrift2"/>
       </w:pPr>
-      <w:bookmarkStart w:id="76" w:name="_Toc242189180"/>
+      <w:bookmarkStart w:id="76" w:name="_Toc242259386"/>
       <w:r>
         <w:t>Original- und Live-Übersicht</w:t>
       </w:r>
@@ -19184,7 +19184,7 @@
       <w:pPr>
         <w:pStyle w:val="berschrift2"/>
       </w:pPr>
-      <w:bookmarkStart w:id="77" w:name="_Toc242189181"/>
+      <w:bookmarkStart w:id="77" w:name="_Toc242259387"/>
       <w:r>
         <w:t>3D-Lager</w:t>
       </w:r>
@@ -19277,7 +19277,7 @@
       <w:pPr>
         <w:pStyle w:val="berschrift2"/>
       </w:pPr>
-      <w:bookmarkStart w:id="78" w:name="_Toc242189182"/>
+      <w:bookmarkStart w:id="78" w:name="_Toc242259388"/>
       <w:r>
         <w:t>Produktivität</w:t>
       </w:r>
@@ -19373,7 +19373,7 @@
       <w:pPr>
         <w:pStyle w:val="berschrift2"/>
       </w:pPr>
-      <w:bookmarkStart w:id="79" w:name="_Toc242189183"/>
+      <w:bookmarkStart w:id="79" w:name="_Toc242259389"/>
       <w:r>
         <w:t>Leistung je Person (nur nach Anmeldung)</w:t>
       </w:r>
@@ -19463,7 +19463,7 @@
       <w:pPr>
         <w:pStyle w:val="berschrift2"/>
       </w:pPr>
-      <w:bookmarkStart w:id="80" w:name="_Toc242189184"/>
+      <w:bookmarkStart w:id="80" w:name="_Toc242259390"/>
       <w:r>
         <w:t>Kapazität</w:t>
       </w:r>
@@ -19612,7 +19612,7 @@
       <w:pPr>
         <w:pStyle w:val="berschrift2"/>
       </w:pPr>
-      <w:bookmarkStart w:id="81" w:name="_Toc242189185"/>
+      <w:bookmarkStart w:id="81" w:name="_Toc242259391"/>
       <w:r>
         <w:t>Verwendung &amp; Risiko</w:t>
       </w:r>
@@ -19719,7 +19719,7 @@
       <w:pPr>
         <w:pStyle w:val="berschrift2"/>
       </w:pPr>
-      <w:bookmarkStart w:id="82" w:name="_Toc242189186"/>
+      <w:bookmarkStart w:id="82" w:name="_Toc242259392"/>
       <w:r>
         <w:t>Dispositionsprüfung</w:t>
       </w:r>
@@ -19890,7 +19890,7 @@
       <w:pPr>
         <w:pStyle w:val="berschrift2"/>
       </w:pPr>
-      <w:bookmarkStart w:id="83" w:name="_Toc242189187"/>
+      <w:bookmarkStart w:id="83" w:name="_Toc242259393"/>
       <w:r>
         <w:t>Kennzahlen-Glossar</w:t>
       </w:r>
@@ -20635,7 +20635,7 @@
       <w:pPr>
         <w:pStyle w:val="berschrift1"/>
       </w:pPr>
-      <w:bookmarkStart w:id="84" w:name="_Toc242189188"/>
+      <w:bookmarkStart w:id="84" w:name="_Toc242259394"/>
       <w:r>
         <w:t>HR</w:t>
       </w:r>
@@ -20658,7 +20658,7 @@
       <w:pPr>
         <w:pStyle w:val="berschrift2"/>
       </w:pPr>
-      <w:bookmarkStart w:id="85" w:name="_Toc242189189"/>
+      <w:bookmarkStart w:id="85" w:name="_Toc242259395"/>
       <w:r>
         <w:t>HR Dashboard</w:t>
       </w:r>
@@ -20853,7 +20853,7 @@
       <w:pPr>
         <w:pStyle w:val="berschrift2"/>
       </w:pPr>
-      <w:bookmarkStart w:id="86" w:name="_Toc242189190"/>
+      <w:bookmarkStart w:id="86" w:name="_Toc242259396"/>
       <w:r>
         <w:t>Überblick</w:t>
       </w:r>
@@ -20943,7 +20943,7 @@
       <w:pPr>
         <w:pStyle w:val="berschrift2"/>
       </w:pPr>
-      <w:bookmarkStart w:id="87" w:name="_Toc242189191"/>
+      <w:bookmarkStart w:id="87" w:name="_Toc242259397"/>
       <w:r>
         <w:t>Fluktuation</w:t>
       </w:r>
@@ -21132,7 +21132,7 @@
       <w:pPr>
         <w:pStyle w:val="berschrift2"/>
       </w:pPr>
-      <w:bookmarkStart w:id="88" w:name="_Toc242189192"/>
+      <w:bookmarkStart w:id="88" w:name="_Toc242259398"/>
       <w:r>
         <w:t>Ampel</w:t>
       </w:r>
@@ -21225,7 +21225,7 @@
       <w:pPr>
         <w:pStyle w:val="berschrift2"/>
       </w:pPr>
-      <w:bookmarkStart w:id="89" w:name="_Toc242189193"/>
+      <w:bookmarkStart w:id="89" w:name="_Toc242259399"/>
       <w:r>
         <w:t>Absenzen</w:t>
       </w:r>
@@ -21337,7 +21337,7 @@
       <w:pPr>
         <w:pStyle w:val="berschrift2"/>
       </w:pPr>
-      <w:bookmarkStart w:id="90" w:name="_Toc242189194"/>
+      <w:bookmarkStart w:id="90" w:name="_Toc242259400"/>
       <w:r>
         <w:t>Zeit / Ferien</w:t>
       </w:r>
@@ -21436,7 +21436,7 @@
       <w:pPr>
         <w:pStyle w:val="berschrift2"/>
       </w:pPr>
-      <w:bookmarkStart w:id="91" w:name="_Toc242189195"/>
+      <w:bookmarkStart w:id="91" w:name="_Toc242259401"/>
       <w:r>
         <w:t>Mitarbeitende</w:t>
       </w:r>
@@ -21526,7 +21526,7 @@
       <w:pPr>
         <w:pStyle w:val="berschrift2"/>
       </w:pPr>
-      <w:bookmarkStart w:id="92" w:name="_Toc242189196"/>
+      <w:bookmarkStart w:id="92" w:name="_Toc242259402"/>
       <w:r>
         <w:t>Datenstatus</w:t>
       </w:r>
@@ -21616,7 +21616,7 @@
       <w:pPr>
         <w:pStyle w:val="berschrift2"/>
       </w:pPr>
-      <w:bookmarkStart w:id="93" w:name="_Toc242189197"/>
+      <w:bookmarkStart w:id="93" w:name="_Toc242259403"/>
       <w:r>
         <w:t>Anleitung</w:t>
       </w:r>
@@ -21709,7 +21709,7 @@
       <w:pPr>
         <w:pStyle w:val="berschrift2"/>
       </w:pPr>
-      <w:bookmarkStart w:id="94" w:name="_Toc242189198"/>
+      <w:bookmarkStart w:id="94" w:name="_Toc242259404"/>
       <w:r>
         <w:t>HR KPI Schulung</w:t>
       </w:r>
@@ -21814,7 +21814,7 @@
       <w:pPr>
         <w:pStyle w:val="berschrift2"/>
       </w:pPr>
-      <w:bookmarkStart w:id="95" w:name="_Toc242189199"/>
+      <w:bookmarkStart w:id="95" w:name="_Toc242259405"/>
       <w:r>
         <w:t>Kennzahlen-Glossar</w:t>
       </w:r>
@@ -22600,7 +22600,7 @@
       <w:pPr>
         <w:pStyle w:val="berschrift1"/>
       </w:pPr>
-      <w:bookmarkStart w:id="96" w:name="_Toc242189200"/>
+      <w:bookmarkStart w:id="96" w:name="_Toc242259406"/>
       <w:r>
         <w:t>Weltlage</w:t>
       </w:r>
@@ -22643,7 +22643,7 @@
       <w:pPr>
         <w:pStyle w:val="berschrift2"/>
       </w:pPr>
-      <w:bookmarkStart w:id="97" w:name="_Toc242189201"/>
+      <w:bookmarkStart w:id="97" w:name="_Toc242259407"/>
       <w:r>
         <w:t>Radar</w:t>
       </w:r>
@@ -22961,7 +22961,7 @@
       <w:pPr>
         <w:pStyle w:val="berschrift2"/>
       </w:pPr>
-      <w:bookmarkStart w:id="98" w:name="_Toc242189202"/>
+      <w:bookmarkStart w:id="98" w:name="_Toc242259408"/>
       <w:r>
         <w:t>Länder</w:t>
       </w:r>
@@ -23088,7 +23088,7 @@
       <w:pPr>
         <w:pStyle w:val="berschrift2"/>
       </w:pPr>
-      <w:bookmarkStart w:id="99" w:name="_Toc242189203"/>
+      <w:bookmarkStart w:id="99" w:name="_Toc242259409"/>
       <w:r>
         <w:t>Rohstoffe und Währungen</w:t>
       </w:r>
@@ -23348,7 +23348,7 @@
       <w:pPr>
         <w:pStyle w:val="berschrift2"/>
       </w:pPr>
-      <w:bookmarkStart w:id="100" w:name="_Toc242189204"/>
+      <w:bookmarkStart w:id="100" w:name="_Toc242259410"/>
       <w:r>
         <w:t>Ereignisse</w:t>
       </w:r>
@@ -23472,7 +23472,7 @@
       <w:pPr>
         <w:pStyle w:val="berschrift2"/>
       </w:pPr>
-      <w:bookmarkStart w:id="101" w:name="_Toc242189205"/>
+      <w:bookmarkStart w:id="101" w:name="_Toc242259411"/>
       <w:r>
         <w:t>Kennzahlen-Glossar</w:t>
       </w:r>
@@ -24012,7 +24012,7 @@
       <w:pPr>
         <w:pStyle w:val="berschrift1"/>
       </w:pPr>
-      <w:bookmarkStart w:id="102" w:name="_Toc242189206"/>
+      <w:bookmarkStart w:id="102" w:name="_Toc242259412"/>
       <w:r>
         <w:t>Netzwerk und IT-Infrastruktur</w:t>
       </w:r>
@@ -24049,7 +24049,7 @@
       <w:pPr>
         <w:pStyle w:val="berschrift2"/>
       </w:pPr>
-      <w:bookmarkStart w:id="103" w:name="_Toc242189207"/>
+      <w:bookmarkStart w:id="103" w:name="_Toc242259413"/>
       <w:r>
         <w:t>Übersicht</w:t>
       </w:r>
@@ -24158,7 +24158,7 @@
       <w:pPr>
         <w:pStyle w:val="berschrift2"/>
       </w:pPr>
-      <w:bookmarkStart w:id="104" w:name="_Toc242189208"/>
+      <w:bookmarkStart w:id="104" w:name="_Toc242259414"/>
       <w:r>
         <w:t>Verfügbarkeit</w:t>
       </w:r>
@@ -24282,7 +24282,7 @@
       <w:pPr>
         <w:pStyle w:val="berschrift2"/>
       </w:pPr>
-      <w:bookmarkStart w:id="105" w:name="_Toc242189209"/>
+      <w:bookmarkStart w:id="105" w:name="_Toc242259415"/>
       <w:r>
         <w:t>Netz oder Daten</w:t>
       </w:r>
@@ -24406,7 +24406,7 @@
       <w:pPr>
         <w:pStyle w:val="berschrift2"/>
       </w:pPr>
-      <w:bookmarkStart w:id="106" w:name="_Toc242189210"/>
+      <w:bookmarkStart w:id="106" w:name="_Toc242259416"/>
       <w:r>
         <w:t>Sicherheit</w:t>
       </w:r>
@@ -24512,7 +24512,7 @@
       <w:pPr>
         <w:pStyle w:val="berschrift2"/>
       </w:pPr>
-      <w:bookmarkStart w:id="107" w:name="_Toc242189211"/>
+      <w:bookmarkStart w:id="107" w:name="_Toc242259417"/>
       <w:r>
         <w:t>Active Directory</w:t>
       </w:r>
@@ -24621,7 +24621,7 @@
       <w:pPr>
         <w:pStyle w:val="berschrift2"/>
       </w:pPr>
-      <w:bookmarkStart w:id="108" w:name="_Toc242189212"/>
+      <w:bookmarkStart w:id="108" w:name="_Toc242259418"/>
       <w:r>
         <w:t>AD-Infrastruktur</w:t>
       </w:r>
@@ -24701,7 +24701,7 @@
       <w:pPr>
         <w:pStyle w:val="berschrift2"/>
       </w:pPr>
-      <w:bookmarkStart w:id="109" w:name="_Toc242189213"/>
+      <w:bookmarkStart w:id="109" w:name="_Toc242259419"/>
       <w:r>
         <w:t>Gruppenrichtlinien</w:t>
       </w:r>
@@ -24781,7 +24781,7 @@
       <w:pPr>
         <w:pStyle w:val="berschrift2"/>
       </w:pPr>
-      <w:bookmarkStart w:id="110" w:name="_Toc242189214"/>
+      <w:bookmarkStart w:id="110" w:name="_Toc242259420"/>
       <w:r>
         <w:t>DNS</w:t>
       </w:r>
@@ -24843,7 +24843,7 @@
       <w:pPr>
         <w:pStyle w:val="berschrift2"/>
       </w:pPr>
-      <w:bookmarkStart w:id="111" w:name="_Toc242189215"/>
+      <w:bookmarkStart w:id="111" w:name="_Toc242259421"/>
       <w:r>
         <w:t>Verlauf</w:t>
       </w:r>
@@ -24936,7 +24936,7 @@
       <w:pPr>
         <w:pStyle w:val="berschrift2"/>
       </w:pPr>
-      <w:bookmarkStart w:id="112" w:name="_Toc242189216"/>
+      <w:bookmarkStart w:id="112" w:name="_Toc242259422"/>
       <w:r>
         <w:t>Migration</w:t>
       </w:r>
@@ -25109,7 +25109,7 @@
       <w:pPr>
         <w:pStyle w:val="berschrift2"/>
       </w:pPr>
-      <w:bookmarkStart w:id="113" w:name="_Toc242189217"/>
+      <w:bookmarkStart w:id="113" w:name="_Toc242259423"/>
       <w:r>
         <w:t>Bericht</w:t>
       </w:r>
@@ -25218,7 +25218,7 @@
       <w:pPr>
         <w:pStyle w:val="berschrift2"/>
       </w:pPr>
-      <w:bookmarkStart w:id="114" w:name="_Toc242189218"/>
+      <w:bookmarkStart w:id="114" w:name="_Toc242259424"/>
       <w:r>
         <w:t>Arbeitsplätze</w:t>
       </w:r>
@@ -25324,7 +25324,7 @@
       <w:pPr>
         <w:pStyle w:val="berschrift2"/>
       </w:pPr>
-      <w:bookmarkStart w:id="115" w:name="_Toc242189219"/>
+      <w:bookmarkStart w:id="115" w:name="_Toc242259425"/>
       <w:r>
         <w:t>Kennzahlen-Glossar</w:t>
       </w:r>
@@ -25905,7 +25905,7 @@
       <w:pPr>
         <w:pStyle w:val="berschrift1"/>
       </w:pPr>
-      <w:bookmarkStart w:id="116" w:name="_Toc242189220"/>
+      <w:bookmarkStart w:id="116" w:name="_Toc242259426"/>
       <w:r>
         <w:t>Projekte</w:t>
       </w:r>
@@ -25923,7 +25923,7 @@
       <w:pPr>
         <w:pStyle w:val="berschrift2"/>
       </w:pPr>
-      <w:bookmarkStart w:id="117" w:name="_Toc242189221"/>
+      <w:bookmarkStart w:id="117" w:name="_Toc242259427"/>
       <w:r>
         <w:t>Projekte</w:t>
       </w:r>
@@ -26117,7 +26117,7 @@
       <w:pPr>
         <w:pStyle w:val="berschrift2"/>
       </w:pPr>
-      <w:bookmarkStart w:id="118" w:name="_Toc242189222"/>
+      <w:bookmarkStart w:id="118" w:name="_Toc242259428"/>
       <w:r>
         <w:t>Kennzahlen-Glossar</w:t>
       </w:r>
@@ -26532,7 +26532,7 @@
         <w:noProof/>
       </w:rPr>
       <w:drawing>
-        <wp:inline distT="0" distB="0" distL="0" distR="0" wp14:anchorId="7F187E9E" wp14:editId="69BE64D6">
+        <wp:inline distT="0" distB="0" distL="0" distR="0" wp14:anchorId="5BA9B779" wp14:editId="18F0967E">
           <wp:extent cx="720000" cy="349200"/>
           <wp:effectExtent l="0" t="0" r="0" b="0"/>
           <wp:docPr id="10" name="Trafag Logo Kopf"/>
@@ -26582,9 +26582,9 @@
 <file path=word/numbering.xml><?xml version="1.0" encoding="utf-8"?>
 <w:numbering xmlns:wpc="http://schemas.microsoft.com/office/word/2010/wordprocessingCanvas" xmlns:cx="http://schemas.microsoft.com/office/drawing/2014/chartex" xmlns:cx1="http://schemas.microsoft.com/office/drawing/2015/9/8/chartex" xmlns:cx2="http://schemas.microsoft.com/office/drawing/2015/10/21/chartex" xmlns:cx3="http://schemas.microsoft.com/office/drawing/2016/5/9/chartex" xmlns:cx4="http://schemas.microsoft.com/office/drawing/2016/5/10/chartex" xmlns:cx5="http://schemas.microsoft.com/office/drawing/2016/5/11/chartex" xmlns:cx6="http://schemas.microsoft.com/office/drawing/2016/5/12/chartex" xmlns:cx7="http://schemas.microsoft.com/office/drawing/2016/5/13/chartex" xmlns:cx8="http://schemas.microsoft.com/office/drawing/2016/5/14/chartex" xmlns:mc="http://schemas.openxmlformats.org/markup-compatibility/2006" xmlns:aink="http://schemas.microsoft.com/office/drawing/2016/ink" xmlns:am3d="http://schemas.microsoft.com/office/drawing/2017/model3d" xmlns:o="urn:schemas-microsoft-com:office:office" xmlns:oel="http://schemas.microsoft.com/office/2019/extlst" xmlns:r="http://schemas.openxmlformats.org/officeDocument/2006/relationships" xmlns:m="http://schemas.openxmlformats.org/officeDocument/2006/math" xmlns:v="urn:schemas-microsoft-com:vml" xmlns:wp14="http://schemas.microsoft.com/office/word/2010/wordprocessingDrawing" xmlns:wp="http://schemas.openxmlformats.org/drawingml/2006/wordprocessingDrawing" xmlns:w10="urn:schemas-microsoft-com:office:word" xmlns:w="http://schemas.openxmlformats.org/wordprocessingml/2006/main" xmlns:w14="http://schemas.microsoft.com/office/word/2010/wordml" xmlns:w15="http://schemas.microsoft.com/office/word/2012/wordml" xmlns:w16cex="http://schemas.microsoft.com/office/word/2018/wordml/cex" xmlns:w16cid="http://schemas.microsoft.com/office/word/2016/wordml/cid" xmlns:w16="http://schemas.microsoft.com/office/word/2018/wordml" xmlns:w16du="http://schemas.microsoft.com/office/word/2023/wordml/word16du" xmlns:w16sdtdh="http://schemas.microsoft.com/office/word/2020/wordml/sdtdatahash" xmlns:w16sdtfl="http://schemas.microsoft.com/office/word/2024/wordml/sdtformatlock" xmlns:w16se="http://schemas.microsoft.com/office/word/2015/wordml/symex" xmlns:wpg="http://schemas.microsoft.com/office/word/2010/wordprocessingGroup" xmlns:wpi="http://schemas.microsoft.com/office/word/2010/wordprocessingInk" xmlns:wne="http://schemas.microsoft.com/office/word/2006/wordml" xmlns:wps="http://schemas.microsoft.com/office/word/2010/wordprocessingShape" mc:Ignorable="w14 w15 w16se w16cid w16 w16cex w16sdtdh w16sdtfl w16du wp14">
   <w:abstractNum w:abstractNumId="0" w15:restartNumberingAfterBreak="0">
-    <w:nsid w:val="0B921FE0"/>
+    <w:nsid w:val="284471E0"/>
     <w:multiLevelType w:val="multilevel"/>
-    <w:tmpl w:val="02667B88"/>
+    <w:tmpl w:val="006CAAA0"/>
     <w:lvl w:ilvl="0">
       <w:numFmt w:val="bullet"/>
       <w:lvlText w:val="•"/>
@@ -26638,7 +26638,7 @@
       <w:lvlJc w:val="left"/>
     </w:lvl>
   </w:abstractNum>
-  <w:num w:numId="1" w16cid:durableId="1463965173">
+  <w:num w:numId="1" w16cid:durableId="1660772549">
     <w:abstractNumId w:val="0"/>
   </w:num>
 </w:numbering>
@@ -27258,7 +27258,7 @@
     <w:autoRedefine/>
     <w:uiPriority w:val="39"/>
     <w:unhideWhenUsed/>
-    <w:rsid w:val="00A74826"/>
+    <w:rsid w:val="008A30C5"/>
     <w:pPr>
       <w:spacing w:after="100" w:line="278" w:lineRule="auto"/>
       <w:ind w:left="480"/>
@@ -27275,7 +27275,7 @@
     <w:autoRedefine/>
     <w:uiPriority w:val="39"/>
     <w:unhideWhenUsed/>
-    <w:rsid w:val="00A74826"/>
+    <w:rsid w:val="008A30C5"/>
     <w:pPr>
       <w:spacing w:after="100" w:line="278" w:lineRule="auto"/>
       <w:ind w:left="720"/>
@@ -27292,7 +27292,7 @@
     <w:autoRedefine/>
     <w:uiPriority w:val="39"/>
     <w:unhideWhenUsed/>
-    <w:rsid w:val="00A74826"/>
+    <w:rsid w:val="008A30C5"/>
     <w:pPr>
       <w:spacing w:after="100" w:line="278" w:lineRule="auto"/>
       <w:ind w:left="960"/>
@@ -27309,7 +27309,7 @@
     <w:autoRedefine/>
     <w:uiPriority w:val="39"/>
     <w:unhideWhenUsed/>
-    <w:rsid w:val="00A74826"/>
+    <w:rsid w:val="008A30C5"/>
     <w:pPr>
       <w:spacing w:after="100" w:line="278" w:lineRule="auto"/>
       <w:ind w:left="1200"/>
@@ -27326,7 +27326,7 @@
     <w:autoRedefine/>
     <w:uiPriority w:val="39"/>
     <w:unhideWhenUsed/>
-    <w:rsid w:val="00A74826"/>
+    <w:rsid w:val="008A30C5"/>
     <w:pPr>
       <w:spacing w:after="100" w:line="278" w:lineRule="auto"/>
       <w:ind w:left="1440"/>
@@ -27343,7 +27343,7 @@
     <w:autoRedefine/>
     <w:uiPriority w:val="39"/>
     <w:unhideWhenUsed/>
-    <w:rsid w:val="00A74826"/>
+    <w:rsid w:val="008A30C5"/>
     <w:pPr>
       <w:spacing w:after="100" w:line="278" w:lineRule="auto"/>
       <w:ind w:left="1680"/>
@@ -27360,7 +27360,7 @@
     <w:autoRedefine/>
     <w:uiPriority w:val="39"/>
     <w:unhideWhenUsed/>
-    <w:rsid w:val="00A74826"/>
+    <w:rsid w:val="008A30C5"/>
     <w:pPr>
       <w:spacing w:after="100" w:line="278" w:lineRule="auto"/>
       <w:ind w:left="1920"/>
@@ -27375,7 +27375,7 @@
     <w:basedOn w:val="Absatz-Standardschriftart"/>
     <w:uiPriority w:val="99"/>
     <w:unhideWhenUsed/>
-    <w:rsid w:val="00A74826"/>
+    <w:rsid w:val="008A30C5"/>
     <w:rPr>
       <w:color w:val="467886" w:themeColor="hyperlink"/>
       <w:u w:val="single"/>
@@ -27387,7 +27387,7 @@
     <w:uiPriority w:val="99"/>
     <w:semiHidden/>
     <w:unhideWhenUsed/>
-    <w:rsid w:val="00A74826"/>
+    <w:rsid w:val="008A30C5"/>
     <w:rPr>
       <w:color w:val="605E5C"/>
       <w:shd w:val="clear" w:color="auto" w:fill="E1DFDD"/>

</xml_diff>

<commit_message>
Docs: start page graphic and KPI pull hardening deployed, handbook chapter 10 updated, LEARNINGS (deploy without delta check), coordination closed
Co-Authored-By: Claude Opus 5.5 <noreply@anthropic.com>
</commit_message>
<xml_diff>
--- a/TrafagSalesExporter/wwwroot/handbuch/Trafag_Cockpit_Handbuch.docx
+++ b/TrafagSalesExporter/wwwroot/handbuch/Trafag_Cockpit_Handbuch.docx
@@ -21,7 +21,7 @@
                     <pic:cNvPicPr/>
                   </pic:nvPicPr>
                   <pic:blipFill>
-                    <a:blip xmlns:r="http://schemas.openxmlformats.org/officeDocument/2006/relationships" r:embed="R040c122263ab473b"/>
+                    <a:blip xmlns:r="http://schemas.openxmlformats.org/officeDocument/2006/relationships" r:embed="Rbc86227cb49a4c85"/>
                     <a:stretch>
                       <a:fillRect/>
                     </a:stretch>
@@ -19488,7 +19488,7 @@
     </w:p>
     <w:p>
       <w:r>
-        <w:t xml:space="preserve">Die Kacheln zeigen dieselben Zahlen wie der Report (siehe nächster Abschnitt). Der Abruf läuft automatisch am 2. Kalendertag jedes Monats für den Zeitraum 1. Januar bis Ende Vormonat und dauert einige Minuten. Pro Berichtsmonat wird ein Stand gespeichert; ein neuer Abruf ersetzt den Stand desselben Monats.</w:t>
+        <w:t xml:space="preserve">Die Kacheln zeigen dieselben Zahlen wie der Report (siehe nächster Abschnitt). Der Abruf läuft automatisch ab dem 2. Kalendertag jedes Monats für den Zeitraum 1. Januar bis Ende Vormonat und dauert einige Minuten. Solange der Vormonat fehlt, versucht die App es alle zwei Stunden erneut, auch nach einem Neustart. Jeder Versuch wird gespeichert und steht in den Admin-Logs unter „Operations KPI“. Fehlt der Vormonat ab dem 3. noch immer, erscheint auf der Übersicht und im Report ein roter Warnhinweis. Pro Berichtsmonat wird ein Stand gespeichert; ein neuer Abruf ersetzt den Stand desselben Monats.</w:t>
       </w:r>
     </w:p>
     <w:p>
@@ -20699,8 +20699,8 @@
       </w:pPr>
     </w:p>
     <w:sectPr>
-      <w:headerReference xmlns:r="http://schemas.openxmlformats.org/officeDocument/2006/relationships" w:type="default" r:id="R92c78b01fa774731"/>
-      <w:footerReference xmlns:r="http://schemas.openxmlformats.org/officeDocument/2006/relationships" w:type="default" r:id="R3507387f876440d8"/>
+      <w:headerReference xmlns:r="http://schemas.openxmlformats.org/officeDocument/2006/relationships" w:type="default" r:id="R4b36b99c914445cb"/>
+      <w:footerReference xmlns:r="http://schemas.openxmlformats.org/officeDocument/2006/relationships" w:type="default" r:id="Re805da03ebf34a9e"/>
       <w:titlePg/>
       <w:pgSz w:w="11906" w:h="16838"/>
       <w:pgMar w:top="1300" w:right="1300" w:bottom="1300" w:left="1300" w:header="600" w:footer="600"/>
@@ -20785,7 +20785,7 @@
                   <pic:cNvPicPr/>
                 </pic:nvPicPr>
                 <pic:blipFill>
-                  <a:blip xmlns:r="http://schemas.openxmlformats.org/officeDocument/2006/relationships" r:embed="Rc5dec7ba82734961"/>
+                  <a:blip xmlns:r="http://schemas.openxmlformats.org/officeDocument/2006/relationships" r:embed="R5059f29e514d4dfa"/>
                   <a:stretch>
                     <a:fillRect/>
                   </a:stretch>

</xml_diff>

<commit_message>
Shopfloor: ZD05 sync at 04:00 and 12:45 (was 05:45), handbook; save test of ampel documented
Co-Authored-By: Claude Opus 5.5 <noreply@anthropic.com>
</commit_message>
<xml_diff>
--- a/TrafagSalesExporter/wwwroot/handbuch/Trafag_Cockpit_Handbuch.docx
+++ b/TrafagSalesExporter/wwwroot/handbuch/Trafag_Cockpit_Handbuch.docx
@@ -21,7 +21,7 @@
                     <pic:cNvPicPr/>
                   </pic:nvPicPr>
                   <pic:blipFill>
-                    <a:blip xmlns:r="http://schemas.openxmlformats.org/officeDocument/2006/relationships" r:embed="Rbc86227cb49a4c85"/>
+                    <a:blip xmlns:r="http://schemas.openxmlformats.org/officeDocument/2006/relationships" r:embed="R7cfdc02e4f4542fc"/>
                     <a:stretch>
                       <a:fillRect/>
                     </a:stretch>
@@ -76,7 +76,7 @@
         <w:pStyle w:val="Meta"/>
       </w:pPr>
       <w:r>
-        <w:t xml:space="preserve">Stand der Software: Commit 3ad0dae vom 5. Oktober 2026 · Ausgabe 14.10.2026</w:t>
+        <w:t xml:space="preserve">Stand der Software: Commit 3ad0dae vom 5. Oktober 2026 · Ausgabe 16.10.2026</w:t>
       </w:r>
     </w:p>
     <w:p>
@@ -2991,6 +2991,17 @@
         <w:rPr>
           <w:b/>
         </w:rPr>
+        <w:t xml:space="preserve">Passwörter</w:t>
+      </w:r>
+      <w:r>
+        <w:t xml:space="preserve"> listet alle Bereichs-Logins (Admin, Finance, HR KPI mit Zusatzkonten, Operations, Logistik) mit Benutzer, Status und letzter Änderung. Der angemeldete Admin setzt dort mit „Neu setzen“ ein neues Passwort, ohne das alte zu kennen; es muss mindestens 8 Zeichen lang sein. Gespeichert wird nur ein Hash in der Datenbank, ein Deploy überschreibt ihn nicht. Wer im Bereich angemeldet ist, muss sich danach neu anmelden. Oben auf derselben Seite schaltet „Operations: Login nötig“ das eigene Login für Operations ab: Ist der Schalter aus, sehen und bearbeiten alle mit Windows-Anmeldung den Shopfloor.</w:t>
+      </w:r>
+    </w:p>
+    <w:p>
+      <w:r>
+        <w:rPr>
+          <w:b/>
+        </w:rPr>
         <w:t xml:space="preserve">Standorte</w:t>
       </w:r>
       <w:r>
@@ -19389,7 +19400,7 @@
         <w:t xml:space="preserve">Shopfloor</w:t>
       </w:r>
       <w:r>
-        <w:t xml:space="preserve"> liegt das digitale Shop-Floor-Board, das die Excel-Datei „PPA-Shop-Floor-File“ ersetzt: Pendenzen, Abteilungswerte, Rückstandslisten, Fehlteile, Forecast und die Auslastungsgrafik für das tägliche Shop-Floor-Meeting. Hauptnutzer sind die Leitung Operations, die Produktionsplanung (PPD), die Abteilungsleiter und Teamleiter der Produktion, Einkauf, Verkauf und Logistik. Der Zugang läuft über eine eigene Anmeldung (Benutzer „operations“) oder ein freigegebenes Windows-Konto. Die Liefertreue kommt monatlich direkt aus SAP, das Shopfloor wird werktags um 05:45 und 12:45 Uhr aus SAP ergänzt und sonst im Meeting von Hand gepflegt.</w:t>
+        <w:t xml:space="preserve"> liegt das digitale Shop-Floor-Board, das die Excel-Datei „PPA-Shop-Floor-File“ ersetzt: Pendenzen, Abteilungswerte, Rückstandslisten, Fehlteile, Forecast und die Auslastungsgrafik für das tägliche Shop-Floor-Meeting. Hauptnutzer sind die Leitung Operations, die Produktionsplanung (PPD), die Abteilungsleiter und Teamleiter der Produktion, Einkauf, Verkauf und Logistik. Der Zugang läuft über eine eigene Anmeldung (Benutzer „operations“) oder ein freigegebenes Windows-Konto. Die Liefertreue kommt monatlich direkt aus SAP, das Shopfloor wird werktags um 04:00 und 12:45 Uhr aus SAP ergänzt und sonst im Meeting von Hand gepflegt.</w:t>
       </w:r>
     </w:p>
     <w:p>
@@ -20089,7 +20100,7 @@
     </w:p>
     <w:p>
       <w:r>
-        <w:t xml:space="preserve">Die Daten kommen werktags um 05:45 und 12:45 Uhr aus SAP (Report ZD05, Disponenten 001 und 003). Bemerkung, Liefertermin und Code werden je Material vom Vortag übernommen. Die </w:t>
+        <w:t xml:space="preserve">Die Daten kommen werktags um 04:00 und 12:45 Uhr aus SAP (Report ZD05, Disponenten 001 und 003). Bemerkung, Liefertermin und Code werden je Material vom Vortag übernommen. Die </w:t>
       </w:r>
       <w:r>
         <w:rPr>
@@ -20699,8 +20710,8 @@
       </w:pPr>
     </w:p>
     <w:sectPr>
-      <w:headerReference xmlns:r="http://schemas.openxmlformats.org/officeDocument/2006/relationships" w:type="default" r:id="R4b36b99c914445cb"/>
-      <w:footerReference xmlns:r="http://schemas.openxmlformats.org/officeDocument/2006/relationships" w:type="default" r:id="Re805da03ebf34a9e"/>
+      <w:headerReference xmlns:r="http://schemas.openxmlformats.org/officeDocument/2006/relationships" w:type="default" r:id="R2091c8f875ff4508"/>
+      <w:footerReference xmlns:r="http://schemas.openxmlformats.org/officeDocument/2006/relationships" w:type="default" r:id="Ra85f49d6a09f43db"/>
       <w:titlePg/>
       <w:pgSz w:w="11906" w:h="16838"/>
       <w:pgMar w:top="1300" w:right="1300" w:bottom="1300" w:left="1300" w:header="600" w:footer="600"/>
@@ -20785,7 +20796,7 @@
                   <pic:cNvPicPr/>
                 </pic:nvPicPr>
                 <pic:blipFill>
-                  <a:blip xmlns:r="http://schemas.openxmlformats.org/officeDocument/2006/relationships" r:embed="R5059f29e514d4dfa"/>
+                  <a:blip xmlns:r="http://schemas.openxmlformats.org/officeDocument/2006/relationships" r:embed="Re1de2b4ab0e94dd2"/>
                   <a:stretch>
                     <a:fillRect/>
                   </a:stretch>

</xml_diff>